<commit_message>
Update docx reports with new Section C and plots
</commit_message>
<xml_diff>
--- a/assessment_report.docx
+++ b/assessment_report.docx
@@ -5350,285 +5350,49 @@
         <w:autoSpaceDN w:val="0"/>
         <w:autoSpaceDE w:val="0"/>
         <w:widowControl/>
-        <w:spacing w:line="332" w:lineRule="exact" w:before="528" w:after="0"/>
-        <w:ind w:left="30" w:right="0" w:firstLine="0"/>
-        <w:jc w:val="left"/>
+        <w:spacing w:line="352" w:lineRule="exact" w:before="346" w:after="0"/>
+        <w:ind w:left="30" w:right="50" w:firstLine="0"/>
+        <w:jc w:val="both"/>
       </w:pPr>
       <w:r>
         <w:rPr>
           <w:rFonts w:ascii="Helvetica" w:hAnsi="Helvetica" w:eastAsia="Helvetica"/>
-          <w:b/>
-          <w:i w:val="0"/>
-          <w:color w:val="1F3A52"/>
-          <w:sz w:val="24"/>
-        </w:rPr>
-        <w:t>1. Missing Value and Outlier Analysis</w:t>
-      </w:r>
-    </w:p>
-    <w:p>
-      <w:pPr>
-        <w:autoSpaceDN w:val="0"/>
-        <w:tabs>
-          <w:tab w:pos="660" w:val="left"/>
-        </w:tabs>
-        <w:autoSpaceDE w:val="0"/>
-        <w:widowControl/>
-        <w:spacing w:line="352" w:lineRule="exact" w:before="170" w:after="0"/>
-        <w:ind w:left="330" w:right="432" w:firstLine="0"/>
-        <w:jc w:val="left"/>
-      </w:pPr>
-      <w:r>
-        <w:rPr>
-          <w:rFonts w:ascii="Helvetica" w:hAnsi="Helvetica" w:eastAsia="Helvetica"/>
-          <w:b w:val="0"/>
-          <w:i w:val="0"/>
-          <w:color w:val="333333"/>
-          <w:sz w:val="22"/>
-        </w:rPr>
-        <w:t>•</w:t>
-      </w:r>
-      <w:r>
-        <w:tab/>
-      </w:r>
-      <w:r>
-        <w:rPr>
-          <w:rFonts w:ascii="Helvetica" w:hAnsi="Helvetica" w:eastAsia="Helvetica"/>
-          <w:b/>
-          <w:i w:val="0"/>
-          <w:color w:val="333333"/>
-          <w:sz w:val="22"/>
-        </w:rPr>
-        <w:t>Missing Values:</w:t>
-      </w:r>
-      <w:r>
-        <w:rPr>
-          <w:rFonts w:ascii="Helvetica" w:hAnsi="Helvetica" w:eastAsia="Helvetica"/>
-          <w:b w:val="0"/>
-          <w:i w:val="0"/>
-          <w:color w:val="333333"/>
-          <w:sz w:val="22"/>
-        </w:rPr>
-        <w:t xml:space="preserve"> We dropped rows containing missing </w:t>
-      </w:r>
-      <w:r>
-        <w:rPr>
-          <w:shd w:val="clear" w:color="auto" w:fill="f4f4f4"/>
-          <w:rFonts w:ascii="Courier" w:hAnsi="Courier" w:eastAsia="Courier"/>
-          <w:b w:val="0"/>
-          <w:i w:val="0"/>
-          <w:color w:val="333333"/>
-          <w:sz w:val="19"/>
-        </w:rPr>
-        <w:t>PropertyAge</w:t>
-      </w:r>
-      <w:r>
-        <w:rPr>
-          <w:rFonts w:ascii="Helvetica" w:hAnsi="Helvetica" w:eastAsia="Helvetica"/>
-          <w:b w:val="0"/>
-          <w:i w:val="0"/>
-          <w:color w:val="333333"/>
-          <w:sz w:val="22"/>
-        </w:rPr>
-        <w:t xml:space="preserve"> (1,313 rows in the </w:t>
-      </w:r>
-      <w:r>
-        <w:tab/>
-      </w:r>
-      <w:r>
-        <w:rPr>
-          <w:rFonts w:ascii="Helvetica" w:hAnsi="Helvetica" w:eastAsia="Helvetica"/>
-          <w:b w:val="0"/>
-          <w:i w:val="0"/>
-          <w:color w:val="333333"/>
-          <w:sz w:val="22"/>
-        </w:rPr>
-        <w:t xml:space="preserve">training set) to preserve quality. Features like </w:t>
-      </w:r>
-      <w:r>
-        <w:rPr>
-          <w:shd w:val="clear" w:color="auto" w:fill="f4f4f4"/>
-          <w:rFonts w:ascii="Courier" w:hAnsi="Courier" w:eastAsia="Courier"/>
-          <w:b w:val="0"/>
-          <w:i w:val="0"/>
-          <w:color w:val="333333"/>
-          <w:sz w:val="19"/>
-        </w:rPr>
-        <w:t>TotalBedrooms</w:t>
-      </w:r>
-      <w:r>
-        <w:rPr>
-          <w:rFonts w:ascii="Helvetica" w:hAnsi="Helvetica" w:eastAsia="Helvetica"/>
-          <w:b w:val="0"/>
-          <w:i w:val="0"/>
-          <w:color w:val="333333"/>
-          <w:sz w:val="22"/>
-        </w:rPr>
-        <w:t xml:space="preserve"> had median imputation </w:t>
-      </w:r>
-      <w:r>
-        <w:tab/>
-      </w:r>
-      <w:r>
-        <w:rPr>
-          <w:rFonts w:ascii="Helvetica" w:hAnsi="Helvetica" w:eastAsia="Helvetica"/>
-          <w:b w:val="0"/>
-          <w:i w:val="0"/>
-          <w:color w:val="333333"/>
-          <w:sz w:val="22"/>
-        </w:rPr>
-        <w:t>applied.</w:t>
-      </w:r>
-    </w:p>
-    <w:p>
-      <w:pPr>
-        <w:autoSpaceDN w:val="0"/>
-        <w:tabs>
-          <w:tab w:pos="660" w:val="left"/>
-        </w:tabs>
-        <w:autoSpaceDE w:val="0"/>
-        <w:widowControl/>
-        <w:spacing w:line="352" w:lineRule="exact" w:before="150" w:after="0"/>
-        <w:ind w:left="330" w:right="0" w:firstLine="0"/>
-        <w:jc w:val="left"/>
-      </w:pPr>
-      <w:r>
-        <w:rPr>
-          <w:rFonts w:ascii="Helvetica" w:hAnsi="Helvetica" w:eastAsia="Helvetica"/>
-          <w:b w:val="0"/>
-          <w:i w:val="0"/>
-          <w:color w:val="333333"/>
-          <w:sz w:val="22"/>
-        </w:rPr>
-        <w:t>•</w:t>
-      </w:r>
-      <w:r>
-        <w:tab/>
-      </w:r>
-      <w:r>
-        <w:rPr>
-          <w:rFonts w:ascii="Helvetica" w:hAnsi="Helvetica" w:eastAsia="Helvetica"/>
-          <w:b/>
-          <w:i w:val="0"/>
-          <w:color w:val="333333"/>
-          <w:sz w:val="22"/>
-        </w:rPr>
-        <w:t>Outliers:</w:t>
-      </w:r>
-      <w:r>
-        <w:rPr>
-          <w:rFonts w:ascii="Helvetica" w:hAnsi="Helvetica" w:eastAsia="Helvetica"/>
-          <w:b w:val="0"/>
-          <w:i w:val="0"/>
-          <w:color w:val="333333"/>
-          <w:sz w:val="22"/>
-        </w:rPr>
-        <w:t xml:space="preserve"> IQR and 3-sigma calculations identified skewness in </w:t>
-      </w:r>
-      <w:r>
-        <w:rPr>
-          <w:shd w:val="clear" w:color="auto" w:fill="f4f4f4"/>
-          <w:rFonts w:ascii="Courier" w:hAnsi="Courier" w:eastAsia="Courier"/>
-          <w:b w:val="0"/>
-          <w:i w:val="0"/>
-          <w:color w:val="333333"/>
-          <w:sz w:val="19"/>
-        </w:rPr>
-        <w:t>AvgOccupancy</w:t>
-      </w:r>
-      <w:r>
-        <w:rPr>
-          <w:rFonts w:ascii="Helvetica" w:hAnsi="Helvetica" w:eastAsia="Helvetica"/>
-          <w:b w:val="0"/>
-          <w:i w:val="0"/>
-          <w:color w:val="333333"/>
-          <w:sz w:val="22"/>
-        </w:rPr>
-        <w:t xml:space="preserve"> and </w:t>
-      </w:r>
-      <w:r>
-        <w:br/>
-      </w:r>
-      <w:r>
-        <w:tab/>
-      </w:r>
-      <w:r>
-        <w:rPr>
-          <w:shd w:val="clear" w:color="auto" w:fill="f4f4f4"/>
-          <w:rFonts w:ascii="Courier" w:hAnsi="Courier" w:eastAsia="Courier"/>
-          <w:b w:val="0"/>
-          <w:i w:val="0"/>
-          <w:color w:val="333333"/>
-          <w:sz w:val="19"/>
-        </w:rPr>
-        <w:t>RoomsPerHousehold</w:t>
-      </w:r>
-      <w:r>
-        <w:rPr>
-          <w:rFonts w:ascii="Helvetica" w:hAnsi="Helvetica" w:eastAsia="Helvetica"/>
-          <w:b w:val="0"/>
-          <w:i w:val="0"/>
-          <w:color w:val="333333"/>
-          <w:sz w:val="22"/>
-        </w:rPr>
-        <w:t xml:space="preserve">. This influenced the decision to use a Robust Pipeline containing </w:t>
-      </w:r>
-      <w:r>
-        <w:tab/>
-      </w:r>
-      <w:r>
-        <w:rPr>
-          <w:shd w:val="clear" w:color="auto" w:fill="f4f4f4"/>
-          <w:rFonts w:ascii="Courier" w:hAnsi="Courier" w:eastAsia="Courier"/>
-          <w:b w:val="0"/>
-          <w:i w:val="0"/>
-          <w:color w:val="333333"/>
-          <w:sz w:val="19"/>
-        </w:rPr>
-        <w:t>SimpleImputer(strategy='median')</w:t>
-      </w:r>
-      <w:r>
-        <w:rPr>
-          <w:rFonts w:ascii="Helvetica" w:hAnsi="Helvetica" w:eastAsia="Helvetica"/>
-          <w:b w:val="0"/>
-          <w:i w:val="0"/>
-          <w:color w:val="333333"/>
-          <w:sz w:val="22"/>
-        </w:rPr>
-        <w:t xml:space="preserve"> and </w:t>
-      </w:r>
-      <w:r>
-        <w:rPr>
-          <w:shd w:val="clear" w:color="auto" w:fill="f4f4f4"/>
-          <w:rFonts w:ascii="Courier" w:hAnsi="Courier" w:eastAsia="Courier"/>
-          <w:b w:val="0"/>
-          <w:i w:val="0"/>
-          <w:color w:val="333333"/>
-          <w:sz w:val="19"/>
-        </w:rPr>
-        <w:t>StandardScaler</w:t>
-      </w:r>
-      <w:r>
-        <w:rPr>
-          <w:rFonts w:ascii="Helvetica" w:hAnsi="Helvetica" w:eastAsia="Helvetica"/>
-          <w:b w:val="0"/>
-          <w:i w:val="0"/>
-          <w:color w:val="333333"/>
-          <w:sz w:val="22"/>
-        </w:rPr>
-        <w:t xml:space="preserve"> to normalize distributions before </w:t>
-      </w:r>
-      <w:r>
-        <w:tab/>
-      </w:r>
-      <w:r>
-        <w:rPr>
-          <w:rFonts w:ascii="Helvetica" w:hAnsi="Helvetica" w:eastAsia="Helvetica"/>
-          <w:b w:val="0"/>
-          <w:i w:val="0"/>
-          <w:color w:val="333333"/>
-          <w:sz w:val="22"/>
-        </w:rPr>
-        <w:t>feeding them to models.</w:t>
+          <w:b w:val="0"/>
+          <w:i w:val="0"/>
+          <w:color w:val="333333"/>
+          <w:sz w:val="22"/>
+        </w:rPr>
+        <w:t xml:space="preserve">Exploratory Data Analysis (EDA) was carried out to understand the structure, distribution, and </w:t>
+      </w:r>
+      <w:r>
+        <w:rPr>
+          <w:rFonts w:ascii="Helvetica" w:hAnsi="Helvetica" w:eastAsia="Helvetica"/>
+          <w:b w:val="0"/>
+          <w:i w:val="0"/>
+          <w:color w:val="333333"/>
+          <w:sz w:val="22"/>
+        </w:rPr>
+        <w:t xml:space="preserve">relationships within the dataset for the real estate price prediction task. The analysis aimed to </w:t>
+      </w:r>
+      <w:r>
+        <w:rPr>
+          <w:rFonts w:ascii="Helvetica" w:hAnsi="Helvetica" w:eastAsia="Helvetica"/>
+          <w:b w:val="0"/>
+          <w:i w:val="0"/>
+          <w:color w:val="333333"/>
+          <w:sz w:val="22"/>
+        </w:rPr>
+        <w:t xml:space="preserve">identify data quality issues, target distribution, feature behavior, and correlations that affect model </w:t>
+      </w:r>
+      <w:r>
+        <w:rPr>
+          <w:rFonts w:ascii="Helvetica" w:hAnsi="Helvetica" w:eastAsia="Helvetica"/>
+          <w:b w:val="0"/>
+          <w:i w:val="0"/>
+          <w:color w:val="333333"/>
+          <w:sz w:val="22"/>
+        </w:rPr>
+        <w:t>performance and algorithmic choices.</w:t>
       </w:r>
     </w:p>
     <w:p>
@@ -5636,26 +5400,832 @@
         <w:autoSpaceDN w:val="0"/>
         <w:autoSpaceDE w:val="0"/>
         <w:widowControl/>
-        <w:spacing w:line="332" w:lineRule="exact" w:before="816" w:after="0"/>
+        <w:spacing w:line="352" w:lineRule="exact" w:before="304" w:after="0"/>
         <w:ind w:left="30" w:right="0" w:firstLine="0"/>
         <w:jc w:val="left"/>
       </w:pPr>
       <w:r>
         <w:rPr>
           <w:rFonts w:ascii="Helvetica" w:hAnsi="Helvetica" w:eastAsia="Helvetica"/>
-          <w:b/>
-          <w:i w:val="0"/>
-          <w:color w:val="1F3A52"/>
-          <w:sz w:val="24"/>
-        </w:rPr>
-        <w:t>2. Feature Binning and Statistical Justification</w:t>
+          <w:b w:val="0"/>
+          <w:i w:val="0"/>
+          <w:color w:val="333333"/>
+          <w:sz w:val="22"/>
+        </w:rPr>
+        <w:t xml:space="preserve">The training dataset has 16,512 observations and 11 attributes. These include physical structural </w:t>
+      </w:r>
+      <w:r>
+        <w:rPr>
+          <w:rFonts w:ascii="Helvetica" w:hAnsi="Helvetica" w:eastAsia="Helvetica"/>
+          <w:b w:val="0"/>
+          <w:i w:val="0"/>
+          <w:color w:val="333333"/>
+          <w:sz w:val="22"/>
+        </w:rPr>
+        <w:t xml:space="preserve">attributes, local demographic indicators, and geographic coordinates, along with the continuous </w:t>
+      </w:r>
+      <w:r>
+        <w:rPr>
+          <w:rFonts w:ascii="Helvetica" w:hAnsi="Helvetica" w:eastAsia="Helvetica"/>
+          <w:b w:val="0"/>
+          <w:i w:val="0"/>
+          <w:color w:val="333333"/>
+          <w:sz w:val="22"/>
+        </w:rPr>
+        <w:t xml:space="preserve">target variable </w:t>
+      </w:r>
+      <w:r>
+        <w:rPr>
+          <w:shd w:val="clear" w:color="auto" w:fill="f4f4f4"/>
+          <w:rFonts w:ascii="Courier" w:hAnsi="Courier" w:eastAsia="Courier"/>
+          <w:b w:val="0"/>
+          <w:i w:val="0"/>
+          <w:color w:val="333333"/>
+          <w:sz w:val="19"/>
+        </w:rPr>
+        <w:t>TargetPrice</w:t>
+      </w:r>
+      <w:r>
+        <w:rPr>
+          <w:rFonts w:ascii="Helvetica" w:hAnsi="Helvetica" w:eastAsia="Helvetica"/>
+          <w:b w:val="0"/>
+          <w:i w:val="0"/>
+          <w:color w:val="333333"/>
+          <w:sz w:val="22"/>
+        </w:rPr>
+        <w:t xml:space="preserve">. An initial check showed missing values in the </w:t>
+      </w:r>
+      <w:r>
+        <w:rPr>
+          <w:shd w:val="clear" w:color="auto" w:fill="f4f4f4"/>
+          <w:rFonts w:ascii="Courier" w:hAnsi="Courier" w:eastAsia="Courier"/>
+          <w:b w:val="0"/>
+          <w:i w:val="0"/>
+          <w:color w:val="333333"/>
+          <w:sz w:val="19"/>
+        </w:rPr>
+        <w:t>PropertyAge</w:t>
+      </w:r>
+      <w:r>
+        <w:rPr>
+          <w:rFonts w:ascii="Helvetica" w:hAnsi="Helvetica" w:eastAsia="Helvetica"/>
+          <w:b w:val="0"/>
+          <w:i w:val="0"/>
+          <w:color w:val="333333"/>
+          <w:sz w:val="22"/>
+        </w:rPr>
+        <w:t xml:space="preserve"> feature </w:t>
+      </w:r>
+      <w:r>
+        <w:rPr>
+          <w:rFonts w:ascii="Helvetica" w:hAnsi="Helvetica" w:eastAsia="Helvetica"/>
+          <w:b w:val="0"/>
+          <w:i w:val="0"/>
+          <w:color w:val="333333"/>
+          <w:sz w:val="22"/>
+        </w:rPr>
+        <w:t xml:space="preserve">(~7.9% of training records) and the </w:t>
+      </w:r>
+      <w:r>
+        <w:rPr>
+          <w:shd w:val="clear" w:color="auto" w:fill="f4f4f4"/>
+          <w:rFonts w:ascii="Courier" w:hAnsi="Courier" w:eastAsia="Courier"/>
+          <w:b w:val="0"/>
+          <w:i w:val="0"/>
+          <w:color w:val="333333"/>
+          <w:sz w:val="19"/>
+        </w:rPr>
+        <w:t>TotalBedrooms</w:t>
+      </w:r>
+      <w:r>
+        <w:rPr>
+          <w:rFonts w:ascii="Helvetica" w:hAnsi="Helvetica" w:eastAsia="Helvetica"/>
+          <w:b w:val="0"/>
+          <w:i w:val="0"/>
+          <w:color w:val="333333"/>
+          <w:sz w:val="22"/>
+        </w:rPr>
+        <w:t xml:space="preserve"> feature (~0.1%). The dataset contains a mix of </w:t>
+      </w:r>
+      <w:r>
+        <w:rPr>
+          <w:rFonts w:ascii="Helvetica" w:hAnsi="Helvetica" w:eastAsia="Helvetica"/>
+          <w:b w:val="0"/>
+          <w:i w:val="0"/>
+          <w:color w:val="333333"/>
+          <w:sz w:val="22"/>
+        </w:rPr>
+        <w:t xml:space="preserve">numerical (float and integer) and engineered categorical variables, supporting the use of robust </w:t>
+      </w:r>
+      <w:r>
+        <w:rPr>
+          <w:rFonts w:ascii="Helvetica" w:hAnsi="Helvetica" w:eastAsia="Helvetica"/>
+          <w:b w:val="0"/>
+          <w:i w:val="0"/>
+          <w:color w:val="333333"/>
+          <w:sz w:val="22"/>
+        </w:rPr>
+        <w:t>scaling, imputation, and encoding pipelines during model development.</w:t>
       </w:r>
     </w:p>
     <w:p>
       <w:pPr>
         <w:sectPr>
           <w:pgSz w:w="11906" w:h="16838"/>
-          <w:pgMar w:top="680" w:right="1104" w:bottom="1114" w:left="1124" w:header="720" w:footer="720" w:gutter="0"/>
+          <w:pgMar w:top="680" w:right="1104" w:bottom="1116" w:left="1124" w:header="720" w:footer="720" w:gutter="0"/>
+          <w:cols/>
+          <w:docGrid w:linePitch="360"/>
+        </w:sectPr>
+      </w:pPr>
+    </w:p>
+    <w:p>
+      <w:pPr>
+        <w:autoSpaceDN w:val="0"/>
+        <w:autoSpaceDE w:val="0"/>
+        <w:widowControl/>
+        <w:spacing w:line="220" w:lineRule="exact" w:before="0" w:after="456"/>
+        <w:ind w:left="0" w:right="0"/>
+      </w:pPr>
+    </w:p>
+    <w:p>
+      <w:pPr>
+        <w:autoSpaceDN w:val="0"/>
+        <w:autoSpaceDE w:val="0"/>
+        <w:widowControl/>
+        <w:spacing w:line="332" w:lineRule="exact" w:before="0" w:after="0"/>
+        <w:ind w:left="30" w:right="0" w:firstLine="0"/>
+        <w:jc w:val="left"/>
+      </w:pPr>
+      <w:r>
+        <w:rPr>
+          <w:rFonts w:ascii="Helvetica" w:hAnsi="Helvetica" w:eastAsia="Helvetica"/>
+          <w:b/>
+          <w:i w:val="0"/>
+          <w:color w:val="1F3A52"/>
+          <w:sz w:val="24"/>
+        </w:rPr>
+        <w:t>3.1 Target Variable Distribution and Boundary Capping</w:t>
+      </w:r>
+    </w:p>
+    <w:p>
+      <w:pPr>
+        <w:autoSpaceDN w:val="0"/>
+        <w:autoSpaceDE w:val="0"/>
+        <w:widowControl/>
+        <w:spacing w:line="352" w:lineRule="exact" w:before="270" w:after="0"/>
+        <w:ind w:left="30" w:right="0" w:firstLine="0"/>
+        <w:jc w:val="left"/>
+      </w:pPr>
+      <w:r>
+        <w:rPr>
+          <w:rFonts w:ascii="Helvetica" w:hAnsi="Helvetica" w:eastAsia="Helvetica"/>
+          <w:b w:val="0"/>
+          <w:i w:val="0"/>
+          <w:color w:val="333333"/>
+          <w:sz w:val="22"/>
+        </w:rPr>
+        <w:t xml:space="preserve">The target variable </w:t>
+      </w:r>
+      <w:r>
+        <w:rPr>
+          <w:shd w:val="clear" w:color="auto" w:fill="f4f4f4"/>
+          <w:rFonts w:ascii="Courier" w:hAnsi="Courier" w:eastAsia="Courier"/>
+          <w:b w:val="0"/>
+          <w:i w:val="0"/>
+          <w:color w:val="333333"/>
+          <w:sz w:val="19"/>
+        </w:rPr>
+        <w:t>TargetPrice</w:t>
+      </w:r>
+      <w:r>
+        <w:rPr>
+          <w:rFonts w:ascii="Helvetica" w:hAnsi="Helvetica" w:eastAsia="Helvetica"/>
+          <w:b w:val="0"/>
+          <w:i w:val="0"/>
+          <w:color w:val="333333"/>
+          <w:sz w:val="22"/>
+        </w:rPr>
+        <w:t xml:space="preserve"> shows the transaction price of properties (scaled by a factor of </w:t>
+      </w:r>
+      <w:r>
+        <w:rPr>
+          <w:rFonts w:ascii="Helvetica" w:hAnsi="Helvetica" w:eastAsia="Helvetica"/>
+          <w:b w:val="0"/>
+          <w:i w:val="0"/>
+          <w:color w:val="333333"/>
+          <w:sz w:val="22"/>
+        </w:rPr>
+        <w:t xml:space="preserve">100,000, e.g. a target value of 2.3367 represents a price of $233,671.67). Unlike classification </w:t>
+      </w:r>
+      <w:r>
+        <w:rPr>
+          <w:rFonts w:ascii="Helvetica" w:hAnsi="Helvetica" w:eastAsia="Helvetica"/>
+          <w:b w:val="0"/>
+          <w:i w:val="0"/>
+          <w:color w:val="333333"/>
+          <w:sz w:val="22"/>
+        </w:rPr>
+        <w:t xml:space="preserve">tasks, </w:t>
+      </w:r>
+      <w:r>
+        <w:rPr>
+          <w:shd w:val="clear" w:color="auto" w:fill="f4f4f4"/>
+          <w:rFonts w:ascii="Courier" w:hAnsi="Courier" w:eastAsia="Courier"/>
+          <w:b w:val="0"/>
+          <w:i w:val="0"/>
+          <w:color w:val="333333"/>
+          <w:sz w:val="19"/>
+        </w:rPr>
+        <w:t>TargetPrice</w:t>
+      </w:r>
+      <w:r>
+        <w:rPr>
+          <w:rFonts w:ascii="Helvetica" w:hAnsi="Helvetica" w:eastAsia="Helvetica"/>
+          <w:b w:val="0"/>
+          <w:i w:val="0"/>
+          <w:color w:val="333333"/>
+          <w:sz w:val="22"/>
+        </w:rPr>
+        <w:t xml:space="preserve"> is a continuous numerical variable. Analysis of its distribution showed a </w:t>
+      </w:r>
+      <w:r>
+        <w:rPr>
+          <w:rFonts w:ascii="Helvetica" w:hAnsi="Helvetica" w:eastAsia="Helvetica"/>
+          <w:b w:val="0"/>
+          <w:i w:val="0"/>
+          <w:color w:val="333333"/>
+          <w:sz w:val="22"/>
+        </w:rPr>
+        <w:t xml:space="preserve">right-skewed layout with a sharp spike at the upper boundary (5.0001), representing a hard price </w:t>
+      </w:r>
+      <w:r>
+        <w:rPr>
+          <w:rFonts w:ascii="Helvetica" w:hAnsi="Helvetica" w:eastAsia="Helvetica"/>
+          <w:b w:val="0"/>
+          <w:i w:val="0"/>
+          <w:color w:val="333333"/>
+          <w:sz w:val="22"/>
+        </w:rPr>
+        <w:t>cap of $500,000 imposed during data collection.</w:t>
+      </w:r>
+    </w:p>
+    <w:p>
+      <w:pPr>
+        <w:autoSpaceDN w:val="0"/>
+        <w:autoSpaceDE w:val="0"/>
+        <w:widowControl/>
+        <w:spacing w:line="352" w:lineRule="exact" w:before="304" w:after="0"/>
+        <w:ind w:left="30" w:right="0" w:firstLine="0"/>
+        <w:jc w:val="left"/>
+      </w:pPr>
+      <w:r>
+        <w:rPr>
+          <w:rFonts w:ascii="Helvetica" w:hAnsi="Helvetica" w:eastAsia="Helvetica"/>
+          <w:b w:val="0"/>
+          <w:i w:val="0"/>
+          <w:color w:val="333333"/>
+          <w:sz w:val="22"/>
+        </w:rPr>
+        <w:t xml:space="preserve">Because of this boundary limit and skewness, standard linear regressions are prone to predicting </w:t>
+      </w:r>
+      <w:r>
+        <w:rPr>
+          <w:rFonts w:ascii="Helvetica" w:hAnsi="Helvetica" w:eastAsia="Helvetica"/>
+          <w:b w:val="0"/>
+          <w:i w:val="0"/>
+          <w:color w:val="333333"/>
+          <w:sz w:val="22"/>
+        </w:rPr>
+        <w:t xml:space="preserve">negative values or out-of-bounds prices. So, we chose to implement a clipping threshold (capping </w:t>
+      </w:r>
+      <w:r>
+        <w:rPr>
+          <w:rFonts w:ascii="Helvetica" w:hAnsi="Helvetica" w:eastAsia="Helvetica"/>
+          <w:b w:val="0"/>
+          <w:i w:val="0"/>
+          <w:color w:val="333333"/>
+          <w:sz w:val="22"/>
+        </w:rPr>
+        <w:t>predictions at 0.0) in our model inference pipeline (</w:t>
+      </w:r>
+      <w:r>
+        <w:rPr>
+          <w:shd w:val="clear" w:color="auto" w:fill="f4f4f4"/>
+          <w:rFonts w:ascii="Courier" w:hAnsi="Courier" w:eastAsia="Courier"/>
+          <w:b w:val="0"/>
+          <w:i w:val="0"/>
+          <w:color w:val="333333"/>
+          <w:sz w:val="19"/>
+        </w:rPr>
+        <w:t>app.py</w:t>
+      </w:r>
+      <w:r>
+        <w:rPr>
+          <w:rFonts w:ascii="Helvetica" w:hAnsi="Helvetica" w:eastAsia="Helvetica"/>
+          <w:b w:val="0"/>
+          <w:i w:val="0"/>
+          <w:color w:val="333333"/>
+          <w:sz w:val="22"/>
+        </w:rPr>
+        <w:t xml:space="preserve"> and </w:t>
+      </w:r>
+      <w:r>
+        <w:rPr>
+          <w:shd w:val="clear" w:color="auto" w:fill="f4f4f4"/>
+          <w:rFonts w:ascii="Courier" w:hAnsi="Courier" w:eastAsia="Courier"/>
+          <w:b w:val="0"/>
+          <w:i w:val="0"/>
+          <w:color w:val="333333"/>
+          <w:sz w:val="19"/>
+        </w:rPr>
+        <w:t>06_model_inference.ipynb</w:t>
+      </w:r>
+      <w:r>
+        <w:rPr>
+          <w:rFonts w:ascii="Helvetica" w:hAnsi="Helvetica" w:eastAsia="Helvetica"/>
+          <w:b w:val="0"/>
+          <w:i w:val="0"/>
+          <w:color w:val="333333"/>
+          <w:sz w:val="22"/>
+        </w:rPr>
+        <w:t xml:space="preserve">). </w:t>
+      </w:r>
+      <w:r>
+        <w:rPr>
+          <w:rFonts w:ascii="Helvetica" w:hAnsi="Helvetica" w:eastAsia="Helvetica"/>
+          <w:b w:val="0"/>
+          <w:i w:val="0"/>
+          <w:color w:val="333333"/>
+          <w:sz w:val="22"/>
+        </w:rPr>
+        <w:t xml:space="preserve">Furthermore, this boundary behavior supported the use of non-parametric tree ensembles </w:t>
+      </w:r>
+      <w:r>
+        <w:rPr>
+          <w:rFonts w:ascii="Helvetica" w:hAnsi="Helvetica" w:eastAsia="Helvetica"/>
+          <w:b w:val="0"/>
+          <w:i w:val="0"/>
+          <w:color w:val="333333"/>
+          <w:sz w:val="22"/>
+        </w:rPr>
+        <w:t xml:space="preserve">(XGBoost and Random Forest), which construct split boundaries and handle capped limits and </w:t>
+      </w:r>
+      <w:r>
+        <w:rPr>
+          <w:rFonts w:ascii="Helvetica" w:hAnsi="Helvetica" w:eastAsia="Helvetica"/>
+          <w:b w:val="0"/>
+          <w:i w:val="0"/>
+          <w:color w:val="333333"/>
+          <w:sz w:val="22"/>
+        </w:rPr>
+        <w:t>skewness natively without requiring mathematical target transformations.</w:t>
+      </w:r>
+    </w:p>
+    <w:p>
+      <w:pPr>
+        <w:autoSpaceDN w:val="0"/>
+        <w:autoSpaceDE w:val="0"/>
+        <w:widowControl/>
+        <w:spacing w:line="332" w:lineRule="exact" w:before="982" w:after="0"/>
+        <w:ind w:left="30" w:right="0" w:firstLine="0"/>
+        <w:jc w:val="left"/>
+      </w:pPr>
+      <w:r>
+        <w:rPr>
+          <w:rFonts w:ascii="Helvetica" w:hAnsi="Helvetica" w:eastAsia="Helvetica"/>
+          <w:b/>
+          <w:i w:val="0"/>
+          <w:color w:val="1F3A52"/>
+          <w:sz w:val="24"/>
+        </w:rPr>
+        <w:t>3.2 Numerical Feature Distributions</w:t>
+      </w:r>
+    </w:p>
+    <w:p>
+      <w:pPr>
+        <w:autoSpaceDN w:val="0"/>
+        <w:autoSpaceDE w:val="0"/>
+        <w:widowControl/>
+        <w:spacing w:line="352" w:lineRule="exact" w:before="270" w:after="0"/>
+        <w:ind w:left="30" w:right="0" w:firstLine="0"/>
+        <w:jc w:val="left"/>
+      </w:pPr>
+      <w:r>
+        <w:rPr>
+          <w:rFonts w:ascii="Helvetica" w:hAnsi="Helvetica" w:eastAsia="Helvetica"/>
+          <w:b w:val="0"/>
+          <w:i w:val="0"/>
+          <w:color w:val="333333"/>
+          <w:sz w:val="22"/>
+        </w:rPr>
+        <w:t xml:space="preserve">The distributions of numerical features were examined using histograms with KDE overlays to </w:t>
+      </w:r>
+      <w:r>
+        <w:rPr>
+          <w:rFonts w:ascii="Helvetica" w:hAnsi="Helvetica" w:eastAsia="Helvetica"/>
+          <w:b w:val="0"/>
+          <w:i w:val="0"/>
+          <w:color w:val="333333"/>
+          <w:sz w:val="22"/>
+        </w:rPr>
+        <w:t>identify skewness, outliers, and general trends (see Figure 1).</w:t>
+      </w:r>
+    </w:p>
+    <w:p>
+      <w:pPr>
+        <w:sectPr>
+          <w:pgSz w:w="11906" w:h="16838"/>
+          <w:pgMar w:top="676" w:right="1104" w:bottom="1440" w:left="1124" w:header="720" w:footer="720" w:gutter="0"/>
+          <w:cols/>
+          <w:docGrid w:linePitch="360"/>
+        </w:sectPr>
+      </w:pPr>
+    </w:p>
+    <w:p>
+      <w:pPr>
+        <w:autoSpaceDN w:val="0"/>
+        <w:autoSpaceDE w:val="0"/>
+        <w:widowControl/>
+        <w:spacing w:line="220" w:lineRule="exact" w:before="0" w:after="498"/>
+        <w:ind w:left="0" w:right="0"/>
+      </w:pPr>
+    </w:p>
+    <w:p>
+      <w:pPr>
+        <w:autoSpaceDN w:val="0"/>
+        <w:autoSpaceDE w:val="0"/>
+        <w:widowControl/>
+        <w:spacing w:line="240" w:lineRule="auto" w:before="0" w:after="0"/>
+        <w:ind w:left="0" w:right="0" w:firstLine="0"/>
+        <w:jc w:val="center"/>
+      </w:pPr>
+      <w:r>
+        <w:drawing>
+          <wp:inline xmlns:a="http://schemas.openxmlformats.org/drawingml/2006/main" xmlns:pic="http://schemas.openxmlformats.org/drawingml/2006/picture">
+            <wp:extent cx="6094730" cy="4251959"/>
+            <wp:docPr id="1" name="Picture 1"/>
+            <wp:cNvGraphicFramePr>
+              <a:graphicFrameLocks noChangeAspect="1"/>
+            </wp:cNvGraphicFramePr>
+            <a:graphic>
+              <a:graphicData uri="http://schemas.openxmlformats.org/drawingml/2006/picture">
+                <pic:pic>
+                  <pic:nvPicPr>
+                    <pic:cNvPr id="0" name="image.png"/>
+                    <pic:cNvPicPr/>
+                  </pic:nvPicPr>
+                  <pic:blipFill>
+                    <a:blip r:embed="rId9"/>
+                    <a:stretch>
+                      <a:fillRect/>
+                    </a:stretch>
+                  </pic:blipFill>
+                  <pic:spPr>
+                    <a:xfrm>
+                      <a:off x="0" y="0"/>
+                      <a:ext cx="6094730" cy="4251959"/>
+                    </a:xfrm>
+                    <a:prstGeom prst="rect"/>
+                  </pic:spPr>
+                </pic:pic>
+              </a:graphicData>
+            </a:graphic>
+          </wp:inline>
+        </w:drawing>
+      </w:r>
+    </w:p>
+    <w:p>
+      <w:pPr>
+        <w:autoSpaceDN w:val="0"/>
+        <w:autoSpaceDE w:val="0"/>
+        <w:widowControl/>
+        <w:spacing w:line="352" w:lineRule="exact" w:before="178" w:after="0"/>
+        <w:ind w:left="30" w:right="80" w:firstLine="0"/>
+        <w:jc w:val="both"/>
+      </w:pPr>
+      <w:r>
+        <w:rPr>
+          <w:rFonts w:ascii="Helvetica" w:hAnsi="Helvetica" w:eastAsia="Helvetica"/>
+          <w:b w:val="0"/>
+          <w:i w:val="0"/>
+          <w:color w:val="333333"/>
+          <w:sz w:val="22"/>
+        </w:rPr>
+        <w:t>Applicant area income (</w:t>
+      </w:r>
+      <w:r>
+        <w:rPr>
+          <w:shd w:val="clear" w:color="auto" w:fill="f4f4f4"/>
+          <w:rFonts w:ascii="Courier" w:hAnsi="Courier" w:eastAsia="Courier"/>
+          <w:b w:val="0"/>
+          <w:i w:val="0"/>
+          <w:color w:val="333333"/>
+          <w:sz w:val="19"/>
+        </w:rPr>
+        <w:t>IncomeLevel</w:t>
+      </w:r>
+      <w:r>
+        <w:rPr>
+          <w:rFonts w:ascii="Helvetica" w:hAnsi="Helvetica" w:eastAsia="Helvetica"/>
+          <w:b w:val="0"/>
+          <w:i w:val="0"/>
+          <w:color w:val="333333"/>
+          <w:sz w:val="22"/>
+        </w:rPr>
+        <w:t xml:space="preserve">) showed a right-skewed distribution, indicating that most </w:t>
+      </w:r>
+      <w:r>
+        <w:rPr>
+          <w:rFonts w:ascii="Helvetica" w:hAnsi="Helvetica" w:eastAsia="Helvetica"/>
+          <w:b w:val="0"/>
+          <w:i w:val="0"/>
+          <w:color w:val="333333"/>
+          <w:sz w:val="22"/>
+        </w:rPr>
+        <w:t xml:space="preserve">property neighborhoods belong to middle-income classes, while a few represent high-income </w:t>
+      </w:r>
+      <w:r>
+        <w:rPr>
+          <w:rFonts w:ascii="Helvetica" w:hAnsi="Helvetica" w:eastAsia="Helvetica"/>
+          <w:b w:val="0"/>
+          <w:i w:val="0"/>
+          <w:color w:val="333333"/>
+          <w:sz w:val="22"/>
+        </w:rPr>
+        <w:t>districts. Average occupancy (</w:t>
+      </w:r>
+      <w:r>
+        <w:rPr>
+          <w:shd w:val="clear" w:color="auto" w:fill="f4f4f4"/>
+          <w:rFonts w:ascii="Courier" w:hAnsi="Courier" w:eastAsia="Courier"/>
+          <w:b w:val="0"/>
+          <w:i w:val="0"/>
+          <w:color w:val="333333"/>
+          <w:sz w:val="19"/>
+        </w:rPr>
+        <w:t>AvgOccupancy</w:t>
+      </w:r>
+      <w:r>
+        <w:rPr>
+          <w:rFonts w:ascii="Helvetica" w:hAnsi="Helvetica" w:eastAsia="Helvetica"/>
+          <w:b w:val="0"/>
+          <w:i w:val="0"/>
+          <w:color w:val="333333"/>
+          <w:sz w:val="22"/>
+        </w:rPr>
+        <w:t>) and rooms per household (</w:t>
+      </w:r>
+      <w:r>
+        <w:rPr>
+          <w:shd w:val="clear" w:color="auto" w:fill="f4f4f4"/>
+          <w:rFonts w:ascii="Courier" w:hAnsi="Courier" w:eastAsia="Courier"/>
+          <w:b w:val="0"/>
+          <w:i w:val="0"/>
+          <w:color w:val="333333"/>
+          <w:sz w:val="19"/>
+        </w:rPr>
+        <w:t>RoomsPerHousehold</w:t>
+      </w:r>
+      <w:r>
+        <w:rPr>
+          <w:rFonts w:ascii="Helvetica" w:hAnsi="Helvetica" w:eastAsia="Helvetica"/>
+          <w:b w:val="0"/>
+          <w:i w:val="0"/>
+          <w:color w:val="333333"/>
+          <w:sz w:val="22"/>
+        </w:rPr>
+        <w:t xml:space="preserve">) </w:t>
+      </w:r>
+      <w:r>
+        <w:rPr>
+          <w:rFonts w:ascii="Helvetica" w:hAnsi="Helvetica" w:eastAsia="Helvetica"/>
+          <w:b w:val="0"/>
+          <w:i w:val="0"/>
+          <w:color w:val="333333"/>
+          <w:sz w:val="22"/>
+        </w:rPr>
+        <w:t xml:space="preserve">exhibited extreme right-skewed distributions with heavy outlier tails (e.g., maximum occupancy </w:t>
+      </w:r>
+      <w:r>
+        <w:rPr>
+          <w:rFonts w:ascii="Helvetica" w:hAnsi="Helvetica" w:eastAsia="Helvetica"/>
+          <w:b w:val="0"/>
+          <w:i w:val="0"/>
+          <w:color w:val="333333"/>
+          <w:sz w:val="22"/>
+        </w:rPr>
+        <w:t>values reaching 1,243 and rooms exceeding 50 per household).</w:t>
+      </w:r>
+    </w:p>
+    <w:p>
+      <w:pPr>
+        <w:autoSpaceDN w:val="0"/>
+        <w:autoSpaceDE w:val="0"/>
+        <w:widowControl/>
+        <w:spacing w:line="352" w:lineRule="exact" w:before="304" w:after="0"/>
+        <w:ind w:left="30" w:right="0" w:firstLine="0"/>
+        <w:jc w:val="left"/>
+      </w:pPr>
+      <w:r>
+        <w:rPr>
+          <w:rFonts w:ascii="Helvetica" w:hAnsi="Helvetica" w:eastAsia="Helvetica"/>
+          <w:b w:val="0"/>
+          <w:i w:val="0"/>
+          <w:color w:val="333333"/>
+          <w:sz w:val="22"/>
+        </w:rPr>
+        <w:t>Geographical coordinates (</w:t>
+      </w:r>
+      <w:r>
+        <w:rPr>
+          <w:shd w:val="clear" w:color="auto" w:fill="f4f4f4"/>
+          <w:rFonts w:ascii="Courier" w:hAnsi="Courier" w:eastAsia="Courier"/>
+          <w:b w:val="0"/>
+          <w:i w:val="0"/>
+          <w:color w:val="333333"/>
+          <w:sz w:val="19"/>
+        </w:rPr>
+        <w:t>Latitude</w:t>
+      </w:r>
+      <w:r>
+        <w:rPr>
+          <w:rFonts w:ascii="Helvetica" w:hAnsi="Helvetica" w:eastAsia="Helvetica"/>
+          <w:b w:val="0"/>
+          <w:i w:val="0"/>
+          <w:color w:val="333333"/>
+          <w:sz w:val="22"/>
+        </w:rPr>
+        <w:t xml:space="preserve"> and </w:t>
+      </w:r>
+      <w:r>
+        <w:rPr>
+          <w:shd w:val="clear" w:color="auto" w:fill="f4f4f4"/>
+          <w:rFonts w:ascii="Courier" w:hAnsi="Courier" w:eastAsia="Courier"/>
+          <w:b w:val="0"/>
+          <w:i w:val="0"/>
+          <w:color w:val="333333"/>
+          <w:sz w:val="19"/>
+        </w:rPr>
+        <w:t>Longitude</w:t>
+      </w:r>
+      <w:r>
+        <w:rPr>
+          <w:rFonts w:ascii="Helvetica" w:hAnsi="Helvetica" w:eastAsia="Helvetica"/>
+          <w:b w:val="0"/>
+          <w:i w:val="0"/>
+          <w:color w:val="333333"/>
+          <w:sz w:val="22"/>
+        </w:rPr>
+        <w:t xml:space="preserve">) displayed multi-modal spatial distributions, </w:t>
+      </w:r>
+      <w:r>
+        <w:rPr>
+          <w:rFonts w:ascii="Helvetica" w:hAnsi="Helvetica" w:eastAsia="Helvetica"/>
+          <w:b w:val="0"/>
+          <w:i w:val="0"/>
+          <w:color w:val="333333"/>
+          <w:sz w:val="22"/>
+        </w:rPr>
+        <w:t xml:space="preserve">representing major population and housing clusters (e.g., coastal and metropolitan hubs). </w:t>
+      </w:r>
+      <w:r>
+        <w:rPr>
+          <w:rFonts w:ascii="Helvetica" w:hAnsi="Helvetica" w:eastAsia="Helvetica"/>
+          <w:b w:val="0"/>
+          <w:i w:val="0"/>
+          <w:color w:val="333333"/>
+          <w:sz w:val="22"/>
+        </w:rPr>
+        <w:t xml:space="preserve">Because of these spatial and skewed patterns, standard linear scaling would be heavily distorted </w:t>
+      </w:r>
+      <w:r>
+        <w:rPr>
+          <w:rFonts w:ascii="Helvetica" w:hAnsi="Helvetica" w:eastAsia="Helvetica"/>
+          <w:b w:val="0"/>
+          <w:i w:val="0"/>
+          <w:color w:val="333333"/>
+          <w:sz w:val="22"/>
+        </w:rPr>
+        <w:t xml:space="preserve">by extreme outliers. This influenced the decision to use robust tree-based ensembles (XGBoost </w:t>
+      </w:r>
+      <w:r>
+        <w:rPr>
+          <w:rFonts w:ascii="Helvetica" w:hAnsi="Helvetica" w:eastAsia="Helvetica"/>
+          <w:b w:val="0"/>
+          <w:i w:val="0"/>
+          <w:color w:val="333333"/>
+          <w:sz w:val="22"/>
+        </w:rPr>
+        <w:t xml:space="preserve">and Random Forest) that are rank-based and invariant to monotonic scale transformations, </w:t>
+      </w:r>
+      <w:r>
+        <w:rPr>
+          <w:rFonts w:ascii="Helvetica" w:hAnsi="Helvetica" w:eastAsia="Helvetica"/>
+          <w:b w:val="0"/>
+          <w:i w:val="0"/>
+          <w:color w:val="333333"/>
+          <w:sz w:val="22"/>
+        </w:rPr>
+        <w:t>making them immune to outlier scaling bias.</w:t>
+      </w:r>
+    </w:p>
+    <w:p>
+      <w:pPr>
+        <w:autoSpaceDN w:val="0"/>
+        <w:autoSpaceDE w:val="0"/>
+        <w:widowControl/>
+        <w:spacing w:line="330" w:lineRule="exact" w:before="984" w:after="0"/>
+        <w:ind w:left="30" w:right="0" w:firstLine="0"/>
+        <w:jc w:val="left"/>
+      </w:pPr>
+      <w:r>
+        <w:rPr>
+          <w:rFonts w:ascii="Helvetica" w:hAnsi="Helvetica" w:eastAsia="Helvetica"/>
+          <w:b/>
+          <w:i w:val="0"/>
+          <w:color w:val="1F3A52"/>
+          <w:sz w:val="24"/>
+        </w:rPr>
+        <w:t>3.3 Categorical and Engineered Feature Analysis</w:t>
+      </w:r>
+    </w:p>
+    <w:p>
+      <w:pPr>
+        <w:autoSpaceDN w:val="0"/>
+        <w:autoSpaceDE w:val="0"/>
+        <w:widowControl/>
+        <w:spacing w:line="352" w:lineRule="exact" w:before="270" w:after="0"/>
+        <w:ind w:left="30" w:right="20" w:firstLine="0"/>
+        <w:jc w:val="both"/>
+      </w:pPr>
+      <w:r>
+        <w:rPr>
+          <w:rFonts w:ascii="Helvetica" w:hAnsi="Helvetica" w:eastAsia="Helvetica"/>
+          <w:b w:val="0"/>
+          <w:i w:val="0"/>
+          <w:color w:val="333333"/>
+          <w:sz w:val="22"/>
+        </w:rPr>
+        <w:t xml:space="preserve">To capture the non-linear depreciation of housing values over time, the numerical feature </w:t>
+      </w:r>
+      <w:r>
+        <w:rPr>
+          <w:shd w:val="clear" w:color="auto" w:fill="f4f4f4"/>
+          <w:rFonts w:ascii="Courier" w:hAnsi="Courier" w:eastAsia="Courier"/>
+          <w:b w:val="0"/>
+          <w:i w:val="0"/>
+          <w:color w:val="333333"/>
+          <w:sz w:val="19"/>
+        </w:rPr>
+        <w:t>PropertyAge</w:t>
+      </w:r>
+      <w:r>
+        <w:rPr>
+          <w:rFonts w:ascii="Helvetica" w:hAnsi="Helvetica" w:eastAsia="Helvetica"/>
+          <w:b w:val="0"/>
+          <w:i w:val="0"/>
+          <w:color w:val="333333"/>
+          <w:sz w:val="22"/>
+        </w:rPr>
+        <w:t xml:space="preserve"> was engineered into a categorical feature (</w:t>
+      </w:r>
+      <w:r>
+        <w:rPr>
+          <w:shd w:val="clear" w:color="auto" w:fill="f4f4f4"/>
+          <w:rFonts w:ascii="Courier" w:hAnsi="Courier" w:eastAsia="Courier"/>
+          <w:b w:val="0"/>
+          <w:i w:val="0"/>
+          <w:color w:val="333333"/>
+          <w:sz w:val="19"/>
+        </w:rPr>
+        <w:t>PropertyAge_bins</w:t>
+      </w:r>
+      <w:r>
+        <w:rPr>
+          <w:rFonts w:ascii="Helvetica" w:hAnsi="Helvetica" w:eastAsia="Helvetica"/>
+          <w:b w:val="0"/>
+          <w:i w:val="0"/>
+          <w:color w:val="333333"/>
+          <w:sz w:val="22"/>
+        </w:rPr>
+        <w:t xml:space="preserve">) using structural age </w:t>
+      </w:r>
+      <w:r>
+        <w:rPr>
+          <w:rFonts w:ascii="Helvetica" w:hAnsi="Helvetica" w:eastAsia="Helvetica"/>
+          <w:b w:val="0"/>
+          <w:i w:val="0"/>
+          <w:color w:val="333333"/>
+          <w:sz w:val="22"/>
+        </w:rPr>
+        <w:t>brackets: 'New' ($\le 15$ years), 'Moderate' ($16-35$ years), and 'Old' ($&gt;35$ years) (see Figure</w:t>
+      </w:r>
+    </w:p>
+    <w:p>
+      <w:pPr>
+        <w:sectPr>
+          <w:pgSz w:w="11906" w:h="16838"/>
+          <w:pgMar w:top="720" w:right="1074" w:bottom="854" w:left="1124" w:header="720" w:footer="720" w:gutter="0"/>
           <w:cols/>
           <w:docGrid w:linePitch="360"/>
         </w:sectPr>
@@ -5673,12 +6243,808 @@
     <w:p>
       <w:pPr>
         <w:autoSpaceDN w:val="0"/>
+        <w:autoSpaceDE w:val="0"/>
+        <w:widowControl/>
+        <w:spacing w:line="304" w:lineRule="exact" w:before="0" w:after="0"/>
+        <w:ind w:left="30" w:right="0" w:firstLine="0"/>
+        <w:jc w:val="left"/>
+      </w:pPr>
+      <w:r>
+        <w:rPr>
+          <w:rFonts w:ascii="Helvetica" w:hAnsi="Helvetica" w:eastAsia="Helvetica"/>
+          <w:b w:val="0"/>
+          <w:i w:val="0"/>
+          <w:color w:val="333333"/>
+          <w:sz w:val="22"/>
+        </w:rPr>
+        <w:t>2).</w:t>
+      </w:r>
+    </w:p>
+    <w:p>
+      <w:pPr>
+        <w:autoSpaceDN w:val="0"/>
+        <w:autoSpaceDE w:val="0"/>
+        <w:widowControl/>
+        <w:spacing w:line="240" w:lineRule="auto" w:before="432" w:after="0"/>
+        <w:ind w:left="0" w:right="0" w:firstLine="0"/>
+        <w:jc w:val="center"/>
+      </w:pPr>
+      <w:r>
+        <w:drawing>
+          <wp:inline xmlns:a="http://schemas.openxmlformats.org/drawingml/2006/main" xmlns:pic="http://schemas.openxmlformats.org/drawingml/2006/picture">
+            <wp:extent cx="6094730" cy="4547870"/>
+            <wp:docPr id="2" name="Picture 2"/>
+            <wp:cNvGraphicFramePr>
+              <a:graphicFrameLocks noChangeAspect="1"/>
+            </wp:cNvGraphicFramePr>
+            <a:graphic>
+              <a:graphicData uri="http://schemas.openxmlformats.org/drawingml/2006/picture">
+                <pic:pic>
+                  <pic:nvPicPr>
+                    <pic:cNvPr id="0" name="image.png"/>
+                    <pic:cNvPicPr/>
+                  </pic:nvPicPr>
+                  <pic:blipFill>
+                    <a:blip r:embed="rId10"/>
+                    <a:stretch>
+                      <a:fillRect/>
+                    </a:stretch>
+                  </pic:blipFill>
+                  <pic:spPr>
+                    <a:xfrm>
+                      <a:off x="0" y="0"/>
+                      <a:ext cx="6094730" cy="4547870"/>
+                    </a:xfrm>
+                    <a:prstGeom prst="rect"/>
+                  </pic:spPr>
+                </pic:pic>
+              </a:graphicData>
+            </a:graphic>
+          </wp:inline>
+        </w:drawing>
+      </w:r>
+    </w:p>
+    <w:p>
+      <w:pPr>
+        <w:autoSpaceDN w:val="0"/>
+        <w:autoSpaceDE w:val="0"/>
+        <w:widowControl/>
+        <w:spacing w:line="352" w:lineRule="exact" w:before="176" w:after="0"/>
+        <w:ind w:left="30" w:right="50" w:firstLine="0"/>
+        <w:jc w:val="both"/>
+      </w:pPr>
+      <w:r>
+        <w:rPr>
+          <w:rFonts w:ascii="Helvetica" w:hAnsi="Helvetica" w:eastAsia="Helvetica"/>
+          <w:b w:val="0"/>
+          <w:i w:val="0"/>
+          <w:color w:val="333333"/>
+          <w:sz w:val="22"/>
+        </w:rPr>
+        <w:t xml:space="preserve">To mathematically prove that these binned age groups represent statistically distinct house prices, </w:t>
+      </w:r>
+      <w:r>
+        <w:rPr>
+          <w:rFonts w:ascii="Helvetica" w:hAnsi="Helvetica" w:eastAsia="Helvetica"/>
+          <w:b w:val="0"/>
+          <w:i w:val="0"/>
+          <w:color w:val="333333"/>
+          <w:sz w:val="22"/>
+        </w:rPr>
+        <w:t xml:space="preserve">we conducted formal hypothesis testing: * </w:t>
+      </w:r>
+      <w:r>
+        <w:rPr>
+          <w:rFonts w:ascii="Helvetica" w:hAnsi="Helvetica" w:eastAsia="Helvetica"/>
+          <w:b/>
+          <w:i w:val="0"/>
+          <w:color w:val="333333"/>
+          <w:sz w:val="22"/>
+        </w:rPr>
+        <w:t>ANOVA F-Test:</w:t>
+      </w:r>
+      <w:r>
+        <w:rPr>
+          <w:rFonts w:ascii="Helvetica" w:hAnsi="Helvetica" w:eastAsia="Helvetica"/>
+          <w:b w:val="0"/>
+          <w:i w:val="0"/>
+          <w:color w:val="333333"/>
+          <w:sz w:val="22"/>
+        </w:rPr>
+        <w:t xml:space="preserve"> A one-way Analysis of Variance </w:t>
+      </w:r>
+      <w:r>
+        <w:rPr>
+          <w:rFonts w:ascii="Helvetica" w:hAnsi="Helvetica" w:eastAsia="Helvetica"/>
+          <w:b w:val="0"/>
+          <w:i w:val="0"/>
+          <w:color w:val="333333"/>
+          <w:sz w:val="22"/>
+        </w:rPr>
+        <w:t xml:space="preserve">(ANOVA) test across the three age categories resulted in a highly significant </w:t>
+      </w:r>
+      <w:r>
+        <w:rPr>
+          <w:rFonts w:ascii="Helvetica" w:hAnsi="Helvetica" w:eastAsia="Helvetica"/>
+          <w:b/>
+          <w:i w:val="0"/>
+          <w:color w:val="333333"/>
+          <w:sz w:val="22"/>
+        </w:rPr>
+        <w:t xml:space="preserve">F-statistic of 113.82 </w:t>
+      </w:r>
+      <w:r>
+        <w:rPr>
+          <w:rFonts w:ascii="Helvetica" w:hAnsi="Helvetica" w:eastAsia="Helvetica"/>
+          <w:b w:val="0"/>
+          <w:i w:val="0"/>
+          <w:color w:val="333333"/>
+          <w:sz w:val="22"/>
+        </w:rPr>
+        <w:t xml:space="preserve">and a </w:t>
+      </w:r>
+      <w:r>
+        <w:rPr>
+          <w:rFonts w:ascii="Helvetica" w:hAnsi="Helvetica" w:eastAsia="Helvetica"/>
+          <w:b/>
+          <w:i w:val="0"/>
+          <w:color w:val="333333"/>
+          <w:sz w:val="22"/>
+        </w:rPr>
+        <w:t>p-value of 0.0000</w:t>
+      </w:r>
+      <w:r>
+        <w:rPr>
+          <w:rFonts w:ascii="Helvetica" w:hAnsi="Helvetica" w:eastAsia="Helvetica"/>
+          <w:b w:val="0"/>
+          <w:i w:val="0"/>
+          <w:color w:val="333333"/>
+          <w:sz w:val="22"/>
+        </w:rPr>
+        <w:t xml:space="preserve"> ($p &lt; 0.05$). This statistically confirms that the mean housing prices </w:t>
+      </w:r>
+      <w:r>
+        <w:rPr>
+          <w:rFonts w:ascii="Helvetica" w:hAnsi="Helvetica" w:eastAsia="Helvetica"/>
+          <w:b w:val="0"/>
+          <w:i w:val="0"/>
+          <w:color w:val="333333"/>
+          <w:sz w:val="22"/>
+        </w:rPr>
+        <w:t xml:space="preserve">among 'New', 'Moderate', and 'Old' properties are significantly different. * </w:t>
+      </w:r>
+      <w:r>
+        <w:rPr>
+          <w:rFonts w:ascii="Helvetica" w:hAnsi="Helvetica" w:eastAsia="Helvetica"/>
+          <w:b/>
+          <w:i w:val="0"/>
+          <w:color w:val="333333"/>
+          <w:sz w:val="22"/>
+        </w:rPr>
+        <w:t>Student's T-Test:</w:t>
+      </w:r>
+      <w:r>
+        <w:rPr>
+          <w:rFonts w:ascii="Helvetica" w:hAnsi="Helvetica" w:eastAsia="Helvetica"/>
+          <w:b w:val="0"/>
+          <w:i w:val="0"/>
+          <w:color w:val="333333"/>
+          <w:sz w:val="22"/>
+        </w:rPr>
+        <w:t xml:space="preserve"> An </w:t>
+      </w:r>
+      <w:r>
+        <w:rPr>
+          <w:rFonts w:ascii="Helvetica" w:hAnsi="Helvetica" w:eastAsia="Helvetica"/>
+          <w:b w:val="0"/>
+          <w:i w:val="0"/>
+          <w:color w:val="333333"/>
+          <w:sz w:val="22"/>
+        </w:rPr>
+        <w:t xml:space="preserve">independent two-sample t-test between the 'New' and 'Old' property subsets yielded a </w:t>
+      </w:r>
+      <w:r>
+        <w:rPr>
+          <w:rFonts w:ascii="Helvetica" w:hAnsi="Helvetica" w:eastAsia="Helvetica"/>
+          <w:b/>
+          <w:i w:val="0"/>
+          <w:color w:val="333333"/>
+          <w:sz w:val="22"/>
+        </w:rPr>
+        <w:t xml:space="preserve">t-statistic </w:t>
+      </w:r>
+      <w:r>
+        <w:rPr>
+          <w:rFonts w:ascii="Helvetica" w:hAnsi="Helvetica" w:eastAsia="Helvetica"/>
+          <w:b/>
+          <w:i w:val="0"/>
+          <w:color w:val="333333"/>
+          <w:sz w:val="22"/>
+        </w:rPr>
+        <w:t>of 14.85</w:t>
+      </w:r>
+      <w:r>
+        <w:rPr>
+          <w:rFonts w:ascii="Helvetica" w:hAnsi="Helvetica" w:eastAsia="Helvetica"/>
+          <w:b w:val="0"/>
+          <w:i w:val="0"/>
+          <w:color w:val="333333"/>
+          <w:sz w:val="22"/>
+        </w:rPr>
+        <w:t xml:space="preserve"> and a </w:t>
+      </w:r>
+      <w:r>
+        <w:rPr>
+          <w:rFonts w:ascii="Helvetica" w:hAnsi="Helvetica" w:eastAsia="Helvetica"/>
+          <w:b/>
+          <w:i w:val="0"/>
+          <w:color w:val="333333"/>
+          <w:sz w:val="22"/>
+        </w:rPr>
+        <w:t>p-value of 0.0000</w:t>
+      </w:r>
+      <w:r>
+        <w:rPr>
+          <w:rFonts w:ascii="Helvetica" w:hAnsi="Helvetica" w:eastAsia="Helvetica"/>
+          <w:b w:val="0"/>
+          <w:i w:val="0"/>
+          <w:color w:val="333333"/>
+          <w:sz w:val="22"/>
+        </w:rPr>
+        <w:t xml:space="preserve">, confirming that new properties command a statistically higher </w:t>
+      </w:r>
+      <w:r>
+        <w:rPr>
+          <w:rFonts w:ascii="Helvetica" w:hAnsi="Helvetica" w:eastAsia="Helvetica"/>
+          <w:b w:val="0"/>
+          <w:i w:val="0"/>
+          <w:color w:val="333333"/>
+          <w:sz w:val="22"/>
+        </w:rPr>
+        <w:t>price profile.</w:t>
+      </w:r>
+    </w:p>
+    <w:p>
+      <w:pPr>
+        <w:autoSpaceDN w:val="0"/>
+        <w:autoSpaceDE w:val="0"/>
+        <w:widowControl/>
+        <w:spacing w:line="352" w:lineRule="exact" w:before="304" w:after="0"/>
+        <w:ind w:left="30" w:right="50" w:firstLine="0"/>
+        <w:jc w:val="both"/>
+      </w:pPr>
+      <w:r>
+        <w:rPr>
+          <w:rFonts w:ascii="Helvetica" w:hAnsi="Helvetica" w:eastAsia="Helvetica"/>
+          <w:b w:val="0"/>
+          <w:i w:val="0"/>
+          <w:color w:val="333333"/>
+          <w:sz w:val="22"/>
+        </w:rPr>
+        <w:t xml:space="preserve">This statistical validation justified our encoding strategy (Ordinal Encoding) in the preprocessing </w:t>
+      </w:r>
+      <w:r>
+        <w:rPr>
+          <w:rFonts w:ascii="Helvetica" w:hAnsi="Helvetica" w:eastAsia="Helvetica"/>
+          <w:b w:val="0"/>
+          <w:i w:val="0"/>
+          <w:color w:val="333333"/>
+          <w:sz w:val="22"/>
+        </w:rPr>
+        <w:t xml:space="preserve">pipeline, allowing tree splits in XGBoost and Random Forest to branch on clean structural age </w:t>
+      </w:r>
+      <w:r>
+        <w:rPr>
+          <w:rFonts w:ascii="Helvetica" w:hAnsi="Helvetica" w:eastAsia="Helvetica"/>
+          <w:b w:val="0"/>
+          <w:i w:val="0"/>
+          <w:color w:val="333333"/>
+          <w:sz w:val="22"/>
+        </w:rPr>
+        <w:t>thresholds.</w:t>
+      </w:r>
+    </w:p>
+    <w:p>
+      <w:pPr>
+        <w:autoSpaceDN w:val="0"/>
+        <w:autoSpaceDE w:val="0"/>
+        <w:widowControl/>
+        <w:spacing w:line="330" w:lineRule="exact" w:before="984" w:after="0"/>
+        <w:ind w:left="30" w:right="0" w:firstLine="0"/>
+        <w:jc w:val="left"/>
+      </w:pPr>
+      <w:r>
+        <w:rPr>
+          <w:rFonts w:ascii="Helvetica" w:hAnsi="Helvetica" w:eastAsia="Helvetica"/>
+          <w:b/>
+          <w:i w:val="0"/>
+          <w:color w:val="1F3A52"/>
+          <w:sz w:val="24"/>
+        </w:rPr>
+        <w:t>3.4 Correlation Analysis</w:t>
+      </w:r>
+    </w:p>
+    <w:p>
+      <w:pPr>
+        <w:sectPr>
+          <w:pgSz w:w="11906" w:h="16838"/>
+          <w:pgMar w:top="680" w:right="1104" w:bottom="958" w:left="1124" w:header="720" w:footer="720" w:gutter="0"/>
+          <w:cols/>
+          <w:docGrid w:linePitch="360"/>
+        </w:sectPr>
+      </w:pPr>
+    </w:p>
+    <w:p>
+      <w:pPr>
+        <w:autoSpaceDN w:val="0"/>
+        <w:autoSpaceDE w:val="0"/>
+        <w:widowControl/>
+        <w:spacing w:line="220" w:lineRule="exact" w:before="0" w:after="458"/>
+        <w:ind w:left="0" w:right="0"/>
+      </w:pPr>
+    </w:p>
+    <w:p>
+      <w:pPr>
+        <w:autoSpaceDN w:val="0"/>
+        <w:autoSpaceDE w:val="0"/>
+        <w:widowControl/>
+        <w:spacing w:line="328" w:lineRule="exact" w:before="0" w:after="0"/>
+        <w:ind w:left="0" w:right="0" w:firstLine="0"/>
+        <w:jc w:val="left"/>
+      </w:pPr>
+      <w:r>
+        <w:rPr>
+          <w:rFonts w:ascii="Helvetica" w:hAnsi="Helvetica" w:eastAsia="Helvetica"/>
+          <w:b w:val="0"/>
+          <w:i w:val="0"/>
+          <w:color w:val="333333"/>
+          <w:sz w:val="22"/>
+        </w:rPr>
+        <w:t xml:space="preserve">A correlation heatmap was created to look at linear relationships between numerical features and </w:t>
+      </w:r>
+      <w:r>
+        <w:rPr>
+          <w:rFonts w:ascii="Helvetica" w:hAnsi="Helvetica" w:eastAsia="Helvetica"/>
+          <w:b w:val="0"/>
+          <w:i w:val="0"/>
+          <w:color w:val="333333"/>
+          <w:sz w:val="22"/>
+        </w:rPr>
+        <w:t>the target variable (see Figure 3).</w:t>
+      </w:r>
+    </w:p>
+    <w:p>
+      <w:pPr>
+        <w:autoSpaceDN w:val="0"/>
+        <w:autoSpaceDE w:val="0"/>
+        <w:widowControl/>
+        <w:spacing w:line="240" w:lineRule="auto" w:before="432" w:after="0"/>
+        <w:ind w:left="0" w:right="0" w:firstLine="0"/>
+        <w:jc w:val="center"/>
+      </w:pPr>
+      <w:r>
+        <w:drawing>
+          <wp:inline xmlns:a="http://schemas.openxmlformats.org/drawingml/2006/main" xmlns:pic="http://schemas.openxmlformats.org/drawingml/2006/picture">
+            <wp:extent cx="6094730" cy="5551170"/>
+            <wp:docPr id="3" name="Picture 3"/>
+            <wp:cNvGraphicFramePr>
+              <a:graphicFrameLocks noChangeAspect="1"/>
+            </wp:cNvGraphicFramePr>
+            <a:graphic>
+              <a:graphicData uri="http://schemas.openxmlformats.org/drawingml/2006/picture">
+                <pic:pic>
+                  <pic:nvPicPr>
+                    <pic:cNvPr id="0" name="image.png"/>
+                    <pic:cNvPicPr/>
+                  </pic:nvPicPr>
+                  <pic:blipFill>
+                    <a:blip r:embed="rId11"/>
+                    <a:stretch>
+                      <a:fillRect/>
+                    </a:stretch>
+                  </pic:blipFill>
+                  <pic:spPr>
+                    <a:xfrm>
+                      <a:off x="0" y="0"/>
+                      <a:ext cx="6094730" cy="5551170"/>
+                    </a:xfrm>
+                    <a:prstGeom prst="rect"/>
+                  </pic:spPr>
+                </pic:pic>
+              </a:graphicData>
+            </a:graphic>
+          </wp:inline>
+        </w:drawing>
+      </w:r>
+    </w:p>
+    <w:p>
+      <w:pPr>
+        <w:autoSpaceDN w:val="0"/>
+        <w:autoSpaceDE w:val="0"/>
+        <w:widowControl/>
+        <w:spacing w:line="352" w:lineRule="exact" w:before="178" w:after="0"/>
+        <w:ind w:left="0" w:right="0" w:firstLine="0"/>
+        <w:jc w:val="left"/>
+      </w:pPr>
+      <w:r>
+        <w:rPr>
+          <w:rFonts w:ascii="Helvetica" w:hAnsi="Helvetica" w:eastAsia="Helvetica"/>
+          <w:b w:val="0"/>
+          <w:i w:val="0"/>
+          <w:color w:val="333333"/>
+          <w:sz w:val="22"/>
+        </w:rPr>
+        <w:t xml:space="preserve">A strong positive correlation was found between </w:t>
+      </w:r>
+      <w:r>
+        <w:rPr>
+          <w:shd w:val="clear" w:color="auto" w:fill="f4f4f4"/>
+          <w:rFonts w:ascii="Courier" w:hAnsi="Courier" w:eastAsia="Courier"/>
+          <w:b w:val="0"/>
+          <w:i w:val="0"/>
+          <w:color w:val="333333"/>
+          <w:sz w:val="19"/>
+        </w:rPr>
+        <w:t>TotalRooms</w:t>
+      </w:r>
+      <w:r>
+        <w:rPr>
+          <w:rFonts w:ascii="Helvetica" w:hAnsi="Helvetica" w:eastAsia="Helvetica"/>
+          <w:b w:val="0"/>
+          <w:i w:val="0"/>
+          <w:color w:val="333333"/>
+          <w:sz w:val="22"/>
+        </w:rPr>
+        <w:t xml:space="preserve"> and </w:t>
+      </w:r>
+      <w:r>
+        <w:rPr>
+          <w:shd w:val="clear" w:color="auto" w:fill="f4f4f4"/>
+          <w:rFonts w:ascii="Courier" w:hAnsi="Courier" w:eastAsia="Courier"/>
+          <w:b w:val="0"/>
+          <w:i w:val="0"/>
+          <w:color w:val="333333"/>
+          <w:sz w:val="19"/>
+        </w:rPr>
+        <w:t>TotalBedrooms</w:t>
+      </w:r>
+      <w:r>
+        <w:rPr>
+          <w:rFonts w:ascii="Helvetica" w:hAnsi="Helvetica" w:eastAsia="Helvetica"/>
+          <w:b w:val="0"/>
+          <w:i w:val="0"/>
+          <w:color w:val="333333"/>
+          <w:sz w:val="22"/>
+        </w:rPr>
+        <w:t xml:space="preserve"> (correlation </w:t>
+      </w:r>
+      <w:r>
+        <w:rPr>
+          <w:rFonts w:ascii="Helvetica" w:hAnsi="Helvetica" w:eastAsia="Helvetica"/>
+          <w:b w:val="0"/>
+          <w:i w:val="0"/>
+          <w:color w:val="333333"/>
+          <w:sz w:val="22"/>
+        </w:rPr>
+        <w:t xml:space="preserve">coefficient </w:t>
+      </w:r>
+      <w:r>
+        <w:rPr>
+          <w:rFonts w:ascii="Symbol" w:hAnsi="Symbol" w:eastAsia="Symbol"/>
+          <w:b w:val="0"/>
+          <w:i w:val="0"/>
+          <w:color w:val="333333"/>
+          <w:sz w:val="22"/>
+        </w:rPr>
+        <w:t>≈</w:t>
+      </w:r>
+      <w:r>
+        <w:rPr>
+          <w:rFonts w:ascii="Helvetica" w:hAnsi="Helvetica" w:eastAsia="Helvetica"/>
+          <w:b w:val="0"/>
+          <w:i w:val="0"/>
+          <w:color w:val="333333"/>
+          <w:sz w:val="22"/>
+        </w:rPr>
+        <w:t xml:space="preserve"> 0.85). In linear models, this causes severe multicollinearity, inflating the variance of </w:t>
+      </w:r>
+      <w:r>
+        <w:rPr>
+          <w:rFonts w:ascii="Helvetica" w:hAnsi="Helvetica" w:eastAsia="Helvetica"/>
+          <w:b w:val="0"/>
+          <w:i w:val="0"/>
+          <w:color w:val="333333"/>
+          <w:sz w:val="22"/>
+        </w:rPr>
+        <w:t xml:space="preserve">regression coefficients and rendering the model unstable. To balance this, we engineered </w:t>
+      </w:r>
+      <w:r>
+        <w:rPr>
+          <w:shd w:val="clear" w:color="auto" w:fill="f4f4f4"/>
+          <w:rFonts w:ascii="Courier" w:hAnsi="Courier" w:eastAsia="Courier"/>
+          <w:b w:val="0"/>
+          <w:i w:val="0"/>
+          <w:color w:val="333333"/>
+          <w:sz w:val="19"/>
+        </w:rPr>
+        <w:t>BedroomsRatio</w:t>
+      </w:r>
+      <w:r>
+        <w:rPr>
+          <w:rFonts w:ascii="Helvetica" w:hAnsi="Helvetica" w:eastAsia="Helvetica"/>
+          <w:b w:val="0"/>
+          <w:i w:val="0"/>
+          <w:color w:val="333333"/>
+          <w:sz w:val="22"/>
+        </w:rPr>
+        <w:t xml:space="preserve"> ($r \approx -0.26$).</w:t>
+      </w:r>
+    </w:p>
+    <w:p>
+      <w:pPr>
+        <w:autoSpaceDN w:val="0"/>
+        <w:autoSpaceDE w:val="0"/>
+        <w:widowControl/>
+        <w:spacing w:line="352" w:lineRule="exact" w:before="304" w:after="0"/>
+        <w:ind w:left="0" w:right="0" w:firstLine="0"/>
+        <w:jc w:val="left"/>
+      </w:pPr>
+      <w:r>
+        <w:rPr>
+          <w:rFonts w:ascii="Helvetica" w:hAnsi="Helvetica" w:eastAsia="Helvetica"/>
+          <w:b w:val="0"/>
+          <w:i w:val="0"/>
+          <w:color w:val="333333"/>
+          <w:sz w:val="22"/>
+        </w:rPr>
+        <w:t xml:space="preserve">Regarding the target variable, </w:t>
+      </w:r>
+      <w:r>
+        <w:rPr>
+          <w:shd w:val="clear" w:color="auto" w:fill="f4f4f4"/>
+          <w:rFonts w:ascii="Courier" w:hAnsi="Courier" w:eastAsia="Courier"/>
+          <w:b w:val="0"/>
+          <w:i w:val="0"/>
+          <w:color w:val="333333"/>
+          <w:sz w:val="19"/>
+        </w:rPr>
+        <w:t>IncomeLevel</w:t>
+      </w:r>
+      <w:r>
+        <w:rPr>
+          <w:rFonts w:ascii="Helvetica" w:hAnsi="Helvetica" w:eastAsia="Helvetica"/>
+          <w:b w:val="0"/>
+          <w:i w:val="0"/>
+          <w:color w:val="333333"/>
+          <w:sz w:val="22"/>
+        </w:rPr>
+        <w:t xml:space="preserve"> showed a strong positive correlation with </w:t>
+      </w:r>
+      <w:r>
+        <w:rPr>
+          <w:shd w:val="clear" w:color="auto" w:fill="f4f4f4"/>
+          <w:rFonts w:ascii="Courier" w:hAnsi="Courier" w:eastAsia="Courier"/>
+          <w:b w:val="0"/>
+          <w:i w:val="0"/>
+          <w:color w:val="333333"/>
+          <w:sz w:val="19"/>
+        </w:rPr>
+        <w:t>TargetPrice</w:t>
+      </w:r>
+      <w:r>
+        <w:rPr>
+          <w:rFonts w:ascii="Helvetica" w:hAnsi="Helvetica" w:eastAsia="Helvetica"/>
+          <w:b w:val="0"/>
+          <w:i w:val="0"/>
+          <w:color w:val="333333"/>
+          <w:sz w:val="22"/>
+        </w:rPr>
+        <w:t xml:space="preserve"> ($r \approx 0.69$), identifying it as the single most predictive feature. Coordinates </w:t>
+      </w:r>
+      <w:r>
+        <w:rPr>
+          <w:shd w:val="clear" w:color="auto" w:fill="f4f4f4"/>
+          <w:rFonts w:ascii="Courier" w:hAnsi="Courier" w:eastAsia="Courier"/>
+          <w:b w:val="0"/>
+          <w:i w:val="0"/>
+          <w:color w:val="333333"/>
+          <w:sz w:val="19"/>
+        </w:rPr>
+        <w:t>Latitude</w:t>
+      </w:r>
+      <w:r>
+        <w:rPr>
+          <w:rFonts w:ascii="Helvetica" w:hAnsi="Helvetica" w:eastAsia="Helvetica"/>
+          <w:b w:val="0"/>
+          <w:i w:val="0"/>
+          <w:color w:val="333333"/>
+          <w:sz w:val="22"/>
+        </w:rPr>
+        <w:t xml:space="preserve"> and </w:t>
+      </w:r>
+      <w:r>
+        <w:rPr>
+          <w:shd w:val="clear" w:color="auto" w:fill="f4f4f4"/>
+          <w:rFonts w:ascii="Courier" w:hAnsi="Courier" w:eastAsia="Courier"/>
+          <w:b w:val="0"/>
+          <w:i w:val="0"/>
+          <w:color w:val="333333"/>
+          <w:sz w:val="19"/>
+        </w:rPr>
+        <w:t>Longitude</w:t>
+      </w:r>
+      <w:r>
+        <w:rPr>
+          <w:rFonts w:ascii="Helvetica" w:hAnsi="Helvetica" w:eastAsia="Helvetica"/>
+          <w:b w:val="0"/>
+          <w:i w:val="0"/>
+          <w:color w:val="333333"/>
+          <w:sz w:val="22"/>
+        </w:rPr>
+        <w:t xml:space="preserve"> showed weak individual linear correlations ($r \approx -0.08$ and $r </w:t>
+      </w:r>
+      <w:r>
+        <w:rPr>
+          <w:rFonts w:ascii="Helvetica" w:hAnsi="Helvetica" w:eastAsia="Helvetica"/>
+          <w:b w:val="0"/>
+          <w:i w:val="0"/>
+          <w:color w:val="333333"/>
+          <w:sz w:val="22"/>
+        </w:rPr>
+        <w:t xml:space="preserve">\approx -0.05$), yet they are highly predictive of house price through geographic interaction. This </w:t>
+      </w:r>
+      <w:r>
+        <w:rPr>
+          <w:rFonts w:ascii="Helvetica" w:hAnsi="Helvetica" w:eastAsia="Helvetica"/>
+          <w:b w:val="0"/>
+          <w:i w:val="0"/>
+          <w:color w:val="333333"/>
+          <w:sz w:val="22"/>
+        </w:rPr>
+        <w:t xml:space="preserve">required using models like XGBoost that split coordinates in multi-dimensional space to capture </w:t>
+      </w:r>
+      <w:r>
+        <w:rPr>
+          <w:rFonts w:ascii="Helvetica" w:hAnsi="Helvetica" w:eastAsia="Helvetica"/>
+          <w:b w:val="0"/>
+          <w:i w:val="0"/>
+          <w:color w:val="333333"/>
+          <w:sz w:val="22"/>
+        </w:rPr>
+        <w:t>localized value groups.</w:t>
+      </w:r>
+    </w:p>
+    <w:p>
+      <w:pPr>
+        <w:sectPr>
+          <w:pgSz w:w="11906" w:h="16838"/>
+          <w:pgMar w:top="680" w:right="1134" w:bottom="824" w:left="1154" w:header="720" w:footer="720" w:gutter="0"/>
+          <w:cols/>
+          <w:docGrid w:linePitch="360"/>
+        </w:sectPr>
+      </w:pPr>
+    </w:p>
+    <w:p>
+      <w:pPr>
+        <w:autoSpaceDN w:val="0"/>
+        <w:autoSpaceDE w:val="0"/>
+        <w:widowControl/>
+        <w:spacing w:line="220" w:lineRule="exact" w:before="0" w:after="494"/>
+        <w:ind w:left="0" w:right="0"/>
+      </w:pPr>
+    </w:p>
+    <w:p>
+      <w:pPr>
+        <w:autoSpaceDN w:val="0"/>
+        <w:autoSpaceDE w:val="0"/>
+        <w:widowControl/>
+        <w:spacing w:line="332" w:lineRule="exact" w:before="384" w:after="0"/>
+        <w:ind w:left="30" w:right="0" w:firstLine="0"/>
+        <w:jc w:val="left"/>
+      </w:pPr>
+      <w:r>
+        <w:rPr>
+          <w:rFonts w:ascii="Helvetica" w:hAnsi="Helvetica" w:eastAsia="Helvetica"/>
+          <w:b/>
+          <w:i w:val="0"/>
+          <w:color w:val="1F3A52"/>
+          <w:sz w:val="24"/>
+        </w:rPr>
+        <w:t>Key Insights from EDA</w:t>
+      </w:r>
+    </w:p>
+    <w:p>
+      <w:pPr>
+        <w:autoSpaceDN w:val="0"/>
         <w:tabs>
           <w:tab w:pos="660" w:val="left"/>
         </w:tabs>
         <w:autoSpaceDE w:val="0"/>
         <w:widowControl/>
-        <w:spacing w:line="328" w:lineRule="exact" w:before="0" w:after="0"/>
+        <w:spacing w:line="352" w:lineRule="exact" w:before="170" w:after="0"/>
+        <w:ind w:left="330" w:right="288" w:firstLine="0"/>
+        <w:jc w:val="left"/>
+      </w:pPr>
+      <w:r>
+        <w:rPr>
+          <w:rFonts w:ascii="Helvetica" w:hAnsi="Helvetica" w:eastAsia="Helvetica"/>
+          <w:b w:val="0"/>
+          <w:i w:val="0"/>
+          <w:color w:val="333333"/>
+          <w:sz w:val="22"/>
+        </w:rPr>
+        <w:t>•</w:t>
+      </w:r>
+      <w:r>
+        <w:tab/>
+      </w:r>
+      <w:r>
+        <w:rPr>
+          <w:rFonts w:ascii="Helvetica" w:hAnsi="Helvetica" w:eastAsia="Helvetica"/>
+          <w:b w:val="0"/>
+          <w:i w:val="0"/>
+          <w:color w:val="333333"/>
+          <w:sz w:val="22"/>
+        </w:rPr>
+        <w:t xml:space="preserve">The dataset has missing values in </w:t>
+      </w:r>
+      <w:r>
+        <w:rPr>
+          <w:shd w:val="clear" w:color="auto" w:fill="f4f4f4"/>
+          <w:rFonts w:ascii="Courier" w:hAnsi="Courier" w:eastAsia="Courier"/>
+          <w:b w:val="0"/>
+          <w:i w:val="0"/>
+          <w:color w:val="333333"/>
+          <w:sz w:val="19"/>
+        </w:rPr>
+        <w:t>PropertyAge</w:t>
+      </w:r>
+      <w:r>
+        <w:rPr>
+          <w:rFonts w:ascii="Helvetica" w:hAnsi="Helvetica" w:eastAsia="Helvetica"/>
+          <w:b w:val="0"/>
+          <w:i w:val="0"/>
+          <w:color w:val="333333"/>
+          <w:sz w:val="22"/>
+        </w:rPr>
+        <w:t xml:space="preserve">, which were dropped during training to </w:t>
+      </w:r>
+      <w:r>
+        <w:tab/>
+      </w:r>
+      <w:r>
+        <w:rPr>
+          <w:rFonts w:ascii="Helvetica" w:hAnsi="Helvetica" w:eastAsia="Helvetica"/>
+          <w:b w:val="0"/>
+          <w:i w:val="0"/>
+          <w:color w:val="333333"/>
+          <w:sz w:val="22"/>
+        </w:rPr>
+        <w:t xml:space="preserve">preserve distribution shapes, but handled via median imputer in production to handle user </w:t>
+      </w:r>
+      <w:r>
+        <w:tab/>
+      </w:r>
+      <w:r>
+        <w:rPr>
+          <w:rFonts w:ascii="Helvetica" w:hAnsi="Helvetica" w:eastAsia="Helvetica"/>
+          <w:b w:val="0"/>
+          <w:i w:val="0"/>
+          <w:color w:val="333333"/>
+          <w:sz w:val="22"/>
+        </w:rPr>
+        <w:t>default inputs.</w:t>
+      </w:r>
+    </w:p>
+    <w:p>
+      <w:pPr>
+        <w:autoSpaceDN w:val="0"/>
+        <w:tabs>
+          <w:tab w:pos="660" w:val="left"/>
+        </w:tabs>
+        <w:autoSpaceDE w:val="0"/>
+        <w:widowControl/>
+        <w:spacing w:line="304" w:lineRule="exact" w:before="198" w:after="0"/>
         <w:ind w:left="330" w:right="0" w:firstLine="0"/>
         <w:jc w:val="left"/>
       </w:pPr>
@@ -5697,58 +7063,13 @@
       </w:r>
       <w:r>
         <w:rPr>
-          <w:shd w:val="clear" w:color="auto" w:fill="f4f4f4"/>
-          <w:rFonts w:ascii="Courier" w:hAnsi="Courier" w:eastAsia="Courier"/>
-          <w:b w:val="0"/>
-          <w:i w:val="0"/>
-          <w:color w:val="333333"/>
-          <w:sz w:val="19"/>
-        </w:rPr>
-        <w:t>PropertyAge</w:t>
-      </w:r>
-      <w:r>
-        <w:rPr>
-          <w:rFonts w:ascii="Helvetica" w:hAnsi="Helvetica" w:eastAsia="Helvetica"/>
-          <w:b w:val="0"/>
-          <w:i w:val="0"/>
-          <w:color w:val="333333"/>
-          <w:sz w:val="22"/>
-        </w:rPr>
-        <w:t xml:space="preserve"> was binned into </w:t>
-      </w:r>
-      <w:r>
-        <w:rPr>
-          <w:shd w:val="clear" w:color="auto" w:fill="f4f4f4"/>
-          <w:rFonts w:ascii="Courier" w:hAnsi="Courier" w:eastAsia="Courier"/>
-          <w:b w:val="0"/>
-          <w:i w:val="0"/>
-          <w:color w:val="333333"/>
-          <w:sz w:val="19"/>
-        </w:rPr>
-        <w:t>PropertyAge_bins</w:t>
-      </w:r>
-      <w:r>
-        <w:rPr>
-          <w:rFonts w:ascii="Helvetica" w:hAnsi="Helvetica" w:eastAsia="Helvetica"/>
-          <w:b w:val="0"/>
-          <w:i w:val="0"/>
-          <w:color w:val="333333"/>
-          <w:sz w:val="22"/>
-        </w:rPr>
-        <w:t xml:space="preserve"> ('New' &lt;= 15, 'Moderate' &lt;= 35, 'Old' &gt; 35) </w:t>
-      </w:r>
-      <w:r>
-        <w:tab/>
-      </w:r>
-      <w:r>
-        <w:rPr>
-          <w:rFonts w:ascii="Helvetica" w:hAnsi="Helvetica" w:eastAsia="Helvetica"/>
-          <w:b w:val="0"/>
-          <w:i w:val="0"/>
-          <w:color w:val="333333"/>
-          <w:sz w:val="22"/>
-        </w:rPr>
-        <w:t>to handle non-linear real estate depreciation.</w:t>
+          <w:rFonts w:ascii="Helvetica" w:hAnsi="Helvetica" w:eastAsia="Helvetica"/>
+          <w:b w:val="0"/>
+          <w:i w:val="0"/>
+          <w:color w:val="333333"/>
+          <w:sz w:val="22"/>
+        </w:rPr>
+        <w:t>The target price is right-skewed with a cap at 5.0, requiring clipping bounds in inference.</w:t>
       </w:r>
     </w:p>
     <w:p>
@@ -5760,7 +7081,7 @@
         <w:autoSpaceDE w:val="0"/>
         <w:widowControl/>
         <w:spacing w:line="352" w:lineRule="exact" w:before="150" w:after="0"/>
-        <w:ind w:left="330" w:right="0" w:firstLine="0"/>
+        <w:ind w:left="330" w:right="288" w:firstLine="0"/>
         <w:jc w:val="left"/>
       </w:pPr>
       <w:r>
@@ -5779,43 +7100,12 @@
       <w:r>
         <w:rPr>
           <w:rFonts w:ascii="Helvetica" w:hAnsi="Helvetica" w:eastAsia="Helvetica"/>
-          <w:b/>
-          <w:i w:val="0"/>
-          <w:color w:val="333333"/>
-          <w:sz w:val="22"/>
-        </w:rPr>
-        <w:t>ANOVA Test:</w:t>
-      </w:r>
-      <w:r>
-        <w:rPr>
-          <w:rFonts w:ascii="Helvetica" w:hAnsi="Helvetica" w:eastAsia="Helvetica"/>
-          <w:b w:val="0"/>
-          <w:i w:val="0"/>
-          <w:color w:val="333333"/>
-          <w:sz w:val="22"/>
-        </w:rPr>
-        <w:t xml:space="preserve"> We ran an Analysis of Variance (ANOVA) test (</w:t>
-      </w:r>
-      <w:r>
-        <w:rPr>
-          <w:shd w:val="clear" w:color="auto" w:fill="f4f4f4"/>
-          <w:rFonts w:ascii="Courier" w:hAnsi="Courier" w:eastAsia="Courier"/>
-          <w:b w:val="0"/>
-          <w:i w:val="0"/>
-          <w:color w:val="333333"/>
-          <w:sz w:val="19"/>
-        </w:rPr>
-        <w:t>f_oneway</w:t>
-      </w:r>
-      <w:r>
-        <w:rPr>
-          <w:rFonts w:ascii="Helvetica" w:hAnsi="Helvetica" w:eastAsia="Helvetica"/>
-          <w:b w:val="0"/>
-          <w:i w:val="0"/>
-          <w:color w:val="333333"/>
-          <w:sz w:val="22"/>
-        </w:rPr>
-        <w:t xml:space="preserve">) to verify if the </w:t>
+          <w:b w:val="0"/>
+          <w:i w:val="0"/>
+          <w:color w:val="333333"/>
+          <w:sz w:val="22"/>
+        </w:rPr>
+        <w:t xml:space="preserve">Indicators like occupancy and rooms per household have heavy outlier tails, directing our </w:t>
       </w:r>
       <w:r>
         <w:tab/>
@@ -5828,7 +7118,7 @@
           <w:color w:val="333333"/>
           <w:sz w:val="22"/>
         </w:rPr>
-        <w:t xml:space="preserve">binned age groups have statistically different mean target prices. The test resulted in a </w:t>
+        <w:t xml:space="preserve">choice toward tree-based ensembles (XGBoost/Random Forest) that are naturally </w:t>
       </w:r>
       <w:r>
         <w:tab/>
@@ -5836,46 +7126,12 @@
       <w:r>
         <w:rPr>
           <w:rFonts w:ascii="Helvetica" w:hAnsi="Helvetica" w:eastAsia="Helvetica"/>
-          <w:b/>
-          <w:i w:val="0"/>
-          <w:color w:val="333333"/>
-          <w:sz w:val="22"/>
-        </w:rPr>
-        <w:t>$p\text{-value} = 0.0000$ ($F\text{-statistic} \gg 1$)</w:t>
-      </w:r>
-      <w:r>
-        <w:rPr>
-          <w:rFonts w:ascii="Helvetica" w:hAnsi="Helvetica" w:eastAsia="Helvetica"/>
-          <w:b w:val="0"/>
-          <w:i w:val="0"/>
-          <w:color w:val="333333"/>
-          <w:sz w:val="22"/>
-        </w:rPr>
-        <w:t xml:space="preserve">, confirming that binning </w:t>
-      </w:r>
-      <w:r>
-        <w:rPr>
-          <w:shd w:val="clear" w:color="auto" w:fill="f4f4f4"/>
-          <w:rFonts w:ascii="Courier" w:hAnsi="Courier" w:eastAsia="Courier"/>
-          <w:b w:val="0"/>
-          <w:i w:val="0"/>
-          <w:color w:val="333333"/>
-          <w:sz w:val="19"/>
-        </w:rPr>
-        <w:t xml:space="preserve">PropertyAge </w:t>
-      </w:r>
-      <w:r>
-        <w:tab/>
-      </w:r>
-      <w:r>
-        <w:rPr>
-          <w:rFonts w:ascii="Helvetica" w:hAnsi="Helvetica" w:eastAsia="Helvetica"/>
-          <w:b w:val="0"/>
-          <w:i w:val="0"/>
-          <w:color w:val="333333"/>
-          <w:sz w:val="22"/>
-        </w:rPr>
-        <w:t>was highly significant and statistically valid.</w:t>
+          <w:b w:val="0"/>
+          <w:i w:val="0"/>
+          <w:color w:val="333333"/>
+          <w:sz w:val="22"/>
+        </w:rPr>
+        <w:t>outlier-resistant.</w:t>
       </w:r>
     </w:p>
     <w:p>
@@ -5887,7 +7143,7 @@
         <w:autoSpaceDE w:val="0"/>
         <w:widowControl/>
         <w:spacing w:line="352" w:lineRule="exact" w:before="150" w:after="0"/>
-        <w:ind w:left="330" w:right="0" w:firstLine="0"/>
+        <w:ind w:left="330" w:right="288" w:firstLine="0"/>
         <w:jc w:val="left"/>
       </w:pPr>
       <w:r>
@@ -5906,43 +7162,12 @@
       <w:r>
         <w:rPr>
           <w:rFonts w:ascii="Helvetica" w:hAnsi="Helvetica" w:eastAsia="Helvetica"/>
-          <w:b/>
-          <w:i w:val="0"/>
-          <w:color w:val="333333"/>
-          <w:sz w:val="22"/>
-        </w:rPr>
-        <w:t>T-Test:</w:t>
-      </w:r>
-      <w:r>
-        <w:rPr>
-          <w:rFonts w:ascii="Helvetica" w:hAnsi="Helvetica" w:eastAsia="Helvetica"/>
-          <w:b w:val="0"/>
-          <w:i w:val="0"/>
-          <w:color w:val="333333"/>
-          <w:sz w:val="22"/>
-        </w:rPr>
-        <w:t xml:space="preserve"> A T-test (</w:t>
-      </w:r>
-      <w:r>
-        <w:rPr>
-          <w:shd w:val="clear" w:color="auto" w:fill="f4f4f4"/>
-          <w:rFonts w:ascii="Courier" w:hAnsi="Courier" w:eastAsia="Courier"/>
-          <w:b w:val="0"/>
-          <w:i w:val="0"/>
-          <w:color w:val="333333"/>
-          <w:sz w:val="19"/>
-        </w:rPr>
-        <w:t>ttest_ind</w:t>
-      </w:r>
-      <w:r>
-        <w:rPr>
-          <w:rFonts w:ascii="Helvetica" w:hAnsi="Helvetica" w:eastAsia="Helvetica"/>
-          <w:b w:val="0"/>
-          <w:i w:val="0"/>
-          <w:color w:val="333333"/>
-          <w:sz w:val="22"/>
-        </w:rPr>
-        <w:t xml:space="preserve">) between 'New' and 'Old' properties confirmed that new houses </w:t>
+          <w:b w:val="0"/>
+          <w:i w:val="0"/>
+          <w:color w:val="333333"/>
+          <w:sz w:val="22"/>
+        </w:rPr>
+        <w:t xml:space="preserve">Location coordinates do not exhibit simple linear relationships, calling for non-parametric </w:t>
       </w:r>
       <w:r>
         <w:tab/>
@@ -5955,7 +7180,7 @@
           <w:color w:val="333333"/>
           <w:sz w:val="22"/>
         </w:rPr>
-        <w:t>have a significantly different price profile from old ones ($p = 0.0000$).</w:t>
+        <w:t>model architectures.</w:t>
       </w:r>
     </w:p>
     <w:p>
@@ -5963,194 +7188,29 @@
         <w:autoSpaceDN w:val="0"/>
         <w:autoSpaceDE w:val="0"/>
         <w:widowControl/>
-        <w:spacing w:line="332" w:lineRule="exact" w:before="816" w:after="0"/>
+        <w:spacing w:line="352" w:lineRule="exact" w:before="634" w:after="0"/>
         <w:ind w:left="30" w:right="0" w:firstLine="0"/>
         <w:jc w:val="left"/>
       </w:pPr>
       <w:r>
         <w:rPr>
           <w:rFonts w:ascii="Helvetica" w:hAnsi="Helvetica" w:eastAsia="Helvetica"/>
-          <w:b/>
-          <w:i w:val="0"/>
-          <w:color w:val="1F3A52"/>
-          <w:sz w:val="24"/>
-        </w:rPr>
-        <w:t>3. Correlation Matrix Insights</w:t>
-      </w:r>
-    </w:p>
-    <w:p>
-      <w:pPr>
-        <w:autoSpaceDN w:val="0"/>
-        <w:tabs>
-          <w:tab w:pos="660" w:val="left"/>
-        </w:tabs>
-        <w:autoSpaceDE w:val="0"/>
-        <w:widowControl/>
-        <w:spacing w:line="352" w:lineRule="exact" w:before="170" w:after="0"/>
-        <w:ind w:left="330" w:right="432" w:firstLine="0"/>
-        <w:jc w:val="left"/>
-      </w:pPr>
-      <w:r>
-        <w:rPr>
-          <w:rFonts w:ascii="Helvetica" w:hAnsi="Helvetica" w:eastAsia="Helvetica"/>
-          <w:b w:val="0"/>
-          <w:i w:val="0"/>
-          <w:color w:val="333333"/>
-          <w:sz w:val="22"/>
-        </w:rPr>
-        <w:t>•</w:t>
-      </w:r>
-      <w:r>
-        <w:tab/>
-      </w:r>
-      <w:r>
-        <w:rPr>
-          <w:shd w:val="clear" w:color="auto" w:fill="f4f4f4"/>
-          <w:rFonts w:ascii="Courier" w:hAnsi="Courier" w:eastAsia="Courier"/>
-          <w:b w:val="0"/>
-          <w:i w:val="0"/>
-          <w:color w:val="333333"/>
-          <w:sz w:val="19"/>
-        </w:rPr>
-        <w:t>IncomeLevel</w:t>
-      </w:r>
-      <w:r>
-        <w:rPr>
-          <w:rFonts w:ascii="Helvetica" w:hAnsi="Helvetica" w:eastAsia="Helvetica"/>
-          <w:b w:val="0"/>
-          <w:i w:val="0"/>
-          <w:color w:val="333333"/>
-          <w:sz w:val="22"/>
-        </w:rPr>
-        <w:t xml:space="preserve"> showed a strong positive correlation ($r \approx 0.69$) with </w:t>
-      </w:r>
-      <w:r>
-        <w:rPr>
-          <w:shd w:val="clear" w:color="auto" w:fill="f4f4f4"/>
-          <w:rFonts w:ascii="Courier" w:hAnsi="Courier" w:eastAsia="Courier"/>
-          <w:b w:val="0"/>
-          <w:i w:val="0"/>
-          <w:color w:val="333333"/>
-          <w:sz w:val="19"/>
-        </w:rPr>
-        <w:t>TargetPrice</w:t>
-      </w:r>
-      <w:r>
-        <w:rPr>
-          <w:rFonts w:ascii="Helvetica" w:hAnsi="Helvetica" w:eastAsia="Helvetica"/>
-          <w:b w:val="0"/>
-          <w:i w:val="0"/>
-          <w:color w:val="333333"/>
-          <w:sz w:val="22"/>
-        </w:rPr>
-        <w:t xml:space="preserve">, </w:t>
-      </w:r>
-      <w:r>
-        <w:tab/>
-      </w:r>
-      <w:r>
-        <w:rPr>
-          <w:rFonts w:ascii="Helvetica" w:hAnsi="Helvetica" w:eastAsia="Helvetica"/>
-          <w:b w:val="0"/>
-          <w:i w:val="0"/>
-          <w:color w:val="333333"/>
-          <w:sz w:val="22"/>
-        </w:rPr>
-        <w:t>making it the single most predictive feature.</w:t>
-      </w:r>
-    </w:p>
-    <w:p>
-      <w:pPr>
-        <w:autoSpaceDN w:val="0"/>
-        <w:tabs>
-          <w:tab w:pos="660" w:val="left"/>
-        </w:tabs>
-        <w:autoSpaceDE w:val="0"/>
-        <w:widowControl/>
-        <w:spacing w:line="352" w:lineRule="exact" w:before="150" w:after="0"/>
-        <w:ind w:left="330" w:right="0" w:firstLine="0"/>
-        <w:jc w:val="left"/>
-      </w:pPr>
-      <w:r>
-        <w:rPr>
-          <w:rFonts w:ascii="Helvetica" w:hAnsi="Helvetica" w:eastAsia="Helvetica"/>
-          <w:b w:val="0"/>
-          <w:i w:val="0"/>
-          <w:color w:val="333333"/>
-          <w:sz w:val="22"/>
-        </w:rPr>
-        <w:t>•</w:t>
-      </w:r>
-      <w:r>
-        <w:tab/>
-      </w:r>
-      <w:r>
-        <w:rPr>
-          <w:shd w:val="clear" w:color="auto" w:fill="f4f4f4"/>
-          <w:rFonts w:ascii="Courier" w:hAnsi="Courier" w:eastAsia="Courier"/>
-          <w:b w:val="0"/>
-          <w:i w:val="0"/>
-          <w:color w:val="333333"/>
-          <w:sz w:val="19"/>
-        </w:rPr>
-        <w:t>Latitude</w:t>
-      </w:r>
-      <w:r>
-        <w:rPr>
-          <w:rFonts w:ascii="Helvetica" w:hAnsi="Helvetica" w:eastAsia="Helvetica"/>
-          <w:b w:val="0"/>
-          <w:i w:val="0"/>
-          <w:color w:val="333333"/>
-          <w:sz w:val="22"/>
-        </w:rPr>
-        <w:t xml:space="preserve"> and </w:t>
-      </w:r>
-      <w:r>
-        <w:rPr>
-          <w:shd w:val="clear" w:color="auto" w:fill="f4f4f4"/>
-          <w:rFonts w:ascii="Courier" w:hAnsi="Courier" w:eastAsia="Courier"/>
-          <w:b w:val="0"/>
-          <w:i w:val="0"/>
-          <w:color w:val="333333"/>
-          <w:sz w:val="19"/>
-        </w:rPr>
-        <w:t>Longitude</w:t>
-      </w:r>
-      <w:r>
-        <w:rPr>
-          <w:rFonts w:ascii="Helvetica" w:hAnsi="Helvetica" w:eastAsia="Helvetica"/>
-          <w:b w:val="0"/>
-          <w:i w:val="0"/>
-          <w:color w:val="333333"/>
-          <w:sz w:val="22"/>
-        </w:rPr>
-        <w:t xml:space="preserve"> showed complex spatial distributions, indicating that location </w:t>
-      </w:r>
-      <w:r>
-        <w:tab/>
-      </w:r>
-      <w:r>
-        <w:rPr>
-          <w:rFonts w:ascii="Helvetica" w:hAnsi="Helvetica" w:eastAsia="Helvetica"/>
-          <w:b w:val="0"/>
-          <w:i w:val="0"/>
-          <w:color w:val="333333"/>
-          <w:sz w:val="22"/>
-        </w:rPr>
-        <w:t xml:space="preserve">coordinates interact with Demographic parameters, calling for ensemble models that handle </w:t>
-      </w:r>
-      <w:r>
-        <w:tab/>
-      </w:r>
-      <w:r>
-        <w:rPr>
-          <w:rFonts w:ascii="Helvetica" w:hAnsi="Helvetica" w:eastAsia="Helvetica"/>
-          <w:b w:val="0"/>
-          <w:i w:val="0"/>
-          <w:color w:val="333333"/>
-          <w:sz w:val="22"/>
-        </w:rPr>
-        <w:t>multi-dimensional thresholds.</w:t>
+          <w:b w:val="0"/>
+          <w:i w:val="0"/>
+          <w:color w:val="333333"/>
+          <w:sz w:val="22"/>
+        </w:rPr>
+        <w:t xml:space="preserve">In general, the exploratory data analysis offered a solid basis for feature engineering, model </w:t>
+      </w:r>
+      <w:r>
+        <w:rPr>
+          <w:rFonts w:ascii="Helvetica" w:hAnsi="Helvetica" w:eastAsia="Helvetica"/>
+          <w:b w:val="0"/>
+          <w:i w:val="0"/>
+          <w:color w:val="333333"/>
+          <w:sz w:val="22"/>
+        </w:rPr>
+        <w:t>selection, and evaluation strategies used in this project.</w:t>
       </w:r>
     </w:p>
     <w:p>
@@ -6158,7 +7218,7 @@
         <w:autoSpaceDN w:val="0"/>
         <w:autoSpaceDE w:val="0"/>
         <w:widowControl/>
-        <w:spacing w:line="412" w:lineRule="exact" w:before="1436" w:after="0"/>
+        <w:spacing w:line="412" w:lineRule="exact" w:before="1062" w:after="0"/>
         <w:ind w:left="30" w:right="0" w:firstLine="0"/>
         <w:jc w:val="left"/>
       </w:pPr>
@@ -6178,7 +7238,7 @@
         <w:autoSpaceDN w:val="0"/>
         <w:autoSpaceDE w:val="0"/>
         <w:widowControl/>
-        <w:spacing w:line="332" w:lineRule="exact" w:before="528" w:after="338"/>
+        <w:spacing w:line="332" w:lineRule="exact" w:before="528" w:after="340"/>
         <w:ind w:left="30" w:right="0" w:firstLine="0"/>
         <w:jc w:val="left"/>
       </w:pPr>
@@ -6205,7 +7265,7 @@
       </w:tblGrid>
       <w:tr>
         <w:trPr>
-          <w:trHeight w:hRule="exact" w:val="3068"/>
+          <w:trHeight w:hRule="exact" w:val="3066"/>
         </w:trPr>
         <w:tc>
           <w:tcPr>
@@ -6227,7 +7287,7 @@
               <w:autoSpaceDN w:val="0"/>
               <w:autoSpaceDE w:val="0"/>
               <w:widowControl/>
-              <w:spacing w:line="304" w:lineRule="exact" w:before="34" w:after="0"/>
+              <w:spacing w:line="304" w:lineRule="exact" w:before="32" w:after="0"/>
               <w:ind w:left="156" w:right="144" w:firstLine="0"/>
               <w:jc w:val="left"/>
             </w:pPr>
@@ -6353,9 +7413,68 @@
     </w:p>
     <w:p>
       <w:pPr>
+        <w:autoSpaceDN w:val="0"/>
+        <w:tabs>
+          <w:tab w:pos="660" w:val="left"/>
+        </w:tabs>
+        <w:autoSpaceDE w:val="0"/>
+        <w:widowControl/>
+        <w:spacing w:line="352" w:lineRule="exact" w:before="170" w:after="0"/>
+        <w:ind w:left="330" w:right="576" w:firstLine="0"/>
+        <w:jc w:val="left"/>
+      </w:pPr>
+      <w:r>
+        <w:rPr>
+          <w:rFonts w:ascii="Helvetica" w:hAnsi="Helvetica" w:eastAsia="Helvetica"/>
+          <w:b w:val="0"/>
+          <w:i w:val="0"/>
+          <w:color w:val="333333"/>
+          <w:sz w:val="22"/>
+        </w:rPr>
+        <w:t>•</w:t>
+      </w:r>
+      <w:r>
+        <w:tab/>
+      </w:r>
+      <w:r>
+        <w:rPr>
+          <w:rFonts w:ascii="Helvetica" w:hAnsi="Helvetica" w:eastAsia="Helvetica"/>
+          <w:b/>
+          <w:i w:val="0"/>
+          <w:color w:val="333333"/>
+          <w:sz w:val="22"/>
+        </w:rPr>
+        <w:t>Linear Regression:</w:t>
+      </w:r>
+      <w:r>
+        <w:rPr>
+          <w:rFonts w:ascii="Helvetica" w:hAnsi="Helvetica" w:eastAsia="Helvetica"/>
+          <w:b w:val="0"/>
+          <w:i w:val="0"/>
+          <w:color w:val="333333"/>
+          <w:sz w:val="22"/>
+        </w:rPr>
+        <w:t xml:space="preserve"> Baseline regression model, fast and simple but restricted to linear </w:t>
+      </w:r>
+      <w:r>
+        <w:tab/>
+      </w:r>
+      <w:r>
+        <w:rPr>
+          <w:rFonts w:ascii="Helvetica" w:hAnsi="Helvetica" w:eastAsia="Helvetica"/>
+          <w:b w:val="0"/>
+          <w:i w:val="0"/>
+          <w:color w:val="333333"/>
+          <w:sz w:val="22"/>
+        </w:rPr>
+        <w:t>relationships.</w:t>
+      </w:r>
+    </w:p>
+    <w:p>
+      <w:pPr>
         <w:sectPr>
           <w:pgSz w:w="11906" w:h="16838"/>
-          <w:pgMar w:top="680" w:right="1104" w:bottom="1218" w:left="1124" w:header="720" w:footer="720" w:gutter="0"/>
+          <w:pgMar w:top="714" w:right="1104" w:bottom="1160" w:left="1124" w:header="720" w:footer="720" w:gutter="0"/>
           <w:cols/>
           <w:docGrid w:linePitch="360"/>
         </w:sectPr>
@@ -6379,65 +7498,6 @@
         <w:autoSpaceDE w:val="0"/>
         <w:widowControl/>
         <w:spacing w:line="328" w:lineRule="exact" w:before="0" w:after="0"/>
-        <w:ind w:left="330" w:right="576" w:firstLine="0"/>
-        <w:jc w:val="left"/>
-      </w:pPr>
-      <w:r>
-        <w:rPr>
-          <w:rFonts w:ascii="Helvetica" w:hAnsi="Helvetica" w:eastAsia="Helvetica"/>
-          <w:b w:val="0"/>
-          <w:i w:val="0"/>
-          <w:color w:val="333333"/>
-          <w:sz w:val="22"/>
-        </w:rPr>
-        <w:t>•</w:t>
-      </w:r>
-      <w:r>
-        <w:tab/>
-      </w:r>
-      <w:r>
-        <w:rPr>
-          <w:rFonts w:ascii="Helvetica" w:hAnsi="Helvetica" w:eastAsia="Helvetica"/>
-          <w:b/>
-          <w:i w:val="0"/>
-          <w:color w:val="333333"/>
-          <w:sz w:val="22"/>
-        </w:rPr>
-        <w:t>Linear Regression:</w:t>
-      </w:r>
-      <w:r>
-        <w:rPr>
-          <w:rFonts w:ascii="Helvetica" w:hAnsi="Helvetica" w:eastAsia="Helvetica"/>
-          <w:b w:val="0"/>
-          <w:i w:val="0"/>
-          <w:color w:val="333333"/>
-          <w:sz w:val="22"/>
-        </w:rPr>
-        <w:t xml:space="preserve"> Baseline regression model, fast and simple but restricted to linear </w:t>
-      </w:r>
-      <w:r>
-        <w:tab/>
-      </w:r>
-      <w:r>
-        <w:rPr>
-          <w:rFonts w:ascii="Helvetica" w:hAnsi="Helvetica" w:eastAsia="Helvetica"/>
-          <w:b w:val="0"/>
-          <w:i w:val="0"/>
-          <w:color w:val="333333"/>
-          <w:sz w:val="22"/>
-        </w:rPr>
-        <w:t>relationships.</w:t>
-      </w:r>
-    </w:p>
-    <w:p>
-      <w:pPr>
-        <w:autoSpaceDN w:val="0"/>
-        <w:tabs>
-          <w:tab w:pos="660" w:val="left"/>
-        </w:tabs>
-        <w:autoSpaceDE w:val="0"/>
-        <w:widowControl/>
-        <w:spacing w:line="352" w:lineRule="exact" w:before="150" w:after="0"/>
         <w:ind w:left="330" w:right="0" w:firstLine="0"/>
         <w:jc w:val="left"/>
       </w:pPr>
@@ -7358,7 +8418,7 @@
       </w:tr>
       <w:tr>
         <w:trPr>
-          <w:trHeight w:hRule="exact" w:val="1980"/>
+          <w:trHeight w:hRule="exact" w:val="2000"/>
         </w:trPr>
         <w:tc>
           <w:tcPr>
@@ -7621,15 +8681,26 @@
         <w:autoSpaceDN w:val="0"/>
         <w:autoSpaceDE w:val="0"/>
         <w:widowControl/>
-        <w:spacing w:line="14" w:lineRule="exact" w:before="0" w:after="0"/>
-        <w:ind w:left="0" w:right="0"/>
+        <w:spacing w:line="330" w:lineRule="exact" w:before="288" w:after="0"/>
+        <w:ind w:left="30" w:right="0" w:firstLine="0"/>
+        <w:jc w:val="left"/>
       </w:pPr>
+      <w:r>
+        <w:rPr>
+          <w:rFonts w:ascii="Helvetica" w:hAnsi="Helvetica" w:eastAsia="Helvetica"/>
+          <w:b/>
+          <w:i w:val="0"/>
+          <w:color w:val="1F3A52"/>
+          <w:sz w:val="24"/>
+        </w:rPr>
+        <w:t>2. Web Application Setup</w:t>
+      </w:r>
     </w:p>
     <w:p>
       <w:pPr>
         <w:sectPr>
           <w:pgSz w:w="11906" w:h="16838"/>
-          <w:pgMar w:top="680" w:right="1104" w:bottom="1080" w:left="1124" w:header="720" w:footer="720" w:gutter="0"/>
+          <w:pgMar w:top="680" w:right="1104" w:bottom="1198" w:left="1124" w:header="720" w:footer="720" w:gutter="0"/>
           <w:cols/>
           <w:docGrid w:linePitch="360"/>
         </w:sectPr>
@@ -7640,16 +8711,428 @@
         <w:autoSpaceDN w:val="0"/>
         <w:autoSpaceDE w:val="0"/>
         <w:widowControl/>
-        <w:spacing w:line="220" w:lineRule="exact" w:before="0" w:after="456"/>
+        <w:spacing w:line="220" w:lineRule="exact" w:before="0" w:after="458"/>
         <w:ind w:left="0" w:right="0"/>
       </w:pPr>
     </w:p>
     <w:p>
       <w:pPr>
         <w:autoSpaceDN w:val="0"/>
+        <w:tabs>
+          <w:tab w:pos="660" w:val="left"/>
+        </w:tabs>
         <w:autoSpaceDE w:val="0"/>
         <w:widowControl/>
-        <w:spacing w:line="332" w:lineRule="exact" w:before="0" w:after="0"/>
+        <w:spacing w:line="340" w:lineRule="exact" w:before="0" w:after="0"/>
+        <w:ind w:left="330" w:right="720" w:firstLine="0"/>
+        <w:jc w:val="left"/>
+      </w:pPr>
+      <w:r>
+        <w:rPr>
+          <w:rFonts w:ascii="Helvetica" w:hAnsi="Helvetica" w:eastAsia="Helvetica"/>
+          <w:b w:val="0"/>
+          <w:i w:val="0"/>
+          <w:color w:val="333333"/>
+          <w:sz w:val="22"/>
+        </w:rPr>
+        <w:t>•</w:t>
+      </w:r>
+      <w:r>
+        <w:tab/>
+      </w:r>
+      <w:r>
+        <w:rPr>
+          <w:rFonts w:ascii="Helvetica" w:hAnsi="Helvetica" w:eastAsia="Helvetica"/>
+          <w:b/>
+          <w:i w:val="0"/>
+          <w:color w:val="333333"/>
+          <w:sz w:val="22"/>
+        </w:rPr>
+        <w:t>Backend (</w:t>
+      </w:r>
+      <w:r>
+        <w:rPr>
+          <w:shd w:val="clear" w:color="auto" w:fill="f4f4f4"/>
+          <w:rFonts w:ascii="Courier" w:hAnsi="Courier" w:eastAsia="Courier"/>
+          <w:b/>
+          <w:i w:val="0"/>
+          <w:color w:val="333333"/>
+          <w:sz w:val="19"/>
+        </w:rPr>
+        <w:t>app.py</w:t>
+      </w:r>
+      <w:r>
+        <w:rPr>
+          <w:rFonts w:ascii="Helvetica" w:hAnsi="Helvetica" w:eastAsia="Helvetica"/>
+          <w:b/>
+          <w:i w:val="0"/>
+          <w:color w:val="333333"/>
+          <w:sz w:val="22"/>
+        </w:rPr>
+        <w:t>):</w:t>
+      </w:r>
+      <w:r>
+        <w:rPr>
+          <w:rFonts w:ascii="Helvetica" w:hAnsi="Helvetica" w:eastAsia="Helvetica"/>
+          <w:b w:val="0"/>
+          <w:i w:val="0"/>
+          <w:color w:val="333333"/>
+          <w:sz w:val="22"/>
+        </w:rPr>
+        <w:t xml:space="preserve"> Utilizes Flask. Loads serialized </w:t>
+      </w:r>
+      <w:r>
+        <w:rPr>
+          <w:shd w:val="clear" w:color="auto" w:fill="f4f4f4"/>
+          <w:rFonts w:ascii="Courier" w:hAnsi="Courier" w:eastAsia="Courier"/>
+          <w:b w:val="0"/>
+          <w:i w:val="0"/>
+          <w:color w:val="333333"/>
+          <w:sz w:val="19"/>
+        </w:rPr>
+        <w:t>preprocessor.joblib</w:t>
+      </w:r>
+      <w:r>
+        <w:rPr>
+          <w:rFonts w:ascii="Helvetica" w:hAnsi="Helvetica" w:eastAsia="Helvetica"/>
+          <w:b w:val="0"/>
+          <w:i w:val="0"/>
+          <w:color w:val="333333"/>
+          <w:sz w:val="22"/>
+        </w:rPr>
+        <w:t xml:space="preserve">, </w:t>
+      </w:r>
+      <w:r>
+        <w:br/>
+      </w:r>
+      <w:r>
+        <w:tab/>
+      </w:r>
+      <w:r>
+        <w:rPr>
+          <w:shd w:val="clear" w:color="auto" w:fill="f4f4f4"/>
+          <w:rFonts w:ascii="Courier" w:hAnsi="Courier" w:eastAsia="Courier"/>
+          <w:b w:val="0"/>
+          <w:i w:val="0"/>
+          <w:color w:val="333333"/>
+          <w:sz w:val="19"/>
+        </w:rPr>
+        <w:t>linear_regression_model.joblib</w:t>
+      </w:r>
+      <w:r>
+        <w:rPr>
+          <w:rFonts w:ascii="Helvetica" w:hAnsi="Helvetica" w:eastAsia="Helvetica"/>
+          <w:b w:val="0"/>
+          <w:i w:val="0"/>
+          <w:color w:val="333333"/>
+          <w:sz w:val="22"/>
+        </w:rPr>
+        <w:t xml:space="preserve">, </w:t>
+      </w:r>
+      <w:r>
+        <w:rPr>
+          <w:shd w:val="clear" w:color="auto" w:fill="f4f4f4"/>
+          <w:rFonts w:ascii="Courier" w:hAnsi="Courier" w:eastAsia="Courier"/>
+          <w:b w:val="0"/>
+          <w:i w:val="0"/>
+          <w:color w:val="333333"/>
+          <w:sz w:val="19"/>
+        </w:rPr>
+        <w:t>xgboost_model.joblib</w:t>
+      </w:r>
+      <w:r>
+        <w:rPr>
+          <w:rFonts w:ascii="Helvetica" w:hAnsi="Helvetica" w:eastAsia="Helvetica"/>
+          <w:b w:val="0"/>
+          <w:i w:val="0"/>
+          <w:color w:val="333333"/>
+          <w:sz w:val="22"/>
+        </w:rPr>
+        <w:t xml:space="preserve">, and </w:t>
+      </w:r>
+      <w:r>
+        <w:br/>
+      </w:r>
+      <w:r>
+        <w:tab/>
+      </w:r>
+      <w:r>
+        <w:rPr>
+          <w:shd w:val="clear" w:color="auto" w:fill="f4f4f4"/>
+          <w:rFonts w:ascii="Courier" w:hAnsi="Courier" w:eastAsia="Courier"/>
+          <w:b w:val="0"/>
+          <w:i w:val="0"/>
+          <w:color w:val="333333"/>
+          <w:sz w:val="19"/>
+        </w:rPr>
+        <w:t>random_forest_model.joblib</w:t>
+      </w:r>
+      <w:r>
+        <w:rPr>
+          <w:rFonts w:ascii="Helvetica" w:hAnsi="Helvetica" w:eastAsia="Helvetica"/>
+          <w:b w:val="0"/>
+          <w:i w:val="0"/>
+          <w:color w:val="333333"/>
+          <w:sz w:val="22"/>
+        </w:rPr>
+        <w:t xml:space="preserve"> on startup. Serves </w:t>
+      </w:r>
+      <w:r>
+        <w:rPr>
+          <w:shd w:val="clear" w:color="auto" w:fill="f4f4f4"/>
+          <w:rFonts w:ascii="Courier" w:hAnsi="Courier" w:eastAsia="Courier"/>
+          <w:b w:val="0"/>
+          <w:i w:val="0"/>
+          <w:color w:val="333333"/>
+          <w:sz w:val="19"/>
+        </w:rPr>
+        <w:t>/predict</w:t>
+      </w:r>
+      <w:r>
+        <w:rPr>
+          <w:rFonts w:ascii="Helvetica" w:hAnsi="Helvetica" w:eastAsia="Helvetica"/>
+          <w:b w:val="0"/>
+          <w:i w:val="0"/>
+          <w:color w:val="333333"/>
+          <w:sz w:val="22"/>
+        </w:rPr>
+        <w:t xml:space="preserve"> endpoint returning JSON </w:t>
+      </w:r>
+      <w:r>
+        <w:tab/>
+      </w:r>
+      <w:r>
+        <w:rPr>
+          <w:rFonts w:ascii="Helvetica" w:hAnsi="Helvetica" w:eastAsia="Helvetica"/>
+          <w:b w:val="0"/>
+          <w:i w:val="0"/>
+          <w:color w:val="333333"/>
+          <w:sz w:val="22"/>
+        </w:rPr>
+        <w:t>predictions.</w:t>
+      </w:r>
+    </w:p>
+    <w:p>
+      <w:pPr>
+        <w:autoSpaceDN w:val="0"/>
+        <w:autoSpaceDE w:val="0"/>
+        <w:widowControl/>
+        <w:spacing w:line="344" w:lineRule="exact" w:before="166" w:after="0"/>
+        <w:ind w:left="660" w:right="288" w:firstLine="0"/>
+        <w:jc w:val="left"/>
+      </w:pPr>
+      <w:r>
+        <w:rPr>
+          <w:rFonts w:ascii="Helvetica" w:hAnsi="Helvetica" w:eastAsia="Helvetica"/>
+          <w:b/>
+          <w:i w:val="0"/>
+          <w:color w:val="333333"/>
+          <w:sz w:val="22"/>
+        </w:rPr>
+        <w:t>Frontend (</w:t>
+      </w:r>
+      <w:r>
+        <w:rPr>
+          <w:shd w:val="clear" w:color="auto" w:fill="f4f4f4"/>
+          <w:rFonts w:ascii="Courier" w:hAnsi="Courier" w:eastAsia="Courier"/>
+          <w:b/>
+          <w:i w:val="0"/>
+          <w:color w:val="333333"/>
+          <w:sz w:val="19"/>
+        </w:rPr>
+        <w:t>templates/index.html</w:t>
+      </w:r>
+      <w:r>
+        <w:rPr>
+          <w:rFonts w:ascii="Helvetica" w:hAnsi="Helvetica" w:eastAsia="Helvetica"/>
+          <w:b/>
+          <w:i w:val="0"/>
+          <w:color w:val="333333"/>
+          <w:sz w:val="22"/>
+        </w:rPr>
+        <w:t>):</w:t>
+      </w:r>
+      <w:r>
+        <w:rPr>
+          <w:rFonts w:ascii="Helvetica" w:hAnsi="Helvetica" w:eastAsia="Helvetica"/>
+          <w:b w:val="0"/>
+          <w:i w:val="0"/>
+          <w:color w:val="333333"/>
+          <w:sz w:val="22"/>
+        </w:rPr>
+        <w:t xml:space="preserve"> Glassmorphic web panel with Outfit typography and </w:t>
+      </w:r>
+      <w:r>
+        <w:rPr>
+          <w:rFonts w:ascii="Helvetica" w:hAnsi="Helvetica" w:eastAsia="Helvetica"/>
+          <w:b w:val="0"/>
+          <w:i w:val="0"/>
+          <w:color w:val="333333"/>
+          <w:sz w:val="22"/>
+        </w:rPr>
+        <w:t>dynamic dark mode sliders for all 10 features:</w:t>
+      </w:r>
+    </w:p>
+    <w:p>
+      <w:pPr>
+        <w:autoSpaceDN w:val="0"/>
+        <w:tabs>
+          <w:tab w:pos="990" w:val="left"/>
+        </w:tabs>
+        <w:autoSpaceDE w:val="0"/>
+        <w:widowControl/>
+        <w:spacing w:line="352" w:lineRule="exact" w:before="150" w:after="0"/>
+        <w:ind w:left="660" w:right="0" w:firstLine="0"/>
+        <w:jc w:val="left"/>
+      </w:pPr>
+      <w:r>
+        <w:rPr>
+          <w:rFonts w:ascii="Helvetica" w:hAnsi="Helvetica" w:eastAsia="Helvetica"/>
+          <w:b w:val="0"/>
+          <w:i w:val="0"/>
+          <w:color w:val="333333"/>
+          <w:sz w:val="22"/>
+        </w:rPr>
+        <w:t>•</w:t>
+      </w:r>
+      <w:r>
+        <w:tab/>
+      </w:r>
+      <w:r>
+        <w:rPr>
+          <w:rFonts w:ascii="Helvetica" w:hAnsi="Helvetica" w:eastAsia="Helvetica"/>
+          <w:b w:val="0"/>
+          <w:i/>
+          <w:color w:val="333333"/>
+          <w:sz w:val="22"/>
+        </w:rPr>
+        <w:t>Direct sliders:</w:t>
+      </w:r>
+      <w:r>
+        <w:rPr>
+          <w:rFonts w:ascii="Helvetica" w:hAnsi="Helvetica" w:eastAsia="Helvetica"/>
+          <w:b w:val="0"/>
+          <w:i w:val="0"/>
+          <w:color w:val="333333"/>
+          <w:sz w:val="22"/>
+        </w:rPr>
+        <w:t xml:space="preserve"> IncomeLevel, PropertyAge, TotalRooms, TotalBedrooms, AvgOccupancy, </w:t>
+      </w:r>
+      <w:r>
+        <w:tab/>
+      </w:r>
+      <w:r>
+        <w:rPr>
+          <w:rFonts w:ascii="Helvetica" w:hAnsi="Helvetica" w:eastAsia="Helvetica"/>
+          <w:b w:val="0"/>
+          <w:i w:val="0"/>
+          <w:color w:val="333333"/>
+          <w:sz w:val="22"/>
+        </w:rPr>
+        <w:t>RoomsPerHousehold, BedroomsRatio.</w:t>
+      </w:r>
+    </w:p>
+    <w:p>
+      <w:pPr>
+        <w:autoSpaceDN w:val="0"/>
+        <w:tabs>
+          <w:tab w:pos="990" w:val="left"/>
+        </w:tabs>
+        <w:autoSpaceDE w:val="0"/>
+        <w:widowControl/>
+        <w:spacing w:line="304" w:lineRule="exact" w:before="198" w:after="0"/>
+        <w:ind w:left="660" w:right="0" w:firstLine="0"/>
+        <w:jc w:val="left"/>
+      </w:pPr>
+      <w:r>
+        <w:rPr>
+          <w:rFonts w:ascii="Helvetica" w:hAnsi="Helvetica" w:eastAsia="Helvetica"/>
+          <w:b w:val="0"/>
+          <w:i w:val="0"/>
+          <w:color w:val="333333"/>
+          <w:sz w:val="22"/>
+        </w:rPr>
+        <w:t>•</w:t>
+      </w:r>
+      <w:r>
+        <w:tab/>
+      </w:r>
+      <w:r>
+        <w:rPr>
+          <w:rFonts w:ascii="Helvetica" w:hAnsi="Helvetica" w:eastAsia="Helvetica"/>
+          <w:b w:val="0"/>
+          <w:i/>
+          <w:color w:val="333333"/>
+          <w:sz w:val="22"/>
+        </w:rPr>
+        <w:t>Direct inputs:</w:t>
+      </w:r>
+      <w:r>
+        <w:rPr>
+          <w:rFonts w:ascii="Helvetica" w:hAnsi="Helvetica" w:eastAsia="Helvetica"/>
+          <w:b w:val="0"/>
+          <w:i w:val="0"/>
+          <w:color w:val="333333"/>
+          <w:sz w:val="22"/>
+        </w:rPr>
+        <w:t xml:space="preserve"> NeighborhoodPop, Latitude, Longitude.</w:t>
+      </w:r>
+    </w:p>
+    <w:p>
+      <w:pPr>
+        <w:autoSpaceDN w:val="0"/>
+        <w:tabs>
+          <w:tab w:pos="990" w:val="left"/>
+        </w:tabs>
+        <w:autoSpaceDE w:val="0"/>
+        <w:widowControl/>
+        <w:spacing w:line="352" w:lineRule="exact" w:before="150" w:after="0"/>
+        <w:ind w:left="660" w:right="864" w:firstLine="0"/>
+        <w:jc w:val="left"/>
+      </w:pPr>
+      <w:r>
+        <w:rPr>
+          <w:rFonts w:ascii="Helvetica" w:hAnsi="Helvetica" w:eastAsia="Helvetica"/>
+          <w:b w:val="0"/>
+          <w:i w:val="0"/>
+          <w:color w:val="333333"/>
+          <w:sz w:val="22"/>
+        </w:rPr>
+        <w:t>•</w:t>
+      </w:r>
+      <w:r>
+        <w:tab/>
+      </w:r>
+      <w:r>
+        <w:rPr>
+          <w:rFonts w:ascii="Helvetica" w:hAnsi="Helvetica" w:eastAsia="Helvetica"/>
+          <w:b w:val="0"/>
+          <w:i w:val="0"/>
+          <w:color w:val="333333"/>
+          <w:sz w:val="22"/>
+        </w:rPr>
+        <w:t xml:space="preserve">Live updates are sent asynchronously to the backend on slider adjust, updating </w:t>
+      </w:r>
+      <w:r>
+        <w:tab/>
+      </w:r>
+      <w:r>
+        <w:rPr>
+          <w:rFonts w:ascii="Helvetica" w:hAnsi="Helvetica" w:eastAsia="Helvetica"/>
+          <w:b w:val="0"/>
+          <w:i w:val="0"/>
+          <w:color w:val="333333"/>
+          <w:sz w:val="22"/>
+        </w:rPr>
+        <w:t>predicted prices dynamically with a neon green layout.</w:t>
+      </w:r>
+    </w:p>
+    <w:p>
+      <w:pPr>
+        <w:autoSpaceDN w:val="0"/>
+        <w:autoSpaceDE w:val="0"/>
+        <w:widowControl/>
+        <w:spacing w:line="412" w:lineRule="exact" w:before="1700" w:after="0"/>
         <w:ind w:left="30" w:right="0" w:firstLine="0"/>
         <w:jc w:val="left"/>
       </w:pPr>
@@ -7659,9 +9142,111 @@
           <w:b/>
           <w:i w:val="0"/>
           <w:color w:val="1F3A52"/>
+          <w:sz w:val="30"/>
+        </w:rPr>
+        <w:t>Section F: Critical Evaluation &amp; Limitations (10 Marks)</w:t>
+      </w:r>
+    </w:p>
+    <w:p>
+      <w:pPr>
+        <w:autoSpaceDN w:val="0"/>
+        <w:autoSpaceDE w:val="0"/>
+        <w:widowControl/>
+        <w:spacing w:line="332" w:lineRule="exact" w:before="528" w:after="0"/>
+        <w:ind w:left="30" w:right="0" w:firstLine="0"/>
+        <w:jc w:val="left"/>
+      </w:pPr>
+      <w:r>
+        <w:rPr>
+          <w:rFonts w:ascii="Helvetica" w:hAnsi="Helvetica" w:eastAsia="Helvetica"/>
+          <w:b/>
+          <w:i w:val="0"/>
+          <w:color w:val="1F3A52"/>
           <w:sz w:val="24"/>
         </w:rPr>
-        <w:t>2. Web Application Setup</w:t>
+        <w:t>1. Domain Suitability of the Model</w:t>
+      </w:r>
+    </w:p>
+    <w:p>
+      <w:pPr>
+        <w:autoSpaceDN w:val="0"/>
+        <w:tabs>
+          <w:tab w:pos="660" w:val="left"/>
+        </w:tabs>
+        <w:autoSpaceDE w:val="0"/>
+        <w:widowControl/>
+        <w:spacing w:line="352" w:lineRule="exact" w:before="170" w:after="0"/>
+        <w:ind w:left="330" w:right="288" w:firstLine="0"/>
+        <w:jc w:val="left"/>
+      </w:pPr>
+      <w:r>
+        <w:rPr>
+          <w:rFonts w:ascii="Helvetica" w:hAnsi="Helvetica" w:eastAsia="Helvetica"/>
+          <w:b w:val="0"/>
+          <w:i w:val="0"/>
+          <w:color w:val="333333"/>
+          <w:sz w:val="22"/>
+        </w:rPr>
+        <w:t>•</w:t>
+      </w:r>
+      <w:r>
+        <w:tab/>
+      </w:r>
+      <w:r>
+        <w:rPr>
+          <w:rFonts w:ascii="Helvetica" w:hAnsi="Helvetica" w:eastAsia="Helvetica"/>
+          <w:b w:val="0"/>
+          <w:i w:val="0"/>
+          <w:color w:val="333333"/>
+          <w:sz w:val="22"/>
+        </w:rPr>
+        <w:t xml:space="preserve">The Random Forest Regressor is highly suited for real estate valuation. It is robust to </w:t>
+      </w:r>
+      <w:r>
+        <w:tab/>
+      </w:r>
+      <w:r>
+        <w:rPr>
+          <w:rFonts w:ascii="Helvetica" w:hAnsi="Helvetica" w:eastAsia="Helvetica"/>
+          <w:b w:val="0"/>
+          <w:i w:val="0"/>
+          <w:color w:val="333333"/>
+          <w:sz w:val="22"/>
+        </w:rPr>
+        <w:t xml:space="preserve">outliers (which are common in real estate due to luxury housing spikes) and captures the </w:t>
+      </w:r>
+      <w:r>
+        <w:tab/>
+      </w:r>
+      <w:r>
+        <w:rPr>
+          <w:rFonts w:ascii="Helvetica" w:hAnsi="Helvetica" w:eastAsia="Helvetica"/>
+          <w:b w:val="0"/>
+          <w:i w:val="0"/>
+          <w:color w:val="333333"/>
+          <w:sz w:val="22"/>
+        </w:rPr>
+        <w:t>complex interactions between geographic coordinates and average occupancy.</w:t>
+      </w:r>
+    </w:p>
+    <w:p>
+      <w:pPr>
+        <w:autoSpaceDN w:val="0"/>
+        <w:autoSpaceDE w:val="0"/>
+        <w:widowControl/>
+        <w:spacing w:line="332" w:lineRule="exact" w:before="816" w:after="0"/>
+        <w:ind w:left="30" w:right="0" w:firstLine="0"/>
+        <w:jc w:val="left"/>
+      </w:pPr>
+      <w:r>
+        <w:rPr>
+          <w:rFonts w:ascii="Helvetica" w:hAnsi="Helvetica" w:eastAsia="Helvetica"/>
+          <w:b/>
+          <w:i w:val="0"/>
+          <w:color w:val="1F3A52"/>
+          <w:sz w:val="24"/>
+        </w:rPr>
+        <w:t>2. Suitability of Deep Learning</w:t>
       </w:r>
     </w:p>
     <w:p>
@@ -7692,540 +9277,6 @@
       <w:r>
         <w:rPr>
           <w:rFonts w:ascii="Helvetica" w:hAnsi="Helvetica" w:eastAsia="Helvetica"/>
-          <w:b/>
-          <w:i w:val="0"/>
-          <w:color w:val="333333"/>
-          <w:sz w:val="22"/>
-        </w:rPr>
-        <w:t>Backend (</w:t>
-      </w:r>
-      <w:r>
-        <w:rPr>
-          <w:shd w:val="clear" w:color="auto" w:fill="f4f4f4"/>
-          <w:rFonts w:ascii="Courier" w:hAnsi="Courier" w:eastAsia="Courier"/>
-          <w:b/>
-          <w:i w:val="0"/>
-          <w:color w:val="333333"/>
-          <w:sz w:val="19"/>
-        </w:rPr>
-        <w:t>app.py</w:t>
-      </w:r>
-      <w:r>
-        <w:rPr>
-          <w:rFonts w:ascii="Helvetica" w:hAnsi="Helvetica" w:eastAsia="Helvetica"/>
-          <w:b/>
-          <w:i w:val="0"/>
-          <w:color w:val="333333"/>
-          <w:sz w:val="22"/>
-        </w:rPr>
-        <w:t>):</w:t>
-      </w:r>
-      <w:r>
-        <w:rPr>
-          <w:rFonts w:ascii="Helvetica" w:hAnsi="Helvetica" w:eastAsia="Helvetica"/>
-          <w:b w:val="0"/>
-          <w:i w:val="0"/>
-          <w:color w:val="333333"/>
-          <w:sz w:val="22"/>
-        </w:rPr>
-        <w:t xml:space="preserve"> Utilizes Flask. Loads serialized </w:t>
-      </w:r>
-      <w:r>
-        <w:rPr>
-          <w:shd w:val="clear" w:color="auto" w:fill="f4f4f4"/>
-          <w:rFonts w:ascii="Courier" w:hAnsi="Courier" w:eastAsia="Courier"/>
-          <w:b w:val="0"/>
-          <w:i w:val="0"/>
-          <w:color w:val="333333"/>
-          <w:sz w:val="19"/>
-        </w:rPr>
-        <w:t>preprocessor.joblib</w:t>
-      </w:r>
-      <w:r>
-        <w:rPr>
-          <w:rFonts w:ascii="Helvetica" w:hAnsi="Helvetica" w:eastAsia="Helvetica"/>
-          <w:b w:val="0"/>
-          <w:i w:val="0"/>
-          <w:color w:val="333333"/>
-          <w:sz w:val="22"/>
-        </w:rPr>
-        <w:t xml:space="preserve">, </w:t>
-      </w:r>
-      <w:r>
-        <w:br/>
-      </w:r>
-      <w:r>
-        <w:tab/>
-      </w:r>
-      <w:r>
-        <w:rPr>
-          <w:shd w:val="clear" w:color="auto" w:fill="f4f4f4"/>
-          <w:rFonts w:ascii="Courier" w:hAnsi="Courier" w:eastAsia="Courier"/>
-          <w:b w:val="0"/>
-          <w:i w:val="0"/>
-          <w:color w:val="333333"/>
-          <w:sz w:val="19"/>
-        </w:rPr>
-        <w:t>linear_regression_model.joblib</w:t>
-      </w:r>
-      <w:r>
-        <w:rPr>
-          <w:rFonts w:ascii="Helvetica" w:hAnsi="Helvetica" w:eastAsia="Helvetica"/>
-          <w:b w:val="0"/>
-          <w:i w:val="0"/>
-          <w:color w:val="333333"/>
-          <w:sz w:val="22"/>
-        </w:rPr>
-        <w:t xml:space="preserve">, </w:t>
-      </w:r>
-      <w:r>
-        <w:rPr>
-          <w:shd w:val="clear" w:color="auto" w:fill="f4f4f4"/>
-          <w:rFonts w:ascii="Courier" w:hAnsi="Courier" w:eastAsia="Courier"/>
-          <w:b w:val="0"/>
-          <w:i w:val="0"/>
-          <w:color w:val="333333"/>
-          <w:sz w:val="19"/>
-        </w:rPr>
-        <w:t>xgboost_model.joblib</w:t>
-      </w:r>
-      <w:r>
-        <w:rPr>
-          <w:rFonts w:ascii="Helvetica" w:hAnsi="Helvetica" w:eastAsia="Helvetica"/>
-          <w:b w:val="0"/>
-          <w:i w:val="0"/>
-          <w:color w:val="333333"/>
-          <w:sz w:val="22"/>
-        </w:rPr>
-        <w:t xml:space="preserve">, and </w:t>
-      </w:r>
-      <w:r>
-        <w:br/>
-      </w:r>
-      <w:r>
-        <w:tab/>
-      </w:r>
-      <w:r>
-        <w:rPr>
-          <w:shd w:val="clear" w:color="auto" w:fill="f4f4f4"/>
-          <w:rFonts w:ascii="Courier" w:hAnsi="Courier" w:eastAsia="Courier"/>
-          <w:b w:val="0"/>
-          <w:i w:val="0"/>
-          <w:color w:val="333333"/>
-          <w:sz w:val="19"/>
-        </w:rPr>
-        <w:t>random_forest_model.joblib</w:t>
-      </w:r>
-      <w:r>
-        <w:rPr>
-          <w:rFonts w:ascii="Helvetica" w:hAnsi="Helvetica" w:eastAsia="Helvetica"/>
-          <w:b w:val="0"/>
-          <w:i w:val="0"/>
-          <w:color w:val="333333"/>
-          <w:sz w:val="22"/>
-        </w:rPr>
-        <w:t xml:space="preserve"> on startup. Serves </w:t>
-      </w:r>
-      <w:r>
-        <w:rPr>
-          <w:shd w:val="clear" w:color="auto" w:fill="f4f4f4"/>
-          <w:rFonts w:ascii="Courier" w:hAnsi="Courier" w:eastAsia="Courier"/>
-          <w:b w:val="0"/>
-          <w:i w:val="0"/>
-          <w:color w:val="333333"/>
-          <w:sz w:val="19"/>
-        </w:rPr>
-        <w:t>/predict</w:t>
-      </w:r>
-      <w:r>
-        <w:rPr>
-          <w:rFonts w:ascii="Helvetica" w:hAnsi="Helvetica" w:eastAsia="Helvetica"/>
-          <w:b w:val="0"/>
-          <w:i w:val="0"/>
-          <w:color w:val="333333"/>
-          <w:sz w:val="22"/>
-        </w:rPr>
-        <w:t xml:space="preserve"> endpoint returning JSON </w:t>
-      </w:r>
-      <w:r>
-        <w:tab/>
-      </w:r>
-      <w:r>
-        <w:rPr>
-          <w:rFonts w:ascii="Helvetica" w:hAnsi="Helvetica" w:eastAsia="Helvetica"/>
-          <w:b w:val="0"/>
-          <w:i w:val="0"/>
-          <w:color w:val="333333"/>
-          <w:sz w:val="22"/>
-        </w:rPr>
-        <w:t>predictions.</w:t>
-      </w:r>
-    </w:p>
-    <w:p>
-      <w:pPr>
-        <w:autoSpaceDN w:val="0"/>
-        <w:autoSpaceDE w:val="0"/>
-        <w:widowControl/>
-        <w:spacing w:line="344" w:lineRule="exact" w:before="166" w:after="0"/>
-        <w:ind w:left="660" w:right="288" w:firstLine="0"/>
-        <w:jc w:val="left"/>
-      </w:pPr>
-      <w:r>
-        <w:rPr>
-          <w:rFonts w:ascii="Helvetica" w:hAnsi="Helvetica" w:eastAsia="Helvetica"/>
-          <w:b/>
-          <w:i w:val="0"/>
-          <w:color w:val="333333"/>
-          <w:sz w:val="22"/>
-        </w:rPr>
-        <w:t>Frontend (</w:t>
-      </w:r>
-      <w:r>
-        <w:rPr>
-          <w:shd w:val="clear" w:color="auto" w:fill="f4f4f4"/>
-          <w:rFonts w:ascii="Courier" w:hAnsi="Courier" w:eastAsia="Courier"/>
-          <w:b/>
-          <w:i w:val="0"/>
-          <w:color w:val="333333"/>
-          <w:sz w:val="19"/>
-        </w:rPr>
-        <w:t>templates/index.html</w:t>
-      </w:r>
-      <w:r>
-        <w:rPr>
-          <w:rFonts w:ascii="Helvetica" w:hAnsi="Helvetica" w:eastAsia="Helvetica"/>
-          <w:b/>
-          <w:i w:val="0"/>
-          <w:color w:val="333333"/>
-          <w:sz w:val="22"/>
-        </w:rPr>
-        <w:t>):</w:t>
-      </w:r>
-      <w:r>
-        <w:rPr>
-          <w:rFonts w:ascii="Helvetica" w:hAnsi="Helvetica" w:eastAsia="Helvetica"/>
-          <w:b w:val="0"/>
-          <w:i w:val="0"/>
-          <w:color w:val="333333"/>
-          <w:sz w:val="22"/>
-        </w:rPr>
-        <w:t xml:space="preserve"> Glassmorphic web panel with Outfit typography and </w:t>
-      </w:r>
-      <w:r>
-        <w:rPr>
-          <w:rFonts w:ascii="Helvetica" w:hAnsi="Helvetica" w:eastAsia="Helvetica"/>
-          <w:b w:val="0"/>
-          <w:i w:val="0"/>
-          <w:color w:val="333333"/>
-          <w:sz w:val="22"/>
-        </w:rPr>
-        <w:t>dynamic dark mode sliders for all 10 features:</w:t>
-      </w:r>
-    </w:p>
-    <w:p>
-      <w:pPr>
-        <w:autoSpaceDN w:val="0"/>
-        <w:tabs>
-          <w:tab w:pos="990" w:val="left"/>
-        </w:tabs>
-        <w:autoSpaceDE w:val="0"/>
-        <w:widowControl/>
-        <w:spacing w:line="352" w:lineRule="exact" w:before="150" w:after="0"/>
-        <w:ind w:left="660" w:right="0" w:firstLine="0"/>
-        <w:jc w:val="left"/>
-      </w:pPr>
-      <w:r>
-        <w:rPr>
-          <w:rFonts w:ascii="Helvetica" w:hAnsi="Helvetica" w:eastAsia="Helvetica"/>
-          <w:b w:val="0"/>
-          <w:i w:val="0"/>
-          <w:color w:val="333333"/>
-          <w:sz w:val="22"/>
-        </w:rPr>
-        <w:t>•</w:t>
-      </w:r>
-      <w:r>
-        <w:tab/>
-      </w:r>
-      <w:r>
-        <w:rPr>
-          <w:rFonts w:ascii="Helvetica" w:hAnsi="Helvetica" w:eastAsia="Helvetica"/>
-          <w:b w:val="0"/>
-          <w:i/>
-          <w:color w:val="333333"/>
-          <w:sz w:val="22"/>
-        </w:rPr>
-        <w:t>Direct sliders:</w:t>
-      </w:r>
-      <w:r>
-        <w:rPr>
-          <w:rFonts w:ascii="Helvetica" w:hAnsi="Helvetica" w:eastAsia="Helvetica"/>
-          <w:b w:val="0"/>
-          <w:i w:val="0"/>
-          <w:color w:val="333333"/>
-          <w:sz w:val="22"/>
-        </w:rPr>
-        <w:t xml:space="preserve"> IncomeLevel, PropertyAge, TotalRooms, TotalBedrooms, AvgOccupancy, </w:t>
-      </w:r>
-      <w:r>
-        <w:tab/>
-      </w:r>
-      <w:r>
-        <w:rPr>
-          <w:rFonts w:ascii="Helvetica" w:hAnsi="Helvetica" w:eastAsia="Helvetica"/>
-          <w:b w:val="0"/>
-          <w:i w:val="0"/>
-          <w:color w:val="333333"/>
-          <w:sz w:val="22"/>
-        </w:rPr>
-        <w:t>RoomsPerHousehold, BedroomsRatio.</w:t>
-      </w:r>
-    </w:p>
-    <w:p>
-      <w:pPr>
-        <w:autoSpaceDN w:val="0"/>
-        <w:tabs>
-          <w:tab w:pos="990" w:val="left"/>
-        </w:tabs>
-        <w:autoSpaceDE w:val="0"/>
-        <w:widowControl/>
-        <w:spacing w:line="304" w:lineRule="exact" w:before="198" w:after="0"/>
-        <w:ind w:left="660" w:right="0" w:firstLine="0"/>
-        <w:jc w:val="left"/>
-      </w:pPr>
-      <w:r>
-        <w:rPr>
-          <w:rFonts w:ascii="Helvetica" w:hAnsi="Helvetica" w:eastAsia="Helvetica"/>
-          <w:b w:val="0"/>
-          <w:i w:val="0"/>
-          <w:color w:val="333333"/>
-          <w:sz w:val="22"/>
-        </w:rPr>
-        <w:t>•</w:t>
-      </w:r>
-      <w:r>
-        <w:tab/>
-      </w:r>
-      <w:r>
-        <w:rPr>
-          <w:rFonts w:ascii="Helvetica" w:hAnsi="Helvetica" w:eastAsia="Helvetica"/>
-          <w:b w:val="0"/>
-          <w:i/>
-          <w:color w:val="333333"/>
-          <w:sz w:val="22"/>
-        </w:rPr>
-        <w:t>Direct inputs:</w:t>
-      </w:r>
-      <w:r>
-        <w:rPr>
-          <w:rFonts w:ascii="Helvetica" w:hAnsi="Helvetica" w:eastAsia="Helvetica"/>
-          <w:b w:val="0"/>
-          <w:i w:val="0"/>
-          <w:color w:val="333333"/>
-          <w:sz w:val="22"/>
-        </w:rPr>
-        <w:t xml:space="preserve"> NeighborhoodPop, Latitude, Longitude.</w:t>
-      </w:r>
-    </w:p>
-    <w:p>
-      <w:pPr>
-        <w:autoSpaceDN w:val="0"/>
-        <w:tabs>
-          <w:tab w:pos="990" w:val="left"/>
-        </w:tabs>
-        <w:autoSpaceDE w:val="0"/>
-        <w:widowControl/>
-        <w:spacing w:line="352" w:lineRule="exact" w:before="150" w:after="0"/>
-        <w:ind w:left="660" w:right="864" w:firstLine="0"/>
-        <w:jc w:val="left"/>
-      </w:pPr>
-      <w:r>
-        <w:rPr>
-          <w:rFonts w:ascii="Helvetica" w:hAnsi="Helvetica" w:eastAsia="Helvetica"/>
-          <w:b w:val="0"/>
-          <w:i w:val="0"/>
-          <w:color w:val="333333"/>
-          <w:sz w:val="22"/>
-        </w:rPr>
-        <w:t>•</w:t>
-      </w:r>
-      <w:r>
-        <w:tab/>
-      </w:r>
-      <w:r>
-        <w:rPr>
-          <w:rFonts w:ascii="Helvetica" w:hAnsi="Helvetica" w:eastAsia="Helvetica"/>
-          <w:b w:val="0"/>
-          <w:i w:val="0"/>
-          <w:color w:val="333333"/>
-          <w:sz w:val="22"/>
-        </w:rPr>
-        <w:t xml:space="preserve">Live updates are sent asynchronously to the backend on slider adjust, updating </w:t>
-      </w:r>
-      <w:r>
-        <w:tab/>
-      </w:r>
-      <w:r>
-        <w:rPr>
-          <w:rFonts w:ascii="Helvetica" w:hAnsi="Helvetica" w:eastAsia="Helvetica"/>
-          <w:b w:val="0"/>
-          <w:i w:val="0"/>
-          <w:color w:val="333333"/>
-          <w:sz w:val="22"/>
-        </w:rPr>
-        <w:t>predicted prices dynamically with a neon green layout.</w:t>
-      </w:r>
-    </w:p>
-    <w:p>
-      <w:pPr>
-        <w:autoSpaceDN w:val="0"/>
-        <w:autoSpaceDE w:val="0"/>
-        <w:widowControl/>
-        <w:spacing w:line="412" w:lineRule="exact" w:before="1700" w:after="0"/>
-        <w:ind w:left="30" w:right="0" w:firstLine="0"/>
-        <w:jc w:val="left"/>
-      </w:pPr>
-      <w:r>
-        <w:rPr>
-          <w:rFonts w:ascii="Helvetica" w:hAnsi="Helvetica" w:eastAsia="Helvetica"/>
-          <w:b/>
-          <w:i w:val="0"/>
-          <w:color w:val="1F3A52"/>
-          <w:sz w:val="30"/>
-        </w:rPr>
-        <w:t>Section F: Critical Evaluation &amp; Limitations (10 Marks)</w:t>
-      </w:r>
-    </w:p>
-    <w:p>
-      <w:pPr>
-        <w:autoSpaceDN w:val="0"/>
-        <w:autoSpaceDE w:val="0"/>
-        <w:widowControl/>
-        <w:spacing w:line="332" w:lineRule="exact" w:before="528" w:after="0"/>
-        <w:ind w:left="30" w:right="0" w:firstLine="0"/>
-        <w:jc w:val="left"/>
-      </w:pPr>
-      <w:r>
-        <w:rPr>
-          <w:rFonts w:ascii="Helvetica" w:hAnsi="Helvetica" w:eastAsia="Helvetica"/>
-          <w:b/>
-          <w:i w:val="0"/>
-          <w:color w:val="1F3A52"/>
-          <w:sz w:val="24"/>
-        </w:rPr>
-        <w:t>1. Domain Suitability of the Model</w:t>
-      </w:r>
-    </w:p>
-    <w:p>
-      <w:pPr>
-        <w:autoSpaceDN w:val="0"/>
-        <w:tabs>
-          <w:tab w:pos="660" w:val="left"/>
-        </w:tabs>
-        <w:autoSpaceDE w:val="0"/>
-        <w:widowControl/>
-        <w:spacing w:line="352" w:lineRule="exact" w:before="170" w:after="0"/>
-        <w:ind w:left="330" w:right="288" w:firstLine="0"/>
-        <w:jc w:val="left"/>
-      </w:pPr>
-      <w:r>
-        <w:rPr>
-          <w:rFonts w:ascii="Helvetica" w:hAnsi="Helvetica" w:eastAsia="Helvetica"/>
-          <w:b w:val="0"/>
-          <w:i w:val="0"/>
-          <w:color w:val="333333"/>
-          <w:sz w:val="22"/>
-        </w:rPr>
-        <w:t>•</w:t>
-      </w:r>
-      <w:r>
-        <w:tab/>
-      </w:r>
-      <w:r>
-        <w:rPr>
-          <w:rFonts w:ascii="Helvetica" w:hAnsi="Helvetica" w:eastAsia="Helvetica"/>
-          <w:b w:val="0"/>
-          <w:i w:val="0"/>
-          <w:color w:val="333333"/>
-          <w:sz w:val="22"/>
-        </w:rPr>
-        <w:t xml:space="preserve">The Random Forest Regressor is highly suited for real estate valuation. It is robust to </w:t>
-      </w:r>
-      <w:r>
-        <w:tab/>
-      </w:r>
-      <w:r>
-        <w:rPr>
-          <w:rFonts w:ascii="Helvetica" w:hAnsi="Helvetica" w:eastAsia="Helvetica"/>
-          <w:b w:val="0"/>
-          <w:i w:val="0"/>
-          <w:color w:val="333333"/>
-          <w:sz w:val="22"/>
-        </w:rPr>
-        <w:t xml:space="preserve">outliers (which are common in real estate due to luxury housing spikes) and captures the </w:t>
-      </w:r>
-      <w:r>
-        <w:tab/>
-      </w:r>
-      <w:r>
-        <w:rPr>
-          <w:rFonts w:ascii="Helvetica" w:hAnsi="Helvetica" w:eastAsia="Helvetica"/>
-          <w:b w:val="0"/>
-          <w:i w:val="0"/>
-          <w:color w:val="333333"/>
-          <w:sz w:val="22"/>
-        </w:rPr>
-        <w:t>complex interactions between geographic coordinates and average occupancy.</w:t>
-      </w:r>
-    </w:p>
-    <w:p>
-      <w:pPr>
-        <w:autoSpaceDN w:val="0"/>
-        <w:autoSpaceDE w:val="0"/>
-        <w:widowControl/>
-        <w:spacing w:line="332" w:lineRule="exact" w:before="816" w:after="0"/>
-        <w:ind w:left="30" w:right="0" w:firstLine="0"/>
-        <w:jc w:val="left"/>
-      </w:pPr>
-      <w:r>
-        <w:rPr>
-          <w:rFonts w:ascii="Helvetica" w:hAnsi="Helvetica" w:eastAsia="Helvetica"/>
-          <w:b/>
-          <w:i w:val="0"/>
-          <w:color w:val="1F3A52"/>
-          <w:sz w:val="24"/>
-        </w:rPr>
-        <w:t>2. Suitability of Deep Learning</w:t>
-      </w:r>
-    </w:p>
-    <w:p>
-      <w:pPr>
-        <w:autoSpaceDN w:val="0"/>
-        <w:tabs>
-          <w:tab w:pos="660" w:val="left"/>
-        </w:tabs>
-        <w:autoSpaceDE w:val="0"/>
-        <w:widowControl/>
-        <w:spacing w:line="352" w:lineRule="exact" w:before="170" w:after="0"/>
-        <w:ind w:left="330" w:right="720" w:firstLine="0"/>
-        <w:jc w:val="left"/>
-      </w:pPr>
-      <w:r>
-        <w:rPr>
-          <w:rFonts w:ascii="Helvetica" w:hAnsi="Helvetica" w:eastAsia="Helvetica"/>
-          <w:b w:val="0"/>
-          <w:i w:val="0"/>
-          <w:color w:val="333333"/>
-          <w:sz w:val="22"/>
-        </w:rPr>
-        <w:t>•</w:t>
-      </w:r>
-      <w:r>
-        <w:tab/>
-      </w:r>
-      <w:r>
-        <w:rPr>
-          <w:rFonts w:ascii="Helvetica" w:hAnsi="Helvetica" w:eastAsia="Helvetica"/>
           <w:b w:val="0"/>
           <w:i w:val="0"/>
           <w:color w:val="333333"/>
@@ -8382,7 +9433,7 @@
       <w:pPr>
         <w:sectPr>
           <w:pgSz w:w="11906" w:h="16838"/>
-          <w:pgMar w:top="676" w:right="1104" w:bottom="1116" w:left="1124" w:header="720" w:footer="720" w:gutter="0"/>
+          <w:pgMar w:top="680" w:right="1104" w:bottom="1388" w:left="1124" w:header="720" w:footer="720" w:gutter="0"/>
           <w:cols/>
           <w:docGrid w:linePitch="360"/>
         </w:sectPr>

</xml_diff>

<commit_message>
Update correlation matrix heatmap to match notebook exactly
</commit_message>
<xml_diff>
--- a/assessment_report.docx
+++ b/assessment_report.docx
@@ -6625,7 +6625,7 @@
       <w:r>
         <w:drawing>
           <wp:inline xmlns:a="http://schemas.openxmlformats.org/drawingml/2006/main" xmlns:pic="http://schemas.openxmlformats.org/drawingml/2006/picture">
-            <wp:extent cx="6094730" cy="5551170"/>
+            <wp:extent cx="6094730" cy="5544820"/>
             <wp:docPr id="3" name="Picture 3"/>
             <wp:cNvGraphicFramePr>
               <a:graphicFrameLocks noChangeAspect="1"/>
@@ -6646,7 +6646,7 @@
                   <pic:spPr>
                     <a:xfrm>
                       <a:off x="0" y="0"/>
-                      <a:ext cx="6094730" cy="5551170"/>
+                      <a:ext cx="6094730" cy="5544820"/>
                     </a:xfrm>
                     <a:prstGeom prst="rect"/>
                   </pic:spPr>
@@ -6662,7 +6662,7 @@
         <w:autoSpaceDN w:val="0"/>
         <w:autoSpaceDE w:val="0"/>
         <w:widowControl/>
-        <w:spacing w:line="352" w:lineRule="exact" w:before="178" w:after="0"/>
+        <w:spacing w:line="352" w:lineRule="exact" w:before="176" w:after="0"/>
         <w:ind w:left="0" w:right="0" w:firstLine="0"/>
         <w:jc w:val="left"/>
       </w:pPr>
@@ -6918,7 +6918,7 @@
       <w:pPr>
         <w:sectPr>
           <w:pgSz w:w="11906" w:h="16838"/>
-          <w:pgMar w:top="680" w:right="1134" w:bottom="824" w:left="1154" w:header="720" w:footer="720" w:gutter="0"/>
+          <w:pgMar w:top="680" w:right="1134" w:bottom="830" w:left="1154" w:header="720" w:footer="720" w:gutter="0"/>
           <w:cols/>
           <w:docGrid w:linePitch="360"/>
         </w:sectPr>

</xml_diff>

<commit_message>
Update Figure 1 to pure KDE density curves and update description text
</commit_message>
<xml_diff>
--- a/assessment_report.docx
+++ b/assessment_report.docx
@@ -5818,17 +5818,17 @@
           <w:color w:val="333333"/>
           <w:sz w:val="22"/>
         </w:rPr>
-        <w:t xml:space="preserve">The distributions of numerical features were examined using histograms with KDE overlays to </w:t>
-      </w:r>
-      <w:r>
-        <w:rPr>
-          <w:rFonts w:ascii="Helvetica" w:hAnsi="Helvetica" w:eastAsia="Helvetica"/>
-          <w:b w:val="0"/>
-          <w:i w:val="0"/>
-          <w:color w:val="333333"/>
-          <w:sz w:val="22"/>
-        </w:rPr>
-        <w:t>identify skewness, outliers, and general trends (see Figure 1).</w:t>
+        <w:t xml:space="preserve">The distributions of numerical features were examined using Kernel Density Estimate (KDE) plot </w:t>
+      </w:r>
+      <w:r>
+        <w:rPr>
+          <w:rFonts w:ascii="Helvetica" w:hAnsi="Helvetica" w:eastAsia="Helvetica"/>
+          <w:b w:val="0"/>
+          <w:i w:val="0"/>
+          <w:color w:val="333333"/>
+          <w:sz w:val="22"/>
+        </w:rPr>
+        <w:t>curves to identify skewness, outliers, and general trends (see Figure 1).</w:t>
       </w:r>
     </w:p>
     <w:p>
@@ -5862,7 +5862,7 @@
       <w:r>
         <w:drawing>
           <wp:inline xmlns:a="http://schemas.openxmlformats.org/drawingml/2006/main" xmlns:pic="http://schemas.openxmlformats.org/drawingml/2006/picture">
-            <wp:extent cx="6094730" cy="4251959"/>
+            <wp:extent cx="6094730" cy="4249420"/>
             <wp:docPr id="1" name="Picture 1"/>
             <wp:cNvGraphicFramePr>
               <a:graphicFrameLocks noChangeAspect="1"/>
@@ -5883,7 +5883,7 @@
                   <pic:spPr>
                     <a:xfrm>
                       <a:off x="0" y="0"/>
-                      <a:ext cx="6094730" cy="4251959"/>
+                      <a:ext cx="6094730" cy="4249420"/>
                     </a:xfrm>
                     <a:prstGeom prst="rect"/>
                   </pic:spPr>
@@ -6225,7 +6225,7 @@
       <w:pPr>
         <w:sectPr>
           <w:pgSz w:w="11906" w:h="16838"/>
-          <w:pgMar w:top="720" w:right="1074" w:bottom="854" w:left="1124" w:header="720" w:footer="720" w:gutter="0"/>
+          <w:pgMar w:top="720" w:right="1074" w:bottom="856" w:left="1124" w:header="720" w:footer="720" w:gutter="0"/>
           <w:cols/>
           <w:docGrid w:linePitch="360"/>
         </w:sectPr>

</xml_diff>

<commit_message>
Include Figure 2 outliers boxplot grid in report Section 3.2
</commit_message>
<xml_diff>
--- a/assessment_report.docx
+++ b/assessment_report.docx
@@ -5798,7 +5798,7 @@
           <w:color w:val="1F3A52"/>
           <w:sz w:val="24"/>
         </w:rPr>
-        <w:t>3.2 Numerical Feature Distributions</w:t>
+        <w:t>3.2 Numerical Feature Distributions and Outlier Diagnostics</w:t>
       </w:r>
     </w:p>
     <w:p>
@@ -5807,8 +5807,8 @@
         <w:autoSpaceDE w:val="0"/>
         <w:widowControl/>
         <w:spacing w:line="352" w:lineRule="exact" w:before="270" w:after="0"/>
-        <w:ind w:left="30" w:right="0" w:firstLine="0"/>
-        <w:jc w:val="left"/>
+        <w:ind w:left="30" w:right="50" w:firstLine="0"/>
+        <w:jc w:val="both"/>
       </w:pPr>
       <w:r>
         <w:rPr>
@@ -5828,7 +5828,17 @@
           <w:color w:val="333333"/>
           <w:sz w:val="22"/>
         </w:rPr>
-        <w:t>curves to identify skewness, outliers, and general trends (see Figure 1).</w:t>
+        <w:t xml:space="preserve">curves to identify skewness and general trends (see Figure 1). To identify specific outlier points </w:t>
+      </w:r>
+      <w:r>
+        <w:rPr>
+          <w:rFonts w:ascii="Helvetica" w:hAnsi="Helvetica" w:eastAsia="Helvetica"/>
+          <w:b w:val="0"/>
+          <w:i w:val="0"/>
+          <w:color w:val="333333"/>
+          <w:sz w:val="22"/>
+        </w:rPr>
+        <w:t>and statistical boundaries, boxplots were compiled for all numerical attributes (see Figure 2).</w:t>
       </w:r>
     </w:p>
     <w:p>
@@ -5899,380 +5909,14 @@
         <w:autoSpaceDN w:val="0"/>
         <w:autoSpaceDE w:val="0"/>
         <w:widowControl/>
-        <w:spacing w:line="352" w:lineRule="exact" w:before="178" w:after="0"/>
-        <w:ind w:left="30" w:right="80" w:firstLine="0"/>
-        <w:jc w:val="both"/>
-      </w:pPr>
-      <w:r>
-        <w:rPr>
-          <w:rFonts w:ascii="Helvetica" w:hAnsi="Helvetica" w:eastAsia="Helvetica"/>
-          <w:b w:val="0"/>
-          <w:i w:val="0"/>
-          <w:color w:val="333333"/>
-          <w:sz w:val="22"/>
-        </w:rPr>
-        <w:t>Applicant area income (</w:t>
-      </w:r>
-      <w:r>
-        <w:rPr>
-          <w:shd w:val="clear" w:color="auto" w:fill="f4f4f4"/>
-          <w:rFonts w:ascii="Courier" w:hAnsi="Courier" w:eastAsia="Courier"/>
-          <w:b w:val="0"/>
-          <w:i w:val="0"/>
-          <w:color w:val="333333"/>
-          <w:sz w:val="19"/>
-        </w:rPr>
-        <w:t>IncomeLevel</w:t>
-      </w:r>
-      <w:r>
-        <w:rPr>
-          <w:rFonts w:ascii="Helvetica" w:hAnsi="Helvetica" w:eastAsia="Helvetica"/>
-          <w:b w:val="0"/>
-          <w:i w:val="0"/>
-          <w:color w:val="333333"/>
-          <w:sz w:val="22"/>
-        </w:rPr>
-        <w:t xml:space="preserve">) showed a right-skewed distribution, indicating that most </w:t>
-      </w:r>
-      <w:r>
-        <w:rPr>
-          <w:rFonts w:ascii="Helvetica" w:hAnsi="Helvetica" w:eastAsia="Helvetica"/>
-          <w:b w:val="0"/>
-          <w:i w:val="0"/>
-          <w:color w:val="333333"/>
-          <w:sz w:val="22"/>
-        </w:rPr>
-        <w:t xml:space="preserve">property neighborhoods belong to middle-income classes, while a few represent high-income </w:t>
-      </w:r>
-      <w:r>
-        <w:rPr>
-          <w:rFonts w:ascii="Helvetica" w:hAnsi="Helvetica" w:eastAsia="Helvetica"/>
-          <w:b w:val="0"/>
-          <w:i w:val="0"/>
-          <w:color w:val="333333"/>
-          <w:sz w:val="22"/>
-        </w:rPr>
-        <w:t>districts. Average occupancy (</w:t>
-      </w:r>
-      <w:r>
-        <w:rPr>
-          <w:shd w:val="clear" w:color="auto" w:fill="f4f4f4"/>
-          <w:rFonts w:ascii="Courier" w:hAnsi="Courier" w:eastAsia="Courier"/>
-          <w:b w:val="0"/>
-          <w:i w:val="0"/>
-          <w:color w:val="333333"/>
-          <w:sz w:val="19"/>
-        </w:rPr>
-        <w:t>AvgOccupancy</w:t>
-      </w:r>
-      <w:r>
-        <w:rPr>
-          <w:rFonts w:ascii="Helvetica" w:hAnsi="Helvetica" w:eastAsia="Helvetica"/>
-          <w:b w:val="0"/>
-          <w:i w:val="0"/>
-          <w:color w:val="333333"/>
-          <w:sz w:val="22"/>
-        </w:rPr>
-        <w:t>) and rooms per household (</w:t>
-      </w:r>
-      <w:r>
-        <w:rPr>
-          <w:shd w:val="clear" w:color="auto" w:fill="f4f4f4"/>
-          <w:rFonts w:ascii="Courier" w:hAnsi="Courier" w:eastAsia="Courier"/>
-          <w:b w:val="0"/>
-          <w:i w:val="0"/>
-          <w:color w:val="333333"/>
-          <w:sz w:val="19"/>
-        </w:rPr>
-        <w:t>RoomsPerHousehold</w:t>
-      </w:r>
-      <w:r>
-        <w:rPr>
-          <w:rFonts w:ascii="Helvetica" w:hAnsi="Helvetica" w:eastAsia="Helvetica"/>
-          <w:b w:val="0"/>
-          <w:i w:val="0"/>
-          <w:color w:val="333333"/>
-          <w:sz w:val="22"/>
-        </w:rPr>
-        <w:t xml:space="preserve">) </w:t>
-      </w:r>
-      <w:r>
-        <w:rPr>
-          <w:rFonts w:ascii="Helvetica" w:hAnsi="Helvetica" w:eastAsia="Helvetica"/>
-          <w:b w:val="0"/>
-          <w:i w:val="0"/>
-          <w:color w:val="333333"/>
-          <w:sz w:val="22"/>
-        </w:rPr>
-        <w:t xml:space="preserve">exhibited extreme right-skewed distributions with heavy outlier tails (e.g., maximum occupancy </w:t>
-      </w:r>
-      <w:r>
-        <w:rPr>
-          <w:rFonts w:ascii="Helvetica" w:hAnsi="Helvetica" w:eastAsia="Helvetica"/>
-          <w:b w:val="0"/>
-          <w:i w:val="0"/>
-          <w:color w:val="333333"/>
-          <w:sz w:val="22"/>
-        </w:rPr>
-        <w:t>values reaching 1,243 and rooms exceeding 50 per household).</w:t>
-      </w:r>
-    </w:p>
-    <w:p>
-      <w:pPr>
-        <w:autoSpaceDN w:val="0"/>
-        <w:autoSpaceDE w:val="0"/>
-        <w:widowControl/>
-        <w:spacing w:line="352" w:lineRule="exact" w:before="304" w:after="0"/>
-        <w:ind w:left="30" w:right="0" w:firstLine="0"/>
-        <w:jc w:val="left"/>
-      </w:pPr>
-      <w:r>
-        <w:rPr>
-          <w:rFonts w:ascii="Helvetica" w:hAnsi="Helvetica" w:eastAsia="Helvetica"/>
-          <w:b w:val="0"/>
-          <w:i w:val="0"/>
-          <w:color w:val="333333"/>
-          <w:sz w:val="22"/>
-        </w:rPr>
-        <w:t>Geographical coordinates (</w:t>
-      </w:r>
-      <w:r>
-        <w:rPr>
-          <w:shd w:val="clear" w:color="auto" w:fill="f4f4f4"/>
-          <w:rFonts w:ascii="Courier" w:hAnsi="Courier" w:eastAsia="Courier"/>
-          <w:b w:val="0"/>
-          <w:i w:val="0"/>
-          <w:color w:val="333333"/>
-          <w:sz w:val="19"/>
-        </w:rPr>
-        <w:t>Latitude</w:t>
-      </w:r>
-      <w:r>
-        <w:rPr>
-          <w:rFonts w:ascii="Helvetica" w:hAnsi="Helvetica" w:eastAsia="Helvetica"/>
-          <w:b w:val="0"/>
-          <w:i w:val="0"/>
-          <w:color w:val="333333"/>
-          <w:sz w:val="22"/>
-        </w:rPr>
-        <w:t xml:space="preserve"> and </w:t>
-      </w:r>
-      <w:r>
-        <w:rPr>
-          <w:shd w:val="clear" w:color="auto" w:fill="f4f4f4"/>
-          <w:rFonts w:ascii="Courier" w:hAnsi="Courier" w:eastAsia="Courier"/>
-          <w:b w:val="0"/>
-          <w:i w:val="0"/>
-          <w:color w:val="333333"/>
-          <w:sz w:val="19"/>
-        </w:rPr>
-        <w:t>Longitude</w:t>
-      </w:r>
-      <w:r>
-        <w:rPr>
-          <w:rFonts w:ascii="Helvetica" w:hAnsi="Helvetica" w:eastAsia="Helvetica"/>
-          <w:b w:val="0"/>
-          <w:i w:val="0"/>
-          <w:color w:val="333333"/>
-          <w:sz w:val="22"/>
-        </w:rPr>
-        <w:t xml:space="preserve">) displayed multi-modal spatial distributions, </w:t>
-      </w:r>
-      <w:r>
-        <w:rPr>
-          <w:rFonts w:ascii="Helvetica" w:hAnsi="Helvetica" w:eastAsia="Helvetica"/>
-          <w:b w:val="0"/>
-          <w:i w:val="0"/>
-          <w:color w:val="333333"/>
-          <w:sz w:val="22"/>
-        </w:rPr>
-        <w:t xml:space="preserve">representing major population and housing clusters (e.g., coastal and metropolitan hubs). </w:t>
-      </w:r>
-      <w:r>
-        <w:rPr>
-          <w:rFonts w:ascii="Helvetica" w:hAnsi="Helvetica" w:eastAsia="Helvetica"/>
-          <w:b w:val="0"/>
-          <w:i w:val="0"/>
-          <w:color w:val="333333"/>
-          <w:sz w:val="22"/>
-        </w:rPr>
-        <w:t xml:space="preserve">Because of these spatial and skewed patterns, standard linear scaling would be heavily distorted </w:t>
-      </w:r>
-      <w:r>
-        <w:rPr>
-          <w:rFonts w:ascii="Helvetica" w:hAnsi="Helvetica" w:eastAsia="Helvetica"/>
-          <w:b w:val="0"/>
-          <w:i w:val="0"/>
-          <w:color w:val="333333"/>
-          <w:sz w:val="22"/>
-        </w:rPr>
-        <w:t xml:space="preserve">by extreme outliers. This influenced the decision to use robust tree-based ensembles (XGBoost </w:t>
-      </w:r>
-      <w:r>
-        <w:rPr>
-          <w:rFonts w:ascii="Helvetica" w:hAnsi="Helvetica" w:eastAsia="Helvetica"/>
-          <w:b w:val="0"/>
-          <w:i w:val="0"/>
-          <w:color w:val="333333"/>
-          <w:sz w:val="22"/>
-        </w:rPr>
-        <w:t xml:space="preserve">and Random Forest) that are rank-based and invariant to monotonic scale transformations, </w:t>
-      </w:r>
-      <w:r>
-        <w:rPr>
-          <w:rFonts w:ascii="Helvetica" w:hAnsi="Helvetica" w:eastAsia="Helvetica"/>
-          <w:b w:val="0"/>
-          <w:i w:val="0"/>
-          <w:color w:val="333333"/>
-          <w:sz w:val="22"/>
-        </w:rPr>
-        <w:t>making them immune to outlier scaling bias.</w:t>
-      </w:r>
-    </w:p>
-    <w:p>
-      <w:pPr>
-        <w:autoSpaceDN w:val="0"/>
-        <w:autoSpaceDE w:val="0"/>
-        <w:widowControl/>
-        <w:spacing w:line="330" w:lineRule="exact" w:before="984" w:after="0"/>
-        <w:ind w:left="30" w:right="0" w:firstLine="0"/>
-        <w:jc w:val="left"/>
-      </w:pPr>
-      <w:r>
-        <w:rPr>
-          <w:rFonts w:ascii="Helvetica" w:hAnsi="Helvetica" w:eastAsia="Helvetica"/>
-          <w:b/>
-          <w:i w:val="0"/>
-          <w:color w:val="1F3A52"/>
-          <w:sz w:val="24"/>
-        </w:rPr>
-        <w:t>3.3 Categorical and Engineered Feature Analysis</w:t>
-      </w:r>
-    </w:p>
-    <w:p>
-      <w:pPr>
-        <w:autoSpaceDN w:val="0"/>
-        <w:autoSpaceDE w:val="0"/>
-        <w:widowControl/>
-        <w:spacing w:line="352" w:lineRule="exact" w:before="270" w:after="0"/>
-        <w:ind w:left="30" w:right="20" w:firstLine="0"/>
-        <w:jc w:val="both"/>
-      </w:pPr>
-      <w:r>
-        <w:rPr>
-          <w:rFonts w:ascii="Helvetica" w:hAnsi="Helvetica" w:eastAsia="Helvetica"/>
-          <w:b w:val="0"/>
-          <w:i w:val="0"/>
-          <w:color w:val="333333"/>
-          <w:sz w:val="22"/>
-        </w:rPr>
-        <w:t xml:space="preserve">To capture the non-linear depreciation of housing values over time, the numerical feature </w:t>
-      </w:r>
-      <w:r>
-        <w:rPr>
-          <w:shd w:val="clear" w:color="auto" w:fill="f4f4f4"/>
-          <w:rFonts w:ascii="Courier" w:hAnsi="Courier" w:eastAsia="Courier"/>
-          <w:b w:val="0"/>
-          <w:i w:val="0"/>
-          <w:color w:val="333333"/>
-          <w:sz w:val="19"/>
-        </w:rPr>
-        <w:t>PropertyAge</w:t>
-      </w:r>
-      <w:r>
-        <w:rPr>
-          <w:rFonts w:ascii="Helvetica" w:hAnsi="Helvetica" w:eastAsia="Helvetica"/>
-          <w:b w:val="0"/>
-          <w:i w:val="0"/>
-          <w:color w:val="333333"/>
-          <w:sz w:val="22"/>
-        </w:rPr>
-        <w:t xml:space="preserve"> was engineered into a categorical feature (</w:t>
-      </w:r>
-      <w:r>
-        <w:rPr>
-          <w:shd w:val="clear" w:color="auto" w:fill="f4f4f4"/>
-          <w:rFonts w:ascii="Courier" w:hAnsi="Courier" w:eastAsia="Courier"/>
-          <w:b w:val="0"/>
-          <w:i w:val="0"/>
-          <w:color w:val="333333"/>
-          <w:sz w:val="19"/>
-        </w:rPr>
-        <w:t>PropertyAge_bins</w:t>
-      </w:r>
-      <w:r>
-        <w:rPr>
-          <w:rFonts w:ascii="Helvetica" w:hAnsi="Helvetica" w:eastAsia="Helvetica"/>
-          <w:b w:val="0"/>
-          <w:i w:val="0"/>
-          <w:color w:val="333333"/>
-          <w:sz w:val="22"/>
-        </w:rPr>
-        <w:t xml:space="preserve">) using structural age </w:t>
-      </w:r>
-      <w:r>
-        <w:rPr>
-          <w:rFonts w:ascii="Helvetica" w:hAnsi="Helvetica" w:eastAsia="Helvetica"/>
-          <w:b w:val="0"/>
-          <w:i w:val="0"/>
-          <w:color w:val="333333"/>
-          <w:sz w:val="22"/>
-        </w:rPr>
-        <w:t>brackets: 'New' ($\le 15$ years), 'Moderate' ($16-35$ years), and 'Old' ($&gt;35$ years) (see Figure</w:t>
-      </w:r>
-    </w:p>
-    <w:p>
-      <w:pPr>
-        <w:sectPr>
-          <w:pgSz w:w="11906" w:h="16838"/>
-          <w:pgMar w:top="720" w:right="1074" w:bottom="856" w:left="1124" w:header="720" w:footer="720" w:gutter="0"/>
-          <w:cols/>
-          <w:docGrid w:linePitch="360"/>
-        </w:sectPr>
-      </w:pPr>
-    </w:p>
-    <w:p>
-      <w:pPr>
-        <w:autoSpaceDN w:val="0"/>
-        <w:autoSpaceDE w:val="0"/>
-        <w:widowControl/>
-        <w:spacing w:line="220" w:lineRule="exact" w:before="0" w:after="458"/>
-        <w:ind w:left="0" w:right="0"/>
-      </w:pPr>
-    </w:p>
-    <w:p>
-      <w:pPr>
-        <w:autoSpaceDN w:val="0"/>
-        <w:autoSpaceDE w:val="0"/>
-        <w:widowControl/>
-        <w:spacing w:line="304" w:lineRule="exact" w:before="0" w:after="0"/>
-        <w:ind w:left="30" w:right="0" w:firstLine="0"/>
-        <w:jc w:val="left"/>
-      </w:pPr>
-      <w:r>
-        <w:rPr>
-          <w:rFonts w:ascii="Helvetica" w:hAnsi="Helvetica" w:eastAsia="Helvetica"/>
-          <w:b w:val="0"/>
-          <w:i w:val="0"/>
-          <w:color w:val="333333"/>
-          <w:sz w:val="22"/>
-        </w:rPr>
-        <w:t>2).</w:t>
-      </w:r>
-    </w:p>
-    <w:p>
-      <w:pPr>
-        <w:autoSpaceDN w:val="0"/>
-        <w:autoSpaceDE w:val="0"/>
-        <w:widowControl/>
-        <w:spacing w:line="240" w:lineRule="auto" w:before="432" w:after="0"/>
+        <w:spacing w:line="240" w:lineRule="auto" w:before="306" w:after="0"/>
         <w:ind w:left="0" w:right="0" w:firstLine="0"/>
         <w:jc w:val="center"/>
       </w:pPr>
       <w:r>
         <w:drawing>
           <wp:inline xmlns:a="http://schemas.openxmlformats.org/drawingml/2006/main" xmlns:pic="http://schemas.openxmlformats.org/drawingml/2006/picture">
-            <wp:extent cx="6094730" cy="4547870"/>
+            <wp:extent cx="6094730" cy="4243070"/>
             <wp:docPr id="2" name="Picture 2"/>
             <wp:cNvGraphicFramePr>
               <a:graphicFrameLocks noChangeAspect="1"/>
@@ -6293,7 +5937,7 @@
                   <pic:spPr>
                     <a:xfrm>
                       <a:off x="0" y="0"/>
-                      <a:ext cx="6094730" cy="4547870"/>
+                      <a:ext cx="6094730" cy="4243070"/>
                     </a:xfrm>
                     <a:prstGeom prst="rect"/>
                   </pic:spPr>
@@ -6306,269 +5950,9 @@
     </w:p>
     <w:p>
       <w:pPr>
-        <w:autoSpaceDN w:val="0"/>
-        <w:autoSpaceDE w:val="0"/>
-        <w:widowControl/>
-        <w:spacing w:line="352" w:lineRule="exact" w:before="176" w:after="0"/>
-        <w:ind w:left="30" w:right="50" w:firstLine="0"/>
-        <w:jc w:val="both"/>
-      </w:pPr>
-      <w:r>
-        <w:rPr>
-          <w:rFonts w:ascii="Helvetica" w:hAnsi="Helvetica" w:eastAsia="Helvetica"/>
-          <w:b w:val="0"/>
-          <w:i w:val="0"/>
-          <w:color w:val="333333"/>
-          <w:sz w:val="22"/>
-        </w:rPr>
-        <w:t xml:space="preserve">To mathematically prove that these binned age groups represent statistically distinct house prices, </w:t>
-      </w:r>
-      <w:r>
-        <w:rPr>
-          <w:rFonts w:ascii="Helvetica" w:hAnsi="Helvetica" w:eastAsia="Helvetica"/>
-          <w:b w:val="0"/>
-          <w:i w:val="0"/>
-          <w:color w:val="333333"/>
-          <w:sz w:val="22"/>
-        </w:rPr>
-        <w:t xml:space="preserve">we conducted formal hypothesis testing: * </w:t>
-      </w:r>
-      <w:r>
-        <w:rPr>
-          <w:rFonts w:ascii="Helvetica" w:hAnsi="Helvetica" w:eastAsia="Helvetica"/>
-          <w:b/>
-          <w:i w:val="0"/>
-          <w:color w:val="333333"/>
-          <w:sz w:val="22"/>
-        </w:rPr>
-        <w:t>ANOVA F-Test:</w:t>
-      </w:r>
-      <w:r>
-        <w:rPr>
-          <w:rFonts w:ascii="Helvetica" w:hAnsi="Helvetica" w:eastAsia="Helvetica"/>
-          <w:b w:val="0"/>
-          <w:i w:val="0"/>
-          <w:color w:val="333333"/>
-          <w:sz w:val="22"/>
-        </w:rPr>
-        <w:t xml:space="preserve"> A one-way Analysis of Variance </w:t>
-      </w:r>
-      <w:r>
-        <w:rPr>
-          <w:rFonts w:ascii="Helvetica" w:hAnsi="Helvetica" w:eastAsia="Helvetica"/>
-          <w:b w:val="0"/>
-          <w:i w:val="0"/>
-          <w:color w:val="333333"/>
-          <w:sz w:val="22"/>
-        </w:rPr>
-        <w:t xml:space="preserve">(ANOVA) test across the three age categories resulted in a highly significant </w:t>
-      </w:r>
-      <w:r>
-        <w:rPr>
-          <w:rFonts w:ascii="Helvetica" w:hAnsi="Helvetica" w:eastAsia="Helvetica"/>
-          <w:b/>
-          <w:i w:val="0"/>
-          <w:color w:val="333333"/>
-          <w:sz w:val="22"/>
-        </w:rPr>
-        <w:t xml:space="preserve">F-statistic of 113.82 </w:t>
-      </w:r>
-      <w:r>
-        <w:rPr>
-          <w:rFonts w:ascii="Helvetica" w:hAnsi="Helvetica" w:eastAsia="Helvetica"/>
-          <w:b w:val="0"/>
-          <w:i w:val="0"/>
-          <w:color w:val="333333"/>
-          <w:sz w:val="22"/>
-        </w:rPr>
-        <w:t xml:space="preserve">and a </w:t>
-      </w:r>
-      <w:r>
-        <w:rPr>
-          <w:rFonts w:ascii="Helvetica" w:hAnsi="Helvetica" w:eastAsia="Helvetica"/>
-          <w:b/>
-          <w:i w:val="0"/>
-          <w:color w:val="333333"/>
-          <w:sz w:val="22"/>
-        </w:rPr>
-        <w:t>p-value of 0.0000</w:t>
-      </w:r>
-      <w:r>
-        <w:rPr>
-          <w:rFonts w:ascii="Helvetica" w:hAnsi="Helvetica" w:eastAsia="Helvetica"/>
-          <w:b w:val="0"/>
-          <w:i w:val="0"/>
-          <w:color w:val="333333"/>
-          <w:sz w:val="22"/>
-        </w:rPr>
-        <w:t xml:space="preserve"> ($p &lt; 0.05$). This statistically confirms that the mean housing prices </w:t>
-      </w:r>
-      <w:r>
-        <w:rPr>
-          <w:rFonts w:ascii="Helvetica" w:hAnsi="Helvetica" w:eastAsia="Helvetica"/>
-          <w:b w:val="0"/>
-          <w:i w:val="0"/>
-          <w:color w:val="333333"/>
-          <w:sz w:val="22"/>
-        </w:rPr>
-        <w:t xml:space="preserve">among 'New', 'Moderate', and 'Old' properties are significantly different. * </w:t>
-      </w:r>
-      <w:r>
-        <w:rPr>
-          <w:rFonts w:ascii="Helvetica" w:hAnsi="Helvetica" w:eastAsia="Helvetica"/>
-          <w:b/>
-          <w:i w:val="0"/>
-          <w:color w:val="333333"/>
-          <w:sz w:val="22"/>
-        </w:rPr>
-        <w:t>Student's T-Test:</w:t>
-      </w:r>
-      <w:r>
-        <w:rPr>
-          <w:rFonts w:ascii="Helvetica" w:hAnsi="Helvetica" w:eastAsia="Helvetica"/>
-          <w:b w:val="0"/>
-          <w:i w:val="0"/>
-          <w:color w:val="333333"/>
-          <w:sz w:val="22"/>
-        </w:rPr>
-        <w:t xml:space="preserve"> An </w:t>
-      </w:r>
-      <w:r>
-        <w:rPr>
-          <w:rFonts w:ascii="Helvetica" w:hAnsi="Helvetica" w:eastAsia="Helvetica"/>
-          <w:b w:val="0"/>
-          <w:i w:val="0"/>
-          <w:color w:val="333333"/>
-          <w:sz w:val="22"/>
-        </w:rPr>
-        <w:t xml:space="preserve">independent two-sample t-test between the 'New' and 'Old' property subsets yielded a </w:t>
-      </w:r>
-      <w:r>
-        <w:rPr>
-          <w:rFonts w:ascii="Helvetica" w:hAnsi="Helvetica" w:eastAsia="Helvetica"/>
-          <w:b/>
-          <w:i w:val="0"/>
-          <w:color w:val="333333"/>
-          <w:sz w:val="22"/>
-        </w:rPr>
-        <w:t xml:space="preserve">t-statistic </w:t>
-      </w:r>
-      <w:r>
-        <w:rPr>
-          <w:rFonts w:ascii="Helvetica" w:hAnsi="Helvetica" w:eastAsia="Helvetica"/>
-          <w:b/>
-          <w:i w:val="0"/>
-          <w:color w:val="333333"/>
-          <w:sz w:val="22"/>
-        </w:rPr>
-        <w:t>of 14.85</w:t>
-      </w:r>
-      <w:r>
-        <w:rPr>
-          <w:rFonts w:ascii="Helvetica" w:hAnsi="Helvetica" w:eastAsia="Helvetica"/>
-          <w:b w:val="0"/>
-          <w:i w:val="0"/>
-          <w:color w:val="333333"/>
-          <w:sz w:val="22"/>
-        </w:rPr>
-        <w:t xml:space="preserve"> and a </w:t>
-      </w:r>
-      <w:r>
-        <w:rPr>
-          <w:rFonts w:ascii="Helvetica" w:hAnsi="Helvetica" w:eastAsia="Helvetica"/>
-          <w:b/>
-          <w:i w:val="0"/>
-          <w:color w:val="333333"/>
-          <w:sz w:val="22"/>
-        </w:rPr>
-        <w:t>p-value of 0.0000</w:t>
-      </w:r>
-      <w:r>
-        <w:rPr>
-          <w:rFonts w:ascii="Helvetica" w:hAnsi="Helvetica" w:eastAsia="Helvetica"/>
-          <w:b w:val="0"/>
-          <w:i w:val="0"/>
-          <w:color w:val="333333"/>
-          <w:sz w:val="22"/>
-        </w:rPr>
-        <w:t xml:space="preserve">, confirming that new properties command a statistically higher </w:t>
-      </w:r>
-      <w:r>
-        <w:rPr>
-          <w:rFonts w:ascii="Helvetica" w:hAnsi="Helvetica" w:eastAsia="Helvetica"/>
-          <w:b w:val="0"/>
-          <w:i w:val="0"/>
-          <w:color w:val="333333"/>
-          <w:sz w:val="22"/>
-        </w:rPr>
-        <w:t>price profile.</w:t>
-      </w:r>
-    </w:p>
-    <w:p>
-      <w:pPr>
-        <w:autoSpaceDN w:val="0"/>
-        <w:autoSpaceDE w:val="0"/>
-        <w:widowControl/>
-        <w:spacing w:line="352" w:lineRule="exact" w:before="304" w:after="0"/>
-        <w:ind w:left="30" w:right="50" w:firstLine="0"/>
-        <w:jc w:val="both"/>
-      </w:pPr>
-      <w:r>
-        <w:rPr>
-          <w:rFonts w:ascii="Helvetica" w:hAnsi="Helvetica" w:eastAsia="Helvetica"/>
-          <w:b w:val="0"/>
-          <w:i w:val="0"/>
-          <w:color w:val="333333"/>
-          <w:sz w:val="22"/>
-        </w:rPr>
-        <w:t xml:space="preserve">This statistical validation justified our encoding strategy (Ordinal Encoding) in the preprocessing </w:t>
-      </w:r>
-      <w:r>
-        <w:rPr>
-          <w:rFonts w:ascii="Helvetica" w:hAnsi="Helvetica" w:eastAsia="Helvetica"/>
-          <w:b w:val="0"/>
-          <w:i w:val="0"/>
-          <w:color w:val="333333"/>
-          <w:sz w:val="22"/>
-        </w:rPr>
-        <w:t xml:space="preserve">pipeline, allowing tree splits in XGBoost and Random Forest to branch on clean structural age </w:t>
-      </w:r>
-      <w:r>
-        <w:rPr>
-          <w:rFonts w:ascii="Helvetica" w:hAnsi="Helvetica" w:eastAsia="Helvetica"/>
-          <w:b w:val="0"/>
-          <w:i w:val="0"/>
-          <w:color w:val="333333"/>
-          <w:sz w:val="22"/>
-        </w:rPr>
-        <w:t>thresholds.</w:t>
-      </w:r>
-    </w:p>
-    <w:p>
-      <w:pPr>
-        <w:autoSpaceDN w:val="0"/>
-        <w:autoSpaceDE w:val="0"/>
-        <w:widowControl/>
-        <w:spacing w:line="330" w:lineRule="exact" w:before="984" w:after="0"/>
-        <w:ind w:left="30" w:right="0" w:firstLine="0"/>
-        <w:jc w:val="left"/>
-      </w:pPr>
-      <w:r>
-        <w:rPr>
-          <w:rFonts w:ascii="Helvetica" w:hAnsi="Helvetica" w:eastAsia="Helvetica"/>
-          <w:b/>
-          <w:i w:val="0"/>
-          <w:color w:val="1F3A52"/>
-          <w:sz w:val="24"/>
-        </w:rPr>
-        <w:t>3.4 Correlation Analysis</w:t>
-      </w:r>
-    </w:p>
-    <w:p>
-      <w:pPr>
         <w:sectPr>
           <w:pgSz w:w="11906" w:h="16838"/>
-          <w:pgMar w:top="680" w:right="1104" w:bottom="958" w:left="1124" w:header="720" w:footer="720" w:gutter="0"/>
+          <w:pgMar w:top="720" w:right="1134" w:bottom="860" w:left="1154" w:header="720" w:footer="720" w:gutter="0"/>
           <w:cols/>
           <w:docGrid w:linePitch="360"/>
         </w:sectPr>
@@ -6588,9 +5972,9 @@
         <w:autoSpaceDN w:val="0"/>
         <w:autoSpaceDE w:val="0"/>
         <w:widowControl/>
-        <w:spacing w:line="328" w:lineRule="exact" w:before="0" w:after="0"/>
-        <w:ind w:left="0" w:right="0" w:firstLine="0"/>
-        <w:jc w:val="left"/>
+        <w:spacing w:line="344" w:lineRule="exact" w:before="0" w:after="0"/>
+        <w:ind w:left="30" w:right="50" w:firstLine="0"/>
+        <w:jc w:val="both"/>
       </w:pPr>
       <w:r>
         <w:rPr>
@@ -6600,17 +5984,120 @@
           <w:color w:val="333333"/>
           <w:sz w:val="22"/>
         </w:rPr>
-        <w:t xml:space="preserve">A correlation heatmap was created to look at linear relationships between numerical features and </w:t>
-      </w:r>
-      <w:r>
-        <w:rPr>
-          <w:rFonts w:ascii="Helvetica" w:hAnsi="Helvetica" w:eastAsia="Helvetica"/>
-          <w:b w:val="0"/>
-          <w:i w:val="0"/>
-          <w:color w:val="333333"/>
-          <w:sz w:val="22"/>
-        </w:rPr>
-        <w:t>the target variable (see Figure 3).</w:t>
+        <w:t>Applicant area income (</w:t>
+      </w:r>
+      <w:r>
+        <w:rPr>
+          <w:shd w:val="clear" w:color="auto" w:fill="f4f4f4"/>
+          <w:rFonts w:ascii="Courier" w:hAnsi="Courier" w:eastAsia="Courier"/>
+          <w:b w:val="0"/>
+          <w:i w:val="0"/>
+          <w:color w:val="333333"/>
+          <w:sz w:val="19"/>
+        </w:rPr>
+        <w:t>IncomeLevel</w:t>
+      </w:r>
+      <w:r>
+        <w:rPr>
+          <w:rFonts w:ascii="Helvetica" w:hAnsi="Helvetica" w:eastAsia="Helvetica"/>
+          <w:b w:val="0"/>
+          <w:i w:val="0"/>
+          <w:color w:val="333333"/>
+          <w:sz w:val="22"/>
+        </w:rPr>
+        <w:t xml:space="preserve">) showed a right-skewed distribution, indicating that most </w:t>
+      </w:r>
+      <w:r>
+        <w:rPr>
+          <w:rFonts w:ascii="Helvetica" w:hAnsi="Helvetica" w:eastAsia="Helvetica"/>
+          <w:b w:val="0"/>
+          <w:i w:val="0"/>
+          <w:color w:val="333333"/>
+          <w:sz w:val="22"/>
+        </w:rPr>
+        <w:t xml:space="preserve">property neighborhoods belong to middle-income classes, while a few represent high-income </w:t>
+      </w:r>
+      <w:r>
+        <w:rPr>
+          <w:rFonts w:ascii="Helvetica" w:hAnsi="Helvetica" w:eastAsia="Helvetica"/>
+          <w:b w:val="0"/>
+          <w:i w:val="0"/>
+          <w:color w:val="333333"/>
+          <w:sz w:val="22"/>
+        </w:rPr>
+        <w:t>districts. As illustrated in the boxplots (Figure 2), average occupancy (</w:t>
+      </w:r>
+      <w:r>
+        <w:rPr>
+          <w:shd w:val="clear" w:color="auto" w:fill="f4f4f4"/>
+          <w:rFonts w:ascii="Courier" w:hAnsi="Courier" w:eastAsia="Courier"/>
+          <w:b w:val="0"/>
+          <w:i w:val="0"/>
+          <w:color w:val="333333"/>
+          <w:sz w:val="19"/>
+        </w:rPr>
+        <w:t>AvgOccupancy</w:t>
+      </w:r>
+      <w:r>
+        <w:rPr>
+          <w:rFonts w:ascii="Helvetica" w:hAnsi="Helvetica" w:eastAsia="Helvetica"/>
+          <w:b w:val="0"/>
+          <w:i w:val="0"/>
+          <w:color w:val="333333"/>
+          <w:sz w:val="22"/>
+        </w:rPr>
+        <w:t xml:space="preserve">) and rooms </w:t>
+      </w:r>
+      <w:r>
+        <w:rPr>
+          <w:rFonts w:ascii="Helvetica" w:hAnsi="Helvetica" w:eastAsia="Helvetica"/>
+          <w:b w:val="0"/>
+          <w:i w:val="0"/>
+          <w:color w:val="333333"/>
+          <w:sz w:val="22"/>
+        </w:rPr>
+        <w:t>per household (</w:t>
+      </w:r>
+      <w:r>
+        <w:rPr>
+          <w:shd w:val="clear" w:color="auto" w:fill="f4f4f4"/>
+          <w:rFonts w:ascii="Courier" w:hAnsi="Courier" w:eastAsia="Courier"/>
+          <w:b w:val="0"/>
+          <w:i w:val="0"/>
+          <w:color w:val="333333"/>
+          <w:sz w:val="19"/>
+        </w:rPr>
+        <w:t>RoomsPerHousehold</w:t>
+      </w:r>
+      <w:r>
+        <w:rPr>
+          <w:rFonts w:ascii="Helvetica" w:hAnsi="Helvetica" w:eastAsia="Helvetica"/>
+          <w:b w:val="0"/>
+          <w:i w:val="0"/>
+          <w:color w:val="333333"/>
+          <w:sz w:val="22"/>
+        </w:rPr>
+        <w:t xml:space="preserve">) exhibit extreme right-skewed distributions with heavy outlier </w:t>
+      </w:r>
+      <w:r>
+        <w:rPr>
+          <w:rFonts w:ascii="Helvetica" w:hAnsi="Helvetica" w:eastAsia="Helvetica"/>
+          <w:b w:val="0"/>
+          <w:i w:val="0"/>
+          <w:color w:val="333333"/>
+          <w:sz w:val="22"/>
+        </w:rPr>
+        <w:t xml:space="preserve">tails, including extreme single-value spikes (e.g., maximum occupancy values reaching 1,243 and </w:t>
+      </w:r>
+      <w:r>
+        <w:rPr>
+          <w:rFonts w:ascii="Helvetica" w:hAnsi="Helvetica" w:eastAsia="Helvetica"/>
+          <w:b w:val="0"/>
+          <w:i w:val="0"/>
+          <w:color w:val="333333"/>
+          <w:sz w:val="22"/>
+        </w:rPr>
+        <w:t>rooms exceeding 50 per household).</w:t>
       </w:r>
     </w:p>
     <w:p>
@@ -6618,14 +6105,247 @@
         <w:autoSpaceDN w:val="0"/>
         <w:autoSpaceDE w:val="0"/>
         <w:widowControl/>
-        <w:spacing w:line="240" w:lineRule="auto" w:before="432" w:after="0"/>
+        <w:spacing w:line="352" w:lineRule="exact" w:before="304" w:after="0"/>
+        <w:ind w:left="30" w:right="0" w:firstLine="0"/>
+        <w:jc w:val="left"/>
+      </w:pPr>
+      <w:r>
+        <w:rPr>
+          <w:rFonts w:ascii="Helvetica" w:hAnsi="Helvetica" w:eastAsia="Helvetica"/>
+          <w:b w:val="0"/>
+          <w:i w:val="0"/>
+          <w:color w:val="333333"/>
+          <w:sz w:val="22"/>
+        </w:rPr>
+        <w:t>Geographical coordinates (</w:t>
+      </w:r>
+      <w:r>
+        <w:rPr>
+          <w:shd w:val="clear" w:color="auto" w:fill="f4f4f4"/>
+          <w:rFonts w:ascii="Courier" w:hAnsi="Courier" w:eastAsia="Courier"/>
+          <w:b w:val="0"/>
+          <w:i w:val="0"/>
+          <w:color w:val="333333"/>
+          <w:sz w:val="19"/>
+        </w:rPr>
+        <w:t>Latitude</w:t>
+      </w:r>
+      <w:r>
+        <w:rPr>
+          <w:rFonts w:ascii="Helvetica" w:hAnsi="Helvetica" w:eastAsia="Helvetica"/>
+          <w:b w:val="0"/>
+          <w:i w:val="0"/>
+          <w:color w:val="333333"/>
+          <w:sz w:val="22"/>
+        </w:rPr>
+        <w:t xml:space="preserve"> and </w:t>
+      </w:r>
+      <w:r>
+        <w:rPr>
+          <w:shd w:val="clear" w:color="auto" w:fill="f4f4f4"/>
+          <w:rFonts w:ascii="Courier" w:hAnsi="Courier" w:eastAsia="Courier"/>
+          <w:b w:val="0"/>
+          <w:i w:val="0"/>
+          <w:color w:val="333333"/>
+          <w:sz w:val="19"/>
+        </w:rPr>
+        <w:t>Longitude</w:t>
+      </w:r>
+      <w:r>
+        <w:rPr>
+          <w:rFonts w:ascii="Helvetica" w:hAnsi="Helvetica" w:eastAsia="Helvetica"/>
+          <w:b w:val="0"/>
+          <w:i w:val="0"/>
+          <w:color w:val="333333"/>
+          <w:sz w:val="22"/>
+        </w:rPr>
+        <w:t xml:space="preserve">) displayed multi-modal spatial distributions, </w:t>
+      </w:r>
+      <w:r>
+        <w:rPr>
+          <w:rFonts w:ascii="Helvetica" w:hAnsi="Helvetica" w:eastAsia="Helvetica"/>
+          <w:b w:val="0"/>
+          <w:i w:val="0"/>
+          <w:color w:val="333333"/>
+          <w:sz w:val="22"/>
+        </w:rPr>
+        <w:t xml:space="preserve">representing major population and housing clusters (e.g., coastal and metropolitan hubs) with no </w:t>
+      </w:r>
+      <w:r>
+        <w:rPr>
+          <w:rFonts w:ascii="Helvetica" w:hAnsi="Helvetica" w:eastAsia="Helvetica"/>
+          <w:b w:val="0"/>
+          <w:i w:val="0"/>
+          <w:color w:val="333333"/>
+          <w:sz w:val="22"/>
+        </w:rPr>
+        <w:t xml:space="preserve">outlier points. Because of these spatial and skewed patterns, standard linear scaling would be </w:t>
+      </w:r>
+      <w:r>
+        <w:rPr>
+          <w:rFonts w:ascii="Helvetica" w:hAnsi="Helvetica" w:eastAsia="Helvetica"/>
+          <w:b w:val="0"/>
+          <w:i w:val="0"/>
+          <w:color w:val="333333"/>
+          <w:sz w:val="22"/>
+        </w:rPr>
+        <w:t xml:space="preserve">heavily distorted by extreme outliers. This influenced the decision to use robust tree-based </w:t>
+      </w:r>
+      <w:r>
+        <w:rPr>
+          <w:rFonts w:ascii="Helvetica" w:hAnsi="Helvetica" w:eastAsia="Helvetica"/>
+          <w:b w:val="0"/>
+          <w:i w:val="0"/>
+          <w:color w:val="333333"/>
+          <w:sz w:val="22"/>
+        </w:rPr>
+        <w:t xml:space="preserve">ensembles (XGBoost and Random Forest) that are rank-based and invariant to monotonic scale </w:t>
+      </w:r>
+      <w:r>
+        <w:rPr>
+          <w:rFonts w:ascii="Helvetica" w:hAnsi="Helvetica" w:eastAsia="Helvetica"/>
+          <w:b w:val="0"/>
+          <w:i w:val="0"/>
+          <w:color w:val="333333"/>
+          <w:sz w:val="22"/>
+        </w:rPr>
+        <w:t>transformations, making them immune to outlier scaling bias.</w:t>
+      </w:r>
+    </w:p>
+    <w:p>
+      <w:pPr>
+        <w:autoSpaceDN w:val="0"/>
+        <w:autoSpaceDE w:val="0"/>
+        <w:widowControl/>
+        <w:spacing w:line="332" w:lineRule="exact" w:before="982" w:after="0"/>
+        <w:ind w:left="30" w:right="0" w:firstLine="0"/>
+        <w:jc w:val="left"/>
+      </w:pPr>
+      <w:r>
+        <w:rPr>
+          <w:rFonts w:ascii="Helvetica" w:hAnsi="Helvetica" w:eastAsia="Helvetica"/>
+          <w:b/>
+          <w:i w:val="0"/>
+          <w:color w:val="1F3A52"/>
+          <w:sz w:val="24"/>
+        </w:rPr>
+        <w:t>3.3 Categorical and Engineered Feature Analysis</w:t>
+      </w:r>
+    </w:p>
+    <w:p>
+      <w:pPr>
+        <w:autoSpaceDN w:val="0"/>
+        <w:autoSpaceDE w:val="0"/>
+        <w:widowControl/>
+        <w:spacing w:line="352" w:lineRule="exact" w:before="270" w:after="0"/>
+        <w:ind w:left="30" w:right="50" w:firstLine="0"/>
+        <w:jc w:val="both"/>
+      </w:pPr>
+      <w:r>
+        <w:rPr>
+          <w:rFonts w:ascii="Helvetica" w:hAnsi="Helvetica" w:eastAsia="Helvetica"/>
+          <w:b w:val="0"/>
+          <w:i w:val="0"/>
+          <w:color w:val="333333"/>
+          <w:sz w:val="22"/>
+        </w:rPr>
+        <w:t xml:space="preserve">To capture the non-linear depreciation of housing values over time, the numerical feature </w:t>
+      </w:r>
+      <w:r>
+        <w:rPr>
+          <w:shd w:val="clear" w:color="auto" w:fill="f4f4f4"/>
+          <w:rFonts w:ascii="Courier" w:hAnsi="Courier" w:eastAsia="Courier"/>
+          <w:b w:val="0"/>
+          <w:i w:val="0"/>
+          <w:color w:val="333333"/>
+          <w:sz w:val="19"/>
+        </w:rPr>
+        <w:t>PropertyAge</w:t>
+      </w:r>
+      <w:r>
+        <w:rPr>
+          <w:rFonts w:ascii="Helvetica" w:hAnsi="Helvetica" w:eastAsia="Helvetica"/>
+          <w:b w:val="0"/>
+          <w:i w:val="0"/>
+          <w:color w:val="333333"/>
+          <w:sz w:val="22"/>
+        </w:rPr>
+        <w:t xml:space="preserve"> was engineered into a categorical feature (</w:t>
+      </w:r>
+      <w:r>
+        <w:rPr>
+          <w:shd w:val="clear" w:color="auto" w:fill="f4f4f4"/>
+          <w:rFonts w:ascii="Courier" w:hAnsi="Courier" w:eastAsia="Courier"/>
+          <w:b w:val="0"/>
+          <w:i w:val="0"/>
+          <w:color w:val="333333"/>
+          <w:sz w:val="19"/>
+        </w:rPr>
+        <w:t>PropertyAge_bins</w:t>
+      </w:r>
+      <w:r>
+        <w:rPr>
+          <w:rFonts w:ascii="Helvetica" w:hAnsi="Helvetica" w:eastAsia="Helvetica"/>
+          <w:b w:val="0"/>
+          <w:i w:val="0"/>
+          <w:color w:val="333333"/>
+          <w:sz w:val="22"/>
+        </w:rPr>
+        <w:t xml:space="preserve">) using structural age </w:t>
+      </w:r>
+      <w:r>
+        <w:rPr>
+          <w:rFonts w:ascii="Helvetica" w:hAnsi="Helvetica" w:eastAsia="Helvetica"/>
+          <w:b w:val="0"/>
+          <w:i w:val="0"/>
+          <w:color w:val="333333"/>
+          <w:sz w:val="22"/>
+        </w:rPr>
+        <w:t xml:space="preserve">brackets: 'New' ($\le 15$ years), 'Moderate' ($16-35$ years), and 'Old' ($&gt;35$ years) (see Figure </w:t>
+      </w:r>
+      <w:r>
+        <w:rPr>
+          <w:rFonts w:ascii="Helvetica" w:hAnsi="Helvetica" w:eastAsia="Helvetica"/>
+          <w:b w:val="0"/>
+          <w:i w:val="0"/>
+          <w:color w:val="333333"/>
+          <w:sz w:val="22"/>
+        </w:rPr>
+        <w:t>3).</w:t>
+      </w:r>
+    </w:p>
+    <w:p>
+      <w:pPr>
+        <w:sectPr>
+          <w:pgSz w:w="11906" w:h="16838"/>
+          <w:pgMar w:top="680" w:right="1104" w:bottom="1440" w:left="1124" w:header="720" w:footer="720" w:gutter="0"/>
+          <w:cols/>
+          <w:docGrid w:linePitch="360"/>
+        </w:sectPr>
+      </w:pPr>
+    </w:p>
+    <w:p>
+      <w:pPr>
+        <w:autoSpaceDN w:val="0"/>
+        <w:autoSpaceDE w:val="0"/>
+        <w:widowControl/>
+        <w:spacing w:line="220" w:lineRule="exact" w:before="0" w:after="498"/>
+        <w:ind w:left="0" w:right="0"/>
+      </w:pPr>
+    </w:p>
+    <w:p>
+      <w:pPr>
+        <w:autoSpaceDN w:val="0"/>
+        <w:autoSpaceDE w:val="0"/>
+        <w:widowControl/>
+        <w:spacing w:line="240" w:lineRule="auto" w:before="0" w:after="0"/>
         <w:ind w:left="0" w:right="0" w:firstLine="0"/>
         <w:jc w:val="center"/>
       </w:pPr>
       <w:r>
         <w:drawing>
           <wp:inline xmlns:a="http://schemas.openxmlformats.org/drawingml/2006/main" xmlns:pic="http://schemas.openxmlformats.org/drawingml/2006/picture">
-            <wp:extent cx="6094730" cy="5544820"/>
+            <wp:extent cx="6094730" cy="4547870"/>
             <wp:docPr id="3" name="Picture 3"/>
             <wp:cNvGraphicFramePr>
               <a:graphicFrameLocks noChangeAspect="1"/>
@@ -6646,7 +6366,7 @@
                   <pic:spPr>
                     <a:xfrm>
                       <a:off x="0" y="0"/>
-                      <a:ext cx="6094730" cy="5544820"/>
+                      <a:ext cx="6094730" cy="4547870"/>
                     </a:xfrm>
                     <a:prstGeom prst="rect"/>
                   </pic:spPr>
@@ -6663,8 +6383,8 @@
         <w:autoSpaceDE w:val="0"/>
         <w:widowControl/>
         <w:spacing w:line="352" w:lineRule="exact" w:before="176" w:after="0"/>
-        <w:ind w:left="0" w:right="0" w:firstLine="0"/>
-        <w:jc w:val="left"/>
+        <w:ind w:left="30" w:right="50" w:firstLine="0"/>
+        <w:jc w:val="both"/>
       </w:pPr>
       <w:r>
         <w:rPr>
@@ -6674,110 +6394,187 @@
           <w:color w:val="333333"/>
           <w:sz w:val="22"/>
         </w:rPr>
-        <w:t xml:space="preserve">A strong positive correlation was found between </w:t>
-      </w:r>
-      <w:r>
-        <w:rPr>
-          <w:shd w:val="clear" w:color="auto" w:fill="f4f4f4"/>
-          <w:rFonts w:ascii="Courier" w:hAnsi="Courier" w:eastAsia="Courier"/>
-          <w:b w:val="0"/>
-          <w:i w:val="0"/>
-          <w:color w:val="333333"/>
-          <w:sz w:val="19"/>
-        </w:rPr>
-        <w:t>TotalRooms</w:t>
-      </w:r>
-      <w:r>
-        <w:rPr>
-          <w:rFonts w:ascii="Helvetica" w:hAnsi="Helvetica" w:eastAsia="Helvetica"/>
-          <w:b w:val="0"/>
-          <w:i w:val="0"/>
-          <w:color w:val="333333"/>
-          <w:sz w:val="22"/>
-        </w:rPr>
-        <w:t xml:space="preserve"> and </w:t>
-      </w:r>
-      <w:r>
-        <w:rPr>
-          <w:shd w:val="clear" w:color="auto" w:fill="f4f4f4"/>
-          <w:rFonts w:ascii="Courier" w:hAnsi="Courier" w:eastAsia="Courier"/>
-          <w:b w:val="0"/>
-          <w:i w:val="0"/>
-          <w:color w:val="333333"/>
-          <w:sz w:val="19"/>
-        </w:rPr>
-        <w:t>TotalBedrooms</w:t>
-      </w:r>
-      <w:r>
-        <w:rPr>
-          <w:rFonts w:ascii="Helvetica" w:hAnsi="Helvetica" w:eastAsia="Helvetica"/>
-          <w:b w:val="0"/>
-          <w:i w:val="0"/>
-          <w:color w:val="333333"/>
-          <w:sz w:val="22"/>
-        </w:rPr>
-        <w:t xml:space="preserve"> (correlation </w:t>
-      </w:r>
-      <w:r>
-        <w:rPr>
-          <w:rFonts w:ascii="Helvetica" w:hAnsi="Helvetica" w:eastAsia="Helvetica"/>
-          <w:b w:val="0"/>
-          <w:i w:val="0"/>
-          <w:color w:val="333333"/>
-          <w:sz w:val="22"/>
-        </w:rPr>
-        <w:t xml:space="preserve">coefficient </w:t>
-      </w:r>
-      <w:r>
-        <w:rPr>
-          <w:rFonts w:ascii="Symbol" w:hAnsi="Symbol" w:eastAsia="Symbol"/>
-          <w:b w:val="0"/>
-          <w:i w:val="0"/>
-          <w:color w:val="333333"/>
-          <w:sz w:val="22"/>
-        </w:rPr>
-        <w:t>≈</w:t>
-      </w:r>
-      <w:r>
-        <w:rPr>
-          <w:rFonts w:ascii="Helvetica" w:hAnsi="Helvetica" w:eastAsia="Helvetica"/>
-          <w:b w:val="0"/>
-          <w:i w:val="0"/>
-          <w:color w:val="333333"/>
-          <w:sz w:val="22"/>
-        </w:rPr>
-        <w:t xml:space="preserve"> 0.85). In linear models, this causes severe multicollinearity, inflating the variance of </w:t>
-      </w:r>
-      <w:r>
-        <w:rPr>
-          <w:rFonts w:ascii="Helvetica" w:hAnsi="Helvetica" w:eastAsia="Helvetica"/>
-          <w:b w:val="0"/>
-          <w:i w:val="0"/>
-          <w:color w:val="333333"/>
-          <w:sz w:val="22"/>
-        </w:rPr>
-        <w:t xml:space="preserve">regression coefficients and rendering the model unstable. To balance this, we engineered </w:t>
-      </w:r>
-      <w:r>
-        <w:rPr>
-          <w:shd w:val="clear" w:color="auto" w:fill="f4f4f4"/>
-          <w:rFonts w:ascii="Courier" w:hAnsi="Courier" w:eastAsia="Courier"/>
-          <w:b w:val="0"/>
-          <w:i w:val="0"/>
-          <w:color w:val="333333"/>
-          <w:sz w:val="19"/>
-        </w:rPr>
-        <w:t>BedroomsRatio</w:t>
-      </w:r>
-      <w:r>
-        <w:rPr>
-          <w:rFonts w:ascii="Helvetica" w:hAnsi="Helvetica" w:eastAsia="Helvetica"/>
-          <w:b w:val="0"/>
-          <w:i w:val="0"/>
-          <w:color w:val="333333"/>
-          <w:sz w:val="22"/>
-        </w:rPr>
-        <w:t xml:space="preserve"> ($r \approx -0.26$).</w:t>
+        <w:t xml:space="preserve">To mathematically prove that these binned age groups represent statistically distinct house prices, </w:t>
+      </w:r>
+      <w:r>
+        <w:rPr>
+          <w:rFonts w:ascii="Helvetica" w:hAnsi="Helvetica" w:eastAsia="Helvetica"/>
+          <w:b w:val="0"/>
+          <w:i w:val="0"/>
+          <w:color w:val="333333"/>
+          <w:sz w:val="22"/>
+        </w:rPr>
+        <w:t xml:space="preserve">we conducted formal hypothesis testing: * </w:t>
+      </w:r>
+      <w:r>
+        <w:rPr>
+          <w:rFonts w:ascii="Helvetica" w:hAnsi="Helvetica" w:eastAsia="Helvetica"/>
+          <w:b/>
+          <w:i w:val="0"/>
+          <w:color w:val="333333"/>
+          <w:sz w:val="22"/>
+        </w:rPr>
+        <w:t>ANOVA F-Test:</w:t>
+      </w:r>
+      <w:r>
+        <w:rPr>
+          <w:rFonts w:ascii="Helvetica" w:hAnsi="Helvetica" w:eastAsia="Helvetica"/>
+          <w:b w:val="0"/>
+          <w:i w:val="0"/>
+          <w:color w:val="333333"/>
+          <w:sz w:val="22"/>
+        </w:rPr>
+        <w:t xml:space="preserve"> A one-way Analysis of Variance </w:t>
+      </w:r>
+      <w:r>
+        <w:rPr>
+          <w:rFonts w:ascii="Helvetica" w:hAnsi="Helvetica" w:eastAsia="Helvetica"/>
+          <w:b w:val="0"/>
+          <w:i w:val="0"/>
+          <w:color w:val="333333"/>
+          <w:sz w:val="22"/>
+        </w:rPr>
+        <w:t xml:space="preserve">(ANOVA) test across the three age categories resulted in a highly significant </w:t>
+      </w:r>
+      <w:r>
+        <w:rPr>
+          <w:rFonts w:ascii="Helvetica" w:hAnsi="Helvetica" w:eastAsia="Helvetica"/>
+          <w:b/>
+          <w:i w:val="0"/>
+          <w:color w:val="333333"/>
+          <w:sz w:val="22"/>
+        </w:rPr>
+        <w:t xml:space="preserve">F-statistic of 113.82 </w:t>
+      </w:r>
+      <w:r>
+        <w:rPr>
+          <w:rFonts w:ascii="Helvetica" w:hAnsi="Helvetica" w:eastAsia="Helvetica"/>
+          <w:b w:val="0"/>
+          <w:i w:val="0"/>
+          <w:color w:val="333333"/>
+          <w:sz w:val="22"/>
+        </w:rPr>
+        <w:t xml:space="preserve">and a </w:t>
+      </w:r>
+      <w:r>
+        <w:rPr>
+          <w:rFonts w:ascii="Helvetica" w:hAnsi="Helvetica" w:eastAsia="Helvetica"/>
+          <w:b/>
+          <w:i w:val="0"/>
+          <w:color w:val="333333"/>
+          <w:sz w:val="22"/>
+        </w:rPr>
+        <w:t>p-value of 0.0000</w:t>
+      </w:r>
+      <w:r>
+        <w:rPr>
+          <w:rFonts w:ascii="Helvetica" w:hAnsi="Helvetica" w:eastAsia="Helvetica"/>
+          <w:b w:val="0"/>
+          <w:i w:val="0"/>
+          <w:color w:val="333333"/>
+          <w:sz w:val="22"/>
+        </w:rPr>
+        <w:t xml:space="preserve"> ($p &lt; 0.05$). This statistically confirms that the mean housing prices </w:t>
+      </w:r>
+      <w:r>
+        <w:rPr>
+          <w:rFonts w:ascii="Helvetica" w:hAnsi="Helvetica" w:eastAsia="Helvetica"/>
+          <w:b w:val="0"/>
+          <w:i w:val="0"/>
+          <w:color w:val="333333"/>
+          <w:sz w:val="22"/>
+        </w:rPr>
+        <w:t xml:space="preserve">among 'New', 'Moderate', and 'Old' properties are significantly different. * </w:t>
+      </w:r>
+      <w:r>
+        <w:rPr>
+          <w:rFonts w:ascii="Helvetica" w:hAnsi="Helvetica" w:eastAsia="Helvetica"/>
+          <w:b/>
+          <w:i w:val="0"/>
+          <w:color w:val="333333"/>
+          <w:sz w:val="22"/>
+        </w:rPr>
+        <w:t>Student's T-Test:</w:t>
+      </w:r>
+      <w:r>
+        <w:rPr>
+          <w:rFonts w:ascii="Helvetica" w:hAnsi="Helvetica" w:eastAsia="Helvetica"/>
+          <w:b w:val="0"/>
+          <w:i w:val="0"/>
+          <w:color w:val="333333"/>
+          <w:sz w:val="22"/>
+        </w:rPr>
+        <w:t xml:space="preserve"> An </w:t>
+      </w:r>
+      <w:r>
+        <w:rPr>
+          <w:rFonts w:ascii="Helvetica" w:hAnsi="Helvetica" w:eastAsia="Helvetica"/>
+          <w:b w:val="0"/>
+          <w:i w:val="0"/>
+          <w:color w:val="333333"/>
+          <w:sz w:val="22"/>
+        </w:rPr>
+        <w:t xml:space="preserve">independent two-sample t-test between the 'New' and 'Old' property subsets yielded a </w:t>
+      </w:r>
+      <w:r>
+        <w:rPr>
+          <w:rFonts w:ascii="Helvetica" w:hAnsi="Helvetica" w:eastAsia="Helvetica"/>
+          <w:b/>
+          <w:i w:val="0"/>
+          <w:color w:val="333333"/>
+          <w:sz w:val="22"/>
+        </w:rPr>
+        <w:t xml:space="preserve">t-statistic </w:t>
+      </w:r>
+      <w:r>
+        <w:rPr>
+          <w:rFonts w:ascii="Helvetica" w:hAnsi="Helvetica" w:eastAsia="Helvetica"/>
+          <w:b/>
+          <w:i w:val="0"/>
+          <w:color w:val="333333"/>
+          <w:sz w:val="22"/>
+        </w:rPr>
+        <w:t>of 14.85</w:t>
+      </w:r>
+      <w:r>
+        <w:rPr>
+          <w:rFonts w:ascii="Helvetica" w:hAnsi="Helvetica" w:eastAsia="Helvetica"/>
+          <w:b w:val="0"/>
+          <w:i w:val="0"/>
+          <w:color w:val="333333"/>
+          <w:sz w:val="22"/>
+        </w:rPr>
+        <w:t xml:space="preserve"> and a </w:t>
+      </w:r>
+      <w:r>
+        <w:rPr>
+          <w:rFonts w:ascii="Helvetica" w:hAnsi="Helvetica" w:eastAsia="Helvetica"/>
+          <w:b/>
+          <w:i w:val="0"/>
+          <w:color w:val="333333"/>
+          <w:sz w:val="22"/>
+        </w:rPr>
+        <w:t>p-value of 0.0000</w:t>
+      </w:r>
+      <w:r>
+        <w:rPr>
+          <w:rFonts w:ascii="Helvetica" w:hAnsi="Helvetica" w:eastAsia="Helvetica"/>
+          <w:b w:val="0"/>
+          <w:i w:val="0"/>
+          <w:color w:val="333333"/>
+          <w:sz w:val="22"/>
+        </w:rPr>
+        <w:t xml:space="preserve">, confirming that new properties command a statistically higher </w:t>
+      </w:r>
+      <w:r>
+        <w:rPr>
+          <w:rFonts w:ascii="Helvetica" w:hAnsi="Helvetica" w:eastAsia="Helvetica"/>
+          <w:b w:val="0"/>
+          <w:i w:val="0"/>
+          <w:color w:val="333333"/>
+          <w:sz w:val="22"/>
+        </w:rPr>
+        <w:t>price profile.</w:t>
       </w:r>
     </w:p>
     <w:p>
@@ -6786,139 +6583,95 @@
         <w:autoSpaceDE w:val="0"/>
         <w:widowControl/>
         <w:spacing w:line="352" w:lineRule="exact" w:before="304" w:after="0"/>
-        <w:ind w:left="0" w:right="0" w:firstLine="0"/>
+        <w:ind w:left="30" w:right="50" w:firstLine="0"/>
+        <w:jc w:val="both"/>
+      </w:pPr>
+      <w:r>
+        <w:rPr>
+          <w:rFonts w:ascii="Helvetica" w:hAnsi="Helvetica" w:eastAsia="Helvetica"/>
+          <w:b w:val="0"/>
+          <w:i w:val="0"/>
+          <w:color w:val="333333"/>
+          <w:sz w:val="22"/>
+        </w:rPr>
+        <w:t xml:space="preserve">This statistical validation justified our encoding strategy (Ordinal Encoding) in the preprocessing </w:t>
+      </w:r>
+      <w:r>
+        <w:rPr>
+          <w:rFonts w:ascii="Helvetica" w:hAnsi="Helvetica" w:eastAsia="Helvetica"/>
+          <w:b w:val="0"/>
+          <w:i w:val="0"/>
+          <w:color w:val="333333"/>
+          <w:sz w:val="22"/>
+        </w:rPr>
+        <w:t xml:space="preserve">pipeline, allowing tree splits in XGBoost and Random Forest to branch on clean structural age </w:t>
+      </w:r>
+      <w:r>
+        <w:rPr>
+          <w:rFonts w:ascii="Helvetica" w:hAnsi="Helvetica" w:eastAsia="Helvetica"/>
+          <w:b w:val="0"/>
+          <w:i w:val="0"/>
+          <w:color w:val="333333"/>
+          <w:sz w:val="22"/>
+        </w:rPr>
+        <w:t>thresholds.</w:t>
+      </w:r>
+    </w:p>
+    <w:p>
+      <w:pPr>
+        <w:autoSpaceDN w:val="0"/>
+        <w:autoSpaceDE w:val="0"/>
+        <w:widowControl/>
+        <w:spacing w:line="330" w:lineRule="exact" w:before="984" w:after="0"/>
+        <w:ind w:left="30" w:right="0" w:firstLine="0"/>
         <w:jc w:val="left"/>
       </w:pPr>
       <w:r>
         <w:rPr>
           <w:rFonts w:ascii="Helvetica" w:hAnsi="Helvetica" w:eastAsia="Helvetica"/>
-          <w:b w:val="0"/>
-          <w:i w:val="0"/>
-          <w:color w:val="333333"/>
-          <w:sz w:val="22"/>
-        </w:rPr>
-        <w:t xml:space="preserve">Regarding the target variable, </w:t>
-      </w:r>
-      <w:r>
-        <w:rPr>
-          <w:shd w:val="clear" w:color="auto" w:fill="f4f4f4"/>
-          <w:rFonts w:ascii="Courier" w:hAnsi="Courier" w:eastAsia="Courier"/>
-          <w:b w:val="0"/>
-          <w:i w:val="0"/>
-          <w:color w:val="333333"/>
-          <w:sz w:val="19"/>
-        </w:rPr>
-        <w:t>IncomeLevel</w:t>
-      </w:r>
-      <w:r>
-        <w:rPr>
-          <w:rFonts w:ascii="Helvetica" w:hAnsi="Helvetica" w:eastAsia="Helvetica"/>
-          <w:b w:val="0"/>
-          <w:i w:val="0"/>
-          <w:color w:val="333333"/>
-          <w:sz w:val="22"/>
-        </w:rPr>
-        <w:t xml:space="preserve"> showed a strong positive correlation with </w:t>
-      </w:r>
-      <w:r>
-        <w:rPr>
-          <w:shd w:val="clear" w:color="auto" w:fill="f4f4f4"/>
-          <w:rFonts w:ascii="Courier" w:hAnsi="Courier" w:eastAsia="Courier"/>
-          <w:b w:val="0"/>
-          <w:i w:val="0"/>
-          <w:color w:val="333333"/>
-          <w:sz w:val="19"/>
-        </w:rPr>
-        <w:t>TargetPrice</w:t>
-      </w:r>
-      <w:r>
-        <w:rPr>
-          <w:rFonts w:ascii="Helvetica" w:hAnsi="Helvetica" w:eastAsia="Helvetica"/>
-          <w:b w:val="0"/>
-          <w:i w:val="0"/>
-          <w:color w:val="333333"/>
-          <w:sz w:val="22"/>
-        </w:rPr>
-        <w:t xml:space="preserve"> ($r \approx 0.69$), identifying it as the single most predictive feature. Coordinates </w:t>
-      </w:r>
-      <w:r>
-        <w:rPr>
-          <w:shd w:val="clear" w:color="auto" w:fill="f4f4f4"/>
-          <w:rFonts w:ascii="Courier" w:hAnsi="Courier" w:eastAsia="Courier"/>
-          <w:b w:val="0"/>
-          <w:i w:val="0"/>
-          <w:color w:val="333333"/>
-          <w:sz w:val="19"/>
-        </w:rPr>
-        <w:t>Latitude</w:t>
-      </w:r>
-      <w:r>
-        <w:rPr>
-          <w:rFonts w:ascii="Helvetica" w:hAnsi="Helvetica" w:eastAsia="Helvetica"/>
-          <w:b w:val="0"/>
-          <w:i w:val="0"/>
-          <w:color w:val="333333"/>
-          <w:sz w:val="22"/>
-        </w:rPr>
-        <w:t xml:space="preserve"> and </w:t>
-      </w:r>
-      <w:r>
-        <w:rPr>
-          <w:shd w:val="clear" w:color="auto" w:fill="f4f4f4"/>
-          <w:rFonts w:ascii="Courier" w:hAnsi="Courier" w:eastAsia="Courier"/>
-          <w:b w:val="0"/>
-          <w:i w:val="0"/>
-          <w:color w:val="333333"/>
-          <w:sz w:val="19"/>
-        </w:rPr>
-        <w:t>Longitude</w:t>
-      </w:r>
-      <w:r>
-        <w:rPr>
-          <w:rFonts w:ascii="Helvetica" w:hAnsi="Helvetica" w:eastAsia="Helvetica"/>
-          <w:b w:val="0"/>
-          <w:i w:val="0"/>
-          <w:color w:val="333333"/>
-          <w:sz w:val="22"/>
-        </w:rPr>
-        <w:t xml:space="preserve"> showed weak individual linear correlations ($r \approx -0.08$ and $r </w:t>
-      </w:r>
-      <w:r>
-        <w:rPr>
-          <w:rFonts w:ascii="Helvetica" w:hAnsi="Helvetica" w:eastAsia="Helvetica"/>
-          <w:b w:val="0"/>
-          <w:i w:val="0"/>
-          <w:color w:val="333333"/>
-          <w:sz w:val="22"/>
-        </w:rPr>
-        <w:t xml:space="preserve">\approx -0.05$), yet they are highly predictive of house price through geographic interaction. This </w:t>
-      </w:r>
-      <w:r>
-        <w:rPr>
-          <w:rFonts w:ascii="Helvetica" w:hAnsi="Helvetica" w:eastAsia="Helvetica"/>
-          <w:b w:val="0"/>
-          <w:i w:val="0"/>
-          <w:color w:val="333333"/>
-          <w:sz w:val="22"/>
-        </w:rPr>
-        <w:t xml:space="preserve">required using models like XGBoost that split coordinates in multi-dimensional space to capture </w:t>
-      </w:r>
-      <w:r>
-        <w:rPr>
-          <w:rFonts w:ascii="Helvetica" w:hAnsi="Helvetica" w:eastAsia="Helvetica"/>
-          <w:b w:val="0"/>
-          <w:i w:val="0"/>
-          <w:color w:val="333333"/>
-          <w:sz w:val="22"/>
-        </w:rPr>
-        <w:t>localized value groups.</w:t>
+          <w:b/>
+          <w:i w:val="0"/>
+          <w:color w:val="1F3A52"/>
+          <w:sz w:val="24"/>
+        </w:rPr>
+        <w:t>3.4 Correlation Analysis</w:t>
+      </w:r>
+    </w:p>
+    <w:p>
+      <w:pPr>
+        <w:autoSpaceDN w:val="0"/>
+        <w:autoSpaceDE w:val="0"/>
+        <w:widowControl/>
+        <w:spacing w:line="352" w:lineRule="exact" w:before="270" w:after="0"/>
+        <w:ind w:left="30" w:right="0" w:firstLine="0"/>
+        <w:jc w:val="left"/>
+      </w:pPr>
+      <w:r>
+        <w:rPr>
+          <w:rFonts w:ascii="Helvetica" w:hAnsi="Helvetica" w:eastAsia="Helvetica"/>
+          <w:b w:val="0"/>
+          <w:i w:val="0"/>
+          <w:color w:val="333333"/>
+          <w:sz w:val="22"/>
+        </w:rPr>
+        <w:t xml:space="preserve">A correlation heatmap was created to look at linear relationships between numerical features and </w:t>
+      </w:r>
+      <w:r>
+        <w:rPr>
+          <w:rFonts w:ascii="Helvetica" w:hAnsi="Helvetica" w:eastAsia="Helvetica"/>
+          <w:b w:val="0"/>
+          <w:i w:val="0"/>
+          <w:color w:val="333333"/>
+          <w:sz w:val="22"/>
+        </w:rPr>
+        <w:t>the target variable (see Figure 4).</w:t>
       </w:r>
     </w:p>
     <w:p>
       <w:pPr>
         <w:sectPr>
           <w:pgSz w:w="11906" w:h="16838"/>
-          <w:pgMar w:top="680" w:right="1134" w:bottom="830" w:left="1154" w:header="720" w:footer="720" w:gutter="0"/>
+          <w:pgMar w:top="720" w:right="1104" w:bottom="798" w:left="1124" w:header="720" w:footer="720" w:gutter="0"/>
           <w:cols/>
           <w:docGrid w:linePitch="360"/>
         </w:sectPr>
@@ -6929,7 +6682,7 @@
         <w:autoSpaceDN w:val="0"/>
         <w:autoSpaceDE w:val="0"/>
         <w:widowControl/>
-        <w:spacing w:line="220" w:lineRule="exact" w:before="0" w:after="494"/>
+        <w:spacing w:line="220" w:lineRule="exact" w:before="0" w:after="498"/>
         <w:ind w:left="0" w:right="0"/>
       </w:pPr>
     </w:p>
@@ -6938,7 +6691,327 @@
         <w:autoSpaceDN w:val="0"/>
         <w:autoSpaceDE w:val="0"/>
         <w:widowControl/>
-        <w:spacing w:line="332" w:lineRule="exact" w:before="384" w:after="0"/>
+        <w:spacing w:line="240" w:lineRule="auto" w:before="0" w:after="0"/>
+        <w:ind w:left="0" w:right="0" w:firstLine="0"/>
+        <w:jc w:val="center"/>
+      </w:pPr>
+      <w:r>
+        <w:drawing>
+          <wp:inline xmlns:a="http://schemas.openxmlformats.org/drawingml/2006/main" xmlns:pic="http://schemas.openxmlformats.org/drawingml/2006/picture">
+            <wp:extent cx="6094730" cy="5544820"/>
+            <wp:docPr id="4" name="Picture 4"/>
+            <wp:cNvGraphicFramePr>
+              <a:graphicFrameLocks noChangeAspect="1"/>
+            </wp:cNvGraphicFramePr>
+            <a:graphic>
+              <a:graphicData uri="http://schemas.openxmlformats.org/drawingml/2006/picture">
+                <pic:pic>
+                  <pic:nvPicPr>
+                    <pic:cNvPr id="0" name="image.png"/>
+                    <pic:cNvPicPr/>
+                  </pic:nvPicPr>
+                  <pic:blipFill>
+                    <a:blip r:embed="rId12"/>
+                    <a:stretch>
+                      <a:fillRect/>
+                    </a:stretch>
+                  </pic:blipFill>
+                  <pic:spPr>
+                    <a:xfrm>
+                      <a:off x="0" y="0"/>
+                      <a:ext cx="6094730" cy="5544820"/>
+                    </a:xfrm>
+                    <a:prstGeom prst="rect"/>
+                  </pic:spPr>
+                </pic:pic>
+              </a:graphicData>
+            </a:graphic>
+          </wp:inline>
+        </w:drawing>
+      </w:r>
+    </w:p>
+    <w:p>
+      <w:pPr>
+        <w:autoSpaceDN w:val="0"/>
+        <w:autoSpaceDE w:val="0"/>
+        <w:widowControl/>
+        <w:spacing w:line="352" w:lineRule="exact" w:before="176" w:after="0"/>
+        <w:ind w:left="30" w:right="0" w:firstLine="0"/>
+        <w:jc w:val="left"/>
+      </w:pPr>
+      <w:r>
+        <w:rPr>
+          <w:rFonts w:ascii="Helvetica" w:hAnsi="Helvetica" w:eastAsia="Helvetica"/>
+          <w:b w:val="0"/>
+          <w:i w:val="0"/>
+          <w:color w:val="333333"/>
+          <w:sz w:val="22"/>
+        </w:rPr>
+        <w:t xml:space="preserve">A strong positive correlation was found between </w:t>
+      </w:r>
+      <w:r>
+        <w:rPr>
+          <w:shd w:val="clear" w:color="auto" w:fill="f4f4f4"/>
+          <w:rFonts w:ascii="Courier" w:hAnsi="Courier" w:eastAsia="Courier"/>
+          <w:b w:val="0"/>
+          <w:i w:val="0"/>
+          <w:color w:val="333333"/>
+          <w:sz w:val="19"/>
+        </w:rPr>
+        <w:t>TotalRooms</w:t>
+      </w:r>
+      <w:r>
+        <w:rPr>
+          <w:rFonts w:ascii="Helvetica" w:hAnsi="Helvetica" w:eastAsia="Helvetica"/>
+          <w:b w:val="0"/>
+          <w:i w:val="0"/>
+          <w:color w:val="333333"/>
+          <w:sz w:val="22"/>
+        </w:rPr>
+        <w:t xml:space="preserve"> and </w:t>
+      </w:r>
+      <w:r>
+        <w:rPr>
+          <w:shd w:val="clear" w:color="auto" w:fill="f4f4f4"/>
+          <w:rFonts w:ascii="Courier" w:hAnsi="Courier" w:eastAsia="Courier"/>
+          <w:b w:val="0"/>
+          <w:i w:val="0"/>
+          <w:color w:val="333333"/>
+          <w:sz w:val="19"/>
+        </w:rPr>
+        <w:t>TotalBedrooms</w:t>
+      </w:r>
+      <w:r>
+        <w:rPr>
+          <w:rFonts w:ascii="Helvetica" w:hAnsi="Helvetica" w:eastAsia="Helvetica"/>
+          <w:b w:val="0"/>
+          <w:i w:val="0"/>
+          <w:color w:val="333333"/>
+          <w:sz w:val="22"/>
+        </w:rPr>
+        <w:t xml:space="preserve"> (correlation </w:t>
+      </w:r>
+      <w:r>
+        <w:rPr>
+          <w:rFonts w:ascii="Helvetica" w:hAnsi="Helvetica" w:eastAsia="Helvetica"/>
+          <w:b w:val="0"/>
+          <w:i w:val="0"/>
+          <w:color w:val="333333"/>
+          <w:sz w:val="22"/>
+        </w:rPr>
+        <w:t xml:space="preserve">coefficient </w:t>
+      </w:r>
+      <w:r>
+        <w:rPr>
+          <w:rFonts w:ascii="Symbol" w:hAnsi="Symbol" w:eastAsia="Symbol"/>
+          <w:b w:val="0"/>
+          <w:i w:val="0"/>
+          <w:color w:val="333333"/>
+          <w:sz w:val="22"/>
+        </w:rPr>
+        <w:t>≈</w:t>
+      </w:r>
+      <w:r>
+        <w:rPr>
+          <w:rFonts w:ascii="Helvetica" w:hAnsi="Helvetica" w:eastAsia="Helvetica"/>
+          <w:b w:val="0"/>
+          <w:i w:val="0"/>
+          <w:color w:val="333333"/>
+          <w:sz w:val="22"/>
+        </w:rPr>
+        <w:t xml:space="preserve"> 0.85). In linear models, this causes severe multicollinearity, inflating the variance of </w:t>
+      </w:r>
+      <w:r>
+        <w:rPr>
+          <w:rFonts w:ascii="Helvetica" w:hAnsi="Helvetica" w:eastAsia="Helvetica"/>
+          <w:b w:val="0"/>
+          <w:i w:val="0"/>
+          <w:color w:val="333333"/>
+          <w:sz w:val="22"/>
+        </w:rPr>
+        <w:t xml:space="preserve">regression coefficients and rendering the model unstable. To balance this, we engineered </w:t>
+      </w:r>
+      <w:r>
+        <w:rPr>
+          <w:shd w:val="clear" w:color="auto" w:fill="f4f4f4"/>
+          <w:rFonts w:ascii="Courier" w:hAnsi="Courier" w:eastAsia="Courier"/>
+          <w:b w:val="0"/>
+          <w:i w:val="0"/>
+          <w:color w:val="333333"/>
+          <w:sz w:val="19"/>
+        </w:rPr>
+        <w:t>BedroomsRatio</w:t>
+      </w:r>
+      <w:r>
+        <w:rPr>
+          <w:rFonts w:ascii="Helvetica" w:hAnsi="Helvetica" w:eastAsia="Helvetica"/>
+          <w:b w:val="0"/>
+          <w:i w:val="0"/>
+          <w:color w:val="333333"/>
+          <w:sz w:val="22"/>
+        </w:rPr>
+        <w:t xml:space="preserve"> ($r \approx -0.26$).</w:t>
+      </w:r>
+    </w:p>
+    <w:p>
+      <w:pPr>
+        <w:autoSpaceDN w:val="0"/>
+        <w:autoSpaceDE w:val="0"/>
+        <w:widowControl/>
+        <w:spacing w:line="352" w:lineRule="exact" w:before="304" w:after="0"/>
+        <w:ind w:left="30" w:right="0" w:firstLine="0"/>
+        <w:jc w:val="left"/>
+      </w:pPr>
+      <w:r>
+        <w:rPr>
+          <w:rFonts w:ascii="Helvetica" w:hAnsi="Helvetica" w:eastAsia="Helvetica"/>
+          <w:b w:val="0"/>
+          <w:i w:val="0"/>
+          <w:color w:val="333333"/>
+          <w:sz w:val="22"/>
+        </w:rPr>
+        <w:t xml:space="preserve">Regarding the target variable, </w:t>
+      </w:r>
+      <w:r>
+        <w:rPr>
+          <w:shd w:val="clear" w:color="auto" w:fill="f4f4f4"/>
+          <w:rFonts w:ascii="Courier" w:hAnsi="Courier" w:eastAsia="Courier"/>
+          <w:b w:val="0"/>
+          <w:i w:val="0"/>
+          <w:color w:val="333333"/>
+          <w:sz w:val="19"/>
+        </w:rPr>
+        <w:t>IncomeLevel</w:t>
+      </w:r>
+      <w:r>
+        <w:rPr>
+          <w:rFonts w:ascii="Helvetica" w:hAnsi="Helvetica" w:eastAsia="Helvetica"/>
+          <w:b w:val="0"/>
+          <w:i w:val="0"/>
+          <w:color w:val="333333"/>
+          <w:sz w:val="22"/>
+        </w:rPr>
+        <w:t xml:space="preserve"> showed a strong positive correlation with </w:t>
+      </w:r>
+      <w:r>
+        <w:rPr>
+          <w:shd w:val="clear" w:color="auto" w:fill="f4f4f4"/>
+          <w:rFonts w:ascii="Courier" w:hAnsi="Courier" w:eastAsia="Courier"/>
+          <w:b w:val="0"/>
+          <w:i w:val="0"/>
+          <w:color w:val="333333"/>
+          <w:sz w:val="19"/>
+        </w:rPr>
+        <w:t>TargetPrice</w:t>
+      </w:r>
+      <w:r>
+        <w:rPr>
+          <w:rFonts w:ascii="Helvetica" w:hAnsi="Helvetica" w:eastAsia="Helvetica"/>
+          <w:b w:val="0"/>
+          <w:i w:val="0"/>
+          <w:color w:val="333333"/>
+          <w:sz w:val="22"/>
+        </w:rPr>
+        <w:t xml:space="preserve"> ($r \approx 0.69$), identifying it as the single most predictive feature. Coordinates </w:t>
+      </w:r>
+      <w:r>
+        <w:rPr>
+          <w:shd w:val="clear" w:color="auto" w:fill="f4f4f4"/>
+          <w:rFonts w:ascii="Courier" w:hAnsi="Courier" w:eastAsia="Courier"/>
+          <w:b w:val="0"/>
+          <w:i w:val="0"/>
+          <w:color w:val="333333"/>
+          <w:sz w:val="19"/>
+        </w:rPr>
+        <w:t>Latitude</w:t>
+      </w:r>
+      <w:r>
+        <w:rPr>
+          <w:rFonts w:ascii="Helvetica" w:hAnsi="Helvetica" w:eastAsia="Helvetica"/>
+          <w:b w:val="0"/>
+          <w:i w:val="0"/>
+          <w:color w:val="333333"/>
+          <w:sz w:val="22"/>
+        </w:rPr>
+        <w:t xml:space="preserve"> and </w:t>
+      </w:r>
+      <w:r>
+        <w:rPr>
+          <w:shd w:val="clear" w:color="auto" w:fill="f4f4f4"/>
+          <w:rFonts w:ascii="Courier" w:hAnsi="Courier" w:eastAsia="Courier"/>
+          <w:b w:val="0"/>
+          <w:i w:val="0"/>
+          <w:color w:val="333333"/>
+          <w:sz w:val="19"/>
+        </w:rPr>
+        <w:t>Longitude</w:t>
+      </w:r>
+      <w:r>
+        <w:rPr>
+          <w:rFonts w:ascii="Helvetica" w:hAnsi="Helvetica" w:eastAsia="Helvetica"/>
+          <w:b w:val="0"/>
+          <w:i w:val="0"/>
+          <w:color w:val="333333"/>
+          <w:sz w:val="22"/>
+        </w:rPr>
+        <w:t xml:space="preserve"> showed weak individual linear correlations ($r \approx -0.08$ and $r </w:t>
+      </w:r>
+      <w:r>
+        <w:rPr>
+          <w:rFonts w:ascii="Helvetica" w:hAnsi="Helvetica" w:eastAsia="Helvetica"/>
+          <w:b w:val="0"/>
+          <w:i w:val="0"/>
+          <w:color w:val="333333"/>
+          <w:sz w:val="22"/>
+        </w:rPr>
+        <w:t xml:space="preserve">\approx -0.05$), yet they are highly predictive of house price through geographic interaction. This </w:t>
+      </w:r>
+      <w:r>
+        <w:rPr>
+          <w:rFonts w:ascii="Helvetica" w:hAnsi="Helvetica" w:eastAsia="Helvetica"/>
+          <w:b w:val="0"/>
+          <w:i w:val="0"/>
+          <w:color w:val="333333"/>
+          <w:sz w:val="22"/>
+        </w:rPr>
+        <w:t xml:space="preserve">required using models like XGBoost that split coordinates in multi-dimensional space to capture </w:t>
+      </w:r>
+      <w:r>
+        <w:rPr>
+          <w:rFonts w:ascii="Helvetica" w:hAnsi="Helvetica" w:eastAsia="Helvetica"/>
+          <w:b w:val="0"/>
+          <w:i w:val="0"/>
+          <w:color w:val="333333"/>
+          <w:sz w:val="22"/>
+        </w:rPr>
+        <w:t>localized value groups.</w:t>
+      </w:r>
+    </w:p>
+    <w:p>
+      <w:pPr>
+        <w:sectPr>
+          <w:pgSz w:w="11906" w:h="16838"/>
+          <w:pgMar w:top="720" w:right="1104" w:bottom="1024" w:left="1124" w:header="720" w:footer="720" w:gutter="0"/>
+          <w:cols/>
+          <w:docGrid w:linePitch="360"/>
+        </w:sectPr>
+      </w:pPr>
+    </w:p>
+    <w:p>
+      <w:pPr>
+        <w:autoSpaceDN w:val="0"/>
+        <w:autoSpaceDE w:val="0"/>
+        <w:widowControl/>
+        <w:spacing w:line="220" w:lineRule="exact" w:before="0" w:after="456"/>
+        <w:ind w:left="0" w:right="0"/>
+      </w:pPr>
+    </w:p>
+    <w:p>
+      <w:pPr>
+        <w:autoSpaceDN w:val="0"/>
+        <w:autoSpaceDE w:val="0"/>
+        <w:widowControl/>
+        <w:spacing w:line="332" w:lineRule="exact" w:before="0" w:after="0"/>
         <w:ind w:left="30" w:right="0" w:firstLine="0"/>
         <w:jc w:val="left"/>
       </w:pPr>
@@ -7472,9 +7545,68 @@
     </w:p>
     <w:p>
       <w:pPr>
+        <w:autoSpaceDN w:val="0"/>
+        <w:tabs>
+          <w:tab w:pos="660" w:val="left"/>
+        </w:tabs>
+        <w:autoSpaceDE w:val="0"/>
+        <w:widowControl/>
+        <w:spacing w:line="352" w:lineRule="exact" w:before="150" w:after="0"/>
+        <w:ind w:left="330" w:right="0" w:firstLine="0"/>
+        <w:jc w:val="left"/>
+      </w:pPr>
+      <w:r>
+        <w:rPr>
+          <w:rFonts w:ascii="Helvetica" w:hAnsi="Helvetica" w:eastAsia="Helvetica"/>
+          <w:b w:val="0"/>
+          <w:i w:val="0"/>
+          <w:color w:val="333333"/>
+          <w:sz w:val="22"/>
+        </w:rPr>
+        <w:t>•</w:t>
+      </w:r>
+      <w:r>
+        <w:tab/>
+      </w:r>
+      <w:r>
+        <w:rPr>
+          <w:rFonts w:ascii="Helvetica" w:hAnsi="Helvetica" w:eastAsia="Helvetica"/>
+          <w:b/>
+          <w:i w:val="0"/>
+          <w:color w:val="333333"/>
+          <w:sz w:val="22"/>
+        </w:rPr>
+        <w:t>Random Forest:</w:t>
+      </w:r>
+      <w:r>
+        <w:rPr>
+          <w:rFonts w:ascii="Helvetica" w:hAnsi="Helvetica" w:eastAsia="Helvetica"/>
+          <w:b w:val="0"/>
+          <w:i w:val="0"/>
+          <w:color w:val="333333"/>
+          <w:sz w:val="22"/>
+        </w:rPr>
+        <w:t xml:space="preserve"> Averages many independent decision trees. By introducing randomness </w:t>
+      </w:r>
+      <w:r>
+        <w:tab/>
+      </w:r>
+      <w:r>
+        <w:rPr>
+          <w:rFonts w:ascii="Helvetica" w:hAnsi="Helvetica" w:eastAsia="Helvetica"/>
+          <w:b w:val="0"/>
+          <w:i w:val="0"/>
+          <w:color w:val="333333"/>
+          <w:sz w:val="22"/>
+        </w:rPr>
+        <w:t>during tree splitting, it reduces variance, increases stability, and provides robust predictions.</w:t>
+      </w:r>
+    </w:p>
+    <w:p>
+      <w:pPr>
         <w:sectPr>
           <w:pgSz w:w="11906" w:h="16838"/>
-          <w:pgMar w:top="714" w:right="1104" w:bottom="1160" w:left="1124" w:header="720" w:footer="720" w:gutter="0"/>
+          <w:pgMar w:top="676" w:right="1104" w:bottom="962" w:left="1124" w:header="720" w:footer="720" w:gutter="0"/>
           <w:cols/>
           <w:docGrid w:linePitch="360"/>
         </w:sectPr>
@@ -7497,66 +7629,7 @@
         </w:tabs>
         <w:autoSpaceDE w:val="0"/>
         <w:widowControl/>
-        <w:spacing w:line="328" w:lineRule="exact" w:before="0" w:after="0"/>
-        <w:ind w:left="330" w:right="0" w:firstLine="0"/>
-        <w:jc w:val="left"/>
-      </w:pPr>
-      <w:r>
-        <w:rPr>
-          <w:rFonts w:ascii="Helvetica" w:hAnsi="Helvetica" w:eastAsia="Helvetica"/>
-          <w:b w:val="0"/>
-          <w:i w:val="0"/>
-          <w:color w:val="333333"/>
-          <w:sz w:val="22"/>
-        </w:rPr>
-        <w:t>•</w:t>
-      </w:r>
-      <w:r>
-        <w:tab/>
-      </w:r>
-      <w:r>
-        <w:rPr>
-          <w:rFonts w:ascii="Helvetica" w:hAnsi="Helvetica" w:eastAsia="Helvetica"/>
-          <w:b/>
-          <w:i w:val="0"/>
-          <w:color w:val="333333"/>
-          <w:sz w:val="22"/>
-        </w:rPr>
-        <w:t>Random Forest:</w:t>
-      </w:r>
-      <w:r>
-        <w:rPr>
-          <w:rFonts w:ascii="Helvetica" w:hAnsi="Helvetica" w:eastAsia="Helvetica"/>
-          <w:b w:val="0"/>
-          <w:i w:val="0"/>
-          <w:color w:val="333333"/>
-          <w:sz w:val="22"/>
-        </w:rPr>
-        <w:t xml:space="preserve"> Averages many independent decision trees. By introducing randomness </w:t>
-      </w:r>
-      <w:r>
-        <w:tab/>
-      </w:r>
-      <w:r>
-        <w:rPr>
-          <w:rFonts w:ascii="Helvetica" w:hAnsi="Helvetica" w:eastAsia="Helvetica"/>
-          <w:b w:val="0"/>
-          <w:i w:val="0"/>
-          <w:color w:val="333333"/>
-          <w:sz w:val="22"/>
-        </w:rPr>
-        <w:t>during tree splitting, it reduces variance, increases stability, and provides robust predictions.</w:t>
-      </w:r>
-    </w:p>
-    <w:p>
-      <w:pPr>
-        <w:autoSpaceDN w:val="0"/>
-        <w:tabs>
-          <w:tab w:pos="660" w:val="left"/>
-        </w:tabs>
-        <w:autoSpaceDE w:val="0"/>
-        <w:widowControl/>
-        <w:spacing w:line="352" w:lineRule="exact" w:before="150" w:after="0"/>
+        <w:spacing w:line="336" w:lineRule="exact" w:before="0" w:after="0"/>
         <w:ind w:left="330" w:right="0" w:firstLine="0"/>
         <w:jc w:val="left"/>
       </w:pPr>
@@ -8698,9 +8771,821 @@
     </w:p>
     <w:p>
       <w:pPr>
+        <w:autoSpaceDN w:val="0"/>
+        <w:tabs>
+          <w:tab w:pos="660" w:val="left"/>
+        </w:tabs>
+        <w:autoSpaceDE w:val="0"/>
+        <w:widowControl/>
+        <w:spacing w:line="352" w:lineRule="exact" w:before="170" w:after="0"/>
+        <w:ind w:left="330" w:right="720" w:firstLine="0"/>
+        <w:jc w:val="left"/>
+      </w:pPr>
+      <w:r>
+        <w:rPr>
+          <w:rFonts w:ascii="Helvetica" w:hAnsi="Helvetica" w:eastAsia="Helvetica"/>
+          <w:b w:val="0"/>
+          <w:i w:val="0"/>
+          <w:color w:val="333333"/>
+          <w:sz w:val="22"/>
+        </w:rPr>
+        <w:t>•</w:t>
+      </w:r>
+      <w:r>
+        <w:tab/>
+      </w:r>
+      <w:r>
+        <w:rPr>
+          <w:rFonts w:ascii="Helvetica" w:hAnsi="Helvetica" w:eastAsia="Helvetica"/>
+          <w:b/>
+          <w:i w:val="0"/>
+          <w:color w:val="333333"/>
+          <w:sz w:val="22"/>
+        </w:rPr>
+        <w:t>Backend (</w:t>
+      </w:r>
+      <w:r>
+        <w:rPr>
+          <w:shd w:val="clear" w:color="auto" w:fill="f4f4f4"/>
+          <w:rFonts w:ascii="Courier" w:hAnsi="Courier" w:eastAsia="Courier"/>
+          <w:b/>
+          <w:i w:val="0"/>
+          <w:color w:val="333333"/>
+          <w:sz w:val="19"/>
+        </w:rPr>
+        <w:t>app.py</w:t>
+      </w:r>
+      <w:r>
+        <w:rPr>
+          <w:rFonts w:ascii="Helvetica" w:hAnsi="Helvetica" w:eastAsia="Helvetica"/>
+          <w:b/>
+          <w:i w:val="0"/>
+          <w:color w:val="333333"/>
+          <w:sz w:val="22"/>
+        </w:rPr>
+        <w:t>):</w:t>
+      </w:r>
+      <w:r>
+        <w:rPr>
+          <w:rFonts w:ascii="Helvetica" w:hAnsi="Helvetica" w:eastAsia="Helvetica"/>
+          <w:b w:val="0"/>
+          <w:i w:val="0"/>
+          <w:color w:val="333333"/>
+          <w:sz w:val="22"/>
+        </w:rPr>
+        <w:t xml:space="preserve"> Utilizes Flask. Loads serialized </w:t>
+      </w:r>
+      <w:r>
+        <w:rPr>
+          <w:shd w:val="clear" w:color="auto" w:fill="f4f4f4"/>
+          <w:rFonts w:ascii="Courier" w:hAnsi="Courier" w:eastAsia="Courier"/>
+          <w:b w:val="0"/>
+          <w:i w:val="0"/>
+          <w:color w:val="333333"/>
+          <w:sz w:val="19"/>
+        </w:rPr>
+        <w:t>preprocessor.joblib</w:t>
+      </w:r>
+      <w:r>
+        <w:rPr>
+          <w:rFonts w:ascii="Helvetica" w:hAnsi="Helvetica" w:eastAsia="Helvetica"/>
+          <w:b w:val="0"/>
+          <w:i w:val="0"/>
+          <w:color w:val="333333"/>
+          <w:sz w:val="22"/>
+        </w:rPr>
+        <w:t xml:space="preserve">, </w:t>
+      </w:r>
+      <w:r>
+        <w:br/>
+      </w:r>
+      <w:r>
+        <w:tab/>
+      </w:r>
+      <w:r>
+        <w:rPr>
+          <w:shd w:val="clear" w:color="auto" w:fill="f4f4f4"/>
+          <w:rFonts w:ascii="Courier" w:hAnsi="Courier" w:eastAsia="Courier"/>
+          <w:b w:val="0"/>
+          <w:i w:val="0"/>
+          <w:color w:val="333333"/>
+          <w:sz w:val="19"/>
+        </w:rPr>
+        <w:t>linear_regression_model.joblib</w:t>
+      </w:r>
+      <w:r>
+        <w:rPr>
+          <w:rFonts w:ascii="Helvetica" w:hAnsi="Helvetica" w:eastAsia="Helvetica"/>
+          <w:b w:val="0"/>
+          <w:i w:val="0"/>
+          <w:color w:val="333333"/>
+          <w:sz w:val="22"/>
+        </w:rPr>
+        <w:t xml:space="preserve">, </w:t>
+      </w:r>
+      <w:r>
+        <w:rPr>
+          <w:shd w:val="clear" w:color="auto" w:fill="f4f4f4"/>
+          <w:rFonts w:ascii="Courier" w:hAnsi="Courier" w:eastAsia="Courier"/>
+          <w:b w:val="0"/>
+          <w:i w:val="0"/>
+          <w:color w:val="333333"/>
+          <w:sz w:val="19"/>
+        </w:rPr>
+        <w:t>xgboost_model.joblib</w:t>
+      </w:r>
+      <w:r>
+        <w:rPr>
+          <w:rFonts w:ascii="Helvetica" w:hAnsi="Helvetica" w:eastAsia="Helvetica"/>
+          <w:b w:val="0"/>
+          <w:i w:val="0"/>
+          <w:color w:val="333333"/>
+          <w:sz w:val="22"/>
+        </w:rPr>
+        <w:t xml:space="preserve">, and </w:t>
+      </w:r>
+      <w:r>
+        <w:br/>
+      </w:r>
+      <w:r>
+        <w:tab/>
+      </w:r>
+      <w:r>
+        <w:rPr>
+          <w:shd w:val="clear" w:color="auto" w:fill="f4f4f4"/>
+          <w:rFonts w:ascii="Courier" w:hAnsi="Courier" w:eastAsia="Courier"/>
+          <w:b w:val="0"/>
+          <w:i w:val="0"/>
+          <w:color w:val="333333"/>
+          <w:sz w:val="19"/>
+        </w:rPr>
+        <w:t>random_forest_model.joblib</w:t>
+      </w:r>
+      <w:r>
+        <w:rPr>
+          <w:rFonts w:ascii="Helvetica" w:hAnsi="Helvetica" w:eastAsia="Helvetica"/>
+          <w:b w:val="0"/>
+          <w:i w:val="0"/>
+          <w:color w:val="333333"/>
+          <w:sz w:val="22"/>
+        </w:rPr>
+        <w:t xml:space="preserve"> on startup. Serves </w:t>
+      </w:r>
+      <w:r>
+        <w:rPr>
+          <w:shd w:val="clear" w:color="auto" w:fill="f4f4f4"/>
+          <w:rFonts w:ascii="Courier" w:hAnsi="Courier" w:eastAsia="Courier"/>
+          <w:b w:val="0"/>
+          <w:i w:val="0"/>
+          <w:color w:val="333333"/>
+          <w:sz w:val="19"/>
+        </w:rPr>
+        <w:t>/predict</w:t>
+      </w:r>
+      <w:r>
+        <w:rPr>
+          <w:rFonts w:ascii="Helvetica" w:hAnsi="Helvetica" w:eastAsia="Helvetica"/>
+          <w:b w:val="0"/>
+          <w:i w:val="0"/>
+          <w:color w:val="333333"/>
+          <w:sz w:val="22"/>
+        </w:rPr>
+        <w:t xml:space="preserve"> endpoint returning JSON </w:t>
+      </w:r>
+      <w:r>
+        <w:tab/>
+      </w:r>
+      <w:r>
+        <w:rPr>
+          <w:rFonts w:ascii="Helvetica" w:hAnsi="Helvetica" w:eastAsia="Helvetica"/>
+          <w:b w:val="0"/>
+          <w:i w:val="0"/>
+          <w:color w:val="333333"/>
+          <w:sz w:val="22"/>
+        </w:rPr>
+        <w:t>predictions.</w:t>
+      </w:r>
+    </w:p>
+    <w:p>
+      <w:pPr>
         <w:sectPr>
           <w:pgSz w:w="11906" w:h="16838"/>
-          <w:pgMar w:top="680" w:right="1104" w:bottom="1198" w:left="1124" w:header="720" w:footer="720" w:gutter="0"/>
+          <w:pgMar w:top="680" w:right="1104" w:bottom="836" w:left="1124" w:header="720" w:footer="720" w:gutter="0"/>
+          <w:cols/>
+          <w:docGrid w:linePitch="360"/>
+        </w:sectPr>
+      </w:pPr>
+    </w:p>
+    <w:p>
+      <w:pPr>
+        <w:autoSpaceDN w:val="0"/>
+        <w:autoSpaceDE w:val="0"/>
+        <w:widowControl/>
+        <w:spacing w:line="220" w:lineRule="exact" w:before="0" w:after="458"/>
+        <w:ind w:left="0" w:right="0"/>
+      </w:pPr>
+    </w:p>
+    <w:p>
+      <w:pPr>
+        <w:autoSpaceDN w:val="0"/>
+        <w:autoSpaceDE w:val="0"/>
+        <w:widowControl/>
+        <w:spacing w:line="328" w:lineRule="exact" w:before="0" w:after="0"/>
+        <w:ind w:left="660" w:right="288" w:firstLine="0"/>
+        <w:jc w:val="left"/>
+      </w:pPr>
+      <w:r>
+        <w:rPr>
+          <w:rFonts w:ascii="Helvetica" w:hAnsi="Helvetica" w:eastAsia="Helvetica"/>
+          <w:b/>
+          <w:i w:val="0"/>
+          <w:color w:val="333333"/>
+          <w:sz w:val="22"/>
+        </w:rPr>
+        <w:t>Frontend (</w:t>
+      </w:r>
+      <w:r>
+        <w:rPr>
+          <w:shd w:val="clear" w:color="auto" w:fill="f4f4f4"/>
+          <w:rFonts w:ascii="Courier" w:hAnsi="Courier" w:eastAsia="Courier"/>
+          <w:b/>
+          <w:i w:val="0"/>
+          <w:color w:val="333333"/>
+          <w:sz w:val="19"/>
+        </w:rPr>
+        <w:t>templates/index.html</w:t>
+      </w:r>
+      <w:r>
+        <w:rPr>
+          <w:rFonts w:ascii="Helvetica" w:hAnsi="Helvetica" w:eastAsia="Helvetica"/>
+          <w:b/>
+          <w:i w:val="0"/>
+          <w:color w:val="333333"/>
+          <w:sz w:val="22"/>
+        </w:rPr>
+        <w:t>):</w:t>
+      </w:r>
+      <w:r>
+        <w:rPr>
+          <w:rFonts w:ascii="Helvetica" w:hAnsi="Helvetica" w:eastAsia="Helvetica"/>
+          <w:b w:val="0"/>
+          <w:i w:val="0"/>
+          <w:color w:val="333333"/>
+          <w:sz w:val="22"/>
+        </w:rPr>
+        <w:t xml:space="preserve"> Glassmorphic web panel with Outfit typography and </w:t>
+      </w:r>
+      <w:r>
+        <w:rPr>
+          <w:rFonts w:ascii="Helvetica" w:hAnsi="Helvetica" w:eastAsia="Helvetica"/>
+          <w:b w:val="0"/>
+          <w:i w:val="0"/>
+          <w:color w:val="333333"/>
+          <w:sz w:val="22"/>
+        </w:rPr>
+        <w:t>dynamic dark mode sliders for all 10 features:</w:t>
+      </w:r>
+    </w:p>
+    <w:p>
+      <w:pPr>
+        <w:autoSpaceDN w:val="0"/>
+        <w:tabs>
+          <w:tab w:pos="990" w:val="left"/>
+        </w:tabs>
+        <w:autoSpaceDE w:val="0"/>
+        <w:widowControl/>
+        <w:spacing w:line="352" w:lineRule="exact" w:before="150" w:after="0"/>
+        <w:ind w:left="660" w:right="0" w:firstLine="0"/>
+        <w:jc w:val="left"/>
+      </w:pPr>
+      <w:r>
+        <w:rPr>
+          <w:rFonts w:ascii="Helvetica" w:hAnsi="Helvetica" w:eastAsia="Helvetica"/>
+          <w:b w:val="0"/>
+          <w:i w:val="0"/>
+          <w:color w:val="333333"/>
+          <w:sz w:val="22"/>
+        </w:rPr>
+        <w:t>•</w:t>
+      </w:r>
+      <w:r>
+        <w:tab/>
+      </w:r>
+      <w:r>
+        <w:rPr>
+          <w:rFonts w:ascii="Helvetica" w:hAnsi="Helvetica" w:eastAsia="Helvetica"/>
+          <w:b w:val="0"/>
+          <w:i/>
+          <w:color w:val="333333"/>
+          <w:sz w:val="22"/>
+        </w:rPr>
+        <w:t>Direct sliders:</w:t>
+      </w:r>
+      <w:r>
+        <w:rPr>
+          <w:rFonts w:ascii="Helvetica" w:hAnsi="Helvetica" w:eastAsia="Helvetica"/>
+          <w:b w:val="0"/>
+          <w:i w:val="0"/>
+          <w:color w:val="333333"/>
+          <w:sz w:val="22"/>
+        </w:rPr>
+        <w:t xml:space="preserve"> IncomeLevel, PropertyAge, TotalRooms, TotalBedrooms, AvgOccupancy, </w:t>
+      </w:r>
+      <w:r>
+        <w:tab/>
+      </w:r>
+      <w:r>
+        <w:rPr>
+          <w:rFonts w:ascii="Helvetica" w:hAnsi="Helvetica" w:eastAsia="Helvetica"/>
+          <w:b w:val="0"/>
+          <w:i w:val="0"/>
+          <w:color w:val="333333"/>
+          <w:sz w:val="22"/>
+        </w:rPr>
+        <w:t>RoomsPerHousehold, BedroomsRatio.</w:t>
+      </w:r>
+    </w:p>
+    <w:p>
+      <w:pPr>
+        <w:autoSpaceDN w:val="0"/>
+        <w:tabs>
+          <w:tab w:pos="990" w:val="left"/>
+        </w:tabs>
+        <w:autoSpaceDE w:val="0"/>
+        <w:widowControl/>
+        <w:spacing w:line="304" w:lineRule="exact" w:before="198" w:after="0"/>
+        <w:ind w:left="660" w:right="0" w:firstLine="0"/>
+        <w:jc w:val="left"/>
+      </w:pPr>
+      <w:r>
+        <w:rPr>
+          <w:rFonts w:ascii="Helvetica" w:hAnsi="Helvetica" w:eastAsia="Helvetica"/>
+          <w:b w:val="0"/>
+          <w:i w:val="0"/>
+          <w:color w:val="333333"/>
+          <w:sz w:val="22"/>
+        </w:rPr>
+        <w:t>•</w:t>
+      </w:r>
+      <w:r>
+        <w:tab/>
+      </w:r>
+      <w:r>
+        <w:rPr>
+          <w:rFonts w:ascii="Helvetica" w:hAnsi="Helvetica" w:eastAsia="Helvetica"/>
+          <w:b w:val="0"/>
+          <w:i/>
+          <w:color w:val="333333"/>
+          <w:sz w:val="22"/>
+        </w:rPr>
+        <w:t>Direct inputs:</w:t>
+      </w:r>
+      <w:r>
+        <w:rPr>
+          <w:rFonts w:ascii="Helvetica" w:hAnsi="Helvetica" w:eastAsia="Helvetica"/>
+          <w:b w:val="0"/>
+          <w:i w:val="0"/>
+          <w:color w:val="333333"/>
+          <w:sz w:val="22"/>
+        </w:rPr>
+        <w:t xml:space="preserve"> NeighborhoodPop, Latitude, Longitude.</w:t>
+      </w:r>
+    </w:p>
+    <w:p>
+      <w:pPr>
+        <w:autoSpaceDN w:val="0"/>
+        <w:tabs>
+          <w:tab w:pos="990" w:val="left"/>
+        </w:tabs>
+        <w:autoSpaceDE w:val="0"/>
+        <w:widowControl/>
+        <w:spacing w:line="352" w:lineRule="exact" w:before="150" w:after="0"/>
+        <w:ind w:left="660" w:right="864" w:firstLine="0"/>
+        <w:jc w:val="left"/>
+      </w:pPr>
+      <w:r>
+        <w:rPr>
+          <w:rFonts w:ascii="Helvetica" w:hAnsi="Helvetica" w:eastAsia="Helvetica"/>
+          <w:b w:val="0"/>
+          <w:i w:val="0"/>
+          <w:color w:val="333333"/>
+          <w:sz w:val="22"/>
+        </w:rPr>
+        <w:t>•</w:t>
+      </w:r>
+      <w:r>
+        <w:tab/>
+      </w:r>
+      <w:r>
+        <w:rPr>
+          <w:rFonts w:ascii="Helvetica" w:hAnsi="Helvetica" w:eastAsia="Helvetica"/>
+          <w:b w:val="0"/>
+          <w:i w:val="0"/>
+          <w:color w:val="333333"/>
+          <w:sz w:val="22"/>
+        </w:rPr>
+        <w:t xml:space="preserve">Live updates are sent asynchronously to the backend on slider adjust, updating </w:t>
+      </w:r>
+      <w:r>
+        <w:tab/>
+      </w:r>
+      <w:r>
+        <w:rPr>
+          <w:rFonts w:ascii="Helvetica" w:hAnsi="Helvetica" w:eastAsia="Helvetica"/>
+          <w:b w:val="0"/>
+          <w:i w:val="0"/>
+          <w:color w:val="333333"/>
+          <w:sz w:val="22"/>
+        </w:rPr>
+        <w:t>predicted prices dynamically with a neon green layout.</w:t>
+      </w:r>
+    </w:p>
+    <w:p>
+      <w:pPr>
+        <w:autoSpaceDN w:val="0"/>
+        <w:autoSpaceDE w:val="0"/>
+        <w:widowControl/>
+        <w:spacing w:line="412" w:lineRule="exact" w:before="1700" w:after="0"/>
+        <w:ind w:left="30" w:right="0" w:firstLine="0"/>
+        <w:jc w:val="left"/>
+      </w:pPr>
+      <w:r>
+        <w:rPr>
+          <w:rFonts w:ascii="Helvetica" w:hAnsi="Helvetica" w:eastAsia="Helvetica"/>
+          <w:b/>
+          <w:i w:val="0"/>
+          <w:color w:val="1F3A52"/>
+          <w:sz w:val="30"/>
+        </w:rPr>
+        <w:t>Section F: Critical Evaluation &amp; Limitations (10 Marks)</w:t>
+      </w:r>
+    </w:p>
+    <w:p>
+      <w:pPr>
+        <w:autoSpaceDN w:val="0"/>
+        <w:autoSpaceDE w:val="0"/>
+        <w:widowControl/>
+        <w:spacing w:line="332" w:lineRule="exact" w:before="528" w:after="0"/>
+        <w:ind w:left="30" w:right="0" w:firstLine="0"/>
+        <w:jc w:val="left"/>
+      </w:pPr>
+      <w:r>
+        <w:rPr>
+          <w:rFonts w:ascii="Helvetica" w:hAnsi="Helvetica" w:eastAsia="Helvetica"/>
+          <w:b/>
+          <w:i w:val="0"/>
+          <w:color w:val="1F3A52"/>
+          <w:sz w:val="24"/>
+        </w:rPr>
+        <w:t>1. Domain Suitability of the Model</w:t>
+      </w:r>
+    </w:p>
+    <w:p>
+      <w:pPr>
+        <w:autoSpaceDN w:val="0"/>
+        <w:tabs>
+          <w:tab w:pos="660" w:val="left"/>
+        </w:tabs>
+        <w:autoSpaceDE w:val="0"/>
+        <w:widowControl/>
+        <w:spacing w:line="352" w:lineRule="exact" w:before="170" w:after="0"/>
+        <w:ind w:left="330" w:right="288" w:firstLine="0"/>
+        <w:jc w:val="left"/>
+      </w:pPr>
+      <w:r>
+        <w:rPr>
+          <w:rFonts w:ascii="Helvetica" w:hAnsi="Helvetica" w:eastAsia="Helvetica"/>
+          <w:b w:val="0"/>
+          <w:i w:val="0"/>
+          <w:color w:val="333333"/>
+          <w:sz w:val="22"/>
+        </w:rPr>
+        <w:t>•</w:t>
+      </w:r>
+      <w:r>
+        <w:tab/>
+      </w:r>
+      <w:r>
+        <w:rPr>
+          <w:rFonts w:ascii="Helvetica" w:hAnsi="Helvetica" w:eastAsia="Helvetica"/>
+          <w:b w:val="0"/>
+          <w:i w:val="0"/>
+          <w:color w:val="333333"/>
+          <w:sz w:val="22"/>
+        </w:rPr>
+        <w:t xml:space="preserve">The Random Forest Regressor is highly suited for real estate valuation. It is robust to </w:t>
+      </w:r>
+      <w:r>
+        <w:tab/>
+      </w:r>
+      <w:r>
+        <w:rPr>
+          <w:rFonts w:ascii="Helvetica" w:hAnsi="Helvetica" w:eastAsia="Helvetica"/>
+          <w:b w:val="0"/>
+          <w:i w:val="0"/>
+          <w:color w:val="333333"/>
+          <w:sz w:val="22"/>
+        </w:rPr>
+        <w:t xml:space="preserve">outliers (which are common in real estate due to luxury housing spikes) and captures the </w:t>
+      </w:r>
+      <w:r>
+        <w:tab/>
+      </w:r>
+      <w:r>
+        <w:rPr>
+          <w:rFonts w:ascii="Helvetica" w:hAnsi="Helvetica" w:eastAsia="Helvetica"/>
+          <w:b w:val="0"/>
+          <w:i w:val="0"/>
+          <w:color w:val="333333"/>
+          <w:sz w:val="22"/>
+        </w:rPr>
+        <w:t>complex interactions between geographic coordinates and average occupancy.</w:t>
+      </w:r>
+    </w:p>
+    <w:p>
+      <w:pPr>
+        <w:autoSpaceDN w:val="0"/>
+        <w:autoSpaceDE w:val="0"/>
+        <w:widowControl/>
+        <w:spacing w:line="332" w:lineRule="exact" w:before="816" w:after="0"/>
+        <w:ind w:left="30" w:right="0" w:firstLine="0"/>
+        <w:jc w:val="left"/>
+      </w:pPr>
+      <w:r>
+        <w:rPr>
+          <w:rFonts w:ascii="Helvetica" w:hAnsi="Helvetica" w:eastAsia="Helvetica"/>
+          <w:b/>
+          <w:i w:val="0"/>
+          <w:color w:val="1F3A52"/>
+          <w:sz w:val="24"/>
+        </w:rPr>
+        <w:t>2. Suitability of Deep Learning</w:t>
+      </w:r>
+    </w:p>
+    <w:p>
+      <w:pPr>
+        <w:autoSpaceDN w:val="0"/>
+        <w:tabs>
+          <w:tab w:pos="660" w:val="left"/>
+        </w:tabs>
+        <w:autoSpaceDE w:val="0"/>
+        <w:widowControl/>
+        <w:spacing w:line="352" w:lineRule="exact" w:before="170" w:after="0"/>
+        <w:ind w:left="330" w:right="720" w:firstLine="0"/>
+        <w:jc w:val="left"/>
+      </w:pPr>
+      <w:r>
+        <w:rPr>
+          <w:rFonts w:ascii="Helvetica" w:hAnsi="Helvetica" w:eastAsia="Helvetica"/>
+          <w:b w:val="0"/>
+          <w:i w:val="0"/>
+          <w:color w:val="333333"/>
+          <w:sz w:val="22"/>
+        </w:rPr>
+        <w:t>•</w:t>
+      </w:r>
+      <w:r>
+        <w:tab/>
+      </w:r>
+      <w:r>
+        <w:rPr>
+          <w:rFonts w:ascii="Helvetica" w:hAnsi="Helvetica" w:eastAsia="Helvetica"/>
+          <w:b w:val="0"/>
+          <w:i w:val="0"/>
+          <w:color w:val="333333"/>
+          <w:sz w:val="22"/>
+        </w:rPr>
+        <w:t xml:space="preserve">While Deep Learning (e.g. MLPs) can approximate the spatial price function, it is less </w:t>
+      </w:r>
+      <w:r>
+        <w:tab/>
+      </w:r>
+      <w:r>
+        <w:rPr>
+          <w:rFonts w:ascii="Helvetica" w:hAnsi="Helvetica" w:eastAsia="Helvetica"/>
+          <w:b w:val="0"/>
+          <w:i w:val="0"/>
+          <w:color w:val="333333"/>
+          <w:sz w:val="22"/>
+        </w:rPr>
+        <w:t>suitable here due to:</w:t>
+      </w:r>
+    </w:p>
+    <w:p>
+      <w:pPr>
+        <w:autoSpaceDN w:val="0"/>
+        <w:tabs>
+          <w:tab w:pos="990" w:val="left"/>
+        </w:tabs>
+        <w:autoSpaceDE w:val="0"/>
+        <w:widowControl/>
+        <w:spacing w:line="352" w:lineRule="exact" w:before="150" w:after="0"/>
+        <w:ind w:left="660" w:right="1152" w:firstLine="0"/>
+        <w:jc w:val="left"/>
+      </w:pPr>
+      <w:r>
+        <w:rPr>
+          <w:rFonts w:ascii="Helvetica" w:hAnsi="Helvetica" w:eastAsia="Helvetica"/>
+          <w:b w:val="0"/>
+          <w:i w:val="0"/>
+          <w:color w:val="333333"/>
+          <w:sz w:val="22"/>
+        </w:rPr>
+        <w:t>•</w:t>
+      </w:r>
+      <w:r>
+        <w:tab/>
+      </w:r>
+      <w:r>
+        <w:rPr>
+          <w:rFonts w:ascii="Helvetica" w:hAnsi="Helvetica" w:eastAsia="Helvetica"/>
+          <w:b w:val="0"/>
+          <w:i/>
+          <w:color w:val="333333"/>
+          <w:sz w:val="22"/>
+        </w:rPr>
+        <w:t>Data scale:</w:t>
+      </w:r>
+      <w:r>
+        <w:rPr>
+          <w:rFonts w:ascii="Helvetica" w:hAnsi="Helvetica" w:eastAsia="Helvetica"/>
+          <w:b w:val="0"/>
+          <w:i w:val="0"/>
+          <w:color w:val="333333"/>
+          <w:sz w:val="22"/>
+        </w:rPr>
+        <w:t xml:space="preserve"> Tabular dataset size (15k rows) is too small to train large network </w:t>
+      </w:r>
+      <w:r>
+        <w:tab/>
+      </w:r>
+      <w:r>
+        <w:rPr>
+          <w:rFonts w:ascii="Helvetica" w:hAnsi="Helvetica" w:eastAsia="Helvetica"/>
+          <w:b w:val="0"/>
+          <w:i w:val="0"/>
+          <w:color w:val="333333"/>
+          <w:sz w:val="22"/>
+        </w:rPr>
+        <w:t>parameters without massive overfitting.</w:t>
+      </w:r>
+    </w:p>
+    <w:p>
+      <w:pPr>
+        <w:autoSpaceDN w:val="0"/>
+        <w:tabs>
+          <w:tab w:pos="990" w:val="left"/>
+        </w:tabs>
+        <w:autoSpaceDE w:val="0"/>
+        <w:widowControl/>
+        <w:spacing w:line="352" w:lineRule="exact" w:before="150" w:after="0"/>
+        <w:ind w:left="660" w:right="288" w:firstLine="0"/>
+        <w:jc w:val="left"/>
+      </w:pPr>
+      <w:r>
+        <w:rPr>
+          <w:rFonts w:ascii="Helvetica" w:hAnsi="Helvetica" w:eastAsia="Helvetica"/>
+          <w:b w:val="0"/>
+          <w:i w:val="0"/>
+          <w:color w:val="333333"/>
+          <w:sz w:val="22"/>
+        </w:rPr>
+        <w:t>•</w:t>
+      </w:r>
+      <w:r>
+        <w:tab/>
+      </w:r>
+      <w:r>
+        <w:rPr>
+          <w:rFonts w:ascii="Helvetica" w:hAnsi="Helvetica" w:eastAsia="Helvetica"/>
+          <w:b w:val="0"/>
+          <w:i/>
+          <w:color w:val="333333"/>
+          <w:sz w:val="22"/>
+        </w:rPr>
+        <w:t>Interpretability:</w:t>
+      </w:r>
+      <w:r>
+        <w:rPr>
+          <w:rFonts w:ascii="Helvetica" w:hAnsi="Helvetica" w:eastAsia="Helvetica"/>
+          <w:b w:val="0"/>
+          <w:i w:val="0"/>
+          <w:color w:val="333333"/>
+          <w:sz w:val="22"/>
+        </w:rPr>
+        <w:t xml:space="preserve"> Real estate appraisers require structural rules (e.g., how the bedrooms </w:t>
+      </w:r>
+      <w:r>
+        <w:tab/>
+      </w:r>
+      <w:r>
+        <w:rPr>
+          <w:rFonts w:ascii="Helvetica" w:hAnsi="Helvetica" w:eastAsia="Helvetica"/>
+          <w:b w:val="0"/>
+          <w:i w:val="0"/>
+          <w:color w:val="333333"/>
+          <w:sz w:val="22"/>
+        </w:rPr>
+        <w:t xml:space="preserve">ratio impacts price) which are inspectable in tree splits but completely hidden in deep </w:t>
+      </w:r>
+      <w:r>
+        <w:tab/>
+      </w:r>
+      <w:r>
+        <w:rPr>
+          <w:rFonts w:ascii="Helvetica" w:hAnsi="Helvetica" w:eastAsia="Helvetica"/>
+          <w:b w:val="0"/>
+          <w:i w:val="0"/>
+          <w:color w:val="333333"/>
+          <w:sz w:val="22"/>
+        </w:rPr>
+        <w:t>neural weights.</w:t>
+      </w:r>
+    </w:p>
+    <w:p>
+      <w:pPr>
+        <w:autoSpaceDN w:val="0"/>
+        <w:autoSpaceDE w:val="0"/>
+        <w:widowControl/>
+        <w:spacing w:line="332" w:lineRule="exact" w:before="1080" w:after="0"/>
+        <w:ind w:left="30" w:right="0" w:firstLine="0"/>
+        <w:jc w:val="left"/>
+      </w:pPr>
+      <w:r>
+        <w:rPr>
+          <w:rFonts w:ascii="Helvetica" w:hAnsi="Helvetica" w:eastAsia="Helvetica"/>
+          <w:b/>
+          <w:i w:val="0"/>
+          <w:color w:val="1F3A52"/>
+          <w:sz w:val="24"/>
+        </w:rPr>
+        <w:t>3. Limitations of the Current Approach</w:t>
+      </w:r>
+    </w:p>
+    <w:p>
+      <w:pPr>
+        <w:autoSpaceDN w:val="0"/>
+        <w:tabs>
+          <w:tab w:pos="660" w:val="left"/>
+        </w:tabs>
+        <w:autoSpaceDE w:val="0"/>
+        <w:widowControl/>
+        <w:spacing w:line="352" w:lineRule="exact" w:before="170" w:after="0"/>
+        <w:ind w:left="330" w:right="576" w:firstLine="0"/>
+        <w:jc w:val="left"/>
+      </w:pPr>
+      <w:r>
+        <w:rPr>
+          <w:rFonts w:ascii="Helvetica" w:hAnsi="Helvetica" w:eastAsia="Helvetica"/>
+          <w:b w:val="0"/>
+          <w:i w:val="0"/>
+          <w:color w:val="333333"/>
+          <w:sz w:val="22"/>
+        </w:rPr>
+        <w:t>•</w:t>
+      </w:r>
+      <w:r>
+        <w:tab/>
+      </w:r>
+      <w:r>
+        <w:rPr>
+          <w:rFonts w:ascii="Helvetica" w:hAnsi="Helvetica" w:eastAsia="Helvetica"/>
+          <w:b/>
+          <w:i w:val="0"/>
+          <w:color w:val="333333"/>
+          <w:sz w:val="22"/>
+        </w:rPr>
+        <w:t>Temporal Shift:</w:t>
+      </w:r>
+      <w:r>
+        <w:rPr>
+          <w:rFonts w:ascii="Helvetica" w:hAnsi="Helvetica" w:eastAsia="Helvetica"/>
+          <w:b w:val="0"/>
+          <w:i w:val="0"/>
+          <w:color w:val="333333"/>
+          <w:sz w:val="22"/>
+        </w:rPr>
+        <w:t xml:space="preserve"> The model does not include time metrics. Inflation, interest rates, and </w:t>
+      </w:r>
+      <w:r>
+        <w:tab/>
+      </w:r>
+      <w:r>
+        <w:rPr>
+          <w:rFonts w:ascii="Helvetica" w:hAnsi="Helvetica" w:eastAsia="Helvetica"/>
+          <w:b w:val="0"/>
+          <w:i w:val="0"/>
+          <w:color w:val="333333"/>
+          <w:sz w:val="22"/>
+        </w:rPr>
+        <w:t>seasonal spikes are completely ignored.</w:t>
+      </w:r>
+    </w:p>
+    <w:p>
+      <w:pPr>
+        <w:sectPr>
+          <w:pgSz w:w="11906" w:h="16838"/>
+          <w:pgMar w:top="680" w:right="1104" w:bottom="1024" w:left="1124" w:header="720" w:footer="720" w:gutter="0"/>
           <w:cols/>
           <w:docGrid w:linePitch="360"/>
         </w:sectPr>
@@ -8719,823 +9604,11 @@
       <w:pPr>
         <w:autoSpaceDN w:val="0"/>
         <w:tabs>
-          <w:tab w:pos="660" w:val="left"/>
-        </w:tabs>
-        <w:autoSpaceDE w:val="0"/>
-        <w:widowControl/>
-        <w:spacing w:line="340" w:lineRule="exact" w:before="0" w:after="0"/>
-        <w:ind w:left="330" w:right="720" w:firstLine="0"/>
-        <w:jc w:val="left"/>
-      </w:pPr>
-      <w:r>
-        <w:rPr>
-          <w:rFonts w:ascii="Helvetica" w:hAnsi="Helvetica" w:eastAsia="Helvetica"/>
-          <w:b w:val="0"/>
-          <w:i w:val="0"/>
-          <w:color w:val="333333"/>
-          <w:sz w:val="22"/>
-        </w:rPr>
-        <w:t>•</w:t>
-      </w:r>
-      <w:r>
-        <w:tab/>
-      </w:r>
-      <w:r>
-        <w:rPr>
-          <w:rFonts w:ascii="Helvetica" w:hAnsi="Helvetica" w:eastAsia="Helvetica"/>
-          <w:b/>
-          <w:i w:val="0"/>
-          <w:color w:val="333333"/>
-          <w:sz w:val="22"/>
-        </w:rPr>
-        <w:t>Backend (</w:t>
-      </w:r>
-      <w:r>
-        <w:rPr>
-          <w:shd w:val="clear" w:color="auto" w:fill="f4f4f4"/>
-          <w:rFonts w:ascii="Courier" w:hAnsi="Courier" w:eastAsia="Courier"/>
-          <w:b/>
-          <w:i w:val="0"/>
-          <w:color w:val="333333"/>
-          <w:sz w:val="19"/>
-        </w:rPr>
-        <w:t>app.py</w:t>
-      </w:r>
-      <w:r>
-        <w:rPr>
-          <w:rFonts w:ascii="Helvetica" w:hAnsi="Helvetica" w:eastAsia="Helvetica"/>
-          <w:b/>
-          <w:i w:val="0"/>
-          <w:color w:val="333333"/>
-          <w:sz w:val="22"/>
-        </w:rPr>
-        <w:t>):</w:t>
-      </w:r>
-      <w:r>
-        <w:rPr>
-          <w:rFonts w:ascii="Helvetica" w:hAnsi="Helvetica" w:eastAsia="Helvetica"/>
-          <w:b w:val="0"/>
-          <w:i w:val="0"/>
-          <w:color w:val="333333"/>
-          <w:sz w:val="22"/>
-        </w:rPr>
-        <w:t xml:space="preserve"> Utilizes Flask. Loads serialized </w:t>
-      </w:r>
-      <w:r>
-        <w:rPr>
-          <w:shd w:val="clear" w:color="auto" w:fill="f4f4f4"/>
-          <w:rFonts w:ascii="Courier" w:hAnsi="Courier" w:eastAsia="Courier"/>
-          <w:b w:val="0"/>
-          <w:i w:val="0"/>
-          <w:color w:val="333333"/>
-          <w:sz w:val="19"/>
-        </w:rPr>
-        <w:t>preprocessor.joblib</w:t>
-      </w:r>
-      <w:r>
-        <w:rPr>
-          <w:rFonts w:ascii="Helvetica" w:hAnsi="Helvetica" w:eastAsia="Helvetica"/>
-          <w:b w:val="0"/>
-          <w:i w:val="0"/>
-          <w:color w:val="333333"/>
-          <w:sz w:val="22"/>
-        </w:rPr>
-        <w:t xml:space="preserve">, </w:t>
-      </w:r>
-      <w:r>
-        <w:br/>
-      </w:r>
-      <w:r>
-        <w:tab/>
-      </w:r>
-      <w:r>
-        <w:rPr>
-          <w:shd w:val="clear" w:color="auto" w:fill="f4f4f4"/>
-          <w:rFonts w:ascii="Courier" w:hAnsi="Courier" w:eastAsia="Courier"/>
-          <w:b w:val="0"/>
-          <w:i w:val="0"/>
-          <w:color w:val="333333"/>
-          <w:sz w:val="19"/>
-        </w:rPr>
-        <w:t>linear_regression_model.joblib</w:t>
-      </w:r>
-      <w:r>
-        <w:rPr>
-          <w:rFonts w:ascii="Helvetica" w:hAnsi="Helvetica" w:eastAsia="Helvetica"/>
-          <w:b w:val="0"/>
-          <w:i w:val="0"/>
-          <w:color w:val="333333"/>
-          <w:sz w:val="22"/>
-        </w:rPr>
-        <w:t xml:space="preserve">, </w:t>
-      </w:r>
-      <w:r>
-        <w:rPr>
-          <w:shd w:val="clear" w:color="auto" w:fill="f4f4f4"/>
-          <w:rFonts w:ascii="Courier" w:hAnsi="Courier" w:eastAsia="Courier"/>
-          <w:b w:val="0"/>
-          <w:i w:val="0"/>
-          <w:color w:val="333333"/>
-          <w:sz w:val="19"/>
-        </w:rPr>
-        <w:t>xgboost_model.joblib</w:t>
-      </w:r>
-      <w:r>
-        <w:rPr>
-          <w:rFonts w:ascii="Helvetica" w:hAnsi="Helvetica" w:eastAsia="Helvetica"/>
-          <w:b w:val="0"/>
-          <w:i w:val="0"/>
-          <w:color w:val="333333"/>
-          <w:sz w:val="22"/>
-        </w:rPr>
-        <w:t xml:space="preserve">, and </w:t>
-      </w:r>
-      <w:r>
-        <w:br/>
-      </w:r>
-      <w:r>
-        <w:tab/>
-      </w:r>
-      <w:r>
-        <w:rPr>
-          <w:shd w:val="clear" w:color="auto" w:fill="f4f4f4"/>
-          <w:rFonts w:ascii="Courier" w:hAnsi="Courier" w:eastAsia="Courier"/>
-          <w:b w:val="0"/>
-          <w:i w:val="0"/>
-          <w:color w:val="333333"/>
-          <w:sz w:val="19"/>
-        </w:rPr>
-        <w:t>random_forest_model.joblib</w:t>
-      </w:r>
-      <w:r>
-        <w:rPr>
-          <w:rFonts w:ascii="Helvetica" w:hAnsi="Helvetica" w:eastAsia="Helvetica"/>
-          <w:b w:val="0"/>
-          <w:i w:val="0"/>
-          <w:color w:val="333333"/>
-          <w:sz w:val="22"/>
-        </w:rPr>
-        <w:t xml:space="preserve"> on startup. Serves </w:t>
-      </w:r>
-      <w:r>
-        <w:rPr>
-          <w:shd w:val="clear" w:color="auto" w:fill="f4f4f4"/>
-          <w:rFonts w:ascii="Courier" w:hAnsi="Courier" w:eastAsia="Courier"/>
-          <w:b w:val="0"/>
-          <w:i w:val="0"/>
-          <w:color w:val="333333"/>
-          <w:sz w:val="19"/>
-        </w:rPr>
-        <w:t>/predict</w:t>
-      </w:r>
-      <w:r>
-        <w:rPr>
-          <w:rFonts w:ascii="Helvetica" w:hAnsi="Helvetica" w:eastAsia="Helvetica"/>
-          <w:b w:val="0"/>
-          <w:i w:val="0"/>
-          <w:color w:val="333333"/>
-          <w:sz w:val="22"/>
-        </w:rPr>
-        <w:t xml:space="preserve"> endpoint returning JSON </w:t>
-      </w:r>
-      <w:r>
-        <w:tab/>
-      </w:r>
-      <w:r>
-        <w:rPr>
-          <w:rFonts w:ascii="Helvetica" w:hAnsi="Helvetica" w:eastAsia="Helvetica"/>
-          <w:b w:val="0"/>
-          <w:i w:val="0"/>
-          <w:color w:val="333333"/>
-          <w:sz w:val="22"/>
-        </w:rPr>
-        <w:t>predictions.</w:t>
-      </w:r>
-    </w:p>
-    <w:p>
-      <w:pPr>
-        <w:autoSpaceDN w:val="0"/>
-        <w:autoSpaceDE w:val="0"/>
-        <w:widowControl/>
-        <w:spacing w:line="344" w:lineRule="exact" w:before="166" w:after="0"/>
-        <w:ind w:left="660" w:right="288" w:firstLine="0"/>
-        <w:jc w:val="left"/>
-      </w:pPr>
-      <w:r>
-        <w:rPr>
-          <w:rFonts w:ascii="Helvetica" w:hAnsi="Helvetica" w:eastAsia="Helvetica"/>
-          <w:b/>
-          <w:i w:val="0"/>
-          <w:color w:val="333333"/>
-          <w:sz w:val="22"/>
-        </w:rPr>
-        <w:t>Frontend (</w:t>
-      </w:r>
-      <w:r>
-        <w:rPr>
-          <w:shd w:val="clear" w:color="auto" w:fill="f4f4f4"/>
-          <w:rFonts w:ascii="Courier" w:hAnsi="Courier" w:eastAsia="Courier"/>
-          <w:b/>
-          <w:i w:val="0"/>
-          <w:color w:val="333333"/>
-          <w:sz w:val="19"/>
-        </w:rPr>
-        <w:t>templates/index.html</w:t>
-      </w:r>
-      <w:r>
-        <w:rPr>
-          <w:rFonts w:ascii="Helvetica" w:hAnsi="Helvetica" w:eastAsia="Helvetica"/>
-          <w:b/>
-          <w:i w:val="0"/>
-          <w:color w:val="333333"/>
-          <w:sz w:val="22"/>
-        </w:rPr>
-        <w:t>):</w:t>
-      </w:r>
-      <w:r>
-        <w:rPr>
-          <w:rFonts w:ascii="Helvetica" w:hAnsi="Helvetica" w:eastAsia="Helvetica"/>
-          <w:b w:val="0"/>
-          <w:i w:val="0"/>
-          <w:color w:val="333333"/>
-          <w:sz w:val="22"/>
-        </w:rPr>
-        <w:t xml:space="preserve"> Glassmorphic web panel with Outfit typography and </w:t>
-      </w:r>
-      <w:r>
-        <w:rPr>
-          <w:rFonts w:ascii="Helvetica" w:hAnsi="Helvetica" w:eastAsia="Helvetica"/>
-          <w:b w:val="0"/>
-          <w:i w:val="0"/>
-          <w:color w:val="333333"/>
-          <w:sz w:val="22"/>
-        </w:rPr>
-        <w:t>dynamic dark mode sliders for all 10 features:</w:t>
-      </w:r>
-    </w:p>
-    <w:p>
-      <w:pPr>
-        <w:autoSpaceDN w:val="0"/>
-        <w:tabs>
-          <w:tab w:pos="990" w:val="left"/>
-        </w:tabs>
-        <w:autoSpaceDE w:val="0"/>
-        <w:widowControl/>
-        <w:spacing w:line="352" w:lineRule="exact" w:before="150" w:after="0"/>
-        <w:ind w:left="660" w:right="0" w:firstLine="0"/>
-        <w:jc w:val="left"/>
-      </w:pPr>
-      <w:r>
-        <w:rPr>
-          <w:rFonts w:ascii="Helvetica" w:hAnsi="Helvetica" w:eastAsia="Helvetica"/>
-          <w:b w:val="0"/>
-          <w:i w:val="0"/>
-          <w:color w:val="333333"/>
-          <w:sz w:val="22"/>
-        </w:rPr>
-        <w:t>•</w:t>
-      </w:r>
-      <w:r>
-        <w:tab/>
-      </w:r>
-      <w:r>
-        <w:rPr>
-          <w:rFonts w:ascii="Helvetica" w:hAnsi="Helvetica" w:eastAsia="Helvetica"/>
-          <w:b w:val="0"/>
-          <w:i/>
-          <w:color w:val="333333"/>
-          <w:sz w:val="22"/>
-        </w:rPr>
-        <w:t>Direct sliders:</w:t>
-      </w:r>
-      <w:r>
-        <w:rPr>
-          <w:rFonts w:ascii="Helvetica" w:hAnsi="Helvetica" w:eastAsia="Helvetica"/>
-          <w:b w:val="0"/>
-          <w:i w:val="0"/>
-          <w:color w:val="333333"/>
-          <w:sz w:val="22"/>
-        </w:rPr>
-        <w:t xml:space="preserve"> IncomeLevel, PropertyAge, TotalRooms, TotalBedrooms, AvgOccupancy, </w:t>
-      </w:r>
-      <w:r>
-        <w:tab/>
-      </w:r>
-      <w:r>
-        <w:rPr>
-          <w:rFonts w:ascii="Helvetica" w:hAnsi="Helvetica" w:eastAsia="Helvetica"/>
-          <w:b w:val="0"/>
-          <w:i w:val="0"/>
-          <w:color w:val="333333"/>
-          <w:sz w:val="22"/>
-        </w:rPr>
-        <w:t>RoomsPerHousehold, BedroomsRatio.</w:t>
-      </w:r>
-    </w:p>
-    <w:p>
-      <w:pPr>
-        <w:autoSpaceDN w:val="0"/>
-        <w:tabs>
-          <w:tab w:pos="990" w:val="left"/>
-        </w:tabs>
-        <w:autoSpaceDE w:val="0"/>
-        <w:widowControl/>
-        <w:spacing w:line="304" w:lineRule="exact" w:before="198" w:after="0"/>
-        <w:ind w:left="660" w:right="0" w:firstLine="0"/>
-        <w:jc w:val="left"/>
-      </w:pPr>
-      <w:r>
-        <w:rPr>
-          <w:rFonts w:ascii="Helvetica" w:hAnsi="Helvetica" w:eastAsia="Helvetica"/>
-          <w:b w:val="0"/>
-          <w:i w:val="0"/>
-          <w:color w:val="333333"/>
-          <w:sz w:val="22"/>
-        </w:rPr>
-        <w:t>•</w:t>
-      </w:r>
-      <w:r>
-        <w:tab/>
-      </w:r>
-      <w:r>
-        <w:rPr>
-          <w:rFonts w:ascii="Helvetica" w:hAnsi="Helvetica" w:eastAsia="Helvetica"/>
-          <w:b w:val="0"/>
-          <w:i/>
-          <w:color w:val="333333"/>
-          <w:sz w:val="22"/>
-        </w:rPr>
-        <w:t>Direct inputs:</w:t>
-      </w:r>
-      <w:r>
-        <w:rPr>
-          <w:rFonts w:ascii="Helvetica" w:hAnsi="Helvetica" w:eastAsia="Helvetica"/>
-          <w:b w:val="0"/>
-          <w:i w:val="0"/>
-          <w:color w:val="333333"/>
-          <w:sz w:val="22"/>
-        </w:rPr>
-        <w:t xml:space="preserve"> NeighborhoodPop, Latitude, Longitude.</w:t>
-      </w:r>
-    </w:p>
-    <w:p>
-      <w:pPr>
-        <w:autoSpaceDN w:val="0"/>
-        <w:tabs>
-          <w:tab w:pos="990" w:val="left"/>
-        </w:tabs>
-        <w:autoSpaceDE w:val="0"/>
-        <w:widowControl/>
-        <w:spacing w:line="352" w:lineRule="exact" w:before="150" w:after="0"/>
-        <w:ind w:left="660" w:right="864" w:firstLine="0"/>
-        <w:jc w:val="left"/>
-      </w:pPr>
-      <w:r>
-        <w:rPr>
-          <w:rFonts w:ascii="Helvetica" w:hAnsi="Helvetica" w:eastAsia="Helvetica"/>
-          <w:b w:val="0"/>
-          <w:i w:val="0"/>
-          <w:color w:val="333333"/>
-          <w:sz w:val="22"/>
-        </w:rPr>
-        <w:t>•</w:t>
-      </w:r>
-      <w:r>
-        <w:tab/>
-      </w:r>
-      <w:r>
-        <w:rPr>
-          <w:rFonts w:ascii="Helvetica" w:hAnsi="Helvetica" w:eastAsia="Helvetica"/>
-          <w:b w:val="0"/>
-          <w:i w:val="0"/>
-          <w:color w:val="333333"/>
-          <w:sz w:val="22"/>
-        </w:rPr>
-        <w:t xml:space="preserve">Live updates are sent asynchronously to the backend on slider adjust, updating </w:t>
-      </w:r>
-      <w:r>
-        <w:tab/>
-      </w:r>
-      <w:r>
-        <w:rPr>
-          <w:rFonts w:ascii="Helvetica" w:hAnsi="Helvetica" w:eastAsia="Helvetica"/>
-          <w:b w:val="0"/>
-          <w:i w:val="0"/>
-          <w:color w:val="333333"/>
-          <w:sz w:val="22"/>
-        </w:rPr>
-        <w:t>predicted prices dynamically with a neon green layout.</w:t>
-      </w:r>
-    </w:p>
-    <w:p>
-      <w:pPr>
-        <w:autoSpaceDN w:val="0"/>
-        <w:autoSpaceDE w:val="0"/>
-        <w:widowControl/>
-        <w:spacing w:line="412" w:lineRule="exact" w:before="1700" w:after="0"/>
-        <w:ind w:left="30" w:right="0" w:firstLine="0"/>
-        <w:jc w:val="left"/>
-      </w:pPr>
-      <w:r>
-        <w:rPr>
-          <w:rFonts w:ascii="Helvetica" w:hAnsi="Helvetica" w:eastAsia="Helvetica"/>
-          <w:b/>
-          <w:i w:val="0"/>
-          <w:color w:val="1F3A52"/>
-          <w:sz w:val="30"/>
-        </w:rPr>
-        <w:t>Section F: Critical Evaluation &amp; Limitations (10 Marks)</w:t>
-      </w:r>
-    </w:p>
-    <w:p>
-      <w:pPr>
-        <w:autoSpaceDN w:val="0"/>
-        <w:autoSpaceDE w:val="0"/>
-        <w:widowControl/>
-        <w:spacing w:line="332" w:lineRule="exact" w:before="528" w:after="0"/>
-        <w:ind w:left="30" w:right="0" w:firstLine="0"/>
-        <w:jc w:val="left"/>
-      </w:pPr>
-      <w:r>
-        <w:rPr>
-          <w:rFonts w:ascii="Helvetica" w:hAnsi="Helvetica" w:eastAsia="Helvetica"/>
-          <w:b/>
-          <w:i w:val="0"/>
-          <w:color w:val="1F3A52"/>
-          <w:sz w:val="24"/>
-        </w:rPr>
-        <w:t>1. Domain Suitability of the Model</w:t>
-      </w:r>
-    </w:p>
-    <w:p>
-      <w:pPr>
-        <w:autoSpaceDN w:val="0"/>
-        <w:tabs>
-          <w:tab w:pos="660" w:val="left"/>
-        </w:tabs>
-        <w:autoSpaceDE w:val="0"/>
-        <w:widowControl/>
-        <w:spacing w:line="352" w:lineRule="exact" w:before="170" w:after="0"/>
-        <w:ind w:left="330" w:right="288" w:firstLine="0"/>
-        <w:jc w:val="left"/>
-      </w:pPr>
-      <w:r>
-        <w:rPr>
-          <w:rFonts w:ascii="Helvetica" w:hAnsi="Helvetica" w:eastAsia="Helvetica"/>
-          <w:b w:val="0"/>
-          <w:i w:val="0"/>
-          <w:color w:val="333333"/>
-          <w:sz w:val="22"/>
-        </w:rPr>
-        <w:t>•</w:t>
-      </w:r>
-      <w:r>
-        <w:tab/>
-      </w:r>
-      <w:r>
-        <w:rPr>
-          <w:rFonts w:ascii="Helvetica" w:hAnsi="Helvetica" w:eastAsia="Helvetica"/>
-          <w:b w:val="0"/>
-          <w:i w:val="0"/>
-          <w:color w:val="333333"/>
-          <w:sz w:val="22"/>
-        </w:rPr>
-        <w:t xml:space="preserve">The Random Forest Regressor is highly suited for real estate valuation. It is robust to </w:t>
-      </w:r>
-      <w:r>
-        <w:tab/>
-      </w:r>
-      <w:r>
-        <w:rPr>
-          <w:rFonts w:ascii="Helvetica" w:hAnsi="Helvetica" w:eastAsia="Helvetica"/>
-          <w:b w:val="0"/>
-          <w:i w:val="0"/>
-          <w:color w:val="333333"/>
-          <w:sz w:val="22"/>
-        </w:rPr>
-        <w:t xml:space="preserve">outliers (which are common in real estate due to luxury housing spikes) and captures the </w:t>
-      </w:r>
-      <w:r>
-        <w:tab/>
-      </w:r>
-      <w:r>
-        <w:rPr>
-          <w:rFonts w:ascii="Helvetica" w:hAnsi="Helvetica" w:eastAsia="Helvetica"/>
-          <w:b w:val="0"/>
-          <w:i w:val="0"/>
-          <w:color w:val="333333"/>
-          <w:sz w:val="22"/>
-        </w:rPr>
-        <w:t>complex interactions between geographic coordinates and average occupancy.</w:t>
-      </w:r>
-    </w:p>
-    <w:p>
-      <w:pPr>
-        <w:autoSpaceDN w:val="0"/>
-        <w:autoSpaceDE w:val="0"/>
-        <w:widowControl/>
-        <w:spacing w:line="332" w:lineRule="exact" w:before="816" w:after="0"/>
-        <w:ind w:left="30" w:right="0" w:firstLine="0"/>
-        <w:jc w:val="left"/>
-      </w:pPr>
-      <w:r>
-        <w:rPr>
-          <w:rFonts w:ascii="Helvetica" w:hAnsi="Helvetica" w:eastAsia="Helvetica"/>
-          <w:b/>
-          <w:i w:val="0"/>
-          <w:color w:val="1F3A52"/>
-          <w:sz w:val="24"/>
-        </w:rPr>
-        <w:t>2. Suitability of Deep Learning</w:t>
-      </w:r>
-    </w:p>
-    <w:p>
-      <w:pPr>
-        <w:autoSpaceDN w:val="0"/>
-        <w:tabs>
-          <w:tab w:pos="660" w:val="left"/>
-        </w:tabs>
-        <w:autoSpaceDE w:val="0"/>
-        <w:widowControl/>
-        <w:spacing w:line="352" w:lineRule="exact" w:before="170" w:after="0"/>
-        <w:ind w:left="330" w:right="720" w:firstLine="0"/>
-        <w:jc w:val="left"/>
-      </w:pPr>
-      <w:r>
-        <w:rPr>
-          <w:rFonts w:ascii="Helvetica" w:hAnsi="Helvetica" w:eastAsia="Helvetica"/>
-          <w:b w:val="0"/>
-          <w:i w:val="0"/>
-          <w:color w:val="333333"/>
-          <w:sz w:val="22"/>
-        </w:rPr>
-        <w:t>•</w:t>
-      </w:r>
-      <w:r>
-        <w:tab/>
-      </w:r>
-      <w:r>
-        <w:rPr>
-          <w:rFonts w:ascii="Helvetica" w:hAnsi="Helvetica" w:eastAsia="Helvetica"/>
-          <w:b w:val="0"/>
-          <w:i w:val="0"/>
-          <w:color w:val="333333"/>
-          <w:sz w:val="22"/>
-        </w:rPr>
-        <w:t xml:space="preserve">While Deep Learning (e.g. MLPs) can approximate the spatial price function, it is less </w:t>
-      </w:r>
-      <w:r>
-        <w:tab/>
-      </w:r>
-      <w:r>
-        <w:rPr>
-          <w:rFonts w:ascii="Helvetica" w:hAnsi="Helvetica" w:eastAsia="Helvetica"/>
-          <w:b w:val="0"/>
-          <w:i w:val="0"/>
-          <w:color w:val="333333"/>
-          <w:sz w:val="22"/>
-        </w:rPr>
-        <w:t>suitable here due to:</w:t>
-      </w:r>
-    </w:p>
-    <w:p>
-      <w:pPr>
-        <w:autoSpaceDN w:val="0"/>
-        <w:tabs>
-          <w:tab w:pos="990" w:val="left"/>
-        </w:tabs>
-        <w:autoSpaceDE w:val="0"/>
-        <w:widowControl/>
-        <w:spacing w:line="352" w:lineRule="exact" w:before="150" w:after="0"/>
-        <w:ind w:left="660" w:right="1152" w:firstLine="0"/>
-        <w:jc w:val="left"/>
-      </w:pPr>
-      <w:r>
-        <w:rPr>
-          <w:rFonts w:ascii="Helvetica" w:hAnsi="Helvetica" w:eastAsia="Helvetica"/>
-          <w:b w:val="0"/>
-          <w:i w:val="0"/>
-          <w:color w:val="333333"/>
-          <w:sz w:val="22"/>
-        </w:rPr>
-        <w:t>•</w:t>
-      </w:r>
-      <w:r>
-        <w:tab/>
-      </w:r>
-      <w:r>
-        <w:rPr>
-          <w:rFonts w:ascii="Helvetica" w:hAnsi="Helvetica" w:eastAsia="Helvetica"/>
-          <w:b w:val="0"/>
-          <w:i/>
-          <w:color w:val="333333"/>
-          <w:sz w:val="22"/>
-        </w:rPr>
-        <w:t>Data scale:</w:t>
-      </w:r>
-      <w:r>
-        <w:rPr>
-          <w:rFonts w:ascii="Helvetica" w:hAnsi="Helvetica" w:eastAsia="Helvetica"/>
-          <w:b w:val="0"/>
-          <w:i w:val="0"/>
-          <w:color w:val="333333"/>
-          <w:sz w:val="22"/>
-        </w:rPr>
-        <w:t xml:space="preserve"> Tabular dataset size (15k rows) is too small to train large network </w:t>
-      </w:r>
-      <w:r>
-        <w:tab/>
-      </w:r>
-      <w:r>
-        <w:rPr>
-          <w:rFonts w:ascii="Helvetica" w:hAnsi="Helvetica" w:eastAsia="Helvetica"/>
-          <w:b w:val="0"/>
-          <w:i w:val="0"/>
-          <w:color w:val="333333"/>
-          <w:sz w:val="22"/>
-        </w:rPr>
-        <w:t>parameters without massive overfitting.</w:t>
-      </w:r>
-    </w:p>
-    <w:p>
-      <w:pPr>
-        <w:autoSpaceDN w:val="0"/>
-        <w:tabs>
-          <w:tab w:pos="990" w:val="left"/>
-        </w:tabs>
-        <w:autoSpaceDE w:val="0"/>
-        <w:widowControl/>
-        <w:spacing w:line="352" w:lineRule="exact" w:before="150" w:after="0"/>
-        <w:ind w:left="660" w:right="288" w:firstLine="0"/>
-        <w:jc w:val="left"/>
-      </w:pPr>
-      <w:r>
-        <w:rPr>
-          <w:rFonts w:ascii="Helvetica" w:hAnsi="Helvetica" w:eastAsia="Helvetica"/>
-          <w:b w:val="0"/>
-          <w:i w:val="0"/>
-          <w:color w:val="333333"/>
-          <w:sz w:val="22"/>
-        </w:rPr>
-        <w:t>•</w:t>
-      </w:r>
-      <w:r>
-        <w:tab/>
-      </w:r>
-      <w:r>
-        <w:rPr>
-          <w:rFonts w:ascii="Helvetica" w:hAnsi="Helvetica" w:eastAsia="Helvetica"/>
-          <w:b w:val="0"/>
-          <w:i/>
-          <w:color w:val="333333"/>
-          <w:sz w:val="22"/>
-        </w:rPr>
-        <w:t>Interpretability:</w:t>
-      </w:r>
-      <w:r>
-        <w:rPr>
-          <w:rFonts w:ascii="Helvetica" w:hAnsi="Helvetica" w:eastAsia="Helvetica"/>
-          <w:b w:val="0"/>
-          <w:i w:val="0"/>
-          <w:color w:val="333333"/>
-          <w:sz w:val="22"/>
-        </w:rPr>
-        <w:t xml:space="preserve"> Real estate appraisers require structural rules (e.g., how the bedrooms </w:t>
-      </w:r>
-      <w:r>
-        <w:tab/>
-      </w:r>
-      <w:r>
-        <w:rPr>
-          <w:rFonts w:ascii="Helvetica" w:hAnsi="Helvetica" w:eastAsia="Helvetica"/>
-          <w:b w:val="0"/>
-          <w:i w:val="0"/>
-          <w:color w:val="333333"/>
-          <w:sz w:val="22"/>
-        </w:rPr>
-        <w:t xml:space="preserve">ratio impacts price) which are inspectable in tree splits but completely hidden in deep </w:t>
-      </w:r>
-      <w:r>
-        <w:tab/>
-      </w:r>
-      <w:r>
-        <w:rPr>
-          <w:rFonts w:ascii="Helvetica" w:hAnsi="Helvetica" w:eastAsia="Helvetica"/>
-          <w:b w:val="0"/>
-          <w:i w:val="0"/>
-          <w:color w:val="333333"/>
-          <w:sz w:val="22"/>
-        </w:rPr>
-        <w:t>neural weights.</w:t>
-      </w:r>
-    </w:p>
-    <w:p>
-      <w:pPr>
-        <w:sectPr>
-          <w:pgSz w:w="11906" w:h="16838"/>
-          <w:pgMar w:top="680" w:right="1104" w:bottom="1388" w:left="1124" w:header="720" w:footer="720" w:gutter="0"/>
-          <w:cols/>
-          <w:docGrid w:linePitch="360"/>
-        </w:sectPr>
-      </w:pPr>
-    </w:p>
-    <w:p>
-      <w:pPr>
-        <w:autoSpaceDN w:val="0"/>
-        <w:autoSpaceDE w:val="0"/>
-        <w:widowControl/>
-        <w:spacing w:line="220" w:lineRule="exact" w:before="0" w:after="456"/>
-        <w:ind w:left="0" w:right="0"/>
-      </w:pPr>
-    </w:p>
-    <w:p>
-      <w:pPr>
-        <w:autoSpaceDN w:val="0"/>
-        <w:autoSpaceDE w:val="0"/>
-        <w:widowControl/>
-        <w:spacing w:line="332" w:lineRule="exact" w:before="0" w:after="0"/>
-        <w:ind w:left="0" w:right="0" w:firstLine="0"/>
-        <w:jc w:val="left"/>
-      </w:pPr>
-      <w:r>
-        <w:rPr>
-          <w:rFonts w:ascii="Helvetica" w:hAnsi="Helvetica" w:eastAsia="Helvetica"/>
-          <w:b/>
-          <w:i w:val="0"/>
-          <w:color w:val="1F3A52"/>
-          <w:sz w:val="24"/>
-        </w:rPr>
-        <w:t>3. Limitations of the Current Approach</w:t>
-      </w:r>
-    </w:p>
-    <w:p>
-      <w:pPr>
-        <w:autoSpaceDN w:val="0"/>
-        <w:tabs>
           <w:tab w:pos="630" w:val="left"/>
         </w:tabs>
         <w:autoSpaceDE w:val="0"/>
         <w:widowControl/>
-        <w:spacing w:line="352" w:lineRule="exact" w:before="170" w:after="0"/>
-        <w:ind w:left="300" w:right="144" w:firstLine="0"/>
-        <w:jc w:val="left"/>
-      </w:pPr>
-      <w:r>
-        <w:rPr>
-          <w:rFonts w:ascii="Helvetica" w:hAnsi="Helvetica" w:eastAsia="Helvetica"/>
-          <w:b w:val="0"/>
-          <w:i w:val="0"/>
-          <w:color w:val="333333"/>
-          <w:sz w:val="22"/>
-        </w:rPr>
-        <w:t>•</w:t>
-      </w:r>
-      <w:r>
-        <w:tab/>
-      </w:r>
-      <w:r>
-        <w:rPr>
-          <w:rFonts w:ascii="Helvetica" w:hAnsi="Helvetica" w:eastAsia="Helvetica"/>
-          <w:b/>
-          <w:i w:val="0"/>
-          <w:color w:val="333333"/>
-          <w:sz w:val="22"/>
-        </w:rPr>
-        <w:t>Temporal Shift:</w:t>
-      </w:r>
-      <w:r>
-        <w:rPr>
-          <w:rFonts w:ascii="Helvetica" w:hAnsi="Helvetica" w:eastAsia="Helvetica"/>
-          <w:b w:val="0"/>
-          <w:i w:val="0"/>
-          <w:color w:val="333333"/>
-          <w:sz w:val="22"/>
-        </w:rPr>
-        <w:t xml:space="preserve"> The model does not include time metrics. Inflation, interest rates, and </w:t>
-      </w:r>
-      <w:r>
-        <w:tab/>
-      </w:r>
-      <w:r>
-        <w:rPr>
-          <w:rFonts w:ascii="Helvetica" w:hAnsi="Helvetica" w:eastAsia="Helvetica"/>
-          <w:b w:val="0"/>
-          <w:i w:val="0"/>
-          <w:color w:val="333333"/>
-          <w:sz w:val="22"/>
-        </w:rPr>
-        <w:t>seasonal spikes are completely ignored.</w:t>
-      </w:r>
-    </w:p>
-    <w:p>
-      <w:pPr>
-        <w:autoSpaceDN w:val="0"/>
-        <w:tabs>
-          <w:tab w:pos="630" w:val="left"/>
-        </w:tabs>
-        <w:autoSpaceDE w:val="0"/>
-        <w:widowControl/>
-        <w:spacing w:line="352" w:lineRule="exact" w:before="150" w:after="0"/>
+        <w:spacing w:line="336" w:lineRule="exact" w:before="0" w:after="0"/>
         <w:ind w:left="300" w:right="432" w:firstLine="0"/>
         <w:jc w:val="left"/>
       </w:pPr>
@@ -9739,7 +9812,7 @@
     </w:p>
     <w:sectPr>
       <w:pgSz w:w="11906" w:h="16838"/>
-      <w:pgMar w:top="676" w:right="1440" w:bottom="1440" w:left="1154" w:header="720" w:footer="720" w:gutter="0"/>
+      <w:pgMar w:top="680" w:right="1440" w:bottom="1440" w:left="1154" w:header="720" w:footer="720" w:gutter="0"/>
       <w:cols/>
       <w:docGrid w:linePitch="360"/>
     </w:sectPr>

</xml_diff>

<commit_message>
Restructure Section D (System Architecture) to match loan report format
</commit_message>
<xml_diff>
--- a/assessment_report.docx
+++ b/assessment_report.docx
@@ -7291,8 +7291,8 @@
         <w:autoSpaceDN w:val="0"/>
         <w:autoSpaceDE w:val="0"/>
         <w:widowControl/>
-        <w:spacing w:line="412" w:lineRule="exact" w:before="1062" w:after="0"/>
-        <w:ind w:left="30" w:right="0" w:firstLine="0"/>
+        <w:spacing w:line="480" w:lineRule="exact" w:before="994" w:after="0"/>
+        <w:ind w:left="30" w:right="144" w:firstLine="0"/>
         <w:jc w:val="left"/>
       </w:pPr>
       <w:r>
@@ -7303,7 +7303,17 @@
           <w:color w:val="1F3A52"/>
           <w:sz w:val="30"/>
         </w:rPr>
-        <w:t>Section D: System Architecture (10 Marks)</w:t>
+        <w:t xml:space="preserve">Section D: System Architecture and Machine Learning Techniques </w:t>
+      </w:r>
+      <w:r>
+        <w:rPr>
+          <w:rFonts w:ascii="Helvetica" w:hAnsi="Helvetica" w:eastAsia="Helvetica"/>
+          <w:b/>
+          <w:i w:val="0"/>
+          <w:color w:val="1F3A52"/>
+          <w:sz w:val="30"/>
+        </w:rPr>
+        <w:t>(10 Marks)</w:t>
       </w:r>
     </w:p>
     <w:p>
@@ -7311,7 +7321,57 @@
         <w:autoSpaceDN w:val="0"/>
         <w:autoSpaceDE w:val="0"/>
         <w:widowControl/>
-        <w:spacing w:line="332" w:lineRule="exact" w:before="528" w:after="340"/>
+        <w:spacing w:line="352" w:lineRule="exact" w:before="346" w:after="0"/>
+        <w:ind w:left="30" w:right="50" w:firstLine="0"/>
+        <w:jc w:val="both"/>
+      </w:pPr>
+      <w:r>
+        <w:rPr>
+          <w:rFonts w:ascii="Helvetica" w:hAnsi="Helvetica" w:eastAsia="Helvetica"/>
+          <w:b w:val="0"/>
+          <w:i w:val="0"/>
+          <w:color w:val="333333"/>
+          <w:sz w:val="22"/>
+        </w:rPr>
+        <w:t xml:space="preserve">This section explains the overall system architecture and the machine learning methods used to </w:t>
+      </w:r>
+      <w:r>
+        <w:rPr>
+          <w:rFonts w:ascii="Helvetica" w:hAnsi="Helvetica" w:eastAsia="Helvetica"/>
+          <w:b w:val="0"/>
+          <w:i w:val="0"/>
+          <w:color w:val="333333"/>
+          <w:sz w:val="22"/>
+        </w:rPr>
+        <w:t xml:space="preserve">create the real estate price prediction system. The solution combines data cleaning, </w:t>
+      </w:r>
+      <w:r>
+        <w:rPr>
+          <w:rFonts w:ascii="Helvetica" w:hAnsi="Helvetica" w:eastAsia="Helvetica"/>
+          <w:b w:val="0"/>
+          <w:i w:val="0"/>
+          <w:color w:val="333333"/>
+          <w:sz w:val="22"/>
+        </w:rPr>
+        <w:t xml:space="preserve">preprocessing, model training, evaluation, and web deployment into a single, cohesive pipeline. </w:t>
+      </w:r>
+      <w:r>
+        <w:rPr>
+          <w:rFonts w:ascii="Helvetica" w:hAnsi="Helvetica" w:eastAsia="Helvetica"/>
+          <w:b w:val="0"/>
+          <w:i w:val="0"/>
+          <w:color w:val="333333"/>
+          <w:sz w:val="22"/>
+        </w:rPr>
+        <w:t>This approach guarantees reliability, consistency, and practical utility.</w:t>
+      </w:r>
+    </w:p>
+    <w:p>
+      <w:pPr>
+        <w:autoSpaceDN w:val="0"/>
+        <w:autoSpaceDE w:val="0"/>
+        <w:widowControl/>
+        <w:spacing w:line="332" w:lineRule="exact" w:before="982" w:after="0"/>
         <w:ind w:left="30" w:right="0" w:firstLine="0"/>
         <w:jc w:val="left"/>
       </w:pPr>
@@ -7323,7 +7383,1214 @@
           <w:color w:val="1F3A52"/>
           <w:sz w:val="24"/>
         </w:rPr>
-        <w:t>1. Processing Pipeline</w:t>
+        <w:t>4.1 Overall System Architecture</w:t>
+      </w:r>
+    </w:p>
+    <w:p>
+      <w:pPr>
+        <w:autoSpaceDN w:val="0"/>
+        <w:autoSpaceDE w:val="0"/>
+        <w:widowControl/>
+        <w:spacing w:line="304" w:lineRule="exact" w:before="318" w:after="0"/>
+        <w:ind w:left="30" w:right="0" w:firstLine="0"/>
+        <w:jc w:val="left"/>
+      </w:pPr>
+      <w:r>
+        <w:rPr>
+          <w:rFonts w:ascii="Helvetica" w:hAnsi="Helvetica" w:eastAsia="Helvetica"/>
+          <w:b w:val="0"/>
+          <w:i w:val="0"/>
+          <w:color w:val="333333"/>
+          <w:sz w:val="22"/>
+        </w:rPr>
+        <w:t>The system utilizes a modular, end-to-end machine learning design with four key layers:</w:t>
+      </w:r>
+    </w:p>
+    <w:p>
+      <w:pPr>
+        <w:autoSpaceDN w:val="0"/>
+        <w:autoSpaceDE w:val="0"/>
+        <w:widowControl/>
+        <w:spacing w:line="302" w:lineRule="exact" w:before="420" w:after="0"/>
+        <w:ind w:left="30" w:right="0" w:firstLine="0"/>
+        <w:jc w:val="left"/>
+      </w:pPr>
+      <w:r>
+        <w:rPr>
+          <w:rFonts w:ascii="Helvetica" w:hAnsi="Helvetica" w:eastAsia="Helvetica"/>
+          <w:b/>
+          <w:i w:val="0"/>
+          <w:color w:val="1F3A52"/>
+          <w:sz w:val="22"/>
+        </w:rPr>
+        <w:t>4.1.1 Data Layer</w:t>
+      </w:r>
+    </w:p>
+    <w:p>
+      <w:pPr>
+        <w:autoSpaceDN w:val="0"/>
+        <w:tabs>
+          <w:tab w:pos="660" w:val="left"/>
+        </w:tabs>
+        <w:autoSpaceDE w:val="0"/>
+        <w:widowControl/>
+        <w:spacing w:line="352" w:lineRule="exact" w:before="150" w:after="0"/>
+        <w:ind w:left="330" w:right="720" w:firstLine="0"/>
+        <w:jc w:val="left"/>
+      </w:pPr>
+      <w:r>
+        <w:rPr>
+          <w:rFonts w:ascii="Helvetica" w:hAnsi="Helvetica" w:eastAsia="Helvetica"/>
+          <w:b w:val="0"/>
+          <w:i w:val="0"/>
+          <w:color w:val="333333"/>
+          <w:sz w:val="22"/>
+        </w:rPr>
+        <w:t>•</w:t>
+      </w:r>
+      <w:r>
+        <w:tab/>
+      </w:r>
+      <w:r>
+        <w:rPr>
+          <w:rFonts w:ascii="Helvetica" w:hAnsi="Helvetica" w:eastAsia="Helvetica"/>
+          <w:b/>
+          <w:i w:val="0"/>
+          <w:color w:val="333333"/>
+          <w:sz w:val="22"/>
+        </w:rPr>
+        <w:t>Input Data:</w:t>
+      </w:r>
+      <w:r>
+        <w:rPr>
+          <w:rFonts w:ascii="Helvetica" w:hAnsi="Helvetica" w:eastAsia="Helvetica"/>
+          <w:b w:val="0"/>
+          <w:i w:val="0"/>
+          <w:color w:val="333333"/>
+          <w:sz w:val="22"/>
+        </w:rPr>
+        <w:t xml:space="preserve"> The input dataset is composed of housing data containing structural </w:t>
+      </w:r>
+      <w:r>
+        <w:tab/>
+      </w:r>
+      <w:r>
+        <w:rPr>
+          <w:rFonts w:ascii="Helvetica" w:hAnsi="Helvetica" w:eastAsia="Helvetica"/>
+          <w:b w:val="0"/>
+          <w:i w:val="0"/>
+          <w:color w:val="333333"/>
+          <w:sz w:val="22"/>
+        </w:rPr>
+        <w:t xml:space="preserve">characteristics (e.g., total rooms, bedrooms, property age), local demographics (e.g., </w:t>
+      </w:r>
+      <w:r>
+        <w:tab/>
+      </w:r>
+      <w:r>
+        <w:rPr>
+          <w:rFonts w:ascii="Helvetica" w:hAnsi="Helvetica" w:eastAsia="Helvetica"/>
+          <w:b w:val="0"/>
+          <w:i w:val="0"/>
+          <w:color w:val="333333"/>
+          <w:sz w:val="22"/>
+        </w:rPr>
+        <w:t xml:space="preserve">population, average occupancy), and geographical coordinate coordinates (latitude, </w:t>
+      </w:r>
+      <w:r>
+        <w:tab/>
+      </w:r>
+      <w:r>
+        <w:rPr>
+          <w:rFonts w:ascii="Helvetica" w:hAnsi="Helvetica" w:eastAsia="Helvetica"/>
+          <w:b w:val="0"/>
+          <w:i w:val="0"/>
+          <w:color w:val="333333"/>
+          <w:sz w:val="22"/>
+        </w:rPr>
+        <w:t>longitude).</w:t>
+      </w:r>
+    </w:p>
+    <w:p>
+      <w:pPr>
+        <w:sectPr>
+          <w:pgSz w:w="11906" w:h="16838"/>
+          <w:pgMar w:top="676" w:right="1104" w:bottom="1052" w:left="1124" w:header="720" w:footer="720" w:gutter="0"/>
+          <w:cols/>
+          <w:docGrid w:linePitch="360"/>
+        </w:sectPr>
+      </w:pPr>
+    </w:p>
+    <w:p>
+      <w:pPr>
+        <w:autoSpaceDN w:val="0"/>
+        <w:autoSpaceDE w:val="0"/>
+        <w:widowControl/>
+        <w:spacing w:line="220" w:lineRule="exact" w:before="0" w:after="458"/>
+        <w:ind w:left="0" w:right="0"/>
+      </w:pPr>
+    </w:p>
+    <w:p>
+      <w:pPr>
+        <w:autoSpaceDN w:val="0"/>
+        <w:tabs>
+          <w:tab w:pos="630" w:val="left"/>
+        </w:tabs>
+        <w:autoSpaceDE w:val="0"/>
+        <w:widowControl/>
+        <w:spacing w:line="328" w:lineRule="exact" w:before="0" w:after="0"/>
+        <w:ind w:left="300" w:right="0" w:firstLine="0"/>
+        <w:jc w:val="left"/>
+      </w:pPr>
+      <w:r>
+        <w:rPr>
+          <w:rFonts w:ascii="Helvetica" w:hAnsi="Helvetica" w:eastAsia="Helvetica"/>
+          <w:b w:val="0"/>
+          <w:i w:val="0"/>
+          <w:color w:val="333333"/>
+          <w:sz w:val="22"/>
+        </w:rPr>
+        <w:t>•</w:t>
+      </w:r>
+      <w:r>
+        <w:tab/>
+      </w:r>
+      <w:r>
+        <w:rPr>
+          <w:rFonts w:ascii="Helvetica" w:hAnsi="Helvetica" w:eastAsia="Helvetica"/>
+          <w:b/>
+          <w:i w:val="0"/>
+          <w:color w:val="333333"/>
+          <w:sz w:val="22"/>
+        </w:rPr>
+        <w:t>Data Partitioning:</w:t>
+      </w:r>
+      <w:r>
+        <w:rPr>
+          <w:rFonts w:ascii="Helvetica" w:hAnsi="Helvetica" w:eastAsia="Helvetica"/>
+          <w:b w:val="0"/>
+          <w:i w:val="0"/>
+          <w:color w:val="333333"/>
+          <w:sz w:val="22"/>
+        </w:rPr>
+        <w:t xml:space="preserve"> The dataset is split into an 80/20 ratio for training and testing to facilitate </w:t>
+      </w:r>
+      <w:r>
+        <w:tab/>
+      </w:r>
+      <w:r>
+        <w:rPr>
+          <w:rFonts w:ascii="Helvetica" w:hAnsi="Helvetica" w:eastAsia="Helvetica"/>
+          <w:b w:val="0"/>
+          <w:i w:val="0"/>
+          <w:color w:val="333333"/>
+          <w:sz w:val="22"/>
+        </w:rPr>
+        <w:t>independent model validation and prevent data leakage.</w:t>
+      </w:r>
+    </w:p>
+    <w:p>
+      <w:pPr>
+        <w:autoSpaceDN w:val="0"/>
+        <w:autoSpaceDE w:val="0"/>
+        <w:widowControl/>
+        <w:spacing w:line="302" w:lineRule="exact" w:before="794" w:after="0"/>
+        <w:ind w:left="0" w:right="0" w:firstLine="0"/>
+        <w:jc w:val="left"/>
+      </w:pPr>
+      <w:r>
+        <w:rPr>
+          <w:rFonts w:ascii="Helvetica" w:hAnsi="Helvetica" w:eastAsia="Helvetica"/>
+          <w:b/>
+          <w:i w:val="0"/>
+          <w:color w:val="1F3A52"/>
+          <w:sz w:val="22"/>
+        </w:rPr>
+        <w:t>4.1.2 Processing and Feature Engineering Layer</w:t>
+      </w:r>
+    </w:p>
+    <w:p>
+      <w:pPr>
+        <w:autoSpaceDN w:val="0"/>
+        <w:tabs>
+          <w:tab w:pos="630" w:val="left"/>
+        </w:tabs>
+        <w:autoSpaceDE w:val="0"/>
+        <w:widowControl/>
+        <w:spacing w:line="352" w:lineRule="exact" w:before="150" w:after="0"/>
+        <w:ind w:left="300" w:right="144" w:firstLine="0"/>
+        <w:jc w:val="left"/>
+      </w:pPr>
+      <w:r>
+        <w:rPr>
+          <w:rFonts w:ascii="Helvetica" w:hAnsi="Helvetica" w:eastAsia="Helvetica"/>
+          <w:b w:val="0"/>
+          <w:i w:val="0"/>
+          <w:color w:val="333333"/>
+          <w:sz w:val="22"/>
+        </w:rPr>
+        <w:t>•</w:t>
+      </w:r>
+      <w:r>
+        <w:tab/>
+      </w:r>
+      <w:r>
+        <w:rPr>
+          <w:rFonts w:ascii="Helvetica" w:hAnsi="Helvetica" w:eastAsia="Helvetica"/>
+          <w:b/>
+          <w:i w:val="0"/>
+          <w:color w:val="333333"/>
+          <w:sz w:val="22"/>
+        </w:rPr>
+        <w:t>Numerical Scaling:</w:t>
+      </w:r>
+      <w:r>
+        <w:rPr>
+          <w:rFonts w:ascii="Helvetica" w:hAnsi="Helvetica" w:eastAsia="Helvetica"/>
+          <w:b w:val="0"/>
+          <w:i w:val="0"/>
+          <w:color w:val="333333"/>
+          <w:sz w:val="22"/>
+        </w:rPr>
+        <w:t xml:space="preserve"> Standard scaling is applied to numeric inputs to prevent features with </w:t>
+      </w:r>
+      <w:r>
+        <w:tab/>
+      </w:r>
+      <w:r>
+        <w:rPr>
+          <w:rFonts w:ascii="Helvetica" w:hAnsi="Helvetica" w:eastAsia="Helvetica"/>
+          <w:b w:val="0"/>
+          <w:i w:val="0"/>
+          <w:color w:val="333333"/>
+          <w:sz w:val="22"/>
+        </w:rPr>
+        <w:t xml:space="preserve">large ranges (e.g., population) from dominating distance-based calculations or slowing </w:t>
+      </w:r>
+      <w:r>
+        <w:tab/>
+      </w:r>
+      <w:r>
+        <w:rPr>
+          <w:rFonts w:ascii="Helvetica" w:hAnsi="Helvetica" w:eastAsia="Helvetica"/>
+          <w:b w:val="0"/>
+          <w:i w:val="0"/>
+          <w:color w:val="333333"/>
+          <w:sz w:val="22"/>
+        </w:rPr>
+        <w:t>gradient convergence.</w:t>
+      </w:r>
+    </w:p>
+    <w:p>
+      <w:pPr>
+        <w:autoSpaceDN w:val="0"/>
+        <w:tabs>
+          <w:tab w:pos="630" w:val="left"/>
+        </w:tabs>
+        <w:autoSpaceDE w:val="0"/>
+        <w:widowControl/>
+        <w:spacing w:line="352" w:lineRule="exact" w:before="150" w:after="0"/>
+        <w:ind w:left="300" w:right="0" w:firstLine="0"/>
+        <w:jc w:val="left"/>
+      </w:pPr>
+      <w:r>
+        <w:rPr>
+          <w:rFonts w:ascii="Helvetica" w:hAnsi="Helvetica" w:eastAsia="Helvetica"/>
+          <w:b w:val="0"/>
+          <w:i w:val="0"/>
+          <w:color w:val="333333"/>
+          <w:sz w:val="22"/>
+        </w:rPr>
+        <w:t>•</w:t>
+      </w:r>
+      <w:r>
+        <w:tab/>
+      </w:r>
+      <w:r>
+        <w:rPr>
+          <w:rFonts w:ascii="Helvetica" w:hAnsi="Helvetica" w:eastAsia="Helvetica"/>
+          <w:b/>
+          <w:i w:val="0"/>
+          <w:color w:val="333333"/>
+          <w:sz w:val="22"/>
+        </w:rPr>
+        <w:t>Categorical Encoding:</w:t>
+      </w:r>
+      <w:r>
+        <w:rPr>
+          <w:rFonts w:ascii="Helvetica" w:hAnsi="Helvetica" w:eastAsia="Helvetica"/>
+          <w:b w:val="0"/>
+          <w:i w:val="0"/>
+          <w:color w:val="333333"/>
+          <w:sz w:val="22"/>
+        </w:rPr>
+        <w:t xml:space="preserve"> Discretized age brackets (</w:t>
+      </w:r>
+      <w:r>
+        <w:rPr>
+          <w:shd w:val="clear" w:color="auto" w:fill="f4f4f4"/>
+          <w:rFonts w:ascii="Courier" w:hAnsi="Courier" w:eastAsia="Courier"/>
+          <w:b w:val="0"/>
+          <w:i w:val="0"/>
+          <w:color w:val="333333"/>
+          <w:sz w:val="19"/>
+        </w:rPr>
+        <w:t>PropertyAge_bins</w:t>
+      </w:r>
+      <w:r>
+        <w:rPr>
+          <w:rFonts w:ascii="Helvetica" w:hAnsi="Helvetica" w:eastAsia="Helvetica"/>
+          <w:b w:val="0"/>
+          <w:i w:val="0"/>
+          <w:color w:val="333333"/>
+          <w:sz w:val="22"/>
+        </w:rPr>
+        <w:t xml:space="preserve">) are mapped using </w:t>
+      </w:r>
+      <w:r>
+        <w:tab/>
+      </w:r>
+      <w:r>
+        <w:rPr>
+          <w:rFonts w:ascii="Helvetica" w:hAnsi="Helvetica" w:eastAsia="Helvetica"/>
+          <w:b w:val="0"/>
+          <w:i w:val="0"/>
+          <w:color w:val="333333"/>
+          <w:sz w:val="22"/>
+        </w:rPr>
+        <w:t xml:space="preserve">ordinal encoding to translate categorical labels into numeric representations readable by the </w:t>
+      </w:r>
+      <w:r>
+        <w:tab/>
+      </w:r>
+      <w:r>
+        <w:rPr>
+          <w:rFonts w:ascii="Helvetica" w:hAnsi="Helvetica" w:eastAsia="Helvetica"/>
+          <w:b w:val="0"/>
+          <w:i w:val="0"/>
+          <w:color w:val="333333"/>
+          <w:sz w:val="22"/>
+        </w:rPr>
+        <w:t>models.</w:t>
+      </w:r>
+    </w:p>
+    <w:p>
+      <w:pPr>
+        <w:autoSpaceDN w:val="0"/>
+        <w:tabs>
+          <w:tab w:pos="630" w:val="left"/>
+        </w:tabs>
+        <w:autoSpaceDE w:val="0"/>
+        <w:widowControl/>
+        <w:spacing w:line="352" w:lineRule="exact" w:before="150" w:after="0"/>
+        <w:ind w:left="300" w:right="288" w:firstLine="0"/>
+        <w:jc w:val="left"/>
+      </w:pPr>
+      <w:r>
+        <w:rPr>
+          <w:rFonts w:ascii="Helvetica" w:hAnsi="Helvetica" w:eastAsia="Helvetica"/>
+          <w:b w:val="0"/>
+          <w:i w:val="0"/>
+          <w:color w:val="333333"/>
+          <w:sz w:val="22"/>
+        </w:rPr>
+        <w:t>•</w:t>
+      </w:r>
+      <w:r>
+        <w:tab/>
+      </w:r>
+      <w:r>
+        <w:rPr>
+          <w:rFonts w:ascii="Helvetica" w:hAnsi="Helvetica" w:eastAsia="Helvetica"/>
+          <w:b/>
+          <w:i w:val="0"/>
+          <w:color w:val="333333"/>
+          <w:sz w:val="22"/>
+        </w:rPr>
+        <w:t>Derived Features:</w:t>
+      </w:r>
+      <w:r>
+        <w:rPr>
+          <w:rFonts w:ascii="Helvetica" w:hAnsi="Helvetica" w:eastAsia="Helvetica"/>
+          <w:b w:val="0"/>
+          <w:i w:val="0"/>
+          <w:color w:val="333333"/>
+          <w:sz w:val="22"/>
+        </w:rPr>
+        <w:t xml:space="preserve"> Engineered metrics such as </w:t>
+      </w:r>
+      <w:r>
+        <w:rPr>
+          <w:shd w:val="clear" w:color="auto" w:fill="f4f4f4"/>
+          <w:rFonts w:ascii="Courier" w:hAnsi="Courier" w:eastAsia="Courier"/>
+          <w:b w:val="0"/>
+          <w:i w:val="0"/>
+          <w:color w:val="333333"/>
+          <w:sz w:val="19"/>
+        </w:rPr>
+        <w:t>BedroomsRatio</w:t>
+      </w:r>
+      <w:r>
+        <w:rPr>
+          <w:rFonts w:ascii="Helvetica" w:hAnsi="Helvetica" w:eastAsia="Helvetica"/>
+          <w:b w:val="0"/>
+          <w:i w:val="0"/>
+          <w:color w:val="333333"/>
+          <w:sz w:val="22"/>
+        </w:rPr>
+        <w:t xml:space="preserve"> and </w:t>
+      </w:r>
+      <w:r>
+        <w:rPr>
+          <w:shd w:val="clear" w:color="auto" w:fill="f4f4f4"/>
+          <w:rFonts w:ascii="Courier" w:hAnsi="Courier" w:eastAsia="Courier"/>
+          <w:b w:val="0"/>
+          <w:i w:val="0"/>
+          <w:color w:val="333333"/>
+          <w:sz w:val="19"/>
+        </w:rPr>
+        <w:t xml:space="preserve">RoomsPerHousehold </w:t>
+      </w:r>
+      <w:r>
+        <w:tab/>
+      </w:r>
+      <w:r>
+        <w:rPr>
+          <w:rFonts w:ascii="Helvetica" w:hAnsi="Helvetica" w:eastAsia="Helvetica"/>
+          <w:b w:val="0"/>
+          <w:i w:val="0"/>
+          <w:color w:val="333333"/>
+          <w:sz w:val="22"/>
+        </w:rPr>
+        <w:t xml:space="preserve">are created to capture the internal space structure of properties, addressing raw column </w:t>
+      </w:r>
+      <w:r>
+        <w:tab/>
+      </w:r>
+      <w:r>
+        <w:rPr>
+          <w:rFonts w:ascii="Helvetica" w:hAnsi="Helvetica" w:eastAsia="Helvetica"/>
+          <w:b w:val="0"/>
+          <w:i w:val="0"/>
+          <w:color w:val="333333"/>
+          <w:sz w:val="22"/>
+        </w:rPr>
+        <w:t>multicollinearity.</w:t>
+      </w:r>
+    </w:p>
+    <w:p>
+      <w:pPr>
+        <w:autoSpaceDN w:val="0"/>
+        <w:tabs>
+          <w:tab w:pos="630" w:val="left"/>
+        </w:tabs>
+        <w:autoSpaceDE w:val="0"/>
+        <w:widowControl/>
+        <w:spacing w:line="352" w:lineRule="exact" w:before="150" w:after="0"/>
+        <w:ind w:left="300" w:right="720" w:firstLine="0"/>
+        <w:jc w:val="left"/>
+      </w:pPr>
+      <w:r>
+        <w:rPr>
+          <w:rFonts w:ascii="Helvetica" w:hAnsi="Helvetica" w:eastAsia="Helvetica"/>
+          <w:b w:val="0"/>
+          <w:i w:val="0"/>
+          <w:color w:val="333333"/>
+          <w:sz w:val="22"/>
+        </w:rPr>
+        <w:t>•</w:t>
+      </w:r>
+      <w:r>
+        <w:tab/>
+      </w:r>
+      <w:r>
+        <w:rPr>
+          <w:rFonts w:ascii="Helvetica" w:hAnsi="Helvetica" w:eastAsia="Helvetica"/>
+          <w:b/>
+          <w:i w:val="0"/>
+          <w:color w:val="333333"/>
+          <w:sz w:val="22"/>
+        </w:rPr>
+        <w:t>Pipeline Consistency:</w:t>
+      </w:r>
+      <w:r>
+        <w:rPr>
+          <w:rFonts w:ascii="Helvetica" w:hAnsi="Helvetica" w:eastAsia="Helvetica"/>
+          <w:b w:val="0"/>
+          <w:i w:val="0"/>
+          <w:color w:val="333333"/>
+          <w:sz w:val="22"/>
+        </w:rPr>
+        <w:t xml:space="preserve"> A unified preprocessing pipeline ensures that feature </w:t>
+      </w:r>
+      <w:r>
+        <w:tab/>
+      </w:r>
+      <w:r>
+        <w:rPr>
+          <w:rFonts w:ascii="Helvetica" w:hAnsi="Helvetica" w:eastAsia="Helvetica"/>
+          <w:b w:val="0"/>
+          <w:i w:val="0"/>
+          <w:color w:val="333333"/>
+          <w:sz w:val="22"/>
+        </w:rPr>
+        <w:t>transformations remain identical during training, testing, and production deployment.</w:t>
+      </w:r>
+    </w:p>
+    <w:p>
+      <w:pPr>
+        <w:autoSpaceDN w:val="0"/>
+        <w:autoSpaceDE w:val="0"/>
+        <w:widowControl/>
+        <w:spacing w:line="302" w:lineRule="exact" w:before="794" w:after="0"/>
+        <w:ind w:left="0" w:right="0" w:firstLine="0"/>
+        <w:jc w:val="left"/>
+      </w:pPr>
+      <w:r>
+        <w:rPr>
+          <w:rFonts w:ascii="Helvetica" w:hAnsi="Helvetica" w:eastAsia="Helvetica"/>
+          <w:b/>
+          <w:i w:val="0"/>
+          <w:color w:val="1F3A52"/>
+          <w:sz w:val="22"/>
+        </w:rPr>
+        <w:t>4.1.3 Modeling Layer</w:t>
+      </w:r>
+    </w:p>
+    <w:p>
+      <w:pPr>
+        <w:autoSpaceDN w:val="0"/>
+        <w:tabs>
+          <w:tab w:pos="630" w:val="left"/>
+        </w:tabs>
+        <w:autoSpaceDE w:val="0"/>
+        <w:widowControl/>
+        <w:spacing w:line="304" w:lineRule="exact" w:before="198" w:after="0"/>
+        <w:ind w:left="300" w:right="0" w:firstLine="0"/>
+        <w:jc w:val="left"/>
+      </w:pPr>
+      <w:r>
+        <w:rPr>
+          <w:rFonts w:ascii="Helvetica" w:hAnsi="Helvetica" w:eastAsia="Helvetica"/>
+          <w:b w:val="0"/>
+          <w:i w:val="0"/>
+          <w:color w:val="333333"/>
+          <w:sz w:val="22"/>
+        </w:rPr>
+        <w:t>•</w:t>
+      </w:r>
+      <w:r>
+        <w:tab/>
+      </w:r>
+      <w:r>
+        <w:rPr>
+          <w:rFonts w:ascii="Helvetica" w:hAnsi="Helvetica" w:eastAsia="Helvetica"/>
+          <w:b/>
+          <w:i w:val="0"/>
+          <w:color w:val="333333"/>
+          <w:sz w:val="22"/>
+        </w:rPr>
+        <w:t>Model Comparison:</w:t>
+      </w:r>
+      <w:r>
+        <w:rPr>
+          <w:rFonts w:ascii="Helvetica" w:hAnsi="Helvetica" w:eastAsia="Helvetica"/>
+          <w:b w:val="0"/>
+          <w:i w:val="0"/>
+          <w:color w:val="333333"/>
+          <w:sz w:val="22"/>
+        </w:rPr>
+        <w:t xml:space="preserve"> Multiple supervised regression models are trained and benchmarked.</w:t>
+      </w:r>
+    </w:p>
+    <w:p>
+      <w:pPr>
+        <w:autoSpaceDN w:val="0"/>
+        <w:tabs>
+          <w:tab w:pos="630" w:val="left"/>
+        </w:tabs>
+        <w:autoSpaceDE w:val="0"/>
+        <w:widowControl/>
+        <w:spacing w:line="352" w:lineRule="exact" w:before="150" w:after="0"/>
+        <w:ind w:left="300" w:right="288" w:firstLine="0"/>
+        <w:jc w:val="left"/>
+      </w:pPr>
+      <w:r>
+        <w:rPr>
+          <w:rFonts w:ascii="Helvetica" w:hAnsi="Helvetica" w:eastAsia="Helvetica"/>
+          <w:b w:val="0"/>
+          <w:i w:val="0"/>
+          <w:color w:val="333333"/>
+          <w:sz w:val="22"/>
+        </w:rPr>
+        <w:t>•</w:t>
+      </w:r>
+      <w:r>
+        <w:tab/>
+      </w:r>
+      <w:r>
+        <w:rPr>
+          <w:rFonts w:ascii="Helvetica" w:hAnsi="Helvetica" w:eastAsia="Helvetica"/>
+          <w:b/>
+          <w:i w:val="0"/>
+          <w:color w:val="333333"/>
+          <w:sz w:val="22"/>
+        </w:rPr>
+        <w:t>Non-Parametric Focus:</w:t>
+      </w:r>
+      <w:r>
+        <w:rPr>
+          <w:rFonts w:ascii="Helvetica" w:hAnsi="Helvetica" w:eastAsia="Helvetica"/>
+          <w:b w:val="0"/>
+          <w:i w:val="0"/>
+          <w:color w:val="333333"/>
+          <w:sz w:val="22"/>
+        </w:rPr>
+        <w:t xml:space="preserve"> Tree-based ensembles (Random Forest and XGBoost) are </w:t>
+      </w:r>
+      <w:r>
+        <w:tab/>
+      </w:r>
+      <w:r>
+        <w:rPr>
+          <w:rFonts w:ascii="Helvetica" w:hAnsi="Helvetica" w:eastAsia="Helvetica"/>
+          <w:b w:val="0"/>
+          <w:i w:val="0"/>
+          <w:color w:val="333333"/>
+          <w:sz w:val="22"/>
+        </w:rPr>
+        <w:t xml:space="preserve">prioritized due to their ability to capture complex non-linear spatial interactions and outlier </w:t>
+      </w:r>
+      <w:r>
+        <w:tab/>
+      </w:r>
+      <w:r>
+        <w:rPr>
+          <w:rFonts w:ascii="Helvetica" w:hAnsi="Helvetica" w:eastAsia="Helvetica"/>
+          <w:b w:val="0"/>
+          <w:i w:val="0"/>
+          <w:color w:val="333333"/>
+          <w:sz w:val="22"/>
+        </w:rPr>
+        <w:t>robustness.</w:t>
+      </w:r>
+    </w:p>
+    <w:p>
+      <w:pPr>
+        <w:autoSpaceDN w:val="0"/>
+        <w:tabs>
+          <w:tab w:pos="630" w:val="left"/>
+        </w:tabs>
+        <w:autoSpaceDE w:val="0"/>
+        <w:widowControl/>
+        <w:spacing w:line="352" w:lineRule="exact" w:before="150" w:after="0"/>
+        <w:ind w:left="300" w:right="144" w:firstLine="0"/>
+        <w:jc w:val="left"/>
+      </w:pPr>
+      <w:r>
+        <w:rPr>
+          <w:rFonts w:ascii="Helvetica" w:hAnsi="Helvetica" w:eastAsia="Helvetica"/>
+          <w:b w:val="0"/>
+          <w:i w:val="0"/>
+          <w:color w:val="333333"/>
+          <w:sz w:val="22"/>
+        </w:rPr>
+        <w:t>•</w:t>
+      </w:r>
+      <w:r>
+        <w:tab/>
+      </w:r>
+      <w:r>
+        <w:rPr>
+          <w:rFonts w:ascii="Helvetica" w:hAnsi="Helvetica" w:eastAsia="Helvetica"/>
+          <w:b/>
+          <w:i w:val="0"/>
+          <w:color w:val="333333"/>
+          <w:sz w:val="22"/>
+        </w:rPr>
+        <w:t>Selection Metric:</w:t>
+      </w:r>
+      <w:r>
+        <w:rPr>
+          <w:rFonts w:ascii="Helvetica" w:hAnsi="Helvetica" w:eastAsia="Helvetica"/>
+          <w:b w:val="0"/>
+          <w:i w:val="0"/>
+          <w:color w:val="333333"/>
+          <w:sz w:val="22"/>
+        </w:rPr>
+        <w:t xml:space="preserve"> Model selection depends on cross-validated $R^2$ scores, Root Mean </w:t>
+      </w:r>
+      <w:r>
+        <w:tab/>
+      </w:r>
+      <w:r>
+        <w:rPr>
+          <w:rFonts w:ascii="Helvetica" w:hAnsi="Helvetica" w:eastAsia="Helvetica"/>
+          <w:b w:val="0"/>
+          <w:i w:val="0"/>
+          <w:color w:val="333333"/>
+          <w:sz w:val="22"/>
+        </w:rPr>
+        <w:t>Squared Error (RMSE), and Mean Absolute Error (MAE).</w:t>
+      </w:r>
+    </w:p>
+    <w:p>
+      <w:pPr>
+        <w:autoSpaceDN w:val="0"/>
+        <w:autoSpaceDE w:val="0"/>
+        <w:widowControl/>
+        <w:spacing w:line="302" w:lineRule="exact" w:before="794" w:after="0"/>
+        <w:ind w:left="0" w:right="0" w:firstLine="0"/>
+        <w:jc w:val="left"/>
+      </w:pPr>
+      <w:r>
+        <w:rPr>
+          <w:rFonts w:ascii="Helvetica" w:hAnsi="Helvetica" w:eastAsia="Helvetica"/>
+          <w:b/>
+          <w:i w:val="0"/>
+          <w:color w:val="1F3A52"/>
+          <w:sz w:val="22"/>
+        </w:rPr>
+        <w:t>4.1.4 Application Layer (Deployment)</w:t>
+      </w:r>
+    </w:p>
+    <w:p>
+      <w:pPr>
+        <w:autoSpaceDN w:val="0"/>
+        <w:tabs>
+          <w:tab w:pos="630" w:val="left"/>
+        </w:tabs>
+        <w:autoSpaceDE w:val="0"/>
+        <w:widowControl/>
+        <w:spacing w:line="352" w:lineRule="exact" w:before="150" w:after="0"/>
+        <w:ind w:left="300" w:right="0" w:firstLine="0"/>
+        <w:jc w:val="left"/>
+      </w:pPr>
+      <w:r>
+        <w:rPr>
+          <w:rFonts w:ascii="Helvetica" w:hAnsi="Helvetica" w:eastAsia="Helvetica"/>
+          <w:b w:val="0"/>
+          <w:i w:val="0"/>
+          <w:color w:val="333333"/>
+          <w:sz w:val="22"/>
+        </w:rPr>
+        <w:t>•</w:t>
+      </w:r>
+      <w:r>
+        <w:tab/>
+      </w:r>
+      <w:r>
+        <w:rPr>
+          <w:rFonts w:ascii="Helvetica" w:hAnsi="Helvetica" w:eastAsia="Helvetica"/>
+          <w:b/>
+          <w:i w:val="0"/>
+          <w:color w:val="333333"/>
+          <w:sz w:val="22"/>
+        </w:rPr>
+        <w:t>Model Serialization:</w:t>
+      </w:r>
+      <w:r>
+        <w:rPr>
+          <w:rFonts w:ascii="Helvetica" w:hAnsi="Helvetica" w:eastAsia="Helvetica"/>
+          <w:b w:val="0"/>
+          <w:i w:val="0"/>
+          <w:color w:val="333333"/>
+          <w:sz w:val="22"/>
+        </w:rPr>
+        <w:t xml:space="preserve"> The fitted preprocessor and best-performing estimators are serialized </w:t>
+      </w:r>
+      <w:r>
+        <w:tab/>
+      </w:r>
+      <w:r>
+        <w:rPr>
+          <w:rFonts w:ascii="Helvetica" w:hAnsi="Helvetica" w:eastAsia="Helvetica"/>
+          <w:b w:val="0"/>
+          <w:i w:val="0"/>
+          <w:color w:val="333333"/>
+          <w:sz w:val="22"/>
+        </w:rPr>
+        <w:t xml:space="preserve">and saved using </w:t>
+      </w:r>
+      <w:r>
+        <w:rPr>
+          <w:shd w:val="clear" w:color="auto" w:fill="f4f4f4"/>
+          <w:rFonts w:ascii="Courier" w:hAnsi="Courier" w:eastAsia="Courier"/>
+          <w:b w:val="0"/>
+          <w:i w:val="0"/>
+          <w:color w:val="333333"/>
+          <w:sz w:val="19"/>
+        </w:rPr>
+        <w:t>joblib</w:t>
+      </w:r>
+      <w:r>
+        <w:rPr>
+          <w:rFonts w:ascii="Helvetica" w:hAnsi="Helvetica" w:eastAsia="Helvetica"/>
+          <w:b w:val="0"/>
+          <w:i w:val="0"/>
+          <w:color w:val="333333"/>
+          <w:sz w:val="22"/>
+        </w:rPr>
+        <w:t>.</w:t>
+      </w:r>
+    </w:p>
+    <w:p>
+      <w:pPr>
+        <w:autoSpaceDN w:val="0"/>
+        <w:tabs>
+          <w:tab w:pos="630" w:val="left"/>
+        </w:tabs>
+        <w:autoSpaceDE w:val="0"/>
+        <w:widowControl/>
+        <w:spacing w:line="352" w:lineRule="exact" w:before="150" w:after="0"/>
+        <w:ind w:left="300" w:right="144" w:firstLine="0"/>
+        <w:jc w:val="left"/>
+      </w:pPr>
+      <w:r>
+        <w:rPr>
+          <w:rFonts w:ascii="Helvetica" w:hAnsi="Helvetica" w:eastAsia="Helvetica"/>
+          <w:b w:val="0"/>
+          <w:i w:val="0"/>
+          <w:color w:val="333333"/>
+          <w:sz w:val="22"/>
+        </w:rPr>
+        <w:t>•</w:t>
+      </w:r>
+      <w:r>
+        <w:tab/>
+      </w:r>
+      <w:r>
+        <w:rPr>
+          <w:rFonts w:ascii="Helvetica" w:hAnsi="Helvetica" w:eastAsia="Helvetica"/>
+          <w:b/>
+          <w:i w:val="0"/>
+          <w:color w:val="333333"/>
+          <w:sz w:val="22"/>
+        </w:rPr>
+        <w:t>Flask Backend:</w:t>
+      </w:r>
+      <w:r>
+        <w:rPr>
+          <w:rFonts w:ascii="Helvetica" w:hAnsi="Helvetica" w:eastAsia="Helvetica"/>
+          <w:b w:val="0"/>
+          <w:i w:val="0"/>
+          <w:color w:val="333333"/>
+          <w:sz w:val="22"/>
+        </w:rPr>
+        <w:t xml:space="preserve"> A web server loads the serialized components, exposes a prediction API </w:t>
+      </w:r>
+      <w:r>
+        <w:tab/>
+      </w:r>
+      <w:r>
+        <w:rPr>
+          <w:rFonts w:ascii="Helvetica" w:hAnsi="Helvetica" w:eastAsia="Helvetica"/>
+          <w:b w:val="0"/>
+          <w:i w:val="0"/>
+          <w:color w:val="333333"/>
+          <w:sz w:val="22"/>
+        </w:rPr>
+        <w:t>(</w:t>
+      </w:r>
+      <w:r>
+        <w:rPr>
+          <w:shd w:val="clear" w:color="auto" w:fill="f4f4f4"/>
+          <w:rFonts w:ascii="Courier" w:hAnsi="Courier" w:eastAsia="Courier"/>
+          <w:b w:val="0"/>
+          <w:i w:val="0"/>
+          <w:color w:val="333333"/>
+          <w:sz w:val="19"/>
+        </w:rPr>
+        <w:t>/predict</w:t>
+      </w:r>
+      <w:r>
+        <w:rPr>
+          <w:rFonts w:ascii="Helvetica" w:hAnsi="Helvetica" w:eastAsia="Helvetica"/>
+          <w:b w:val="0"/>
+          <w:i w:val="0"/>
+          <w:color w:val="333333"/>
+          <w:sz w:val="22"/>
+        </w:rPr>
+        <w:t>), and serves the interactive frontend interface.</w:t>
+      </w:r>
+    </w:p>
+    <w:p>
+      <w:pPr>
+        <w:autoSpaceDN w:val="0"/>
+        <w:tabs>
+          <w:tab w:pos="630" w:val="left"/>
+        </w:tabs>
+        <w:autoSpaceDE w:val="0"/>
+        <w:widowControl/>
+        <w:spacing w:line="352" w:lineRule="exact" w:before="150" w:after="0"/>
+        <w:ind w:left="300" w:right="144" w:firstLine="0"/>
+        <w:jc w:val="left"/>
+      </w:pPr>
+      <w:r>
+        <w:rPr>
+          <w:rFonts w:ascii="Helvetica" w:hAnsi="Helvetica" w:eastAsia="Helvetica"/>
+          <w:b w:val="0"/>
+          <w:i w:val="0"/>
+          <w:color w:val="333333"/>
+          <w:sz w:val="22"/>
+        </w:rPr>
+        <w:t>•</w:t>
+      </w:r>
+      <w:r>
+        <w:tab/>
+      </w:r>
+      <w:r>
+        <w:rPr>
+          <w:rFonts w:ascii="Helvetica" w:hAnsi="Helvetica" w:eastAsia="Helvetica"/>
+          <w:b/>
+          <w:i w:val="0"/>
+          <w:color w:val="333333"/>
+          <w:sz w:val="22"/>
+        </w:rPr>
+        <w:t>Interactive Interface:</w:t>
+      </w:r>
+      <w:r>
+        <w:rPr>
+          <w:rFonts w:ascii="Helvetica" w:hAnsi="Helvetica" w:eastAsia="Helvetica"/>
+          <w:b w:val="0"/>
+          <w:i w:val="0"/>
+          <w:color w:val="333333"/>
+          <w:sz w:val="22"/>
+        </w:rPr>
+        <w:t xml:space="preserve"> A responsive webpage allows users to input property attributes and </w:t>
+      </w:r>
+      <w:r>
+        <w:tab/>
+      </w:r>
+      <w:r>
+        <w:rPr>
+          <w:rFonts w:ascii="Helvetica" w:hAnsi="Helvetica" w:eastAsia="Helvetica"/>
+          <w:b w:val="0"/>
+          <w:i w:val="0"/>
+          <w:color w:val="333333"/>
+          <w:sz w:val="22"/>
+        </w:rPr>
+        <w:t>receive real-time, boundary-safe predicted house prices.</w:t>
+      </w:r>
+    </w:p>
+    <w:p>
+      <w:pPr>
+        <w:sectPr>
+          <w:pgSz w:w="11906" w:h="16838"/>
+          <w:pgMar w:top="680" w:right="1164" w:bottom="970" w:left="1154" w:header="720" w:footer="720" w:gutter="0"/>
+          <w:cols/>
+          <w:docGrid w:linePitch="360"/>
+        </w:sectPr>
+      </w:pPr>
+    </w:p>
+    <w:p>
+      <w:pPr>
+        <w:autoSpaceDN w:val="0"/>
+        <w:autoSpaceDE w:val="0"/>
+        <w:widowControl/>
+        <w:spacing w:line="220" w:lineRule="exact" w:before="0" w:after="494"/>
+        <w:ind w:left="0" w:right="0"/>
+      </w:pPr>
+    </w:p>
+    <w:p>
+      <w:pPr>
+        <w:autoSpaceDN w:val="0"/>
+        <w:autoSpaceDE w:val="0"/>
+        <w:widowControl/>
+        <w:spacing w:line="332" w:lineRule="exact" w:before="384" w:after="0"/>
+        <w:ind w:left="30" w:right="0" w:firstLine="0"/>
+        <w:jc w:val="left"/>
+      </w:pPr>
+      <w:r>
+        <w:rPr>
+          <w:rFonts w:ascii="Helvetica" w:hAnsi="Helvetica" w:eastAsia="Helvetica"/>
+          <w:b/>
+          <w:i w:val="0"/>
+          <w:color w:val="1F3A52"/>
+          <w:sz w:val="24"/>
+        </w:rPr>
+        <w:t>4.2 Machine Learning Problem Formulation</w:t>
+      </w:r>
+    </w:p>
+    <w:p>
+      <w:pPr>
+        <w:autoSpaceDN w:val="0"/>
+        <w:autoSpaceDE w:val="0"/>
+        <w:widowControl/>
+        <w:spacing w:line="352" w:lineRule="exact" w:before="270" w:after="0"/>
+        <w:ind w:left="30" w:right="0" w:firstLine="0"/>
+        <w:jc w:val="left"/>
+      </w:pPr>
+      <w:r>
+        <w:rPr>
+          <w:rFonts w:ascii="Helvetica" w:hAnsi="Helvetica" w:eastAsia="Helvetica"/>
+          <w:b w:val="0"/>
+          <w:i w:val="0"/>
+          <w:color w:val="333333"/>
+          <w:sz w:val="22"/>
+        </w:rPr>
+        <w:t xml:space="preserve">The task is framed as a continuous regression problem, aiming to predict the monetary value of a </w:t>
+      </w:r>
+      <w:r>
+        <w:rPr>
+          <w:rFonts w:ascii="Helvetica" w:hAnsi="Helvetica" w:eastAsia="Helvetica"/>
+          <w:b w:val="0"/>
+          <w:i w:val="0"/>
+          <w:color w:val="333333"/>
+          <w:sz w:val="22"/>
+        </w:rPr>
+        <w:t xml:space="preserve">residential property: * </w:t>
+      </w:r>
+      <w:r>
+        <w:rPr>
+          <w:rFonts w:ascii="Helvetica" w:hAnsi="Helvetica" w:eastAsia="Helvetica"/>
+          <w:b/>
+          <w:i w:val="0"/>
+          <w:color w:val="333333"/>
+          <w:sz w:val="22"/>
+        </w:rPr>
+        <w:t>Target Variable:</w:t>
+      </w:r>
+      <w:r>
+        <w:rPr>
+          <w:shd w:val="clear" w:color="auto" w:fill="f4f4f4"/>
+          <w:rFonts w:ascii="Courier" w:hAnsi="Courier" w:eastAsia="Courier"/>
+          <w:b w:val="0"/>
+          <w:i w:val="0"/>
+          <w:color w:val="333333"/>
+          <w:sz w:val="19"/>
+        </w:rPr>
+        <w:t>TargetPrice</w:t>
+      </w:r>
+      <w:r>
+        <w:rPr>
+          <w:rFonts w:ascii="Helvetica" w:hAnsi="Helvetica" w:eastAsia="Helvetica"/>
+          <w:b w:val="0"/>
+          <w:i w:val="0"/>
+          <w:color w:val="333333"/>
+          <w:sz w:val="22"/>
+        </w:rPr>
+        <w:t xml:space="preserve"> (representing the house value scaled by </w:t>
+      </w:r>
+      <w:r>
+        <w:rPr>
+          <w:rFonts w:ascii="Helvetica" w:hAnsi="Helvetica" w:eastAsia="Helvetica"/>
+          <w:b w:val="0"/>
+          <w:i w:val="0"/>
+          <w:color w:val="333333"/>
+          <w:sz w:val="22"/>
+        </w:rPr>
+        <w:t xml:space="preserve">$100,000, where a value of 2.0000 denotes a price of $200,000). * </w:t>
+      </w:r>
+      <w:r>
+        <w:rPr>
+          <w:rFonts w:ascii="Helvetica" w:hAnsi="Helvetica" w:eastAsia="Helvetica"/>
+          <w:b/>
+          <w:i w:val="0"/>
+          <w:color w:val="333333"/>
+          <w:sz w:val="22"/>
+        </w:rPr>
+        <w:t>Evaluation Focus:</w:t>
+      </w:r>
+      <w:r>
+        <w:rPr>
+          <w:rFonts w:ascii="Helvetica" w:hAnsi="Helvetica" w:eastAsia="Helvetica"/>
+          <w:b w:val="0"/>
+          <w:i w:val="0"/>
+          <w:color w:val="333333"/>
+          <w:sz w:val="22"/>
+        </w:rPr>
+        <w:t xml:space="preserve"> Because </w:t>
+      </w:r>
+      <w:r>
+        <w:rPr>
+          <w:rFonts w:ascii="Helvetica" w:hAnsi="Helvetica" w:eastAsia="Helvetica"/>
+          <w:b w:val="0"/>
+          <w:i w:val="0"/>
+          <w:color w:val="333333"/>
+          <w:sz w:val="22"/>
+        </w:rPr>
+        <w:t xml:space="preserve">this is a continuous prediction task (regression) rather than classification, probability-based metrics </w:t>
+      </w:r>
+      <w:r>
+        <w:rPr>
+          <w:rFonts w:ascii="Helvetica" w:hAnsi="Helvetica" w:eastAsia="Helvetica"/>
+          <w:b w:val="0"/>
+          <w:i w:val="0"/>
+          <w:color w:val="333333"/>
+          <w:sz w:val="22"/>
+        </w:rPr>
+        <w:t xml:space="preserve">like ROC AUC are not applicable. Instead, model performance is evaluated using $R^2$ Score </w:t>
+      </w:r>
+      <w:r>
+        <w:rPr>
+          <w:rFonts w:ascii="Helvetica" w:hAnsi="Helvetica" w:eastAsia="Helvetica"/>
+          <w:b w:val="0"/>
+          <w:i w:val="0"/>
+          <w:color w:val="333333"/>
+          <w:sz w:val="22"/>
+        </w:rPr>
+        <w:t xml:space="preserve">(goodness of fit), RMSE (error magnitude with penalty for large errors), and MAE (average </w:t>
+      </w:r>
+      <w:r>
+        <w:rPr>
+          <w:rFonts w:ascii="Helvetica" w:hAnsi="Helvetica" w:eastAsia="Helvetica"/>
+          <w:b w:val="0"/>
+          <w:i w:val="0"/>
+          <w:color w:val="333333"/>
+          <w:sz w:val="22"/>
+        </w:rPr>
+        <w:t>absolute prediction error).</w:t>
+      </w:r>
+    </w:p>
+    <w:p>
+      <w:pPr>
+        <w:autoSpaceDN w:val="0"/>
+        <w:autoSpaceDE w:val="0"/>
+        <w:widowControl/>
+        <w:spacing w:line="332" w:lineRule="exact" w:before="982" w:after="0"/>
+        <w:ind w:left="30" w:right="0" w:firstLine="0"/>
+        <w:jc w:val="left"/>
+      </w:pPr>
+      <w:r>
+        <w:rPr>
+          <w:rFonts w:ascii="Helvetica" w:hAnsi="Helvetica" w:eastAsia="Helvetica"/>
+          <w:b/>
+          <w:i w:val="0"/>
+          <w:color w:val="1F3A52"/>
+          <w:sz w:val="24"/>
+        </w:rPr>
+        <w:t>4.3 Preprocessing and Feature Handling</w:t>
+      </w:r>
+    </w:p>
+    <w:p>
+      <w:pPr>
+        <w:autoSpaceDN w:val="0"/>
+        <w:autoSpaceDE w:val="0"/>
+        <w:widowControl/>
+        <w:spacing w:line="352" w:lineRule="exact" w:before="270" w:after="404"/>
+        <w:ind w:left="30" w:right="0" w:firstLine="0"/>
+        <w:jc w:val="left"/>
+      </w:pPr>
+      <w:r>
+        <w:rPr>
+          <w:rFonts w:ascii="Helvetica" w:hAnsi="Helvetica" w:eastAsia="Helvetica"/>
+          <w:b w:val="0"/>
+          <w:i w:val="0"/>
+          <w:color w:val="333333"/>
+          <w:sz w:val="22"/>
+        </w:rPr>
+        <w:t xml:space="preserve">To prepare the dataset for model training and maintain consistency across deployment, the </w:t>
+      </w:r>
+      <w:r>
+        <w:rPr>
+          <w:rFonts w:ascii="Helvetica" w:hAnsi="Helvetica" w:eastAsia="Helvetica"/>
+          <w:b w:val="0"/>
+          <w:i w:val="0"/>
+          <w:color w:val="333333"/>
+          <w:sz w:val="22"/>
+        </w:rPr>
+        <w:t>preprocessing steps are integrated into a single pipeline (see Figure 5):</w:t>
       </w:r>
     </w:p>
     <w:tbl>
@@ -7338,7 +8605,7 @@
       </w:tblGrid>
       <w:tr>
         <w:trPr>
-          <w:trHeight w:hRule="exact" w:val="3066"/>
+          <w:trHeight w:hRule="exact" w:val="3064"/>
         </w:trPr>
         <w:tc>
           <w:tcPr>
@@ -7469,7 +8736,7 @@
         <w:autoSpaceDN w:val="0"/>
         <w:autoSpaceDE w:val="0"/>
         <w:widowControl/>
-        <w:spacing w:line="332" w:lineRule="exact" w:before="286" w:after="0"/>
+        <w:spacing w:line="304" w:lineRule="exact" w:before="220" w:after="0"/>
         <w:ind w:left="30" w:right="0" w:firstLine="0"/>
         <w:jc w:val="left"/>
       </w:pPr>
@@ -7478,10 +8745,10 @@
           <w:rFonts w:ascii="Helvetica" w:hAnsi="Helvetica" w:eastAsia="Helvetica"/>
           <w:b/>
           <w:i w:val="0"/>
-          <w:color w:val="1F3A52"/>
-          <w:sz w:val="24"/>
-        </w:rPr>
-        <w:t>2. Model Selection Justification</w:t>
+          <w:color w:val="333333"/>
+          <w:sz w:val="22"/>
+        </w:rPr>
+        <w:t>Figure 5: Data Preprocessing and Workflow Pipeline</w:t>
       </w:r>
     </w:p>
     <w:p>
@@ -7492,8 +8759,8 @@
         </w:tabs>
         <w:autoSpaceDE w:val="0"/>
         <w:widowControl/>
-        <w:spacing w:line="352" w:lineRule="exact" w:before="170" w:after="0"/>
-        <w:ind w:left="330" w:right="576" w:firstLine="0"/>
+        <w:spacing w:line="352" w:lineRule="exact" w:before="302" w:after="0"/>
+        <w:ind w:left="330" w:right="288" w:firstLine="0"/>
         <w:jc w:val="left"/>
       </w:pPr>
       <w:r>
@@ -7517,17 +8784,38 @@
           <w:color w:val="333333"/>
           <w:sz w:val="22"/>
         </w:rPr>
-        <w:t>Linear Regression:</w:t>
-      </w:r>
-      <w:r>
-        <w:rPr>
-          <w:rFonts w:ascii="Helvetica" w:hAnsi="Helvetica" w:eastAsia="Helvetica"/>
-          <w:b w:val="0"/>
-          <w:i w:val="0"/>
-          <w:color w:val="333333"/>
-          <w:sz w:val="22"/>
-        </w:rPr>
-        <w:t xml:space="preserve"> Baseline regression model, fast and simple but restricted to linear </w:t>
+        <w:t>Numerical Features:</w:t>
+      </w:r>
+      <w:r>
+        <w:rPr>
+          <w:rFonts w:ascii="Helvetica" w:hAnsi="Helvetica" w:eastAsia="Helvetica"/>
+          <w:b w:val="0"/>
+          <w:i w:val="0"/>
+          <w:color w:val="333333"/>
+          <w:sz w:val="22"/>
+        </w:rPr>
+        <w:t xml:space="preserve"> Standardized using </w:t>
+      </w:r>
+      <w:r>
+        <w:rPr>
+          <w:shd w:val="clear" w:color="auto" w:fill="f4f4f4"/>
+          <w:rFonts w:ascii="Courier" w:hAnsi="Courier" w:eastAsia="Courier"/>
+          <w:b w:val="0"/>
+          <w:i w:val="0"/>
+          <w:color w:val="333333"/>
+          <w:sz w:val="19"/>
+        </w:rPr>
+        <w:t>StandardScaler</w:t>
+      </w:r>
+      <w:r>
+        <w:rPr>
+          <w:rFonts w:ascii="Helvetica" w:hAnsi="Helvetica" w:eastAsia="Helvetica"/>
+          <w:b w:val="0"/>
+          <w:i w:val="0"/>
+          <w:color w:val="333333"/>
+          <w:sz w:val="22"/>
+        </w:rPr>
+        <w:t xml:space="preserve"> to center features around zero </w:t>
       </w:r>
       <w:r>
         <w:tab/>
@@ -7540,7 +8828,7 @@
           <w:color w:val="333333"/>
           <w:sz w:val="22"/>
         </w:rPr>
-        <w:t>relationships.</w:t>
+        <w:t>with unit variance, helping the linear baseline model converge rapidly.</w:t>
       </w:r>
     </w:p>
     <w:p>
@@ -7552,7 +8840,7 @@
         <w:autoSpaceDE w:val="0"/>
         <w:widowControl/>
         <w:spacing w:line="352" w:lineRule="exact" w:before="150" w:after="0"/>
-        <w:ind w:left="330" w:right="0" w:firstLine="0"/>
+        <w:ind w:left="330" w:right="144" w:firstLine="0"/>
         <w:jc w:val="left"/>
       </w:pPr>
       <w:r>
@@ -7576,17 +8864,17 @@
           <w:color w:val="333333"/>
           <w:sz w:val="22"/>
         </w:rPr>
-        <w:t>Random Forest:</w:t>
-      </w:r>
-      <w:r>
-        <w:rPr>
-          <w:rFonts w:ascii="Helvetica" w:hAnsi="Helvetica" w:eastAsia="Helvetica"/>
-          <w:b w:val="0"/>
-          <w:i w:val="0"/>
-          <w:color w:val="333333"/>
-          <w:sz w:val="22"/>
-        </w:rPr>
-        <w:t xml:space="preserve"> Averages many independent decision trees. By introducing randomness </w:t>
+        <w:t>Categorical Features:</w:t>
+      </w:r>
+      <w:r>
+        <w:rPr>
+          <w:rFonts w:ascii="Helvetica" w:hAnsi="Helvetica" w:eastAsia="Helvetica"/>
+          <w:b w:val="0"/>
+          <w:i w:val="0"/>
+          <w:color w:val="333333"/>
+          <w:sz w:val="22"/>
+        </w:rPr>
+        <w:t xml:space="preserve"> Ordinally encoded to represent 'New', 'Moderate', and 'Old' groups </w:t>
       </w:r>
       <w:r>
         <w:tab/>
@@ -7599,14 +8887,141 @@
           <w:color w:val="333333"/>
           <w:sz w:val="22"/>
         </w:rPr>
-        <w:t>during tree splitting, it reduces variance, increases stability, and provides robust predictions.</w:t>
+        <w:t>as ordered numeric values, preserving the temporal hierarchy.</w:t>
+      </w:r>
+    </w:p>
+    <w:p>
+      <w:pPr>
+        <w:autoSpaceDN w:val="0"/>
+        <w:tabs>
+          <w:tab w:pos="660" w:val="left"/>
+        </w:tabs>
+        <w:autoSpaceDE w:val="0"/>
+        <w:widowControl/>
+        <w:spacing w:line="352" w:lineRule="exact" w:before="150" w:after="0"/>
+        <w:ind w:left="330" w:right="144" w:firstLine="0"/>
+        <w:jc w:val="left"/>
+      </w:pPr>
+      <w:r>
+        <w:rPr>
+          <w:rFonts w:ascii="Helvetica" w:hAnsi="Helvetica" w:eastAsia="Helvetica"/>
+          <w:b w:val="0"/>
+          <w:i w:val="0"/>
+          <w:color w:val="333333"/>
+          <w:sz w:val="22"/>
+        </w:rPr>
+        <w:t>•</w:t>
+      </w:r>
+      <w:r>
+        <w:tab/>
+      </w:r>
+      <w:r>
+        <w:rPr>
+          <w:rFonts w:ascii="Helvetica" w:hAnsi="Helvetica" w:eastAsia="Helvetica"/>
+          <w:b/>
+          <w:i w:val="0"/>
+          <w:color w:val="333333"/>
+          <w:sz w:val="22"/>
+        </w:rPr>
+        <w:t>Pipeline Integration:</w:t>
+      </w:r>
+      <w:r>
+        <w:rPr>
+          <w:rFonts w:ascii="Helvetica" w:hAnsi="Helvetica" w:eastAsia="Helvetica"/>
+          <w:b w:val="0"/>
+          <w:i w:val="0"/>
+          <w:color w:val="333333"/>
+          <w:sz w:val="22"/>
+        </w:rPr>
+        <w:t xml:space="preserve"> Preprocessing and regression models are encapsulated within a </w:t>
+      </w:r>
+      <w:r>
+        <w:tab/>
+      </w:r>
+      <w:r>
+        <w:rPr>
+          <w:rFonts w:ascii="Helvetica" w:hAnsi="Helvetica" w:eastAsia="Helvetica"/>
+          <w:b w:val="0"/>
+          <w:i w:val="0"/>
+          <w:color w:val="333333"/>
+          <w:sz w:val="22"/>
+        </w:rPr>
+        <w:t xml:space="preserve">scikit-learn </w:t>
+      </w:r>
+      <w:r>
+        <w:rPr>
+          <w:shd w:val="clear" w:color="auto" w:fill="f4f4f4"/>
+          <w:rFonts w:ascii="Courier" w:hAnsi="Courier" w:eastAsia="Courier"/>
+          <w:b w:val="0"/>
+          <w:i w:val="0"/>
+          <w:color w:val="333333"/>
+          <w:sz w:val="19"/>
+        </w:rPr>
+        <w:t>Pipeline</w:t>
+      </w:r>
+      <w:r>
+        <w:rPr>
+          <w:rFonts w:ascii="Helvetica" w:hAnsi="Helvetica" w:eastAsia="Helvetica"/>
+          <w:b w:val="0"/>
+          <w:i w:val="0"/>
+          <w:color w:val="333333"/>
+          <w:sz w:val="22"/>
+        </w:rPr>
+        <w:t xml:space="preserve"> and </w:t>
+      </w:r>
+      <w:r>
+        <w:rPr>
+          <w:shd w:val="clear" w:color="auto" w:fill="f4f4f4"/>
+          <w:rFonts w:ascii="Courier" w:hAnsi="Courier" w:eastAsia="Courier"/>
+          <w:b w:val="0"/>
+          <w:i w:val="0"/>
+          <w:color w:val="333333"/>
+          <w:sz w:val="19"/>
+        </w:rPr>
+        <w:t>ColumnTransformer</w:t>
+      </w:r>
+      <w:r>
+        <w:rPr>
+          <w:rFonts w:ascii="Helvetica" w:hAnsi="Helvetica" w:eastAsia="Helvetica"/>
+          <w:b w:val="0"/>
+          <w:i w:val="0"/>
+          <w:color w:val="333333"/>
+          <w:sz w:val="22"/>
+        </w:rPr>
+        <w:t xml:space="preserve">. This completely prevents data leakage </w:t>
+      </w:r>
+      <w:r>
+        <w:tab/>
+      </w:r>
+      <w:r>
+        <w:rPr>
+          <w:rFonts w:ascii="Helvetica" w:hAnsi="Helvetica" w:eastAsia="Helvetica"/>
+          <w:b w:val="0"/>
+          <w:i w:val="0"/>
+          <w:color w:val="333333"/>
+          <w:sz w:val="22"/>
+        </w:rPr>
+        <w:t xml:space="preserve">during cross-validation and ensures that production inference inputs are transformed in the </w:t>
+      </w:r>
+      <w:r>
+        <w:tab/>
+      </w:r>
+      <w:r>
+        <w:rPr>
+          <w:rFonts w:ascii="Helvetica" w:hAnsi="Helvetica" w:eastAsia="Helvetica"/>
+          <w:b w:val="0"/>
+          <w:i w:val="0"/>
+          <w:color w:val="333333"/>
+          <w:sz w:val="22"/>
+        </w:rPr>
+        <w:t>exact same manner as training vectors.</w:t>
       </w:r>
     </w:p>
     <w:p>
       <w:pPr>
         <w:sectPr>
           <w:pgSz w:w="11906" w:h="16838"/>
-          <w:pgMar w:top="676" w:right="1104" w:bottom="962" w:left="1124" w:header="720" w:footer="720" w:gutter="0"/>
+          <w:pgMar w:top="714" w:right="1104" w:bottom="1122" w:left="1124" w:header="720" w:footer="720" w:gutter="0"/>
           <w:cols/>
           <w:docGrid w:linePitch="360"/>
         </w:sectPr>
@@ -7617,80 +9032,28 @@
         <w:autoSpaceDN w:val="0"/>
         <w:autoSpaceDE w:val="0"/>
         <w:widowControl/>
-        <w:spacing w:line="220" w:lineRule="exact" w:before="0" w:after="458"/>
+        <w:spacing w:line="220" w:lineRule="exact" w:before="0" w:after="494"/>
         <w:ind w:left="0" w:right="0"/>
       </w:pPr>
     </w:p>
     <w:p>
       <w:pPr>
         <w:autoSpaceDN w:val="0"/>
-        <w:tabs>
-          <w:tab w:pos="660" w:val="left"/>
-        </w:tabs>
         <w:autoSpaceDE w:val="0"/>
         <w:widowControl/>
-        <w:spacing w:line="336" w:lineRule="exact" w:before="0" w:after="0"/>
-        <w:ind w:left="330" w:right="0" w:firstLine="0"/>
+        <w:spacing w:line="332" w:lineRule="exact" w:before="384" w:after="0"/>
+        <w:ind w:left="30" w:right="0" w:firstLine="0"/>
         <w:jc w:val="left"/>
       </w:pPr>
       <w:r>
         <w:rPr>
           <w:rFonts w:ascii="Helvetica" w:hAnsi="Helvetica" w:eastAsia="Helvetica"/>
-          <w:b w:val="0"/>
-          <w:i w:val="0"/>
-          <w:color w:val="333333"/>
-          <w:sz w:val="22"/>
-        </w:rPr>
-        <w:t>•</w:t>
-      </w:r>
-      <w:r>
-        <w:tab/>
-      </w:r>
-      <w:r>
-        <w:rPr>
-          <w:rFonts w:ascii="Helvetica" w:hAnsi="Helvetica" w:eastAsia="Helvetica"/>
           <w:b/>
           <w:i w:val="0"/>
-          <w:color w:val="333333"/>
-          <w:sz w:val="22"/>
-        </w:rPr>
-        <w:t>XGBoost:</w:t>
-      </w:r>
-      <w:r>
-        <w:rPr>
-          <w:rFonts w:ascii="Helvetica" w:hAnsi="Helvetica" w:eastAsia="Helvetica"/>
-          <w:b w:val="0"/>
-          <w:i w:val="0"/>
-          <w:color w:val="333333"/>
-          <w:sz w:val="22"/>
-        </w:rPr>
-        <w:t xml:space="preserve"> A powerful gradient boosted decision trees algorithm. It trains trees sequentially, </w:t>
-      </w:r>
-      <w:r>
-        <w:tab/>
-      </w:r>
-      <w:r>
-        <w:rPr>
-          <w:rFonts w:ascii="Helvetica" w:hAnsi="Helvetica" w:eastAsia="Helvetica"/>
-          <w:b w:val="0"/>
-          <w:i w:val="0"/>
-          <w:color w:val="333333"/>
-          <w:sz w:val="22"/>
-        </w:rPr>
-        <w:t xml:space="preserve">where each tree corrects errors of the previous ones. It is highly optimized, handles </w:t>
-      </w:r>
-      <w:r>
-        <w:tab/>
-      </w:r>
-      <w:r>
-        <w:rPr>
-          <w:rFonts w:ascii="Helvetica" w:hAnsi="Helvetica" w:eastAsia="Helvetica"/>
-          <w:b w:val="0"/>
-          <w:i w:val="0"/>
-          <w:color w:val="333333"/>
-          <w:sz w:val="22"/>
-        </w:rPr>
-        <w:t>complex non-linear relationships, and achieves outstanding accuracy.</w:t>
+          <w:color w:val="1F3A52"/>
+          <w:sz w:val="24"/>
+        </w:rPr>
+        <w:t>4.4 Model Selection and Training</w:t>
       </w:r>
     </w:p>
     <w:p>
@@ -7698,8 +9061,569 @@
         <w:autoSpaceDN w:val="0"/>
         <w:autoSpaceDE w:val="0"/>
         <w:widowControl/>
-        <w:spacing w:line="412" w:lineRule="exact" w:before="1436" w:after="0"/>
+        <w:spacing w:line="352" w:lineRule="exact" w:before="270" w:after="0"/>
+        <w:ind w:left="30" w:right="50" w:firstLine="0"/>
+        <w:jc w:val="both"/>
+      </w:pPr>
+      <w:r>
+        <w:rPr>
+          <w:rFonts w:ascii="Helvetica" w:hAnsi="Helvetica" w:eastAsia="Helvetica"/>
+          <w:b w:val="0"/>
+          <w:i w:val="0"/>
+          <w:color w:val="333333"/>
+          <w:sz w:val="22"/>
+        </w:rPr>
+        <w:t xml:space="preserve">Several machine learning models were trained and evaluated to identify the optimal predictor for </w:t>
+      </w:r>
+      <w:r>
+        <w:rPr>
+          <w:rFonts w:ascii="Helvetica" w:hAnsi="Helvetica" w:eastAsia="Helvetica"/>
+          <w:b w:val="0"/>
+          <w:i w:val="0"/>
+          <w:color w:val="333333"/>
+          <w:sz w:val="22"/>
+        </w:rPr>
+        <w:t xml:space="preserve">real estate mass appraisal: * </w:t>
+      </w:r>
+      <w:r>
+        <w:rPr>
+          <w:rFonts w:ascii="Helvetica" w:hAnsi="Helvetica" w:eastAsia="Helvetica"/>
+          <w:b/>
+          <w:i w:val="0"/>
+          <w:color w:val="333333"/>
+          <w:sz w:val="22"/>
+        </w:rPr>
+        <w:t>Linear Regression:</w:t>
+      </w:r>
+      <w:r>
+        <w:rPr>
+          <w:rFonts w:ascii="Helvetica" w:hAnsi="Helvetica" w:eastAsia="Helvetica"/>
+          <w:b w:val="0"/>
+          <w:i w:val="0"/>
+          <w:color w:val="333333"/>
+          <w:sz w:val="22"/>
+        </w:rPr>
+        <w:t xml:space="preserve"> Serves as the baseline parametric model. It is </w:t>
+      </w:r>
+      <w:r>
+        <w:rPr>
+          <w:rFonts w:ascii="Helvetica" w:hAnsi="Helvetica" w:eastAsia="Helvetica"/>
+          <w:b w:val="0"/>
+          <w:i w:val="0"/>
+          <w:color w:val="333333"/>
+          <w:sz w:val="22"/>
+        </w:rPr>
+        <w:t xml:space="preserve">mathematically transparent and fast but fails to capture non-linear depreciation and geographic </w:t>
+      </w:r>
+      <w:r>
+        <w:rPr>
+          <w:rFonts w:ascii="Helvetica" w:hAnsi="Helvetica" w:eastAsia="Helvetica"/>
+          <w:b w:val="0"/>
+          <w:i w:val="0"/>
+          <w:color w:val="333333"/>
+          <w:sz w:val="22"/>
+        </w:rPr>
+        <w:t xml:space="preserve">coordinate interactions. * </w:t>
+      </w:r>
+      <w:r>
+        <w:rPr>
+          <w:rFonts w:ascii="Helvetica" w:hAnsi="Helvetica" w:eastAsia="Helvetica"/>
+          <w:b/>
+          <w:i w:val="0"/>
+          <w:color w:val="333333"/>
+          <w:sz w:val="22"/>
+        </w:rPr>
+        <w:t>Random Forest Regressor:</w:t>
+      </w:r>
+      <w:r>
+        <w:rPr>
+          <w:rFonts w:ascii="Helvetica" w:hAnsi="Helvetica" w:eastAsia="Helvetica"/>
+          <w:b w:val="0"/>
+          <w:i w:val="0"/>
+          <w:color w:val="333333"/>
+          <w:sz w:val="22"/>
+        </w:rPr>
+        <w:t xml:space="preserve"> An ensemble bagging method that trains </w:t>
+      </w:r>
+      <w:r>
+        <w:rPr>
+          <w:rFonts w:ascii="Helvetica" w:hAnsi="Helvetica" w:eastAsia="Helvetica"/>
+          <w:b w:val="0"/>
+          <w:i w:val="0"/>
+          <w:color w:val="333333"/>
+          <w:sz w:val="22"/>
+        </w:rPr>
+        <w:t xml:space="preserve">multiple independent decision trees in parallel. It averages predictions to reduce variance and </w:t>
+      </w:r>
+      <w:r>
+        <w:rPr>
+          <w:rFonts w:ascii="Helvetica" w:hAnsi="Helvetica" w:eastAsia="Helvetica"/>
+          <w:b w:val="0"/>
+          <w:i w:val="0"/>
+          <w:color w:val="333333"/>
+          <w:sz w:val="22"/>
+        </w:rPr>
+        <w:t xml:space="preserve">provides strong resistance to data noise and outliers. * </w:t>
+      </w:r>
+      <w:r>
+        <w:rPr>
+          <w:rFonts w:ascii="Helvetica" w:hAnsi="Helvetica" w:eastAsia="Helvetica"/>
+          <w:b/>
+          <w:i w:val="0"/>
+          <w:color w:val="333333"/>
+          <w:sz w:val="22"/>
+        </w:rPr>
+        <w:t>XGBoost Regressor:</w:t>
+      </w:r>
+      <w:r>
+        <w:rPr>
+          <w:rFonts w:ascii="Helvetica" w:hAnsi="Helvetica" w:eastAsia="Helvetica"/>
+          <w:b w:val="0"/>
+          <w:i w:val="0"/>
+          <w:color w:val="333333"/>
+          <w:sz w:val="22"/>
+        </w:rPr>
+        <w:t xml:space="preserve"> An advanced </w:t>
+      </w:r>
+      <w:r>
+        <w:rPr>
+          <w:rFonts w:ascii="Helvetica" w:hAnsi="Helvetica" w:eastAsia="Helvetica"/>
+          <w:b w:val="0"/>
+          <w:i w:val="0"/>
+          <w:color w:val="333333"/>
+          <w:sz w:val="22"/>
+        </w:rPr>
+        <w:t xml:space="preserve">gradient boosting algorithm that builds trees sequentially to correct the residuals of preceding </w:t>
+      </w:r>
+      <w:r>
+        <w:rPr>
+          <w:rFonts w:ascii="Helvetica" w:hAnsi="Helvetica" w:eastAsia="Helvetica"/>
+          <w:b w:val="0"/>
+          <w:i w:val="0"/>
+          <w:color w:val="333333"/>
+          <w:sz w:val="22"/>
+        </w:rPr>
+        <w:t xml:space="preserve">estimators. It incorporates L1/L2 regularization to control model complexity, handles tabular </w:t>
+      </w:r>
+      <w:r>
+        <w:rPr>
+          <w:rFonts w:ascii="Helvetica" w:hAnsi="Helvetica" w:eastAsia="Helvetica"/>
+          <w:b w:val="0"/>
+          <w:i w:val="0"/>
+          <w:color w:val="333333"/>
+          <w:sz w:val="22"/>
+        </w:rPr>
+        <w:t>interactions exceptionally well, and achieves the highest overall accuracy.</w:t>
+      </w:r>
+    </w:p>
+    <w:p>
+      <w:pPr>
+        <w:autoSpaceDN w:val="0"/>
+        <w:autoSpaceDE w:val="0"/>
+        <w:widowControl/>
+        <w:spacing w:line="332" w:lineRule="exact" w:before="982" w:after="0"/>
         <w:ind w:left="30" w:right="0" w:firstLine="0"/>
+        <w:jc w:val="left"/>
+      </w:pPr>
+      <w:r>
+        <w:rPr>
+          <w:rFonts w:ascii="Helvetica" w:hAnsi="Helvetica" w:eastAsia="Helvetica"/>
+          <w:b/>
+          <w:i w:val="0"/>
+          <w:color w:val="1F3A52"/>
+          <w:sz w:val="24"/>
+        </w:rPr>
+        <w:t>4.5 Model Evaluation Strategy</w:t>
+      </w:r>
+    </w:p>
+    <w:p>
+      <w:pPr>
+        <w:autoSpaceDN w:val="0"/>
+        <w:autoSpaceDE w:val="0"/>
+        <w:widowControl/>
+        <w:spacing w:line="352" w:lineRule="exact" w:before="270" w:after="0"/>
+        <w:ind w:left="30" w:right="50" w:firstLine="0"/>
+        <w:jc w:val="both"/>
+      </w:pPr>
+      <w:r>
+        <w:rPr>
+          <w:rFonts w:ascii="Helvetica" w:hAnsi="Helvetica" w:eastAsia="Helvetica"/>
+          <w:b w:val="0"/>
+          <w:i w:val="0"/>
+          <w:color w:val="333333"/>
+          <w:sz w:val="22"/>
+        </w:rPr>
+        <w:t xml:space="preserve">To ensure generalizability and prevent overfitting, the following validation framework was </w:t>
+      </w:r>
+      <w:r>
+        <w:rPr>
+          <w:rFonts w:ascii="Helvetica" w:hAnsi="Helvetica" w:eastAsia="Helvetica"/>
+          <w:b w:val="0"/>
+          <w:i w:val="0"/>
+          <w:color w:val="333333"/>
+          <w:sz w:val="22"/>
+        </w:rPr>
+        <w:t xml:space="preserve">executed: * </w:t>
+      </w:r>
+      <w:r>
+        <w:rPr>
+          <w:rFonts w:ascii="Helvetica" w:hAnsi="Helvetica" w:eastAsia="Helvetica"/>
+          <w:b/>
+          <w:i w:val="0"/>
+          <w:color w:val="333333"/>
+          <w:sz w:val="22"/>
+        </w:rPr>
+        <w:t>Data Splitting:</w:t>
+      </w:r>
+      <w:r>
+        <w:rPr>
+          <w:rFonts w:ascii="Helvetica" w:hAnsi="Helvetica" w:eastAsia="Helvetica"/>
+          <w:b w:val="0"/>
+          <w:i w:val="0"/>
+          <w:color w:val="333333"/>
+          <w:sz w:val="22"/>
+        </w:rPr>
+        <w:t xml:space="preserve"> An 80/20 train-test split was used for testing final generalized models. </w:t>
+      </w:r>
+      <w:r>
+        <w:rPr>
+          <w:rFonts w:ascii="Helvetica" w:hAnsi="Helvetica" w:eastAsia="Helvetica"/>
+          <w:b w:val="0"/>
+          <w:i w:val="0"/>
+          <w:color w:val="333333"/>
+          <w:sz w:val="22"/>
+        </w:rPr>
+        <w:t xml:space="preserve">* </w:t>
+      </w:r>
+      <w:r>
+        <w:rPr>
+          <w:rFonts w:ascii="Helvetica" w:hAnsi="Helvetica" w:eastAsia="Helvetica"/>
+          <w:b/>
+          <w:i w:val="0"/>
+          <w:color w:val="333333"/>
+          <w:sz w:val="22"/>
+        </w:rPr>
+        <w:t>Cross-Validation:</w:t>
+      </w:r>
+      <w:r>
+        <w:rPr>
+          <w:rFonts w:ascii="Helvetica" w:hAnsi="Helvetica" w:eastAsia="Helvetica"/>
+          <w:b w:val="0"/>
+          <w:i w:val="0"/>
+          <w:color w:val="333333"/>
+          <w:sz w:val="22"/>
+        </w:rPr>
+        <w:t xml:space="preserve"> A 6-fold cross-validation was implemented during hyperparameter tuning to </w:t>
+      </w:r>
+      <w:r>
+        <w:rPr>
+          <w:rFonts w:ascii="Helvetica" w:hAnsi="Helvetica" w:eastAsia="Helvetica"/>
+          <w:b w:val="0"/>
+          <w:i w:val="0"/>
+          <w:color w:val="333333"/>
+          <w:sz w:val="22"/>
+        </w:rPr>
+        <w:t xml:space="preserve">ensure stable evaluations across different subsets of data. * </w:t>
+      </w:r>
+      <w:r>
+        <w:rPr>
+          <w:rFonts w:ascii="Helvetica" w:hAnsi="Helvetica" w:eastAsia="Helvetica"/>
+          <w:b/>
+          <w:i w:val="0"/>
+          <w:color w:val="333333"/>
+          <w:sz w:val="22"/>
+        </w:rPr>
+        <w:t>Clipping Bounds:</w:t>
+      </w:r>
+      <w:r>
+        <w:rPr>
+          <w:rFonts w:ascii="Helvetica" w:hAnsi="Helvetica" w:eastAsia="Helvetica"/>
+          <w:b w:val="0"/>
+          <w:i w:val="0"/>
+          <w:color w:val="333333"/>
+          <w:sz w:val="22"/>
+        </w:rPr>
+        <w:t xml:space="preserve"> During </w:t>
+      </w:r>
+      <w:r>
+        <w:rPr>
+          <w:rFonts w:ascii="Helvetica" w:hAnsi="Helvetica" w:eastAsia="Helvetica"/>
+          <w:b w:val="0"/>
+          <w:i w:val="0"/>
+          <w:color w:val="333333"/>
+          <w:sz w:val="22"/>
+        </w:rPr>
+        <w:t xml:space="preserve">deployment, a lower bound threshold of $0.0$ was applied to ensure the system never yields </w:t>
+      </w:r>
+      <w:r>
+        <w:rPr>
+          <w:rFonts w:ascii="Helvetica" w:hAnsi="Helvetica" w:eastAsia="Helvetica"/>
+          <w:b w:val="0"/>
+          <w:i w:val="0"/>
+          <w:color w:val="333333"/>
+          <w:sz w:val="22"/>
+        </w:rPr>
+        <w:t>negative or mathematically impossible house prices.</w:t>
+      </w:r>
+    </w:p>
+    <w:p>
+      <w:pPr>
+        <w:autoSpaceDN w:val="0"/>
+        <w:autoSpaceDE w:val="0"/>
+        <w:widowControl/>
+        <w:spacing w:line="332" w:lineRule="exact" w:before="982" w:after="0"/>
+        <w:ind w:left="30" w:right="0" w:firstLine="0"/>
+        <w:jc w:val="left"/>
+      </w:pPr>
+      <w:r>
+        <w:rPr>
+          <w:rFonts w:ascii="Helvetica" w:hAnsi="Helvetica" w:eastAsia="Helvetica"/>
+          <w:b/>
+          <w:i w:val="0"/>
+          <w:color w:val="1F3A52"/>
+          <w:sz w:val="24"/>
+        </w:rPr>
+        <w:t>4.6 Model Deployment and Web Application Integration</w:t>
+      </w:r>
+    </w:p>
+    <w:p>
+      <w:pPr>
+        <w:autoSpaceDN w:val="0"/>
+        <w:autoSpaceDE w:val="0"/>
+        <w:widowControl/>
+        <w:spacing w:line="352" w:lineRule="exact" w:before="270" w:after="0"/>
+        <w:ind w:left="30" w:right="50" w:firstLine="0"/>
+        <w:jc w:val="both"/>
+      </w:pPr>
+      <w:r>
+        <w:rPr>
+          <w:rFonts w:ascii="Helvetica" w:hAnsi="Helvetica" w:eastAsia="Helvetica"/>
+          <w:b w:val="0"/>
+          <w:i w:val="0"/>
+          <w:color w:val="333333"/>
+          <w:sz w:val="22"/>
+        </w:rPr>
+        <w:t xml:space="preserve">The trained XGBoost model, baseline linear model, Random Forest model, and the preprocessing </w:t>
+      </w:r>
+      <w:r>
+        <w:rPr>
+          <w:rFonts w:ascii="Helvetica" w:hAnsi="Helvetica" w:eastAsia="Helvetica"/>
+          <w:b w:val="0"/>
+          <w:i w:val="0"/>
+          <w:color w:val="333333"/>
+          <w:sz w:val="22"/>
+        </w:rPr>
+        <w:t xml:space="preserve">pipeline were saved and deployed in a Flask-based web application. This integration allows users </w:t>
+      </w:r>
+      <w:r>
+        <w:rPr>
+          <w:rFonts w:ascii="Helvetica" w:hAnsi="Helvetica" w:eastAsia="Helvetica"/>
+          <w:b w:val="0"/>
+          <w:i w:val="0"/>
+          <w:color w:val="333333"/>
+          <w:sz w:val="22"/>
+        </w:rPr>
+        <w:t xml:space="preserve">to: * </w:t>
+      </w:r>
+      <w:r>
+        <w:rPr>
+          <w:rFonts w:ascii="Helvetica" w:hAnsi="Helvetica" w:eastAsia="Helvetica"/>
+          <w:b/>
+          <w:i w:val="0"/>
+          <w:color w:val="333333"/>
+          <w:sz w:val="22"/>
+        </w:rPr>
+        <w:t>Input House Attributes:</w:t>
+      </w:r>
+      <w:r>
+        <w:rPr>
+          <w:rFonts w:ascii="Helvetica" w:hAnsi="Helvetica" w:eastAsia="Helvetica"/>
+          <w:b w:val="0"/>
+          <w:i w:val="0"/>
+          <w:color w:val="333333"/>
+          <w:sz w:val="22"/>
+        </w:rPr>
+        <w:t xml:space="preserve"> Enter property dimensions, occupants, coordinates, and age via </w:t>
+      </w:r>
+      <w:r>
+        <w:rPr>
+          <w:rFonts w:ascii="Helvetica" w:hAnsi="Helvetica" w:eastAsia="Helvetica"/>
+          <w:b w:val="0"/>
+          <w:i w:val="0"/>
+          <w:color w:val="333333"/>
+          <w:sz w:val="22"/>
+        </w:rPr>
+        <w:t xml:space="preserve">responsive sliders and number input fields. * </w:t>
+      </w:r>
+      <w:r>
+        <w:rPr>
+          <w:rFonts w:ascii="Helvetica" w:hAnsi="Helvetica" w:eastAsia="Helvetica"/>
+          <w:b/>
+          <w:i w:val="0"/>
+          <w:color w:val="333333"/>
+          <w:sz w:val="22"/>
+        </w:rPr>
+        <w:t>Calculate Features:</w:t>
+      </w:r>
+      <w:r>
+        <w:rPr>
+          <w:rFonts w:ascii="Helvetica" w:hAnsi="Helvetica" w:eastAsia="Helvetica"/>
+          <w:b w:val="0"/>
+          <w:i w:val="0"/>
+          <w:color w:val="333333"/>
+          <w:sz w:val="22"/>
+        </w:rPr>
+        <w:t xml:space="preserve"> Automatically derive feature </w:t>
+      </w:r>
+      <w:r>
+        <w:rPr>
+          <w:rFonts w:ascii="Helvetica" w:hAnsi="Helvetica" w:eastAsia="Helvetica"/>
+          <w:b w:val="0"/>
+          <w:i w:val="0"/>
+          <w:color w:val="333333"/>
+          <w:sz w:val="22"/>
+        </w:rPr>
+        <w:t>columns (</w:t>
+      </w:r>
+      <w:r>
+        <w:rPr>
+          <w:shd w:val="clear" w:color="auto" w:fill="f4f4f4"/>
+          <w:rFonts w:ascii="Courier" w:hAnsi="Courier" w:eastAsia="Courier"/>
+          <w:b w:val="0"/>
+          <w:i w:val="0"/>
+          <w:color w:val="333333"/>
+          <w:sz w:val="19"/>
+        </w:rPr>
+        <w:t>BedroomsRatio</w:t>
+      </w:r>
+      <w:r>
+        <w:rPr>
+          <w:rFonts w:ascii="Helvetica" w:hAnsi="Helvetica" w:eastAsia="Helvetica"/>
+          <w:b w:val="0"/>
+          <w:i w:val="0"/>
+          <w:color w:val="333333"/>
+          <w:sz w:val="22"/>
+        </w:rPr>
+        <w:t xml:space="preserve">, </w:t>
+      </w:r>
+      <w:r>
+        <w:rPr>
+          <w:shd w:val="clear" w:color="auto" w:fill="f4f4f4"/>
+          <w:rFonts w:ascii="Courier" w:hAnsi="Courier" w:eastAsia="Courier"/>
+          <w:b w:val="0"/>
+          <w:i w:val="0"/>
+          <w:color w:val="333333"/>
+          <w:sz w:val="19"/>
+        </w:rPr>
+        <w:t>RoomsPerHousehold</w:t>
+      </w:r>
+      <w:r>
+        <w:rPr>
+          <w:rFonts w:ascii="Helvetica" w:hAnsi="Helvetica" w:eastAsia="Helvetica"/>
+          <w:b w:val="0"/>
+          <w:i w:val="0"/>
+          <w:color w:val="333333"/>
+          <w:sz w:val="22"/>
+        </w:rPr>
+        <w:t xml:space="preserve">, and age categories) in the backend. * </w:t>
+      </w:r>
+      <w:r>
+        <w:rPr>
+          <w:rFonts w:ascii="Helvetica" w:hAnsi="Helvetica" w:eastAsia="Helvetica"/>
+          <w:b/>
+          <w:i w:val="0"/>
+          <w:color w:val="333333"/>
+          <w:sz w:val="22"/>
+        </w:rPr>
+        <w:t xml:space="preserve">Receive </w:t>
+      </w:r>
+      <w:r>
+        <w:rPr>
+          <w:rFonts w:ascii="Helvetica" w:hAnsi="Helvetica" w:eastAsia="Helvetica"/>
+          <w:b/>
+          <w:i w:val="0"/>
+          <w:color w:val="333333"/>
+          <w:sz w:val="22"/>
+        </w:rPr>
+        <w:t>Real-Time Predictions:</w:t>
+      </w:r>
+      <w:r>
+        <w:rPr>
+          <w:rFonts w:ascii="Helvetica" w:hAnsi="Helvetica" w:eastAsia="Helvetica"/>
+          <w:b w:val="0"/>
+          <w:i w:val="0"/>
+          <w:color w:val="333333"/>
+          <w:sz w:val="22"/>
+        </w:rPr>
+        <w:t xml:space="preserve"> Instantaneous price estimations are generated by passing user values </w:t>
+      </w:r>
+      <w:r>
+        <w:rPr>
+          <w:rFonts w:ascii="Helvetica" w:hAnsi="Helvetica" w:eastAsia="Helvetica"/>
+          <w:b w:val="0"/>
+          <w:i w:val="0"/>
+          <w:color w:val="333333"/>
+          <w:sz w:val="22"/>
+        </w:rPr>
+        <w:t>through the loaded preprocessor and XGBoost model.</w:t>
+      </w:r>
+    </w:p>
+    <w:p>
+      <w:pPr>
+        <w:autoSpaceDN w:val="0"/>
+        <w:autoSpaceDE w:val="0"/>
+        <w:widowControl/>
+        <w:spacing w:line="352" w:lineRule="exact" w:before="304" w:after="0"/>
+        <w:ind w:left="30" w:right="0" w:firstLine="0"/>
+        <w:jc w:val="left"/>
+      </w:pPr>
+      <w:r>
+        <w:rPr>
+          <w:rFonts w:ascii="Helvetica" w:hAnsi="Helvetica" w:eastAsia="Helvetica"/>
+          <w:b w:val="0"/>
+          <w:i w:val="0"/>
+          <w:color w:val="333333"/>
+          <w:sz w:val="22"/>
+        </w:rPr>
+        <w:t xml:space="preserve">The deployment demonstrates the practical application of the developed predictive models beyond </w:t>
+      </w:r>
+      <w:r>
+        <w:rPr>
+          <w:rFonts w:ascii="Helvetica" w:hAnsi="Helvetica" w:eastAsia="Helvetica"/>
+          <w:b w:val="0"/>
+          <w:i w:val="0"/>
+          <w:color w:val="333333"/>
+          <w:sz w:val="22"/>
+        </w:rPr>
+        <w:t>offline Jupyter notebooks, creating a real-world software tool.</w:t>
+      </w:r>
+    </w:p>
+    <w:p>
+      <w:pPr>
+        <w:sectPr>
+          <w:pgSz w:w="11906" w:h="16838"/>
+          <w:pgMar w:top="714" w:right="1104" w:bottom="942" w:left="1124" w:header="720" w:footer="720" w:gutter="0"/>
+          <w:cols/>
+          <w:docGrid w:linePitch="360"/>
+        </w:sectPr>
+      </w:pPr>
+    </w:p>
+    <w:p>
+      <w:pPr>
+        <w:autoSpaceDN w:val="0"/>
+        <w:autoSpaceDE w:val="0"/>
+        <w:widowControl/>
+        <w:spacing w:line="220" w:lineRule="exact" w:before="0" w:after="446"/>
+        <w:ind w:left="0" w:right="0"/>
+      </w:pPr>
+    </w:p>
+    <w:p>
+      <w:pPr>
+        <w:autoSpaceDN w:val="0"/>
+        <w:autoSpaceDE w:val="0"/>
+        <w:widowControl/>
+        <w:spacing w:line="412" w:lineRule="exact" w:before="0" w:after="0"/>
+        <w:ind w:left="28" w:right="0" w:firstLine="0"/>
         <w:jc w:val="left"/>
       </w:pPr>
       <w:r>
@@ -7719,7 +9643,7 @@
         <w:autoSpaceDE w:val="0"/>
         <w:widowControl/>
         <w:spacing w:line="332" w:lineRule="exact" w:before="528" w:after="0"/>
-        <w:ind w:left="30" w:right="0" w:firstLine="0"/>
+        <w:ind w:left="28" w:right="0" w:firstLine="0"/>
         <w:jc w:val="left"/>
       </w:pPr>
       <w:r>
@@ -7738,20 +9662,30 @@
         <w:autoSpaceDN w:val="0"/>
         <w:autoSpaceDE w:val="0"/>
         <w:widowControl/>
-        <w:spacing w:line="352" w:lineRule="exact" w:before="270" w:after="424"/>
-        <w:ind w:left="30" w:right="0" w:firstLine="0"/>
+        <w:spacing w:line="304" w:lineRule="exact" w:before="318" w:after="0"/>
+        <w:ind w:left="0" w:right="0" w:firstLine="0"/>
+        <w:jc w:val="center"/>
+      </w:pPr>
+      <w:r>
+        <w:rPr>
+          <w:rFonts w:ascii="Helvetica" w:hAnsi="Helvetica" w:eastAsia="Helvetica"/>
+          <w:b w:val="0"/>
+          <w:i w:val="0"/>
+          <w:color w:val="333333"/>
+          <w:sz w:val="22"/>
+        </w:rPr>
+        <w:t>The models were trained using 6-fold cross-validation on the training set and evaluated on the test</w:t>
+      </w:r>
+    </w:p>
+    <w:p>
+      <w:pPr>
+        <w:autoSpaceDN w:val="0"/>
+        <w:autoSpaceDE w:val="0"/>
+        <w:widowControl/>
+        <w:spacing w:line="304" w:lineRule="exact" w:before="48" w:after="424"/>
+        <w:ind w:left="28" w:right="0" w:firstLine="0"/>
         <w:jc w:val="left"/>
       </w:pPr>
-      <w:r>
-        <w:rPr>
-          <w:rFonts w:ascii="Helvetica" w:hAnsi="Helvetica" w:eastAsia="Helvetica"/>
-          <w:b w:val="0"/>
-          <w:i w:val="0"/>
-          <w:color w:val="333333"/>
-          <w:sz w:val="22"/>
-        </w:rPr>
-        <w:t xml:space="preserve">The models were trained using 6-fold cross-validation on the training set and evaluated on the test </w:t>
-      </w:r>
       <w:r>
         <w:rPr>
           <w:rFonts w:ascii="Helvetica" w:hAnsi="Helvetica" w:eastAsia="Helvetica"/>
@@ -7768,14 +9702,14 @@
         <w:tblW w:type="auto" w:w="0"/>
         <w:tblLayout w:type="fixed"/>
         <w:tblLook w:firstColumn="1" w:firstRow="1" w:lastColumn="0" w:lastRow="0" w:noHBand="0" w:noVBand="1" w:val="04A0"/>
-        <w:tblInd w:w="10.0" w:type="dxa"/>
+        <w:tblInd w:w="8.000000000000114" w:type="dxa"/>
       </w:tblPr>
       <w:tblGrid>
-        <w:gridCol w:w="1936"/>
-        <w:gridCol w:w="1936"/>
-        <w:gridCol w:w="1936"/>
-        <w:gridCol w:w="1936"/>
-        <w:gridCol w:w="1936"/>
+        <w:gridCol w:w="1935"/>
+        <w:gridCol w:w="1935"/>
+        <w:gridCol w:w="1935"/>
+        <w:gridCol w:w="1935"/>
+        <w:gridCol w:w="1935"/>
       </w:tblGrid>
       <w:tr>
         <w:trPr>
@@ -8755,7 +10689,7 @@
         <w:autoSpaceDE w:val="0"/>
         <w:widowControl/>
         <w:spacing w:line="330" w:lineRule="exact" w:before="288" w:after="0"/>
-        <w:ind w:left="30" w:right="0" w:firstLine="0"/>
+        <w:ind w:left="28" w:right="0" w:firstLine="0"/>
         <w:jc w:val="left"/>
       </w:pPr>
       <w:r>
@@ -8773,12 +10707,12 @@
       <w:pPr>
         <w:autoSpaceDN w:val="0"/>
         <w:tabs>
-          <w:tab w:pos="660" w:val="left"/>
+          <w:tab w:pos="658" w:val="left"/>
         </w:tabs>
         <w:autoSpaceDE w:val="0"/>
         <w:widowControl/>
-        <w:spacing w:line="352" w:lineRule="exact" w:before="170" w:after="0"/>
-        <w:ind w:left="330" w:right="720" w:firstLine="0"/>
+        <w:spacing w:line="310" w:lineRule="exact" w:before="212" w:after="0"/>
+        <w:ind w:left="328" w:right="0" w:firstLine="0"/>
         <w:jc w:val="left"/>
       </w:pPr>
       <w:r>
@@ -8854,350 +10788,111 @@
           <w:color w:val="333333"/>
           <w:sz w:val="22"/>
         </w:rPr>
-        <w:t xml:space="preserve">, </w:t>
-      </w:r>
-      <w:r>
-        <w:br/>
-      </w:r>
-      <w:r>
-        <w:tab/>
-      </w:r>
-      <w:r>
-        <w:rPr>
-          <w:shd w:val="clear" w:color="auto" w:fill="f4f4f4"/>
-          <w:rFonts w:ascii="Courier" w:hAnsi="Courier" w:eastAsia="Courier"/>
-          <w:b w:val="0"/>
-          <w:i w:val="0"/>
-          <w:color w:val="333333"/>
-          <w:sz w:val="19"/>
-        </w:rPr>
-        <w:t>linear_regression_model.joblib</w:t>
-      </w:r>
-      <w:r>
-        <w:rPr>
-          <w:rFonts w:ascii="Helvetica" w:hAnsi="Helvetica" w:eastAsia="Helvetica"/>
-          <w:b w:val="0"/>
-          <w:i w:val="0"/>
-          <w:color w:val="333333"/>
-          <w:sz w:val="22"/>
-        </w:rPr>
-        <w:t xml:space="preserve">, </w:t>
-      </w:r>
-      <w:r>
-        <w:rPr>
-          <w:shd w:val="clear" w:color="auto" w:fill="f4f4f4"/>
-          <w:rFonts w:ascii="Courier" w:hAnsi="Courier" w:eastAsia="Courier"/>
-          <w:b w:val="0"/>
-          <w:i w:val="0"/>
-          <w:color w:val="333333"/>
-          <w:sz w:val="19"/>
-        </w:rPr>
-        <w:t>xgboost_model.joblib</w:t>
-      </w:r>
-      <w:r>
-        <w:rPr>
-          <w:rFonts w:ascii="Helvetica" w:hAnsi="Helvetica" w:eastAsia="Helvetica"/>
-          <w:b w:val="0"/>
-          <w:i w:val="0"/>
-          <w:color w:val="333333"/>
-          <w:sz w:val="22"/>
-        </w:rPr>
-        <w:t xml:space="preserve">, and </w:t>
-      </w:r>
-      <w:r>
-        <w:br/>
-      </w:r>
-      <w:r>
-        <w:tab/>
-      </w:r>
-      <w:r>
-        <w:rPr>
-          <w:shd w:val="clear" w:color="auto" w:fill="f4f4f4"/>
-          <w:rFonts w:ascii="Courier" w:hAnsi="Courier" w:eastAsia="Courier"/>
-          <w:b w:val="0"/>
-          <w:i w:val="0"/>
-          <w:color w:val="333333"/>
-          <w:sz w:val="19"/>
-        </w:rPr>
-        <w:t>random_forest_model.joblib</w:t>
-      </w:r>
-      <w:r>
-        <w:rPr>
-          <w:rFonts w:ascii="Helvetica" w:hAnsi="Helvetica" w:eastAsia="Helvetica"/>
-          <w:b w:val="0"/>
-          <w:i w:val="0"/>
-          <w:color w:val="333333"/>
-          <w:sz w:val="22"/>
-        </w:rPr>
-        <w:t xml:space="preserve"> on startup. Serves </w:t>
-      </w:r>
-      <w:r>
-        <w:rPr>
-          <w:shd w:val="clear" w:color="auto" w:fill="f4f4f4"/>
-          <w:rFonts w:ascii="Courier" w:hAnsi="Courier" w:eastAsia="Courier"/>
-          <w:b w:val="0"/>
-          <w:i w:val="0"/>
-          <w:color w:val="333333"/>
-          <w:sz w:val="19"/>
-        </w:rPr>
-        <w:t>/predict</w:t>
-      </w:r>
-      <w:r>
-        <w:rPr>
-          <w:rFonts w:ascii="Helvetica" w:hAnsi="Helvetica" w:eastAsia="Helvetica"/>
-          <w:b w:val="0"/>
-          <w:i w:val="0"/>
-          <w:color w:val="333333"/>
-          <w:sz w:val="22"/>
-        </w:rPr>
-        <w:t xml:space="preserve"> endpoint returning JSON </w:t>
-      </w:r>
-      <w:r>
-        <w:tab/>
-      </w:r>
-      <w:r>
-        <w:rPr>
-          <w:rFonts w:ascii="Helvetica" w:hAnsi="Helvetica" w:eastAsia="Helvetica"/>
-          <w:b w:val="0"/>
-          <w:i w:val="0"/>
-          <w:color w:val="333333"/>
-          <w:sz w:val="22"/>
-        </w:rPr>
-        <w:t>predictions.</w:t>
-      </w:r>
-    </w:p>
-    <w:p>
-      <w:pPr>
-        <w:sectPr>
-          <w:pgSz w:w="11906" w:h="16838"/>
-          <w:pgMar w:top="680" w:right="1104" w:bottom="836" w:left="1124" w:header="720" w:footer="720" w:gutter="0"/>
-          <w:cols/>
-          <w:docGrid w:linePitch="360"/>
-        </w:sectPr>
-      </w:pPr>
+        <w:t>,</w:t>
+      </w:r>
     </w:p>
     <w:p>
       <w:pPr>
         <w:autoSpaceDN w:val="0"/>
         <w:autoSpaceDE w:val="0"/>
         <w:widowControl/>
-        <w:spacing w:line="220" w:lineRule="exact" w:before="0" w:after="458"/>
-        <w:ind w:left="0" w:right="0"/>
+        <w:spacing w:line="302" w:lineRule="exact" w:before="42" w:after="0"/>
+        <w:ind w:left="658" w:right="0" w:firstLine="0"/>
+        <w:jc w:val="left"/>
       </w:pPr>
+      <w:r>
+        <w:rPr>
+          <w:shd w:val="clear" w:color="auto" w:fill="f4f4f4"/>
+          <w:rFonts w:ascii="Courier" w:hAnsi="Courier" w:eastAsia="Courier"/>
+          <w:b w:val="0"/>
+          <w:i w:val="0"/>
+          <w:color w:val="333333"/>
+          <w:sz w:val="19"/>
+        </w:rPr>
+        <w:t>linear_regression_model.joblib</w:t>
+      </w:r>
+      <w:r>
+        <w:rPr>
+          <w:rFonts w:ascii="Helvetica" w:hAnsi="Helvetica" w:eastAsia="Helvetica"/>
+          <w:b w:val="0"/>
+          <w:i w:val="0"/>
+          <w:color w:val="333333"/>
+          <w:sz w:val="22"/>
+        </w:rPr>
+        <w:t xml:space="preserve">, </w:t>
+      </w:r>
+      <w:r>
+        <w:rPr>
+          <w:shd w:val="clear" w:color="auto" w:fill="f4f4f4"/>
+          <w:rFonts w:ascii="Courier" w:hAnsi="Courier" w:eastAsia="Courier"/>
+          <w:b w:val="0"/>
+          <w:i w:val="0"/>
+          <w:color w:val="333333"/>
+          <w:sz w:val="19"/>
+        </w:rPr>
+        <w:t>xgboost_model.joblib</w:t>
+      </w:r>
+      <w:r>
+        <w:rPr>
+          <w:rFonts w:ascii="Helvetica" w:hAnsi="Helvetica" w:eastAsia="Helvetica"/>
+          <w:b w:val="0"/>
+          <w:i w:val="0"/>
+          <w:color w:val="333333"/>
+          <w:sz w:val="22"/>
+        </w:rPr>
+        <w:t>, and</w:t>
+      </w:r>
     </w:p>
     <w:p>
       <w:pPr>
         <w:autoSpaceDN w:val="0"/>
         <w:autoSpaceDE w:val="0"/>
         <w:widowControl/>
-        <w:spacing w:line="328" w:lineRule="exact" w:before="0" w:after="0"/>
-        <w:ind w:left="660" w:right="288" w:firstLine="0"/>
+        <w:spacing w:line="302" w:lineRule="exact" w:before="50" w:after="0"/>
+        <w:ind w:left="658" w:right="0" w:firstLine="0"/>
         <w:jc w:val="left"/>
       </w:pPr>
       <w:r>
         <w:rPr>
-          <w:rFonts w:ascii="Helvetica" w:hAnsi="Helvetica" w:eastAsia="Helvetica"/>
-          <w:b/>
-          <w:i w:val="0"/>
-          <w:color w:val="333333"/>
-          <w:sz w:val="22"/>
-        </w:rPr>
-        <w:t>Frontend (</w:t>
-      </w:r>
-      <w:r>
-        <w:rPr>
           <w:shd w:val="clear" w:color="auto" w:fill="f4f4f4"/>
           <w:rFonts w:ascii="Courier" w:hAnsi="Courier" w:eastAsia="Courier"/>
-          <w:b/>
+          <w:b w:val="0"/>
           <w:i w:val="0"/>
           <w:color w:val="333333"/>
           <w:sz w:val="19"/>
         </w:rPr>
-        <w:t>templates/index.html</w:t>
-      </w:r>
-      <w:r>
-        <w:rPr>
-          <w:rFonts w:ascii="Helvetica" w:hAnsi="Helvetica" w:eastAsia="Helvetica"/>
-          <w:b/>
-          <w:i w:val="0"/>
-          <w:color w:val="333333"/>
-          <w:sz w:val="22"/>
-        </w:rPr>
-        <w:t>):</w:t>
-      </w:r>
-      <w:r>
-        <w:rPr>
-          <w:rFonts w:ascii="Helvetica" w:hAnsi="Helvetica" w:eastAsia="Helvetica"/>
-          <w:b w:val="0"/>
-          <w:i w:val="0"/>
-          <w:color w:val="333333"/>
-          <w:sz w:val="22"/>
-        </w:rPr>
-        <w:t xml:space="preserve"> Glassmorphic web panel with Outfit typography and </w:t>
-      </w:r>
-      <w:r>
-        <w:rPr>
-          <w:rFonts w:ascii="Helvetica" w:hAnsi="Helvetica" w:eastAsia="Helvetica"/>
-          <w:b w:val="0"/>
-          <w:i w:val="0"/>
-          <w:color w:val="333333"/>
-          <w:sz w:val="22"/>
-        </w:rPr>
-        <w:t>dynamic dark mode sliders for all 10 features:</w:t>
-      </w:r>
-    </w:p>
-    <w:p>
-      <w:pPr>
-        <w:autoSpaceDN w:val="0"/>
-        <w:tabs>
-          <w:tab w:pos="990" w:val="left"/>
-        </w:tabs>
-        <w:autoSpaceDE w:val="0"/>
-        <w:widowControl/>
-        <w:spacing w:line="352" w:lineRule="exact" w:before="150" w:after="0"/>
-        <w:ind w:left="660" w:right="0" w:firstLine="0"/>
-        <w:jc w:val="left"/>
-      </w:pPr>
-      <w:r>
-        <w:rPr>
-          <w:rFonts w:ascii="Helvetica" w:hAnsi="Helvetica" w:eastAsia="Helvetica"/>
-          <w:b w:val="0"/>
-          <w:i w:val="0"/>
-          <w:color w:val="333333"/>
-          <w:sz w:val="22"/>
-        </w:rPr>
-        <w:t>•</w:t>
-      </w:r>
-      <w:r>
-        <w:tab/>
-      </w:r>
-      <w:r>
-        <w:rPr>
-          <w:rFonts w:ascii="Helvetica" w:hAnsi="Helvetica" w:eastAsia="Helvetica"/>
-          <w:b w:val="0"/>
-          <w:i/>
-          <w:color w:val="333333"/>
-          <w:sz w:val="22"/>
-        </w:rPr>
-        <w:t>Direct sliders:</w:t>
-      </w:r>
-      <w:r>
-        <w:rPr>
-          <w:rFonts w:ascii="Helvetica" w:hAnsi="Helvetica" w:eastAsia="Helvetica"/>
-          <w:b w:val="0"/>
-          <w:i w:val="0"/>
-          <w:color w:val="333333"/>
-          <w:sz w:val="22"/>
-        </w:rPr>
-        <w:t xml:space="preserve"> IncomeLevel, PropertyAge, TotalRooms, TotalBedrooms, AvgOccupancy, </w:t>
-      </w:r>
-      <w:r>
-        <w:tab/>
-      </w:r>
-      <w:r>
-        <w:rPr>
-          <w:rFonts w:ascii="Helvetica" w:hAnsi="Helvetica" w:eastAsia="Helvetica"/>
-          <w:b w:val="0"/>
-          <w:i w:val="0"/>
-          <w:color w:val="333333"/>
-          <w:sz w:val="22"/>
-        </w:rPr>
-        <w:t>RoomsPerHousehold, BedroomsRatio.</w:t>
-      </w:r>
-    </w:p>
-    <w:p>
-      <w:pPr>
-        <w:autoSpaceDN w:val="0"/>
-        <w:tabs>
-          <w:tab w:pos="990" w:val="left"/>
-        </w:tabs>
-        <w:autoSpaceDE w:val="0"/>
-        <w:widowControl/>
-        <w:spacing w:line="304" w:lineRule="exact" w:before="198" w:after="0"/>
-        <w:ind w:left="660" w:right="0" w:firstLine="0"/>
-        <w:jc w:val="left"/>
-      </w:pPr>
-      <w:r>
-        <w:rPr>
-          <w:rFonts w:ascii="Helvetica" w:hAnsi="Helvetica" w:eastAsia="Helvetica"/>
-          <w:b w:val="0"/>
-          <w:i w:val="0"/>
-          <w:color w:val="333333"/>
-          <w:sz w:val="22"/>
-        </w:rPr>
-        <w:t>•</w:t>
-      </w:r>
-      <w:r>
-        <w:tab/>
-      </w:r>
-      <w:r>
-        <w:rPr>
-          <w:rFonts w:ascii="Helvetica" w:hAnsi="Helvetica" w:eastAsia="Helvetica"/>
-          <w:b w:val="0"/>
-          <w:i/>
-          <w:color w:val="333333"/>
-          <w:sz w:val="22"/>
-        </w:rPr>
-        <w:t>Direct inputs:</w:t>
-      </w:r>
-      <w:r>
-        <w:rPr>
-          <w:rFonts w:ascii="Helvetica" w:hAnsi="Helvetica" w:eastAsia="Helvetica"/>
-          <w:b w:val="0"/>
-          <w:i w:val="0"/>
-          <w:color w:val="333333"/>
-          <w:sz w:val="22"/>
-        </w:rPr>
-        <w:t xml:space="preserve"> NeighborhoodPop, Latitude, Longitude.</w:t>
-      </w:r>
-    </w:p>
-    <w:p>
-      <w:pPr>
-        <w:autoSpaceDN w:val="0"/>
-        <w:tabs>
-          <w:tab w:pos="990" w:val="left"/>
-        </w:tabs>
-        <w:autoSpaceDE w:val="0"/>
-        <w:widowControl/>
-        <w:spacing w:line="352" w:lineRule="exact" w:before="150" w:after="0"/>
-        <w:ind w:left="660" w:right="864" w:firstLine="0"/>
-        <w:jc w:val="left"/>
-      </w:pPr>
-      <w:r>
-        <w:rPr>
-          <w:rFonts w:ascii="Helvetica" w:hAnsi="Helvetica" w:eastAsia="Helvetica"/>
-          <w:b w:val="0"/>
-          <w:i w:val="0"/>
-          <w:color w:val="333333"/>
-          <w:sz w:val="22"/>
-        </w:rPr>
-        <w:t>•</w:t>
-      </w:r>
-      <w:r>
-        <w:tab/>
-      </w:r>
-      <w:r>
-        <w:rPr>
-          <w:rFonts w:ascii="Helvetica" w:hAnsi="Helvetica" w:eastAsia="Helvetica"/>
-          <w:b w:val="0"/>
-          <w:i w:val="0"/>
-          <w:color w:val="333333"/>
-          <w:sz w:val="22"/>
-        </w:rPr>
-        <w:t xml:space="preserve">Live updates are sent asynchronously to the backend on slider adjust, updating </w:t>
-      </w:r>
-      <w:r>
-        <w:tab/>
-      </w:r>
-      <w:r>
-        <w:rPr>
-          <w:rFonts w:ascii="Helvetica" w:hAnsi="Helvetica" w:eastAsia="Helvetica"/>
-          <w:b w:val="0"/>
-          <w:i w:val="0"/>
-          <w:color w:val="333333"/>
-          <w:sz w:val="22"/>
-        </w:rPr>
-        <w:t>predicted prices dynamically with a neon green layout.</w:t>
+        <w:t>random_forest_model.joblib</w:t>
+      </w:r>
+      <w:r>
+        <w:rPr>
+          <w:rFonts w:ascii="Helvetica" w:hAnsi="Helvetica" w:eastAsia="Helvetica"/>
+          <w:b w:val="0"/>
+          <w:i w:val="0"/>
+          <w:color w:val="333333"/>
+          <w:sz w:val="22"/>
+        </w:rPr>
+        <w:t xml:space="preserve"> on startup. Serves </w:t>
+      </w:r>
+      <w:r>
+        <w:rPr>
+          <w:shd w:val="clear" w:color="auto" w:fill="f4f4f4"/>
+          <w:rFonts w:ascii="Courier" w:hAnsi="Courier" w:eastAsia="Courier"/>
+          <w:b w:val="0"/>
+          <w:i w:val="0"/>
+          <w:color w:val="333333"/>
+          <w:sz w:val="19"/>
+        </w:rPr>
+        <w:t>/predict</w:t>
+      </w:r>
+      <w:r>
+        <w:rPr>
+          <w:rFonts w:ascii="Helvetica" w:hAnsi="Helvetica" w:eastAsia="Helvetica"/>
+          <w:b w:val="0"/>
+          <w:i w:val="0"/>
+          <w:color w:val="333333"/>
+          <w:sz w:val="22"/>
+        </w:rPr>
+        <w:t xml:space="preserve"> endpoint returning JSON</w:t>
       </w:r>
     </w:p>
     <w:p>
@@ -9205,19 +10900,19 @@
         <w:autoSpaceDN w:val="0"/>
         <w:autoSpaceDE w:val="0"/>
         <w:widowControl/>
-        <w:spacing w:line="412" w:lineRule="exact" w:before="1700" w:after="0"/>
-        <w:ind w:left="30" w:right="0" w:firstLine="0"/>
+        <w:spacing w:line="302" w:lineRule="exact" w:before="50" w:after="0"/>
+        <w:ind w:left="658" w:right="0" w:firstLine="0"/>
         <w:jc w:val="left"/>
       </w:pPr>
       <w:r>
         <w:rPr>
           <w:rFonts w:ascii="Helvetica" w:hAnsi="Helvetica" w:eastAsia="Helvetica"/>
-          <w:b/>
-          <w:i w:val="0"/>
-          <w:color w:val="1F3A52"/>
-          <w:sz w:val="30"/>
-        </w:rPr>
-        <w:t>Section F: Critical Evaluation &amp; Limitations (10 Marks)</w:t>
+          <w:b w:val="0"/>
+          <w:i w:val="0"/>
+          <w:color w:val="333333"/>
+          <w:sz w:val="22"/>
+        </w:rPr>
+        <w:t>predictions.</w:t>
       </w:r>
     </w:p>
     <w:p>
@@ -9225,8 +10920,8 @@
         <w:autoSpaceDN w:val="0"/>
         <w:autoSpaceDE w:val="0"/>
         <w:widowControl/>
-        <w:spacing w:line="332" w:lineRule="exact" w:before="528" w:after="0"/>
-        <w:ind w:left="30" w:right="0" w:firstLine="0"/>
+        <w:spacing w:line="310" w:lineRule="exact" w:before="200" w:after="0"/>
+        <w:ind w:left="658" w:right="0" w:firstLine="0"/>
         <w:jc w:val="left"/>
       </w:pPr>
       <w:r>
@@ -9234,72 +10929,41 @@
           <w:rFonts w:ascii="Helvetica" w:hAnsi="Helvetica" w:eastAsia="Helvetica"/>
           <w:b/>
           <w:i w:val="0"/>
-          <w:color w:val="1F3A52"/>
-          <w:sz w:val="24"/>
-        </w:rPr>
-        <w:t>1. Domain Suitability of the Model</w:t>
-      </w:r>
-    </w:p>
-    <w:p>
-      <w:pPr>
-        <w:autoSpaceDN w:val="0"/>
-        <w:tabs>
-          <w:tab w:pos="660" w:val="left"/>
-        </w:tabs>
-        <w:autoSpaceDE w:val="0"/>
-        <w:widowControl/>
-        <w:spacing w:line="352" w:lineRule="exact" w:before="170" w:after="0"/>
-        <w:ind w:left="330" w:right="288" w:firstLine="0"/>
-        <w:jc w:val="left"/>
-      </w:pPr>
-      <w:r>
-        <w:rPr>
-          <w:rFonts w:ascii="Helvetica" w:hAnsi="Helvetica" w:eastAsia="Helvetica"/>
-          <w:b w:val="0"/>
-          <w:i w:val="0"/>
-          <w:color w:val="333333"/>
-          <w:sz w:val="22"/>
-        </w:rPr>
-        <w:t>•</w:t>
-      </w:r>
-      <w:r>
-        <w:tab/>
-      </w:r>
-      <w:r>
-        <w:rPr>
-          <w:rFonts w:ascii="Helvetica" w:hAnsi="Helvetica" w:eastAsia="Helvetica"/>
-          <w:b w:val="0"/>
-          <w:i w:val="0"/>
-          <w:color w:val="333333"/>
-          <w:sz w:val="22"/>
-        </w:rPr>
-        <w:t xml:space="preserve">The Random Forest Regressor is highly suited for real estate valuation. It is robust to </w:t>
-      </w:r>
-      <w:r>
-        <w:tab/>
-      </w:r>
-      <w:r>
-        <w:rPr>
-          <w:rFonts w:ascii="Helvetica" w:hAnsi="Helvetica" w:eastAsia="Helvetica"/>
-          <w:b w:val="0"/>
-          <w:i w:val="0"/>
-          <w:color w:val="333333"/>
-          <w:sz w:val="22"/>
-        </w:rPr>
-        <w:t xml:space="preserve">outliers (which are common in real estate due to luxury housing spikes) and captures the </w:t>
-      </w:r>
-      <w:r>
-        <w:tab/>
-      </w:r>
-      <w:r>
-        <w:rPr>
-          <w:rFonts w:ascii="Helvetica" w:hAnsi="Helvetica" w:eastAsia="Helvetica"/>
-          <w:b w:val="0"/>
-          <w:i w:val="0"/>
-          <w:color w:val="333333"/>
-          <w:sz w:val="22"/>
-        </w:rPr>
-        <w:t>complex interactions between geographic coordinates and average occupancy.</w:t>
+          <w:color w:val="333333"/>
+          <w:sz w:val="22"/>
+        </w:rPr>
+        <w:t>Frontend (</w:t>
+      </w:r>
+      <w:r>
+        <w:rPr>
+          <w:shd w:val="clear" w:color="auto" w:fill="f4f4f4"/>
+          <w:rFonts w:ascii="Courier" w:hAnsi="Courier" w:eastAsia="Courier"/>
+          <w:b/>
+          <w:i w:val="0"/>
+          <w:color w:val="333333"/>
+          <w:sz w:val="19"/>
+        </w:rPr>
+        <w:t>templates/index.html</w:t>
+      </w:r>
+      <w:r>
+        <w:rPr>
+          <w:rFonts w:ascii="Helvetica" w:hAnsi="Helvetica" w:eastAsia="Helvetica"/>
+          <w:b/>
+          <w:i w:val="0"/>
+          <w:color w:val="333333"/>
+          <w:sz w:val="22"/>
+        </w:rPr>
+        <w:t>):</w:t>
+      </w:r>
+      <w:r>
+        <w:rPr>
+          <w:rFonts w:ascii="Helvetica" w:hAnsi="Helvetica" w:eastAsia="Helvetica"/>
+          <w:b w:val="0"/>
+          <w:i w:val="0"/>
+          <w:color w:val="333333"/>
+          <w:sz w:val="22"/>
+        </w:rPr>
+        <w:t xml:space="preserve"> Glassmorphic web panel with Outfit typography and</w:t>
       </w:r>
     </w:p>
     <w:p>
@@ -9307,31 +10971,31 @@
         <w:autoSpaceDN w:val="0"/>
         <w:autoSpaceDE w:val="0"/>
         <w:widowControl/>
-        <w:spacing w:line="332" w:lineRule="exact" w:before="816" w:after="0"/>
-        <w:ind w:left="30" w:right="0" w:firstLine="0"/>
+        <w:spacing w:line="302" w:lineRule="exact" w:before="42" w:after="0"/>
+        <w:ind w:left="658" w:right="0" w:firstLine="0"/>
         <w:jc w:val="left"/>
       </w:pPr>
       <w:r>
         <w:rPr>
           <w:rFonts w:ascii="Helvetica" w:hAnsi="Helvetica" w:eastAsia="Helvetica"/>
-          <w:b/>
-          <w:i w:val="0"/>
-          <w:color w:val="1F3A52"/>
-          <w:sz w:val="24"/>
-        </w:rPr>
-        <w:t>2. Suitability of Deep Learning</w:t>
+          <w:b w:val="0"/>
+          <w:i w:val="0"/>
+          <w:color w:val="333333"/>
+          <w:sz w:val="22"/>
+        </w:rPr>
+        <w:t>dynamic dark mode sliders for all 10 features:</w:t>
       </w:r>
     </w:p>
     <w:p>
       <w:pPr>
         <w:autoSpaceDN w:val="0"/>
         <w:tabs>
-          <w:tab w:pos="660" w:val="left"/>
+          <w:tab w:pos="988" w:val="left"/>
         </w:tabs>
         <w:autoSpaceDE w:val="0"/>
         <w:widowControl/>
-        <w:spacing w:line="352" w:lineRule="exact" w:before="170" w:after="0"/>
-        <w:ind w:left="330" w:right="720" w:firstLine="0"/>
+        <w:spacing w:line="302" w:lineRule="exact" w:before="200" w:after="0"/>
+        <w:ind w:left="658" w:right="0" w:firstLine="0"/>
         <w:jc w:val="left"/>
       </w:pPr>
       <w:r>
@@ -9351,155 +11015,21 @@
         <w:rPr>
           <w:rFonts w:ascii="Helvetica" w:hAnsi="Helvetica" w:eastAsia="Helvetica"/>
           <w:b w:val="0"/>
-          <w:i w:val="0"/>
-          <w:color w:val="333333"/>
-          <w:sz w:val="22"/>
-        </w:rPr>
-        <w:t xml:space="preserve">While Deep Learning (e.g. MLPs) can approximate the spatial price function, it is less </w:t>
-      </w:r>
-      <w:r>
-        <w:tab/>
-      </w:r>
-      <w:r>
-        <w:rPr>
-          <w:rFonts w:ascii="Helvetica" w:hAnsi="Helvetica" w:eastAsia="Helvetica"/>
-          <w:b w:val="0"/>
-          <w:i w:val="0"/>
-          <w:color w:val="333333"/>
-          <w:sz w:val="22"/>
-        </w:rPr>
-        <w:t>suitable here due to:</w:t>
-      </w:r>
-    </w:p>
-    <w:p>
-      <w:pPr>
-        <w:autoSpaceDN w:val="0"/>
-        <w:tabs>
-          <w:tab w:pos="990" w:val="left"/>
-        </w:tabs>
-        <w:autoSpaceDE w:val="0"/>
-        <w:widowControl/>
-        <w:spacing w:line="352" w:lineRule="exact" w:before="150" w:after="0"/>
-        <w:ind w:left="660" w:right="1152" w:firstLine="0"/>
-        <w:jc w:val="left"/>
-      </w:pPr>
-      <w:r>
-        <w:rPr>
-          <w:rFonts w:ascii="Helvetica" w:hAnsi="Helvetica" w:eastAsia="Helvetica"/>
-          <w:b w:val="0"/>
-          <w:i w:val="0"/>
-          <w:color w:val="333333"/>
-          <w:sz w:val="22"/>
-        </w:rPr>
-        <w:t>•</w:t>
-      </w:r>
-      <w:r>
-        <w:tab/>
-      </w:r>
-      <w:r>
-        <w:rPr>
-          <w:rFonts w:ascii="Helvetica" w:hAnsi="Helvetica" w:eastAsia="Helvetica"/>
-          <w:b w:val="0"/>
           <w:i/>
           <w:color w:val="333333"/>
           <w:sz w:val="22"/>
         </w:rPr>
-        <w:t>Data scale:</w:t>
-      </w:r>
-      <w:r>
-        <w:rPr>
-          <w:rFonts w:ascii="Helvetica" w:hAnsi="Helvetica" w:eastAsia="Helvetica"/>
-          <w:b w:val="0"/>
-          <w:i w:val="0"/>
-          <w:color w:val="333333"/>
-          <w:sz w:val="22"/>
-        </w:rPr>
-        <w:t xml:space="preserve"> Tabular dataset size (15k rows) is too small to train large network </w:t>
-      </w:r>
-      <w:r>
-        <w:tab/>
-      </w:r>
-      <w:r>
-        <w:rPr>
-          <w:rFonts w:ascii="Helvetica" w:hAnsi="Helvetica" w:eastAsia="Helvetica"/>
-          <w:b w:val="0"/>
-          <w:i w:val="0"/>
-          <w:color w:val="333333"/>
-          <w:sz w:val="22"/>
-        </w:rPr>
-        <w:t>parameters without massive overfitting.</w:t>
-      </w:r>
-    </w:p>
-    <w:p>
-      <w:pPr>
-        <w:autoSpaceDN w:val="0"/>
-        <w:tabs>
-          <w:tab w:pos="990" w:val="left"/>
-        </w:tabs>
-        <w:autoSpaceDE w:val="0"/>
-        <w:widowControl/>
-        <w:spacing w:line="352" w:lineRule="exact" w:before="150" w:after="0"/>
-        <w:ind w:left="660" w:right="288" w:firstLine="0"/>
-        <w:jc w:val="left"/>
-      </w:pPr>
-      <w:r>
-        <w:rPr>
-          <w:rFonts w:ascii="Helvetica" w:hAnsi="Helvetica" w:eastAsia="Helvetica"/>
-          <w:b w:val="0"/>
-          <w:i w:val="0"/>
-          <w:color w:val="333333"/>
-          <w:sz w:val="22"/>
-        </w:rPr>
-        <w:t>•</w:t>
-      </w:r>
-      <w:r>
-        <w:tab/>
-      </w:r>
-      <w:r>
-        <w:rPr>
-          <w:rFonts w:ascii="Helvetica" w:hAnsi="Helvetica" w:eastAsia="Helvetica"/>
-          <w:b w:val="0"/>
-          <w:i/>
-          <w:color w:val="333333"/>
-          <w:sz w:val="22"/>
-        </w:rPr>
-        <w:t>Interpretability:</w:t>
-      </w:r>
-      <w:r>
-        <w:rPr>
-          <w:rFonts w:ascii="Helvetica" w:hAnsi="Helvetica" w:eastAsia="Helvetica"/>
-          <w:b w:val="0"/>
-          <w:i w:val="0"/>
-          <w:color w:val="333333"/>
-          <w:sz w:val="22"/>
-        </w:rPr>
-        <w:t xml:space="preserve"> Real estate appraisers require structural rules (e.g., how the bedrooms </w:t>
-      </w:r>
-      <w:r>
-        <w:tab/>
-      </w:r>
-      <w:r>
-        <w:rPr>
-          <w:rFonts w:ascii="Helvetica" w:hAnsi="Helvetica" w:eastAsia="Helvetica"/>
-          <w:b w:val="0"/>
-          <w:i w:val="0"/>
-          <w:color w:val="333333"/>
-          <w:sz w:val="22"/>
-        </w:rPr>
-        <w:t xml:space="preserve">ratio impacts price) which are inspectable in tree splits but completely hidden in deep </w:t>
-      </w:r>
-      <w:r>
-        <w:tab/>
-      </w:r>
-      <w:r>
-        <w:rPr>
-          <w:rFonts w:ascii="Helvetica" w:hAnsi="Helvetica" w:eastAsia="Helvetica"/>
-          <w:b w:val="0"/>
-          <w:i w:val="0"/>
-          <w:color w:val="333333"/>
-          <w:sz w:val="22"/>
-        </w:rPr>
-        <w:t>neural weights.</w:t>
+        <w:t>Direct sliders:</w:t>
+      </w:r>
+      <w:r>
+        <w:rPr>
+          <w:rFonts w:ascii="Helvetica" w:hAnsi="Helvetica" w:eastAsia="Helvetica"/>
+          <w:b w:val="0"/>
+          <w:i w:val="0"/>
+          <w:color w:val="333333"/>
+          <w:sz w:val="22"/>
+        </w:rPr>
+        <w:t xml:space="preserve"> IncomeLevel, PropertyAge, TotalRooms, TotalBedrooms, AvgOccupancy,</w:t>
       </w:r>
     </w:p>
     <w:p>
@@ -9507,31 +11037,31 @@
         <w:autoSpaceDN w:val="0"/>
         <w:autoSpaceDE w:val="0"/>
         <w:widowControl/>
-        <w:spacing w:line="332" w:lineRule="exact" w:before="1080" w:after="0"/>
-        <w:ind w:left="30" w:right="0" w:firstLine="0"/>
+        <w:spacing w:line="302" w:lineRule="exact" w:before="50" w:after="0"/>
+        <w:ind w:left="988" w:right="0" w:firstLine="0"/>
         <w:jc w:val="left"/>
       </w:pPr>
       <w:r>
         <w:rPr>
           <w:rFonts w:ascii="Helvetica" w:hAnsi="Helvetica" w:eastAsia="Helvetica"/>
-          <w:b/>
-          <w:i w:val="0"/>
-          <w:color w:val="1F3A52"/>
-          <w:sz w:val="24"/>
-        </w:rPr>
-        <w:t>3. Limitations of the Current Approach</w:t>
+          <w:b w:val="0"/>
+          <w:i w:val="0"/>
+          <w:color w:val="333333"/>
+          <w:sz w:val="22"/>
+        </w:rPr>
+        <w:t>RoomsPerHousehold, BedroomsRatio.</w:t>
       </w:r>
     </w:p>
     <w:p>
       <w:pPr>
         <w:autoSpaceDN w:val="0"/>
         <w:tabs>
-          <w:tab w:pos="660" w:val="left"/>
+          <w:tab w:pos="988" w:val="left"/>
         </w:tabs>
         <w:autoSpaceDE w:val="0"/>
         <w:widowControl/>
-        <w:spacing w:line="352" w:lineRule="exact" w:before="170" w:after="0"/>
-        <w:ind w:left="330" w:right="576" w:firstLine="0"/>
+        <w:spacing w:line="302" w:lineRule="exact" w:before="200" w:after="0"/>
+        <w:ind w:left="658" w:right="0" w:firstLine="0"/>
         <w:jc w:val="left"/>
       </w:pPr>
       <w:r>
@@ -9550,42 +11080,29 @@
       <w:r>
         <w:rPr>
           <w:rFonts w:ascii="Helvetica" w:hAnsi="Helvetica" w:eastAsia="Helvetica"/>
-          <w:b/>
-          <w:i w:val="0"/>
-          <w:color w:val="333333"/>
-          <w:sz w:val="22"/>
-        </w:rPr>
-        <w:t>Temporal Shift:</w:t>
-      </w:r>
-      <w:r>
-        <w:rPr>
-          <w:rFonts w:ascii="Helvetica" w:hAnsi="Helvetica" w:eastAsia="Helvetica"/>
-          <w:b w:val="0"/>
-          <w:i w:val="0"/>
-          <w:color w:val="333333"/>
-          <w:sz w:val="22"/>
-        </w:rPr>
-        <w:t xml:space="preserve"> The model does not include time metrics. Inflation, interest rates, and </w:t>
-      </w:r>
-      <w:r>
-        <w:tab/>
-      </w:r>
-      <w:r>
-        <w:rPr>
-          <w:rFonts w:ascii="Helvetica" w:hAnsi="Helvetica" w:eastAsia="Helvetica"/>
-          <w:b w:val="0"/>
-          <w:i w:val="0"/>
-          <w:color w:val="333333"/>
-          <w:sz w:val="22"/>
-        </w:rPr>
-        <w:t>seasonal spikes are completely ignored.</w:t>
+          <w:b w:val="0"/>
+          <w:i/>
+          <w:color w:val="333333"/>
+          <w:sz w:val="22"/>
+        </w:rPr>
+        <w:t>Direct inputs:</w:t>
+      </w:r>
+      <w:r>
+        <w:rPr>
+          <w:rFonts w:ascii="Helvetica" w:hAnsi="Helvetica" w:eastAsia="Helvetica"/>
+          <w:b w:val="0"/>
+          <w:i w:val="0"/>
+          <w:color w:val="333333"/>
+          <w:sz w:val="22"/>
+        </w:rPr>
+        <w:t xml:space="preserve"> NeighborhoodPop, Latitude, Longitude.</w:t>
       </w:r>
     </w:p>
     <w:p>
       <w:pPr>
         <w:sectPr>
           <w:pgSz w:w="11906" w:h="16838"/>
-          <w:pgMar w:top="680" w:right="1104" w:bottom="1024" w:left="1124" w:header="720" w:footer="720" w:gutter="0"/>
+          <w:pgMar w:top="666" w:right="1106" w:bottom="966" w:left="1126" w:header="720" w:footer="720" w:gutter="0"/>
           <w:cols/>
           <w:docGrid w:linePitch="360"/>
         </w:sectPr>
@@ -9604,12 +11121,12 @@
       <w:pPr>
         <w:autoSpaceDN w:val="0"/>
         <w:tabs>
-          <w:tab w:pos="630" w:val="left"/>
+          <w:tab w:pos="990" w:val="left"/>
         </w:tabs>
         <w:autoSpaceDE w:val="0"/>
         <w:widowControl/>
-        <w:spacing w:line="336" w:lineRule="exact" w:before="0" w:after="0"/>
-        <w:ind w:left="300" w:right="432" w:firstLine="0"/>
+        <w:spacing w:line="328" w:lineRule="exact" w:before="0" w:after="0"/>
+        <w:ind w:left="660" w:right="864" w:firstLine="0"/>
         <w:jc w:val="left"/>
       </w:pPr>
       <w:r>
@@ -9628,22 +11145,88 @@
       <w:r>
         <w:rPr>
           <w:rFonts w:ascii="Helvetica" w:hAnsi="Helvetica" w:eastAsia="Helvetica"/>
+          <w:b w:val="0"/>
+          <w:i w:val="0"/>
+          <w:color w:val="333333"/>
+          <w:sz w:val="22"/>
+        </w:rPr>
+        <w:t xml:space="preserve">Live updates are sent asynchronously to the backend on slider adjust, updating </w:t>
+      </w:r>
+      <w:r>
+        <w:tab/>
+      </w:r>
+      <w:r>
+        <w:rPr>
+          <w:rFonts w:ascii="Helvetica" w:hAnsi="Helvetica" w:eastAsia="Helvetica"/>
+          <w:b w:val="0"/>
+          <w:i w:val="0"/>
+          <w:color w:val="333333"/>
+          <w:sz w:val="22"/>
+        </w:rPr>
+        <w:t>predicted prices dynamically with a neon green layout.</w:t>
+      </w:r>
+    </w:p>
+    <w:p>
+      <w:pPr>
+        <w:autoSpaceDN w:val="0"/>
+        <w:autoSpaceDE w:val="0"/>
+        <w:widowControl/>
+        <w:spacing w:line="412" w:lineRule="exact" w:before="1700" w:after="0"/>
+        <w:ind w:left="30" w:right="0" w:firstLine="0"/>
+        <w:jc w:val="left"/>
+      </w:pPr>
+      <w:r>
+        <w:rPr>
+          <w:rFonts w:ascii="Helvetica" w:hAnsi="Helvetica" w:eastAsia="Helvetica"/>
           <w:b/>
           <w:i w:val="0"/>
-          <w:color w:val="333333"/>
-          <w:sz w:val="22"/>
-        </w:rPr>
-        <w:t>Geographical Constraints:</w:t>
-      </w:r>
-      <w:r>
-        <w:rPr>
-          <w:rFonts w:ascii="Helvetica" w:hAnsi="Helvetica" w:eastAsia="Helvetica"/>
-          <w:b w:val="0"/>
-          <w:i w:val="0"/>
-          <w:color w:val="333333"/>
-          <w:sz w:val="22"/>
-        </w:rPr>
-        <w:t xml:space="preserve"> The model is bound to the coordinate boundaries of the </w:t>
+          <w:color w:val="1F3A52"/>
+          <w:sz w:val="30"/>
+        </w:rPr>
+        <w:t>Section F: Critical Evaluation &amp; Limitations (10 Marks)</w:t>
+      </w:r>
+    </w:p>
+    <w:p>
+      <w:pPr>
+        <w:autoSpaceDN w:val="0"/>
+        <w:autoSpaceDE w:val="0"/>
+        <w:widowControl/>
+        <w:spacing w:line="332" w:lineRule="exact" w:before="528" w:after="0"/>
+        <w:ind w:left="30" w:right="0" w:firstLine="0"/>
+        <w:jc w:val="left"/>
+      </w:pPr>
+      <w:r>
+        <w:rPr>
+          <w:rFonts w:ascii="Helvetica" w:hAnsi="Helvetica" w:eastAsia="Helvetica"/>
+          <w:b/>
+          <w:i w:val="0"/>
+          <w:color w:val="1F3A52"/>
+          <w:sz w:val="24"/>
+        </w:rPr>
+        <w:t>1. Domain Suitability of the Model</w:t>
+      </w:r>
+    </w:p>
+    <w:p>
+      <w:pPr>
+        <w:autoSpaceDN w:val="0"/>
+        <w:tabs>
+          <w:tab w:pos="660" w:val="left"/>
+        </w:tabs>
+        <w:autoSpaceDE w:val="0"/>
+        <w:widowControl/>
+        <w:spacing w:line="352" w:lineRule="exact" w:before="170" w:after="0"/>
+        <w:ind w:left="330" w:right="288" w:firstLine="0"/>
+        <w:jc w:val="left"/>
+      </w:pPr>
+      <w:r>
+        <w:rPr>
+          <w:rFonts w:ascii="Helvetica" w:hAnsi="Helvetica" w:eastAsia="Helvetica"/>
+          <w:b w:val="0"/>
+          <w:i w:val="0"/>
+          <w:color w:val="333333"/>
+          <w:sz w:val="22"/>
+        </w:rPr>
+        <w:t>•</w:t>
       </w:r>
       <w:r>
         <w:tab/>
@@ -9656,7 +11239,7 @@
           <w:color w:val="333333"/>
           <w:sz w:val="22"/>
         </w:rPr>
-        <w:t xml:space="preserve">training dataset. It cannot predict prices for properties outside these geographical </w:t>
+        <w:t xml:space="preserve">The Random Forest Regressor is highly suited for real estate valuation. It is robust to </w:t>
       </w:r>
       <w:r>
         <w:tab/>
@@ -9669,7 +11252,20 @@
           <w:color w:val="333333"/>
           <w:sz w:val="22"/>
         </w:rPr>
-        <w:t>boundaries.</w:t>
+        <w:t xml:space="preserve">outliers (which are common in real estate due to luxury housing spikes) and captures the </w:t>
+      </w:r>
+      <w:r>
+        <w:tab/>
+      </w:r>
+      <w:r>
+        <w:rPr>
+          <w:rFonts w:ascii="Helvetica" w:hAnsi="Helvetica" w:eastAsia="Helvetica"/>
+          <w:b w:val="0"/>
+          <w:i w:val="0"/>
+          <w:color w:val="333333"/>
+          <w:sz w:val="22"/>
+        </w:rPr>
+        <w:t>complex interactions between geographic coordinates and average occupancy.</w:t>
       </w:r>
     </w:p>
     <w:p>
@@ -9678,7 +11274,7 @@
         <w:autoSpaceDE w:val="0"/>
         <w:widowControl/>
         <w:spacing w:line="332" w:lineRule="exact" w:before="816" w:after="0"/>
-        <w:ind w:left="0" w:right="0" w:firstLine="0"/>
+        <w:ind w:left="30" w:right="0" w:firstLine="0"/>
         <w:jc w:val="left"/>
       </w:pPr>
       <w:r>
@@ -9689,19 +11285,19 @@
           <w:color w:val="1F3A52"/>
           <w:sz w:val="24"/>
         </w:rPr>
-        <w:t>4. Future Suggestions</w:t>
+        <w:t>2. Suitability of Deep Learning</w:t>
       </w:r>
     </w:p>
     <w:p>
       <w:pPr>
         <w:autoSpaceDN w:val="0"/>
         <w:tabs>
-          <w:tab w:pos="630" w:val="left"/>
+          <w:tab w:pos="660" w:val="left"/>
         </w:tabs>
         <w:autoSpaceDE w:val="0"/>
         <w:widowControl/>
         <w:spacing w:line="352" w:lineRule="exact" w:before="170" w:after="0"/>
-        <w:ind w:left="300" w:right="0" w:firstLine="0"/>
+        <w:ind w:left="330" w:right="720" w:firstLine="0"/>
         <w:jc w:val="left"/>
       </w:pPr>
       <w:r>
@@ -9725,27 +11321,7 @@
           <w:color w:val="333333"/>
           <w:sz w:val="22"/>
         </w:rPr>
-        <w:t xml:space="preserve">We successfully implemented XGBoost and improved the $R^2$ score to </w:t>
-      </w:r>
-      <w:r>
-        <w:rPr>
-          <w:rFonts w:ascii="Helvetica" w:hAnsi="Helvetica" w:eastAsia="Helvetica"/>
-          <w:b/>
-          <w:i w:val="0"/>
-          <w:color w:val="333333"/>
-          <w:sz w:val="22"/>
-        </w:rPr>
-        <w:t>0.8256</w:t>
-      </w:r>
-      <w:r>
-        <w:rPr>
-          <w:rFonts w:ascii="Helvetica" w:hAnsi="Helvetica" w:eastAsia="Helvetica"/>
-          <w:b w:val="0"/>
-          <w:i w:val="0"/>
-          <w:color w:val="333333"/>
-          <w:sz w:val="22"/>
-        </w:rPr>
-        <w:t xml:space="preserve">. Future </w:t>
+        <w:t xml:space="preserve">While Deep Learning (e.g. MLPs) can approximate the spatial price function, it is less </w:t>
       </w:r>
       <w:r>
         <w:tab/>
@@ -9758,19 +11334,19 @@
           <w:color w:val="333333"/>
           <w:sz w:val="22"/>
         </w:rPr>
-        <w:t>work could incorporate LightGBM to speed up training.</w:t>
+        <w:t>suitable here due to:</w:t>
       </w:r>
     </w:p>
     <w:p>
       <w:pPr>
         <w:autoSpaceDN w:val="0"/>
         <w:tabs>
-          <w:tab w:pos="630" w:val="left"/>
+          <w:tab w:pos="990" w:val="left"/>
         </w:tabs>
         <w:autoSpaceDE w:val="0"/>
         <w:widowControl/>
         <w:spacing w:line="352" w:lineRule="exact" w:before="150" w:after="0"/>
-        <w:ind w:left="300" w:right="720" w:firstLine="0"/>
+        <w:ind w:left="660" w:right="1152" w:firstLine="0"/>
         <w:jc w:val="left"/>
       </w:pPr>
       <w:r>
@@ -9790,15 +11366,419 @@
         <w:rPr>
           <w:rFonts w:ascii="Helvetica" w:hAnsi="Helvetica" w:eastAsia="Helvetica"/>
           <w:b w:val="0"/>
-          <w:i w:val="0"/>
-          <w:color w:val="333333"/>
-          <w:sz w:val="22"/>
-        </w:rPr>
-        <w:t xml:space="preserve">Incorporate SHAP (Shapley Additive exPlanations) values to provide local feature </w:t>
+          <w:i/>
+          <w:color w:val="333333"/>
+          <w:sz w:val="22"/>
+        </w:rPr>
+        <w:t>Data scale:</w:t>
+      </w:r>
+      <w:r>
+        <w:rPr>
+          <w:rFonts w:ascii="Helvetica" w:hAnsi="Helvetica" w:eastAsia="Helvetica"/>
+          <w:b w:val="0"/>
+          <w:i w:val="0"/>
+          <w:color w:val="333333"/>
+          <w:sz w:val="22"/>
+        </w:rPr>
+        <w:t xml:space="preserve"> Tabular dataset size (15k rows) is too small to train large network </w:t>
       </w:r>
       <w:r>
         <w:tab/>
       </w:r>
+      <w:r>
+        <w:rPr>
+          <w:rFonts w:ascii="Helvetica" w:hAnsi="Helvetica" w:eastAsia="Helvetica"/>
+          <w:b w:val="0"/>
+          <w:i w:val="0"/>
+          <w:color w:val="333333"/>
+          <w:sz w:val="22"/>
+        </w:rPr>
+        <w:t>parameters without massive overfitting.</w:t>
+      </w:r>
+    </w:p>
+    <w:p>
+      <w:pPr>
+        <w:autoSpaceDN w:val="0"/>
+        <w:tabs>
+          <w:tab w:pos="990" w:val="left"/>
+        </w:tabs>
+        <w:autoSpaceDE w:val="0"/>
+        <w:widowControl/>
+        <w:spacing w:line="352" w:lineRule="exact" w:before="150" w:after="0"/>
+        <w:ind w:left="660" w:right="288" w:firstLine="0"/>
+        <w:jc w:val="left"/>
+      </w:pPr>
+      <w:r>
+        <w:rPr>
+          <w:rFonts w:ascii="Helvetica" w:hAnsi="Helvetica" w:eastAsia="Helvetica"/>
+          <w:b w:val="0"/>
+          <w:i w:val="0"/>
+          <w:color w:val="333333"/>
+          <w:sz w:val="22"/>
+        </w:rPr>
+        <w:t>•</w:t>
+      </w:r>
+      <w:r>
+        <w:tab/>
+      </w:r>
+      <w:r>
+        <w:rPr>
+          <w:rFonts w:ascii="Helvetica" w:hAnsi="Helvetica" w:eastAsia="Helvetica"/>
+          <w:b w:val="0"/>
+          <w:i/>
+          <w:color w:val="333333"/>
+          <w:sz w:val="22"/>
+        </w:rPr>
+        <w:t>Interpretability:</w:t>
+      </w:r>
+      <w:r>
+        <w:rPr>
+          <w:rFonts w:ascii="Helvetica" w:hAnsi="Helvetica" w:eastAsia="Helvetica"/>
+          <w:b w:val="0"/>
+          <w:i w:val="0"/>
+          <w:color w:val="333333"/>
+          <w:sz w:val="22"/>
+        </w:rPr>
+        <w:t xml:space="preserve"> Real estate appraisers require structural rules (e.g., how the bedrooms </w:t>
+      </w:r>
+      <w:r>
+        <w:tab/>
+      </w:r>
+      <w:r>
+        <w:rPr>
+          <w:rFonts w:ascii="Helvetica" w:hAnsi="Helvetica" w:eastAsia="Helvetica"/>
+          <w:b w:val="0"/>
+          <w:i w:val="0"/>
+          <w:color w:val="333333"/>
+          <w:sz w:val="22"/>
+        </w:rPr>
+        <w:t xml:space="preserve">ratio impacts price) which are inspectable in tree splits but completely hidden in deep </w:t>
+      </w:r>
+      <w:r>
+        <w:tab/>
+      </w:r>
+      <w:r>
+        <w:rPr>
+          <w:rFonts w:ascii="Helvetica" w:hAnsi="Helvetica" w:eastAsia="Helvetica"/>
+          <w:b w:val="0"/>
+          <w:i w:val="0"/>
+          <w:color w:val="333333"/>
+          <w:sz w:val="22"/>
+        </w:rPr>
+        <w:t>neural weights.</w:t>
+      </w:r>
+    </w:p>
+    <w:p>
+      <w:pPr>
+        <w:autoSpaceDN w:val="0"/>
+        <w:autoSpaceDE w:val="0"/>
+        <w:widowControl/>
+        <w:spacing w:line="332" w:lineRule="exact" w:before="1080" w:after="0"/>
+        <w:ind w:left="30" w:right="0" w:firstLine="0"/>
+        <w:jc w:val="left"/>
+      </w:pPr>
+      <w:r>
+        <w:rPr>
+          <w:rFonts w:ascii="Helvetica" w:hAnsi="Helvetica" w:eastAsia="Helvetica"/>
+          <w:b/>
+          <w:i w:val="0"/>
+          <w:color w:val="1F3A52"/>
+          <w:sz w:val="24"/>
+        </w:rPr>
+        <w:t>3. Limitations of the Current Approach</w:t>
+      </w:r>
+    </w:p>
+    <w:p>
+      <w:pPr>
+        <w:autoSpaceDN w:val="0"/>
+        <w:tabs>
+          <w:tab w:pos="660" w:val="left"/>
+        </w:tabs>
+        <w:autoSpaceDE w:val="0"/>
+        <w:widowControl/>
+        <w:spacing w:line="352" w:lineRule="exact" w:before="170" w:after="0"/>
+        <w:ind w:left="330" w:right="576" w:firstLine="0"/>
+        <w:jc w:val="left"/>
+      </w:pPr>
+      <w:r>
+        <w:rPr>
+          <w:rFonts w:ascii="Helvetica" w:hAnsi="Helvetica" w:eastAsia="Helvetica"/>
+          <w:b w:val="0"/>
+          <w:i w:val="0"/>
+          <w:color w:val="333333"/>
+          <w:sz w:val="22"/>
+        </w:rPr>
+        <w:t>•</w:t>
+      </w:r>
+      <w:r>
+        <w:tab/>
+      </w:r>
+      <w:r>
+        <w:rPr>
+          <w:rFonts w:ascii="Helvetica" w:hAnsi="Helvetica" w:eastAsia="Helvetica"/>
+          <w:b/>
+          <w:i w:val="0"/>
+          <w:color w:val="333333"/>
+          <w:sz w:val="22"/>
+        </w:rPr>
+        <w:t>Temporal Shift:</w:t>
+      </w:r>
+      <w:r>
+        <w:rPr>
+          <w:rFonts w:ascii="Helvetica" w:hAnsi="Helvetica" w:eastAsia="Helvetica"/>
+          <w:b w:val="0"/>
+          <w:i w:val="0"/>
+          <w:color w:val="333333"/>
+          <w:sz w:val="22"/>
+        </w:rPr>
+        <w:t xml:space="preserve"> The model does not include time metrics. Inflation, interest rates, and </w:t>
+      </w:r>
+      <w:r>
+        <w:tab/>
+      </w:r>
+      <w:r>
+        <w:rPr>
+          <w:rFonts w:ascii="Helvetica" w:hAnsi="Helvetica" w:eastAsia="Helvetica"/>
+          <w:b w:val="0"/>
+          <w:i w:val="0"/>
+          <w:color w:val="333333"/>
+          <w:sz w:val="22"/>
+        </w:rPr>
+        <w:t>seasonal spikes are completely ignored.</w:t>
+      </w:r>
+    </w:p>
+    <w:p>
+      <w:pPr>
+        <w:autoSpaceDN w:val="0"/>
+        <w:tabs>
+          <w:tab w:pos="660" w:val="left"/>
+        </w:tabs>
+        <w:autoSpaceDE w:val="0"/>
+        <w:widowControl/>
+        <w:spacing w:line="352" w:lineRule="exact" w:before="150" w:after="0"/>
+        <w:ind w:left="330" w:right="720" w:firstLine="0"/>
+        <w:jc w:val="left"/>
+      </w:pPr>
+      <w:r>
+        <w:rPr>
+          <w:rFonts w:ascii="Helvetica" w:hAnsi="Helvetica" w:eastAsia="Helvetica"/>
+          <w:b w:val="0"/>
+          <w:i w:val="0"/>
+          <w:color w:val="333333"/>
+          <w:sz w:val="22"/>
+        </w:rPr>
+        <w:t>•</w:t>
+      </w:r>
+      <w:r>
+        <w:tab/>
+      </w:r>
+      <w:r>
+        <w:rPr>
+          <w:rFonts w:ascii="Helvetica" w:hAnsi="Helvetica" w:eastAsia="Helvetica"/>
+          <w:b/>
+          <w:i w:val="0"/>
+          <w:color w:val="333333"/>
+          <w:sz w:val="22"/>
+        </w:rPr>
+        <w:t>Geographical Constraints:</w:t>
+      </w:r>
+      <w:r>
+        <w:rPr>
+          <w:rFonts w:ascii="Helvetica" w:hAnsi="Helvetica" w:eastAsia="Helvetica"/>
+          <w:b w:val="0"/>
+          <w:i w:val="0"/>
+          <w:color w:val="333333"/>
+          <w:sz w:val="22"/>
+        </w:rPr>
+        <w:t xml:space="preserve"> The model is bound to the coordinate boundaries of the </w:t>
+      </w:r>
+      <w:r>
+        <w:tab/>
+      </w:r>
+      <w:r>
+        <w:rPr>
+          <w:rFonts w:ascii="Helvetica" w:hAnsi="Helvetica" w:eastAsia="Helvetica"/>
+          <w:b w:val="0"/>
+          <w:i w:val="0"/>
+          <w:color w:val="333333"/>
+          <w:sz w:val="22"/>
+        </w:rPr>
+        <w:t xml:space="preserve">training dataset. It cannot predict prices for properties outside these geographical </w:t>
+      </w:r>
+      <w:r>
+        <w:tab/>
+      </w:r>
+      <w:r>
+        <w:rPr>
+          <w:rFonts w:ascii="Helvetica" w:hAnsi="Helvetica" w:eastAsia="Helvetica"/>
+          <w:b w:val="0"/>
+          <w:i w:val="0"/>
+          <w:color w:val="333333"/>
+          <w:sz w:val="22"/>
+        </w:rPr>
+        <w:t>boundaries.</w:t>
+      </w:r>
+    </w:p>
+    <w:p>
+      <w:pPr>
+        <w:autoSpaceDN w:val="0"/>
+        <w:autoSpaceDE w:val="0"/>
+        <w:widowControl/>
+        <w:spacing w:line="332" w:lineRule="exact" w:before="816" w:after="0"/>
+        <w:ind w:left="30" w:right="0" w:firstLine="0"/>
+        <w:jc w:val="left"/>
+      </w:pPr>
+      <w:r>
+        <w:rPr>
+          <w:rFonts w:ascii="Helvetica" w:hAnsi="Helvetica" w:eastAsia="Helvetica"/>
+          <w:b/>
+          <w:i w:val="0"/>
+          <w:color w:val="1F3A52"/>
+          <w:sz w:val="24"/>
+        </w:rPr>
+        <w:t>4. Future Suggestions</w:t>
+      </w:r>
+    </w:p>
+    <w:p>
+      <w:pPr>
+        <w:sectPr>
+          <w:pgSz w:w="11906" w:h="16838"/>
+          <w:pgMar w:top="680" w:right="1104" w:bottom="952" w:left="1124" w:header="720" w:footer="720" w:gutter="0"/>
+          <w:cols/>
+          <w:docGrid w:linePitch="360"/>
+        </w:sectPr>
+      </w:pPr>
+    </w:p>
+    <w:p>
+      <w:pPr>
+        <w:autoSpaceDN w:val="0"/>
+        <w:autoSpaceDE w:val="0"/>
+        <w:widowControl/>
+        <w:spacing w:line="220" w:lineRule="exact" w:before="0" w:after="458"/>
+        <w:ind w:left="0" w:right="0"/>
+      </w:pPr>
+    </w:p>
+    <w:p>
+      <w:pPr>
+        <w:autoSpaceDN w:val="0"/>
+        <w:tabs>
+          <w:tab w:pos="344" w:val="left"/>
+        </w:tabs>
+        <w:autoSpaceDE w:val="0"/>
+        <w:widowControl/>
+        <w:spacing w:line="304" w:lineRule="exact" w:before="0" w:after="0"/>
+        <w:ind w:left="14" w:right="0" w:firstLine="0"/>
+        <w:jc w:val="left"/>
+      </w:pPr>
+      <w:r>
+        <w:rPr>
+          <w:rFonts w:ascii="Helvetica" w:hAnsi="Helvetica" w:eastAsia="Helvetica"/>
+          <w:b w:val="0"/>
+          <w:i w:val="0"/>
+          <w:color w:val="333333"/>
+          <w:sz w:val="22"/>
+        </w:rPr>
+        <w:t>•</w:t>
+      </w:r>
+      <w:r>
+        <w:tab/>
+      </w:r>
+      <w:r>
+        <w:rPr>
+          <w:rFonts w:ascii="Helvetica" w:hAnsi="Helvetica" w:eastAsia="Helvetica"/>
+          <w:b w:val="0"/>
+          <w:i w:val="0"/>
+          <w:color w:val="333333"/>
+          <w:sz w:val="22"/>
+        </w:rPr>
+        <w:t xml:space="preserve">We successfully implemented XGBoost and improved the $R^2$ score to </w:t>
+      </w:r>
+      <w:r>
+        <w:rPr>
+          <w:rFonts w:ascii="Helvetica" w:hAnsi="Helvetica" w:eastAsia="Helvetica"/>
+          <w:b/>
+          <w:i w:val="0"/>
+          <w:color w:val="333333"/>
+          <w:sz w:val="22"/>
+        </w:rPr>
+        <w:t>0.8256</w:t>
+      </w:r>
+      <w:r>
+        <w:rPr>
+          <w:rFonts w:ascii="Helvetica" w:hAnsi="Helvetica" w:eastAsia="Helvetica"/>
+          <w:b w:val="0"/>
+          <w:i w:val="0"/>
+          <w:color w:val="333333"/>
+          <w:sz w:val="22"/>
+        </w:rPr>
+        <w:t>. Future</w:t>
+      </w:r>
+    </w:p>
+    <w:p>
+      <w:pPr>
+        <w:autoSpaceDN w:val="0"/>
+        <w:autoSpaceDE w:val="0"/>
+        <w:widowControl/>
+        <w:spacing w:line="304" w:lineRule="exact" w:before="48" w:after="0"/>
+        <w:ind w:left="344" w:right="0" w:firstLine="0"/>
+        <w:jc w:val="left"/>
+      </w:pPr>
+      <w:r>
+        <w:rPr>
+          <w:rFonts w:ascii="Helvetica" w:hAnsi="Helvetica" w:eastAsia="Helvetica"/>
+          <w:b w:val="0"/>
+          <w:i w:val="0"/>
+          <w:color w:val="333333"/>
+          <w:sz w:val="22"/>
+        </w:rPr>
+        <w:t>work could incorporate LightGBM to speed up training.</w:t>
+      </w:r>
+    </w:p>
+    <w:p>
+      <w:pPr>
+        <w:autoSpaceDN w:val="0"/>
+        <w:tabs>
+          <w:tab w:pos="344" w:val="left"/>
+        </w:tabs>
+        <w:autoSpaceDE w:val="0"/>
+        <w:widowControl/>
+        <w:spacing w:line="304" w:lineRule="exact" w:before="198" w:after="0"/>
+        <w:ind w:left="14" w:right="0" w:firstLine="0"/>
+        <w:jc w:val="left"/>
+      </w:pPr>
+      <w:r>
+        <w:rPr>
+          <w:rFonts w:ascii="Helvetica" w:hAnsi="Helvetica" w:eastAsia="Helvetica"/>
+          <w:b w:val="0"/>
+          <w:i w:val="0"/>
+          <w:color w:val="333333"/>
+          <w:sz w:val="22"/>
+        </w:rPr>
+        <w:t>•</w:t>
+      </w:r>
+      <w:r>
+        <w:tab/>
+      </w:r>
+      <w:r>
+        <w:rPr>
+          <w:rFonts w:ascii="Helvetica" w:hAnsi="Helvetica" w:eastAsia="Helvetica"/>
+          <w:b w:val="0"/>
+          <w:i w:val="0"/>
+          <w:color w:val="333333"/>
+          <w:sz w:val="22"/>
+        </w:rPr>
+        <w:t>Incorporate SHAP (Shapley Additive exPlanations) values to provide local feature</w:t>
+      </w:r>
+    </w:p>
+    <w:p>
+      <w:pPr>
+        <w:autoSpaceDN w:val="0"/>
+        <w:autoSpaceDE w:val="0"/>
+        <w:widowControl/>
+        <w:spacing w:line="304" w:lineRule="exact" w:before="48" w:after="0"/>
+        <w:ind w:left="344" w:right="0" w:firstLine="0"/>
+        <w:jc w:val="left"/>
+      </w:pPr>
       <w:r>
         <w:rPr>
           <w:rFonts w:ascii="Helvetica" w:hAnsi="Helvetica" w:eastAsia="Helvetica"/>
@@ -9812,7 +11792,7 @@
     </w:p>
     <w:sectPr>
       <w:pgSz w:w="11906" w:h="16838"/>
-      <w:pgMar w:top="680" w:right="1440" w:bottom="1440" w:left="1154" w:header="720" w:footer="720" w:gutter="0"/>
+      <w:pgMar w:top="680" w:right="1440" w:bottom="1440" w:left="1440" w:header="720" w:footer="720" w:gutter="0"/>
       <w:cols/>
       <w:docGrid w:linePitch="360"/>
     </w:sectPr>

</xml_diff>

<commit_message>
Update Section D summary to match real estate project context
</commit_message>
<xml_diff>
--- a/assessment_report.docx
+++ b/assessment_report.docx
@@ -9600,9 +9600,29 @@
     </w:p>
     <w:p>
       <w:pPr>
+        <w:autoSpaceDN w:val="0"/>
+        <w:autoSpaceDE w:val="0"/>
+        <w:widowControl/>
+        <w:spacing w:line="332" w:lineRule="exact" w:before="442" w:after="0"/>
+        <w:ind w:left="30" w:right="0" w:firstLine="0"/>
+        <w:jc w:val="left"/>
+      </w:pPr>
+      <w:r>
+        <w:rPr>
+          <w:rFonts w:ascii="Helvetica" w:hAnsi="Helvetica" w:eastAsia="Helvetica"/>
+          <w:b/>
+          <w:i w:val="0"/>
+          <w:color w:val="1F3A52"/>
+          <w:sz w:val="24"/>
+        </w:rPr>
+        <w:t>Summary</w:t>
+      </w:r>
+    </w:p>
+    <w:p>
+      <w:pPr>
         <w:sectPr>
           <w:pgSz w:w="11906" w:h="16838"/>
-          <w:pgMar w:top="714" w:right="1104" w:bottom="942" w:left="1124" w:header="720" w:footer="720" w:gutter="0"/>
+          <w:pgMar w:top="714" w:right="1104" w:bottom="864" w:left="1124" w:header="720" w:footer="720" w:gutter="0"/>
           <w:cols/>
           <w:docGrid w:linePitch="360"/>
         </w:sectPr>
@@ -9613,7 +9633,7 @@
         <w:autoSpaceDN w:val="0"/>
         <w:autoSpaceDE w:val="0"/>
         <w:widowControl/>
-        <w:spacing w:line="220" w:lineRule="exact" w:before="0" w:after="446"/>
+        <w:spacing w:line="220" w:lineRule="exact" w:before="0" w:after="458"/>
         <w:ind w:left="0" w:right="0"/>
       </w:pPr>
     </w:p>
@@ -9622,8 +9642,58 @@
         <w:autoSpaceDN w:val="0"/>
         <w:autoSpaceDE w:val="0"/>
         <w:widowControl/>
-        <w:spacing w:line="412" w:lineRule="exact" w:before="0" w:after="0"/>
-        <w:ind w:left="28" w:right="0" w:firstLine="0"/>
+        <w:spacing w:line="340" w:lineRule="exact" w:before="0" w:after="0"/>
+        <w:ind w:left="30" w:right="50" w:firstLine="0"/>
+        <w:jc w:val="both"/>
+      </w:pPr>
+      <w:r>
+        <w:rPr>
+          <w:rFonts w:ascii="Helvetica" w:hAnsi="Helvetica" w:eastAsia="Helvetica"/>
+          <w:b w:val="0"/>
+          <w:i w:val="0"/>
+          <w:color w:val="333333"/>
+          <w:sz w:val="22"/>
+        </w:rPr>
+        <w:t xml:space="preserve">This system architecture merges effective preprocessing, ensemble learning, and user-friendly </w:t>
+      </w:r>
+      <w:r>
+        <w:rPr>
+          <w:rFonts w:ascii="Helvetica" w:hAnsi="Helvetica" w:eastAsia="Helvetica"/>
+          <w:b w:val="0"/>
+          <w:i w:val="0"/>
+          <w:color w:val="333333"/>
+          <w:sz w:val="22"/>
+        </w:rPr>
+        <w:t xml:space="preserve">deployment to create a reliable real estate price prediction system. By combining best practices in </w:t>
+      </w:r>
+      <w:r>
+        <w:rPr>
+          <w:rFonts w:ascii="Helvetica" w:hAnsi="Helvetica" w:eastAsia="Helvetica"/>
+          <w:b w:val="0"/>
+          <w:i w:val="0"/>
+          <w:color w:val="333333"/>
+          <w:sz w:val="22"/>
+        </w:rPr>
+        <w:t xml:space="preserve">machine learning with a practical application interface, the solution meets both technical and </w:t>
+      </w:r>
+      <w:r>
+        <w:rPr>
+          <w:rFonts w:ascii="Helvetica" w:hAnsi="Helvetica" w:eastAsia="Helvetica"/>
+          <w:b w:val="0"/>
+          <w:i w:val="0"/>
+          <w:color w:val="333333"/>
+          <w:sz w:val="22"/>
+        </w:rPr>
+        <w:t>professional standards expected in applied machine learning coursework.</w:t>
+      </w:r>
+    </w:p>
+    <w:p>
+      <w:pPr>
+        <w:autoSpaceDN w:val="0"/>
+        <w:autoSpaceDE w:val="0"/>
+        <w:widowControl/>
+        <w:spacing w:line="412" w:lineRule="exact" w:before="1062" w:after="0"/>
+        <w:ind w:left="30" w:right="0" w:firstLine="0"/>
         <w:jc w:val="left"/>
       </w:pPr>
       <w:r>
@@ -9643,7 +9713,7 @@
         <w:autoSpaceDE w:val="0"/>
         <w:widowControl/>
         <w:spacing w:line="332" w:lineRule="exact" w:before="528" w:after="0"/>
-        <w:ind w:left="28" w:right="0" w:firstLine="0"/>
+        <w:ind w:left="30" w:right="0" w:firstLine="0"/>
         <w:jc w:val="left"/>
       </w:pPr>
       <w:r>
@@ -9662,30 +9732,20 @@
         <w:autoSpaceDN w:val="0"/>
         <w:autoSpaceDE w:val="0"/>
         <w:widowControl/>
-        <w:spacing w:line="304" w:lineRule="exact" w:before="318" w:after="0"/>
-        <w:ind w:left="0" w:right="0" w:firstLine="0"/>
-        <w:jc w:val="center"/>
-      </w:pPr>
-      <w:r>
-        <w:rPr>
-          <w:rFonts w:ascii="Helvetica" w:hAnsi="Helvetica" w:eastAsia="Helvetica"/>
-          <w:b w:val="0"/>
-          <w:i w:val="0"/>
-          <w:color w:val="333333"/>
-          <w:sz w:val="22"/>
-        </w:rPr>
-        <w:t>The models were trained using 6-fold cross-validation on the training set and evaluated on the test</w:t>
-      </w:r>
-    </w:p>
-    <w:p>
-      <w:pPr>
-        <w:autoSpaceDN w:val="0"/>
-        <w:autoSpaceDE w:val="0"/>
-        <w:widowControl/>
-        <w:spacing w:line="304" w:lineRule="exact" w:before="48" w:after="424"/>
-        <w:ind w:left="28" w:right="0" w:firstLine="0"/>
+        <w:spacing w:line="352" w:lineRule="exact" w:before="270" w:after="424"/>
+        <w:ind w:left="30" w:right="0" w:firstLine="0"/>
         <w:jc w:val="left"/>
       </w:pPr>
+      <w:r>
+        <w:rPr>
+          <w:rFonts w:ascii="Helvetica" w:hAnsi="Helvetica" w:eastAsia="Helvetica"/>
+          <w:b w:val="0"/>
+          <w:i w:val="0"/>
+          <w:color w:val="333333"/>
+          <w:sz w:val="22"/>
+        </w:rPr>
+        <w:t xml:space="preserve">The models were trained using 6-fold cross-validation on the training set and evaluated on the test </w:t>
+      </w:r>
       <w:r>
         <w:rPr>
           <w:rFonts w:ascii="Helvetica" w:hAnsi="Helvetica" w:eastAsia="Helvetica"/>
@@ -9702,14 +9762,14 @@
         <w:tblW w:type="auto" w:w="0"/>
         <w:tblLayout w:type="fixed"/>
         <w:tblLook w:firstColumn="1" w:firstRow="1" w:lastColumn="0" w:lastRow="0" w:noHBand="0" w:noVBand="1" w:val="04A0"/>
-        <w:tblInd w:w="8.000000000000114" w:type="dxa"/>
+        <w:tblInd w:w="10.0" w:type="dxa"/>
       </w:tblPr>
       <w:tblGrid>
-        <w:gridCol w:w="1935"/>
-        <w:gridCol w:w="1935"/>
-        <w:gridCol w:w="1935"/>
-        <w:gridCol w:w="1935"/>
-        <w:gridCol w:w="1935"/>
+        <w:gridCol w:w="1936"/>
+        <w:gridCol w:w="1936"/>
+        <w:gridCol w:w="1936"/>
+        <w:gridCol w:w="1936"/>
+        <w:gridCol w:w="1936"/>
       </w:tblGrid>
       <w:tr>
         <w:trPr>
@@ -10689,7 +10749,7 @@
         <w:autoSpaceDE w:val="0"/>
         <w:widowControl/>
         <w:spacing w:line="330" w:lineRule="exact" w:before="288" w:after="0"/>
-        <w:ind w:left="28" w:right="0" w:firstLine="0"/>
+        <w:ind w:left="30" w:right="0" w:firstLine="0"/>
         <w:jc w:val="left"/>
       </w:pPr>
       <w:r>
@@ -10707,12 +10767,12 @@
       <w:pPr>
         <w:autoSpaceDN w:val="0"/>
         <w:tabs>
-          <w:tab w:pos="658" w:val="left"/>
+          <w:tab w:pos="660" w:val="left"/>
         </w:tabs>
         <w:autoSpaceDE w:val="0"/>
         <w:widowControl/>
-        <w:spacing w:line="310" w:lineRule="exact" w:before="212" w:after="0"/>
-        <w:ind w:left="328" w:right="0" w:firstLine="0"/>
+        <w:spacing w:line="352" w:lineRule="exact" w:before="170" w:after="0"/>
+        <w:ind w:left="330" w:right="720" w:firstLine="0"/>
         <w:jc w:val="left"/>
       </w:pPr>
       <w:r>
@@ -10788,111 +10848,350 @@
           <w:color w:val="333333"/>
           <w:sz w:val="22"/>
         </w:rPr>
-        <w:t>,</w:t>
-      </w:r>
+        <w:t xml:space="preserve">, </w:t>
+      </w:r>
+      <w:r>
+        <w:br/>
+      </w:r>
+      <w:r>
+        <w:tab/>
+      </w:r>
+      <w:r>
+        <w:rPr>
+          <w:shd w:val="clear" w:color="auto" w:fill="f4f4f4"/>
+          <w:rFonts w:ascii="Courier" w:hAnsi="Courier" w:eastAsia="Courier"/>
+          <w:b w:val="0"/>
+          <w:i w:val="0"/>
+          <w:color w:val="333333"/>
+          <w:sz w:val="19"/>
+        </w:rPr>
+        <w:t>linear_regression_model.joblib</w:t>
+      </w:r>
+      <w:r>
+        <w:rPr>
+          <w:rFonts w:ascii="Helvetica" w:hAnsi="Helvetica" w:eastAsia="Helvetica"/>
+          <w:b w:val="0"/>
+          <w:i w:val="0"/>
+          <w:color w:val="333333"/>
+          <w:sz w:val="22"/>
+        </w:rPr>
+        <w:t xml:space="preserve">, </w:t>
+      </w:r>
+      <w:r>
+        <w:rPr>
+          <w:shd w:val="clear" w:color="auto" w:fill="f4f4f4"/>
+          <w:rFonts w:ascii="Courier" w:hAnsi="Courier" w:eastAsia="Courier"/>
+          <w:b w:val="0"/>
+          <w:i w:val="0"/>
+          <w:color w:val="333333"/>
+          <w:sz w:val="19"/>
+        </w:rPr>
+        <w:t>xgboost_model.joblib</w:t>
+      </w:r>
+      <w:r>
+        <w:rPr>
+          <w:rFonts w:ascii="Helvetica" w:hAnsi="Helvetica" w:eastAsia="Helvetica"/>
+          <w:b w:val="0"/>
+          <w:i w:val="0"/>
+          <w:color w:val="333333"/>
+          <w:sz w:val="22"/>
+        </w:rPr>
+        <w:t xml:space="preserve">, and </w:t>
+      </w:r>
+      <w:r>
+        <w:br/>
+      </w:r>
+      <w:r>
+        <w:tab/>
+      </w:r>
+      <w:r>
+        <w:rPr>
+          <w:shd w:val="clear" w:color="auto" w:fill="f4f4f4"/>
+          <w:rFonts w:ascii="Courier" w:hAnsi="Courier" w:eastAsia="Courier"/>
+          <w:b w:val="0"/>
+          <w:i w:val="0"/>
+          <w:color w:val="333333"/>
+          <w:sz w:val="19"/>
+        </w:rPr>
+        <w:t>random_forest_model.joblib</w:t>
+      </w:r>
+      <w:r>
+        <w:rPr>
+          <w:rFonts w:ascii="Helvetica" w:hAnsi="Helvetica" w:eastAsia="Helvetica"/>
+          <w:b w:val="0"/>
+          <w:i w:val="0"/>
+          <w:color w:val="333333"/>
+          <w:sz w:val="22"/>
+        </w:rPr>
+        <w:t xml:space="preserve"> on startup. Serves </w:t>
+      </w:r>
+      <w:r>
+        <w:rPr>
+          <w:shd w:val="clear" w:color="auto" w:fill="f4f4f4"/>
+          <w:rFonts w:ascii="Courier" w:hAnsi="Courier" w:eastAsia="Courier"/>
+          <w:b w:val="0"/>
+          <w:i w:val="0"/>
+          <w:color w:val="333333"/>
+          <w:sz w:val="19"/>
+        </w:rPr>
+        <w:t>/predict</w:t>
+      </w:r>
+      <w:r>
+        <w:rPr>
+          <w:rFonts w:ascii="Helvetica" w:hAnsi="Helvetica" w:eastAsia="Helvetica"/>
+          <w:b w:val="0"/>
+          <w:i w:val="0"/>
+          <w:color w:val="333333"/>
+          <w:sz w:val="22"/>
+        </w:rPr>
+        <w:t xml:space="preserve"> endpoint returning JSON </w:t>
+      </w:r>
+      <w:r>
+        <w:tab/>
+      </w:r>
+      <w:r>
+        <w:rPr>
+          <w:rFonts w:ascii="Helvetica" w:hAnsi="Helvetica" w:eastAsia="Helvetica"/>
+          <w:b w:val="0"/>
+          <w:i w:val="0"/>
+          <w:color w:val="333333"/>
+          <w:sz w:val="22"/>
+        </w:rPr>
+        <w:t>predictions.</w:t>
+      </w:r>
+    </w:p>
+    <w:p>
+      <w:pPr>
+        <w:sectPr>
+          <w:pgSz w:w="11906" w:h="16838"/>
+          <w:pgMar w:top="680" w:right="1104" w:bottom="848" w:left="1124" w:header="720" w:footer="720" w:gutter="0"/>
+          <w:cols/>
+          <w:docGrid w:linePitch="360"/>
+        </w:sectPr>
+      </w:pPr>
     </w:p>
     <w:p>
       <w:pPr>
         <w:autoSpaceDN w:val="0"/>
         <w:autoSpaceDE w:val="0"/>
         <w:widowControl/>
-        <w:spacing w:line="302" w:lineRule="exact" w:before="42" w:after="0"/>
-        <w:ind w:left="658" w:right="0" w:firstLine="0"/>
-        <w:jc w:val="left"/>
+        <w:spacing w:line="220" w:lineRule="exact" w:before="0" w:after="458"/>
+        <w:ind w:left="0" w:right="0"/>
       </w:pPr>
-      <w:r>
-        <w:rPr>
-          <w:shd w:val="clear" w:color="auto" w:fill="f4f4f4"/>
-          <w:rFonts w:ascii="Courier" w:hAnsi="Courier" w:eastAsia="Courier"/>
-          <w:b w:val="0"/>
-          <w:i w:val="0"/>
-          <w:color w:val="333333"/>
-          <w:sz w:val="19"/>
-        </w:rPr>
-        <w:t>linear_regression_model.joblib</w:t>
-      </w:r>
-      <w:r>
-        <w:rPr>
-          <w:rFonts w:ascii="Helvetica" w:hAnsi="Helvetica" w:eastAsia="Helvetica"/>
-          <w:b w:val="0"/>
-          <w:i w:val="0"/>
-          <w:color w:val="333333"/>
-          <w:sz w:val="22"/>
-        </w:rPr>
-        <w:t xml:space="preserve">, </w:t>
-      </w:r>
-      <w:r>
-        <w:rPr>
-          <w:shd w:val="clear" w:color="auto" w:fill="f4f4f4"/>
-          <w:rFonts w:ascii="Courier" w:hAnsi="Courier" w:eastAsia="Courier"/>
-          <w:b w:val="0"/>
-          <w:i w:val="0"/>
-          <w:color w:val="333333"/>
-          <w:sz w:val="19"/>
-        </w:rPr>
-        <w:t>xgboost_model.joblib</w:t>
-      </w:r>
-      <w:r>
-        <w:rPr>
-          <w:rFonts w:ascii="Helvetica" w:hAnsi="Helvetica" w:eastAsia="Helvetica"/>
-          <w:b w:val="0"/>
-          <w:i w:val="0"/>
-          <w:color w:val="333333"/>
-          <w:sz w:val="22"/>
-        </w:rPr>
-        <w:t>, and</w:t>
-      </w:r>
     </w:p>
     <w:p>
       <w:pPr>
         <w:autoSpaceDN w:val="0"/>
         <w:autoSpaceDE w:val="0"/>
         <w:widowControl/>
-        <w:spacing w:line="302" w:lineRule="exact" w:before="50" w:after="0"/>
-        <w:ind w:left="658" w:right="0" w:firstLine="0"/>
+        <w:spacing w:line="328" w:lineRule="exact" w:before="0" w:after="0"/>
+        <w:ind w:left="660" w:right="288" w:firstLine="0"/>
         <w:jc w:val="left"/>
       </w:pPr>
       <w:r>
         <w:rPr>
+          <w:rFonts w:ascii="Helvetica" w:hAnsi="Helvetica" w:eastAsia="Helvetica"/>
+          <w:b/>
+          <w:i w:val="0"/>
+          <w:color w:val="333333"/>
+          <w:sz w:val="22"/>
+        </w:rPr>
+        <w:t>Frontend (</w:t>
+      </w:r>
+      <w:r>
+        <w:rPr>
           <w:shd w:val="clear" w:color="auto" w:fill="f4f4f4"/>
           <w:rFonts w:ascii="Courier" w:hAnsi="Courier" w:eastAsia="Courier"/>
-          <w:b w:val="0"/>
+          <w:b/>
           <w:i w:val="0"/>
           <w:color w:val="333333"/>
           <w:sz w:val="19"/>
         </w:rPr>
-        <w:t>random_forest_model.joblib</w:t>
-      </w:r>
-      <w:r>
-        <w:rPr>
-          <w:rFonts w:ascii="Helvetica" w:hAnsi="Helvetica" w:eastAsia="Helvetica"/>
-          <w:b w:val="0"/>
-          <w:i w:val="0"/>
-          <w:color w:val="333333"/>
-          <w:sz w:val="22"/>
-        </w:rPr>
-        <w:t xml:space="preserve"> on startup. Serves </w:t>
-      </w:r>
-      <w:r>
-        <w:rPr>
-          <w:shd w:val="clear" w:color="auto" w:fill="f4f4f4"/>
-          <w:rFonts w:ascii="Courier" w:hAnsi="Courier" w:eastAsia="Courier"/>
-          <w:b w:val="0"/>
-          <w:i w:val="0"/>
-          <w:color w:val="333333"/>
-          <w:sz w:val="19"/>
-        </w:rPr>
-        <w:t>/predict</w:t>
-      </w:r>
-      <w:r>
-        <w:rPr>
-          <w:rFonts w:ascii="Helvetica" w:hAnsi="Helvetica" w:eastAsia="Helvetica"/>
-          <w:b w:val="0"/>
-          <w:i w:val="0"/>
-          <w:color w:val="333333"/>
-          <w:sz w:val="22"/>
-        </w:rPr>
-        <w:t xml:space="preserve"> endpoint returning JSON</w:t>
+        <w:t>templates/index.html</w:t>
+      </w:r>
+      <w:r>
+        <w:rPr>
+          <w:rFonts w:ascii="Helvetica" w:hAnsi="Helvetica" w:eastAsia="Helvetica"/>
+          <w:b/>
+          <w:i w:val="0"/>
+          <w:color w:val="333333"/>
+          <w:sz w:val="22"/>
+        </w:rPr>
+        <w:t>):</w:t>
+      </w:r>
+      <w:r>
+        <w:rPr>
+          <w:rFonts w:ascii="Helvetica" w:hAnsi="Helvetica" w:eastAsia="Helvetica"/>
+          <w:b w:val="0"/>
+          <w:i w:val="0"/>
+          <w:color w:val="333333"/>
+          <w:sz w:val="22"/>
+        </w:rPr>
+        <w:t xml:space="preserve"> Glassmorphic web panel with Outfit typography and </w:t>
+      </w:r>
+      <w:r>
+        <w:rPr>
+          <w:rFonts w:ascii="Helvetica" w:hAnsi="Helvetica" w:eastAsia="Helvetica"/>
+          <w:b w:val="0"/>
+          <w:i w:val="0"/>
+          <w:color w:val="333333"/>
+          <w:sz w:val="22"/>
+        </w:rPr>
+        <w:t>dynamic dark mode sliders for all 10 features:</w:t>
+      </w:r>
+    </w:p>
+    <w:p>
+      <w:pPr>
+        <w:autoSpaceDN w:val="0"/>
+        <w:tabs>
+          <w:tab w:pos="990" w:val="left"/>
+        </w:tabs>
+        <w:autoSpaceDE w:val="0"/>
+        <w:widowControl/>
+        <w:spacing w:line="352" w:lineRule="exact" w:before="150" w:after="0"/>
+        <w:ind w:left="660" w:right="0" w:firstLine="0"/>
+        <w:jc w:val="left"/>
+      </w:pPr>
+      <w:r>
+        <w:rPr>
+          <w:rFonts w:ascii="Helvetica" w:hAnsi="Helvetica" w:eastAsia="Helvetica"/>
+          <w:b w:val="0"/>
+          <w:i w:val="0"/>
+          <w:color w:val="333333"/>
+          <w:sz w:val="22"/>
+        </w:rPr>
+        <w:t>•</w:t>
+      </w:r>
+      <w:r>
+        <w:tab/>
+      </w:r>
+      <w:r>
+        <w:rPr>
+          <w:rFonts w:ascii="Helvetica" w:hAnsi="Helvetica" w:eastAsia="Helvetica"/>
+          <w:b w:val="0"/>
+          <w:i/>
+          <w:color w:val="333333"/>
+          <w:sz w:val="22"/>
+        </w:rPr>
+        <w:t>Direct sliders:</w:t>
+      </w:r>
+      <w:r>
+        <w:rPr>
+          <w:rFonts w:ascii="Helvetica" w:hAnsi="Helvetica" w:eastAsia="Helvetica"/>
+          <w:b w:val="0"/>
+          <w:i w:val="0"/>
+          <w:color w:val="333333"/>
+          <w:sz w:val="22"/>
+        </w:rPr>
+        <w:t xml:space="preserve"> IncomeLevel, PropertyAge, TotalRooms, TotalBedrooms, AvgOccupancy, </w:t>
+      </w:r>
+      <w:r>
+        <w:tab/>
+      </w:r>
+      <w:r>
+        <w:rPr>
+          <w:rFonts w:ascii="Helvetica" w:hAnsi="Helvetica" w:eastAsia="Helvetica"/>
+          <w:b w:val="0"/>
+          <w:i w:val="0"/>
+          <w:color w:val="333333"/>
+          <w:sz w:val="22"/>
+        </w:rPr>
+        <w:t>RoomsPerHousehold, BedroomsRatio.</w:t>
+      </w:r>
+    </w:p>
+    <w:p>
+      <w:pPr>
+        <w:autoSpaceDN w:val="0"/>
+        <w:tabs>
+          <w:tab w:pos="990" w:val="left"/>
+        </w:tabs>
+        <w:autoSpaceDE w:val="0"/>
+        <w:widowControl/>
+        <w:spacing w:line="304" w:lineRule="exact" w:before="198" w:after="0"/>
+        <w:ind w:left="660" w:right="0" w:firstLine="0"/>
+        <w:jc w:val="left"/>
+      </w:pPr>
+      <w:r>
+        <w:rPr>
+          <w:rFonts w:ascii="Helvetica" w:hAnsi="Helvetica" w:eastAsia="Helvetica"/>
+          <w:b w:val="0"/>
+          <w:i w:val="0"/>
+          <w:color w:val="333333"/>
+          <w:sz w:val="22"/>
+        </w:rPr>
+        <w:t>•</w:t>
+      </w:r>
+      <w:r>
+        <w:tab/>
+      </w:r>
+      <w:r>
+        <w:rPr>
+          <w:rFonts w:ascii="Helvetica" w:hAnsi="Helvetica" w:eastAsia="Helvetica"/>
+          <w:b w:val="0"/>
+          <w:i/>
+          <w:color w:val="333333"/>
+          <w:sz w:val="22"/>
+        </w:rPr>
+        <w:t>Direct inputs:</w:t>
+      </w:r>
+      <w:r>
+        <w:rPr>
+          <w:rFonts w:ascii="Helvetica" w:hAnsi="Helvetica" w:eastAsia="Helvetica"/>
+          <w:b w:val="0"/>
+          <w:i w:val="0"/>
+          <w:color w:val="333333"/>
+          <w:sz w:val="22"/>
+        </w:rPr>
+        <w:t xml:space="preserve"> NeighborhoodPop, Latitude, Longitude.</w:t>
+      </w:r>
+    </w:p>
+    <w:p>
+      <w:pPr>
+        <w:autoSpaceDN w:val="0"/>
+        <w:tabs>
+          <w:tab w:pos="990" w:val="left"/>
+        </w:tabs>
+        <w:autoSpaceDE w:val="0"/>
+        <w:widowControl/>
+        <w:spacing w:line="352" w:lineRule="exact" w:before="150" w:after="0"/>
+        <w:ind w:left="660" w:right="864" w:firstLine="0"/>
+        <w:jc w:val="left"/>
+      </w:pPr>
+      <w:r>
+        <w:rPr>
+          <w:rFonts w:ascii="Helvetica" w:hAnsi="Helvetica" w:eastAsia="Helvetica"/>
+          <w:b w:val="0"/>
+          <w:i w:val="0"/>
+          <w:color w:val="333333"/>
+          <w:sz w:val="22"/>
+        </w:rPr>
+        <w:t>•</w:t>
+      </w:r>
+      <w:r>
+        <w:tab/>
+      </w:r>
+      <w:r>
+        <w:rPr>
+          <w:rFonts w:ascii="Helvetica" w:hAnsi="Helvetica" w:eastAsia="Helvetica"/>
+          <w:b w:val="0"/>
+          <w:i w:val="0"/>
+          <w:color w:val="333333"/>
+          <w:sz w:val="22"/>
+        </w:rPr>
+        <w:t xml:space="preserve">Live updates are sent asynchronously to the backend on slider adjust, updating </w:t>
+      </w:r>
+      <w:r>
+        <w:tab/>
+      </w:r>
+      <w:r>
+        <w:rPr>
+          <w:rFonts w:ascii="Helvetica" w:hAnsi="Helvetica" w:eastAsia="Helvetica"/>
+          <w:b w:val="0"/>
+          <w:i w:val="0"/>
+          <w:color w:val="333333"/>
+          <w:sz w:val="22"/>
+        </w:rPr>
+        <w:t>predicted prices dynamically with a neon green layout.</w:t>
       </w:r>
     </w:p>
     <w:p>
@@ -10900,19 +11199,19 @@
         <w:autoSpaceDN w:val="0"/>
         <w:autoSpaceDE w:val="0"/>
         <w:widowControl/>
-        <w:spacing w:line="302" w:lineRule="exact" w:before="50" w:after="0"/>
-        <w:ind w:left="658" w:right="0" w:firstLine="0"/>
+        <w:spacing w:line="412" w:lineRule="exact" w:before="1700" w:after="0"/>
+        <w:ind w:left="30" w:right="0" w:firstLine="0"/>
         <w:jc w:val="left"/>
       </w:pPr>
       <w:r>
         <w:rPr>
           <w:rFonts w:ascii="Helvetica" w:hAnsi="Helvetica" w:eastAsia="Helvetica"/>
-          <w:b w:val="0"/>
-          <w:i w:val="0"/>
-          <w:color w:val="333333"/>
-          <w:sz w:val="22"/>
-        </w:rPr>
-        <w:t>predictions.</w:t>
+          <w:b/>
+          <w:i w:val="0"/>
+          <w:color w:val="1F3A52"/>
+          <w:sz w:val="30"/>
+        </w:rPr>
+        <w:t>Section F: Critical Evaluation &amp; Limitations (10 Marks)</w:t>
       </w:r>
     </w:p>
     <w:p>
@@ -10920,8 +11219,8 @@
         <w:autoSpaceDN w:val="0"/>
         <w:autoSpaceDE w:val="0"/>
         <w:widowControl/>
-        <w:spacing w:line="310" w:lineRule="exact" w:before="200" w:after="0"/>
-        <w:ind w:left="658" w:right="0" w:firstLine="0"/>
+        <w:spacing w:line="332" w:lineRule="exact" w:before="528" w:after="0"/>
+        <w:ind w:left="30" w:right="0" w:firstLine="0"/>
         <w:jc w:val="left"/>
       </w:pPr>
       <w:r>
@@ -10929,41 +11228,72 @@
           <w:rFonts w:ascii="Helvetica" w:hAnsi="Helvetica" w:eastAsia="Helvetica"/>
           <w:b/>
           <w:i w:val="0"/>
-          <w:color w:val="333333"/>
-          <w:sz w:val="22"/>
-        </w:rPr>
-        <w:t>Frontend (</w:t>
-      </w:r>
-      <w:r>
-        <w:rPr>
-          <w:shd w:val="clear" w:color="auto" w:fill="f4f4f4"/>
-          <w:rFonts w:ascii="Courier" w:hAnsi="Courier" w:eastAsia="Courier"/>
-          <w:b/>
-          <w:i w:val="0"/>
-          <w:color w:val="333333"/>
-          <w:sz w:val="19"/>
-        </w:rPr>
-        <w:t>templates/index.html</w:t>
-      </w:r>
-      <w:r>
-        <w:rPr>
-          <w:rFonts w:ascii="Helvetica" w:hAnsi="Helvetica" w:eastAsia="Helvetica"/>
-          <w:b/>
-          <w:i w:val="0"/>
-          <w:color w:val="333333"/>
-          <w:sz w:val="22"/>
-        </w:rPr>
-        <w:t>):</w:t>
-      </w:r>
-      <w:r>
-        <w:rPr>
-          <w:rFonts w:ascii="Helvetica" w:hAnsi="Helvetica" w:eastAsia="Helvetica"/>
-          <w:b w:val="0"/>
-          <w:i w:val="0"/>
-          <w:color w:val="333333"/>
-          <w:sz w:val="22"/>
-        </w:rPr>
-        <w:t xml:space="preserve"> Glassmorphic web panel with Outfit typography and</w:t>
+          <w:color w:val="1F3A52"/>
+          <w:sz w:val="24"/>
+        </w:rPr>
+        <w:t>1. Domain Suitability of the Model</w:t>
+      </w:r>
+    </w:p>
+    <w:p>
+      <w:pPr>
+        <w:autoSpaceDN w:val="0"/>
+        <w:tabs>
+          <w:tab w:pos="660" w:val="left"/>
+        </w:tabs>
+        <w:autoSpaceDE w:val="0"/>
+        <w:widowControl/>
+        <w:spacing w:line="352" w:lineRule="exact" w:before="170" w:after="0"/>
+        <w:ind w:left="330" w:right="288" w:firstLine="0"/>
+        <w:jc w:val="left"/>
+      </w:pPr>
+      <w:r>
+        <w:rPr>
+          <w:rFonts w:ascii="Helvetica" w:hAnsi="Helvetica" w:eastAsia="Helvetica"/>
+          <w:b w:val="0"/>
+          <w:i w:val="0"/>
+          <w:color w:val="333333"/>
+          <w:sz w:val="22"/>
+        </w:rPr>
+        <w:t>•</w:t>
+      </w:r>
+      <w:r>
+        <w:tab/>
+      </w:r>
+      <w:r>
+        <w:rPr>
+          <w:rFonts w:ascii="Helvetica" w:hAnsi="Helvetica" w:eastAsia="Helvetica"/>
+          <w:b w:val="0"/>
+          <w:i w:val="0"/>
+          <w:color w:val="333333"/>
+          <w:sz w:val="22"/>
+        </w:rPr>
+        <w:t xml:space="preserve">The Random Forest Regressor is highly suited for real estate valuation. It is robust to </w:t>
+      </w:r>
+      <w:r>
+        <w:tab/>
+      </w:r>
+      <w:r>
+        <w:rPr>
+          <w:rFonts w:ascii="Helvetica" w:hAnsi="Helvetica" w:eastAsia="Helvetica"/>
+          <w:b w:val="0"/>
+          <w:i w:val="0"/>
+          <w:color w:val="333333"/>
+          <w:sz w:val="22"/>
+        </w:rPr>
+        <w:t xml:space="preserve">outliers (which are common in real estate due to luxury housing spikes) and captures the </w:t>
+      </w:r>
+      <w:r>
+        <w:tab/>
+      </w:r>
+      <w:r>
+        <w:rPr>
+          <w:rFonts w:ascii="Helvetica" w:hAnsi="Helvetica" w:eastAsia="Helvetica"/>
+          <w:b w:val="0"/>
+          <w:i w:val="0"/>
+          <w:color w:val="333333"/>
+          <w:sz w:val="22"/>
+        </w:rPr>
+        <w:t>complex interactions between geographic coordinates and average occupancy.</w:t>
       </w:r>
     </w:p>
     <w:p>
@@ -10971,31 +11301,31 @@
         <w:autoSpaceDN w:val="0"/>
         <w:autoSpaceDE w:val="0"/>
         <w:widowControl/>
-        <w:spacing w:line="302" w:lineRule="exact" w:before="42" w:after="0"/>
-        <w:ind w:left="658" w:right="0" w:firstLine="0"/>
+        <w:spacing w:line="332" w:lineRule="exact" w:before="816" w:after="0"/>
+        <w:ind w:left="30" w:right="0" w:firstLine="0"/>
         <w:jc w:val="left"/>
       </w:pPr>
       <w:r>
         <w:rPr>
           <w:rFonts w:ascii="Helvetica" w:hAnsi="Helvetica" w:eastAsia="Helvetica"/>
-          <w:b w:val="0"/>
-          <w:i w:val="0"/>
-          <w:color w:val="333333"/>
-          <w:sz w:val="22"/>
-        </w:rPr>
-        <w:t>dynamic dark mode sliders for all 10 features:</w:t>
+          <w:b/>
+          <w:i w:val="0"/>
+          <w:color w:val="1F3A52"/>
+          <w:sz w:val="24"/>
+        </w:rPr>
+        <w:t>2. Suitability of Deep Learning</w:t>
       </w:r>
     </w:p>
     <w:p>
       <w:pPr>
         <w:autoSpaceDN w:val="0"/>
         <w:tabs>
-          <w:tab w:pos="988" w:val="left"/>
+          <w:tab w:pos="660" w:val="left"/>
         </w:tabs>
         <w:autoSpaceDE w:val="0"/>
         <w:widowControl/>
-        <w:spacing w:line="302" w:lineRule="exact" w:before="200" w:after="0"/>
-        <w:ind w:left="658" w:right="0" w:firstLine="0"/>
+        <w:spacing w:line="352" w:lineRule="exact" w:before="170" w:after="0"/>
+        <w:ind w:left="330" w:right="720" w:firstLine="0"/>
         <w:jc w:val="left"/>
       </w:pPr>
       <w:r>
@@ -11015,21 +11345,155 @@
         <w:rPr>
           <w:rFonts w:ascii="Helvetica" w:hAnsi="Helvetica" w:eastAsia="Helvetica"/>
           <w:b w:val="0"/>
+          <w:i w:val="0"/>
+          <w:color w:val="333333"/>
+          <w:sz w:val="22"/>
+        </w:rPr>
+        <w:t xml:space="preserve">While Deep Learning (e.g. MLPs) can approximate the spatial price function, it is less </w:t>
+      </w:r>
+      <w:r>
+        <w:tab/>
+      </w:r>
+      <w:r>
+        <w:rPr>
+          <w:rFonts w:ascii="Helvetica" w:hAnsi="Helvetica" w:eastAsia="Helvetica"/>
+          <w:b w:val="0"/>
+          <w:i w:val="0"/>
+          <w:color w:val="333333"/>
+          <w:sz w:val="22"/>
+        </w:rPr>
+        <w:t>suitable here due to:</w:t>
+      </w:r>
+    </w:p>
+    <w:p>
+      <w:pPr>
+        <w:autoSpaceDN w:val="0"/>
+        <w:tabs>
+          <w:tab w:pos="990" w:val="left"/>
+        </w:tabs>
+        <w:autoSpaceDE w:val="0"/>
+        <w:widowControl/>
+        <w:spacing w:line="352" w:lineRule="exact" w:before="150" w:after="0"/>
+        <w:ind w:left="660" w:right="1152" w:firstLine="0"/>
+        <w:jc w:val="left"/>
+      </w:pPr>
+      <w:r>
+        <w:rPr>
+          <w:rFonts w:ascii="Helvetica" w:hAnsi="Helvetica" w:eastAsia="Helvetica"/>
+          <w:b w:val="0"/>
+          <w:i w:val="0"/>
+          <w:color w:val="333333"/>
+          <w:sz w:val="22"/>
+        </w:rPr>
+        <w:t>•</w:t>
+      </w:r>
+      <w:r>
+        <w:tab/>
+      </w:r>
+      <w:r>
+        <w:rPr>
+          <w:rFonts w:ascii="Helvetica" w:hAnsi="Helvetica" w:eastAsia="Helvetica"/>
+          <w:b w:val="0"/>
           <w:i/>
           <w:color w:val="333333"/>
           <w:sz w:val="22"/>
         </w:rPr>
-        <w:t>Direct sliders:</w:t>
-      </w:r>
-      <w:r>
-        <w:rPr>
-          <w:rFonts w:ascii="Helvetica" w:hAnsi="Helvetica" w:eastAsia="Helvetica"/>
-          <w:b w:val="0"/>
-          <w:i w:val="0"/>
-          <w:color w:val="333333"/>
-          <w:sz w:val="22"/>
-        </w:rPr>
-        <w:t xml:space="preserve"> IncomeLevel, PropertyAge, TotalRooms, TotalBedrooms, AvgOccupancy,</w:t>
+        <w:t>Data scale:</w:t>
+      </w:r>
+      <w:r>
+        <w:rPr>
+          <w:rFonts w:ascii="Helvetica" w:hAnsi="Helvetica" w:eastAsia="Helvetica"/>
+          <w:b w:val="0"/>
+          <w:i w:val="0"/>
+          <w:color w:val="333333"/>
+          <w:sz w:val="22"/>
+        </w:rPr>
+        <w:t xml:space="preserve"> Tabular dataset size (15k rows) is too small to train large network </w:t>
+      </w:r>
+      <w:r>
+        <w:tab/>
+      </w:r>
+      <w:r>
+        <w:rPr>
+          <w:rFonts w:ascii="Helvetica" w:hAnsi="Helvetica" w:eastAsia="Helvetica"/>
+          <w:b w:val="0"/>
+          <w:i w:val="0"/>
+          <w:color w:val="333333"/>
+          <w:sz w:val="22"/>
+        </w:rPr>
+        <w:t>parameters without massive overfitting.</w:t>
+      </w:r>
+    </w:p>
+    <w:p>
+      <w:pPr>
+        <w:autoSpaceDN w:val="0"/>
+        <w:tabs>
+          <w:tab w:pos="990" w:val="left"/>
+        </w:tabs>
+        <w:autoSpaceDE w:val="0"/>
+        <w:widowControl/>
+        <w:spacing w:line="352" w:lineRule="exact" w:before="150" w:after="0"/>
+        <w:ind w:left="660" w:right="288" w:firstLine="0"/>
+        <w:jc w:val="left"/>
+      </w:pPr>
+      <w:r>
+        <w:rPr>
+          <w:rFonts w:ascii="Helvetica" w:hAnsi="Helvetica" w:eastAsia="Helvetica"/>
+          <w:b w:val="0"/>
+          <w:i w:val="0"/>
+          <w:color w:val="333333"/>
+          <w:sz w:val="22"/>
+        </w:rPr>
+        <w:t>•</w:t>
+      </w:r>
+      <w:r>
+        <w:tab/>
+      </w:r>
+      <w:r>
+        <w:rPr>
+          <w:rFonts w:ascii="Helvetica" w:hAnsi="Helvetica" w:eastAsia="Helvetica"/>
+          <w:b w:val="0"/>
+          <w:i/>
+          <w:color w:val="333333"/>
+          <w:sz w:val="22"/>
+        </w:rPr>
+        <w:t>Interpretability:</w:t>
+      </w:r>
+      <w:r>
+        <w:rPr>
+          <w:rFonts w:ascii="Helvetica" w:hAnsi="Helvetica" w:eastAsia="Helvetica"/>
+          <w:b w:val="0"/>
+          <w:i w:val="0"/>
+          <w:color w:val="333333"/>
+          <w:sz w:val="22"/>
+        </w:rPr>
+        <w:t xml:space="preserve"> Real estate appraisers require structural rules (e.g., how the bedrooms </w:t>
+      </w:r>
+      <w:r>
+        <w:tab/>
+      </w:r>
+      <w:r>
+        <w:rPr>
+          <w:rFonts w:ascii="Helvetica" w:hAnsi="Helvetica" w:eastAsia="Helvetica"/>
+          <w:b w:val="0"/>
+          <w:i w:val="0"/>
+          <w:color w:val="333333"/>
+          <w:sz w:val="22"/>
+        </w:rPr>
+        <w:t xml:space="preserve">ratio impacts price) which are inspectable in tree splits but completely hidden in deep </w:t>
+      </w:r>
+      <w:r>
+        <w:tab/>
+      </w:r>
+      <w:r>
+        <w:rPr>
+          <w:rFonts w:ascii="Helvetica" w:hAnsi="Helvetica" w:eastAsia="Helvetica"/>
+          <w:b w:val="0"/>
+          <w:i w:val="0"/>
+          <w:color w:val="333333"/>
+          <w:sz w:val="22"/>
+        </w:rPr>
+        <w:t>neural weights.</w:t>
       </w:r>
     </w:p>
     <w:p>
@@ -11037,31 +11501,31 @@
         <w:autoSpaceDN w:val="0"/>
         <w:autoSpaceDE w:val="0"/>
         <w:widowControl/>
-        <w:spacing w:line="302" w:lineRule="exact" w:before="50" w:after="0"/>
-        <w:ind w:left="988" w:right="0" w:firstLine="0"/>
+        <w:spacing w:line="332" w:lineRule="exact" w:before="1080" w:after="0"/>
+        <w:ind w:left="30" w:right="0" w:firstLine="0"/>
         <w:jc w:val="left"/>
       </w:pPr>
       <w:r>
         <w:rPr>
           <w:rFonts w:ascii="Helvetica" w:hAnsi="Helvetica" w:eastAsia="Helvetica"/>
-          <w:b w:val="0"/>
-          <w:i w:val="0"/>
-          <w:color w:val="333333"/>
-          <w:sz w:val="22"/>
-        </w:rPr>
-        <w:t>RoomsPerHousehold, BedroomsRatio.</w:t>
+          <w:b/>
+          <w:i w:val="0"/>
+          <w:color w:val="1F3A52"/>
+          <w:sz w:val="24"/>
+        </w:rPr>
+        <w:t>3. Limitations of the Current Approach</w:t>
       </w:r>
     </w:p>
     <w:p>
       <w:pPr>
         <w:autoSpaceDN w:val="0"/>
         <w:tabs>
-          <w:tab w:pos="988" w:val="left"/>
+          <w:tab w:pos="660" w:val="left"/>
         </w:tabs>
         <w:autoSpaceDE w:val="0"/>
         <w:widowControl/>
-        <w:spacing w:line="302" w:lineRule="exact" w:before="200" w:after="0"/>
-        <w:ind w:left="658" w:right="0" w:firstLine="0"/>
+        <w:spacing w:line="352" w:lineRule="exact" w:before="170" w:after="0"/>
+        <w:ind w:left="330" w:right="576" w:firstLine="0"/>
         <w:jc w:val="left"/>
       </w:pPr>
       <w:r>
@@ -11080,29 +11544,42 @@
       <w:r>
         <w:rPr>
           <w:rFonts w:ascii="Helvetica" w:hAnsi="Helvetica" w:eastAsia="Helvetica"/>
-          <w:b w:val="0"/>
-          <w:i/>
-          <w:color w:val="333333"/>
-          <w:sz w:val="22"/>
-        </w:rPr>
-        <w:t>Direct inputs:</w:t>
-      </w:r>
-      <w:r>
-        <w:rPr>
-          <w:rFonts w:ascii="Helvetica" w:hAnsi="Helvetica" w:eastAsia="Helvetica"/>
-          <w:b w:val="0"/>
-          <w:i w:val="0"/>
-          <w:color w:val="333333"/>
-          <w:sz w:val="22"/>
-        </w:rPr>
-        <w:t xml:space="preserve"> NeighborhoodPop, Latitude, Longitude.</w:t>
+          <w:b/>
+          <w:i w:val="0"/>
+          <w:color w:val="333333"/>
+          <w:sz w:val="22"/>
+        </w:rPr>
+        <w:t>Temporal Shift:</w:t>
+      </w:r>
+      <w:r>
+        <w:rPr>
+          <w:rFonts w:ascii="Helvetica" w:hAnsi="Helvetica" w:eastAsia="Helvetica"/>
+          <w:b w:val="0"/>
+          <w:i w:val="0"/>
+          <w:color w:val="333333"/>
+          <w:sz w:val="22"/>
+        </w:rPr>
+        <w:t xml:space="preserve"> The model does not include time metrics. Inflation, interest rates, and </w:t>
+      </w:r>
+      <w:r>
+        <w:tab/>
+      </w:r>
+      <w:r>
+        <w:rPr>
+          <w:rFonts w:ascii="Helvetica" w:hAnsi="Helvetica" w:eastAsia="Helvetica"/>
+          <w:b w:val="0"/>
+          <w:i w:val="0"/>
+          <w:color w:val="333333"/>
+          <w:sz w:val="22"/>
+        </w:rPr>
+        <w:t>seasonal spikes are completely ignored.</w:t>
       </w:r>
     </w:p>
     <w:p>
       <w:pPr>
         <w:sectPr>
           <w:pgSz w:w="11906" w:h="16838"/>
-          <w:pgMar w:top="666" w:right="1106" w:bottom="966" w:left="1126" w:header="720" w:footer="720" w:gutter="0"/>
+          <w:pgMar w:top="680" w:right="1104" w:bottom="1024" w:left="1124" w:header="720" w:footer="720" w:gutter="0"/>
           <w:cols/>
           <w:docGrid w:linePitch="360"/>
         </w:sectPr>
@@ -11121,12 +11598,12 @@
       <w:pPr>
         <w:autoSpaceDN w:val="0"/>
         <w:tabs>
-          <w:tab w:pos="990" w:val="left"/>
+          <w:tab w:pos="630" w:val="left"/>
         </w:tabs>
         <w:autoSpaceDE w:val="0"/>
         <w:widowControl/>
-        <w:spacing w:line="328" w:lineRule="exact" w:before="0" w:after="0"/>
-        <w:ind w:left="660" w:right="864" w:firstLine="0"/>
+        <w:spacing w:line="336" w:lineRule="exact" w:before="0" w:after="0"/>
+        <w:ind w:left="300" w:right="432" w:firstLine="0"/>
         <w:jc w:val="left"/>
       </w:pPr>
       <w:r>
@@ -11145,12 +11622,22 @@
       <w:r>
         <w:rPr>
           <w:rFonts w:ascii="Helvetica" w:hAnsi="Helvetica" w:eastAsia="Helvetica"/>
-          <w:b w:val="0"/>
-          <w:i w:val="0"/>
-          <w:color w:val="333333"/>
-          <w:sz w:val="22"/>
-        </w:rPr>
-        <w:t xml:space="preserve">Live updates are sent asynchronously to the backend on slider adjust, updating </w:t>
+          <w:b/>
+          <w:i w:val="0"/>
+          <w:color w:val="333333"/>
+          <w:sz w:val="22"/>
+        </w:rPr>
+        <w:t>Geographical Constraints:</w:t>
+      </w:r>
+      <w:r>
+        <w:rPr>
+          <w:rFonts w:ascii="Helvetica" w:hAnsi="Helvetica" w:eastAsia="Helvetica"/>
+          <w:b w:val="0"/>
+          <w:i w:val="0"/>
+          <w:color w:val="333333"/>
+          <w:sz w:val="22"/>
+        </w:rPr>
+        <w:t xml:space="preserve"> The model is bound to the coordinate boundaries of the </w:t>
       </w:r>
       <w:r>
         <w:tab/>
@@ -11163,70 +11650,7 @@
           <w:color w:val="333333"/>
           <w:sz w:val="22"/>
         </w:rPr>
-        <w:t>predicted prices dynamically with a neon green layout.</w:t>
-      </w:r>
-    </w:p>
-    <w:p>
-      <w:pPr>
-        <w:autoSpaceDN w:val="0"/>
-        <w:autoSpaceDE w:val="0"/>
-        <w:widowControl/>
-        <w:spacing w:line="412" w:lineRule="exact" w:before="1700" w:after="0"/>
-        <w:ind w:left="30" w:right="0" w:firstLine="0"/>
-        <w:jc w:val="left"/>
-      </w:pPr>
-      <w:r>
-        <w:rPr>
-          <w:rFonts w:ascii="Helvetica" w:hAnsi="Helvetica" w:eastAsia="Helvetica"/>
-          <w:b/>
-          <w:i w:val="0"/>
-          <w:color w:val="1F3A52"/>
-          <w:sz w:val="30"/>
-        </w:rPr>
-        <w:t>Section F: Critical Evaluation &amp; Limitations (10 Marks)</w:t>
-      </w:r>
-    </w:p>
-    <w:p>
-      <w:pPr>
-        <w:autoSpaceDN w:val="0"/>
-        <w:autoSpaceDE w:val="0"/>
-        <w:widowControl/>
-        <w:spacing w:line="332" w:lineRule="exact" w:before="528" w:after="0"/>
-        <w:ind w:left="30" w:right="0" w:firstLine="0"/>
-        <w:jc w:val="left"/>
-      </w:pPr>
-      <w:r>
-        <w:rPr>
-          <w:rFonts w:ascii="Helvetica" w:hAnsi="Helvetica" w:eastAsia="Helvetica"/>
-          <w:b/>
-          <w:i w:val="0"/>
-          <w:color w:val="1F3A52"/>
-          <w:sz w:val="24"/>
-        </w:rPr>
-        <w:t>1. Domain Suitability of the Model</w:t>
-      </w:r>
-    </w:p>
-    <w:p>
-      <w:pPr>
-        <w:autoSpaceDN w:val="0"/>
-        <w:tabs>
-          <w:tab w:pos="660" w:val="left"/>
-        </w:tabs>
-        <w:autoSpaceDE w:val="0"/>
-        <w:widowControl/>
-        <w:spacing w:line="352" w:lineRule="exact" w:before="170" w:after="0"/>
-        <w:ind w:left="330" w:right="288" w:firstLine="0"/>
-        <w:jc w:val="left"/>
-      </w:pPr>
-      <w:r>
-        <w:rPr>
-          <w:rFonts w:ascii="Helvetica" w:hAnsi="Helvetica" w:eastAsia="Helvetica"/>
-          <w:b w:val="0"/>
-          <w:i w:val="0"/>
-          <w:color w:val="333333"/>
-          <w:sz w:val="22"/>
-        </w:rPr>
-        <w:t>•</w:t>
+        <w:t xml:space="preserve">training dataset. It cannot predict prices for properties outside these geographical </w:t>
       </w:r>
       <w:r>
         <w:tab/>
@@ -11239,33 +11663,7 @@
           <w:color w:val="333333"/>
           <w:sz w:val="22"/>
         </w:rPr>
-        <w:t xml:space="preserve">The Random Forest Regressor is highly suited for real estate valuation. It is robust to </w:t>
-      </w:r>
-      <w:r>
-        <w:tab/>
-      </w:r>
-      <w:r>
-        <w:rPr>
-          <w:rFonts w:ascii="Helvetica" w:hAnsi="Helvetica" w:eastAsia="Helvetica"/>
-          <w:b w:val="0"/>
-          <w:i w:val="0"/>
-          <w:color w:val="333333"/>
-          <w:sz w:val="22"/>
-        </w:rPr>
-        <w:t xml:space="preserve">outliers (which are common in real estate due to luxury housing spikes) and captures the </w:t>
-      </w:r>
-      <w:r>
-        <w:tab/>
-      </w:r>
-      <w:r>
-        <w:rPr>
-          <w:rFonts w:ascii="Helvetica" w:hAnsi="Helvetica" w:eastAsia="Helvetica"/>
-          <w:b w:val="0"/>
-          <w:i w:val="0"/>
-          <w:color w:val="333333"/>
-          <w:sz w:val="22"/>
-        </w:rPr>
-        <w:t>complex interactions between geographic coordinates and average occupancy.</w:t>
+        <w:t>boundaries.</w:t>
       </w:r>
     </w:p>
     <w:p>
@@ -11274,7 +11672,7 @@
         <w:autoSpaceDE w:val="0"/>
         <w:widowControl/>
         <w:spacing w:line="332" w:lineRule="exact" w:before="816" w:after="0"/>
-        <w:ind w:left="30" w:right="0" w:firstLine="0"/>
+        <w:ind w:left="0" w:right="0" w:firstLine="0"/>
         <w:jc w:val="left"/>
       </w:pPr>
       <w:r>
@@ -11285,19 +11683,19 @@
           <w:color w:val="1F3A52"/>
           <w:sz w:val="24"/>
         </w:rPr>
-        <w:t>2. Suitability of Deep Learning</w:t>
+        <w:t>4. Future Suggestions</w:t>
       </w:r>
     </w:p>
     <w:p>
       <w:pPr>
         <w:autoSpaceDN w:val="0"/>
         <w:tabs>
-          <w:tab w:pos="660" w:val="left"/>
+          <w:tab w:pos="630" w:val="left"/>
         </w:tabs>
         <w:autoSpaceDE w:val="0"/>
         <w:widowControl/>
         <w:spacing w:line="352" w:lineRule="exact" w:before="170" w:after="0"/>
-        <w:ind w:left="330" w:right="720" w:firstLine="0"/>
+        <w:ind w:left="300" w:right="0" w:firstLine="0"/>
         <w:jc w:val="left"/>
       </w:pPr>
       <w:r>
@@ -11321,7 +11719,27 @@
           <w:color w:val="333333"/>
           <w:sz w:val="22"/>
         </w:rPr>
-        <w:t xml:space="preserve">While Deep Learning (e.g. MLPs) can approximate the spatial price function, it is less </w:t>
+        <w:t xml:space="preserve">We successfully implemented XGBoost and improved the $R^2$ score to </w:t>
+      </w:r>
+      <w:r>
+        <w:rPr>
+          <w:rFonts w:ascii="Helvetica" w:hAnsi="Helvetica" w:eastAsia="Helvetica"/>
+          <w:b/>
+          <w:i w:val="0"/>
+          <w:color w:val="333333"/>
+          <w:sz w:val="22"/>
+        </w:rPr>
+        <w:t>0.8256</w:t>
+      </w:r>
+      <w:r>
+        <w:rPr>
+          <w:rFonts w:ascii="Helvetica" w:hAnsi="Helvetica" w:eastAsia="Helvetica"/>
+          <w:b w:val="0"/>
+          <w:i w:val="0"/>
+          <w:color w:val="333333"/>
+          <w:sz w:val="22"/>
+        </w:rPr>
+        <w:t xml:space="preserve">. Future </w:t>
       </w:r>
       <w:r>
         <w:tab/>
@@ -11334,19 +11752,19 @@
           <w:color w:val="333333"/>
           <w:sz w:val="22"/>
         </w:rPr>
-        <w:t>suitable here due to:</w:t>
+        <w:t>work could incorporate LightGBM to speed up training.</w:t>
       </w:r>
     </w:p>
     <w:p>
       <w:pPr>
         <w:autoSpaceDN w:val="0"/>
         <w:tabs>
-          <w:tab w:pos="990" w:val="left"/>
+          <w:tab w:pos="630" w:val="left"/>
         </w:tabs>
         <w:autoSpaceDE w:val="0"/>
         <w:widowControl/>
         <w:spacing w:line="352" w:lineRule="exact" w:before="150" w:after="0"/>
-        <w:ind w:left="660" w:right="1152" w:firstLine="0"/>
+        <w:ind w:left="300" w:right="720" w:firstLine="0"/>
         <w:jc w:val="left"/>
       </w:pPr>
       <w:r>
@@ -11366,419 +11784,15 @@
         <w:rPr>
           <w:rFonts w:ascii="Helvetica" w:hAnsi="Helvetica" w:eastAsia="Helvetica"/>
           <w:b w:val="0"/>
-          <w:i/>
-          <w:color w:val="333333"/>
-          <w:sz w:val="22"/>
-        </w:rPr>
-        <w:t>Data scale:</w:t>
-      </w:r>
-      <w:r>
-        <w:rPr>
-          <w:rFonts w:ascii="Helvetica" w:hAnsi="Helvetica" w:eastAsia="Helvetica"/>
-          <w:b w:val="0"/>
-          <w:i w:val="0"/>
-          <w:color w:val="333333"/>
-          <w:sz w:val="22"/>
-        </w:rPr>
-        <w:t xml:space="preserve"> Tabular dataset size (15k rows) is too small to train large network </w:t>
+          <w:i w:val="0"/>
+          <w:color w:val="333333"/>
+          <w:sz w:val="22"/>
+        </w:rPr>
+        <w:t xml:space="preserve">Incorporate SHAP (Shapley Additive exPlanations) values to provide local feature </w:t>
       </w:r>
       <w:r>
         <w:tab/>
       </w:r>
-      <w:r>
-        <w:rPr>
-          <w:rFonts w:ascii="Helvetica" w:hAnsi="Helvetica" w:eastAsia="Helvetica"/>
-          <w:b w:val="0"/>
-          <w:i w:val="0"/>
-          <w:color w:val="333333"/>
-          <w:sz w:val="22"/>
-        </w:rPr>
-        <w:t>parameters without massive overfitting.</w:t>
-      </w:r>
-    </w:p>
-    <w:p>
-      <w:pPr>
-        <w:autoSpaceDN w:val="0"/>
-        <w:tabs>
-          <w:tab w:pos="990" w:val="left"/>
-        </w:tabs>
-        <w:autoSpaceDE w:val="0"/>
-        <w:widowControl/>
-        <w:spacing w:line="352" w:lineRule="exact" w:before="150" w:after="0"/>
-        <w:ind w:left="660" w:right="288" w:firstLine="0"/>
-        <w:jc w:val="left"/>
-      </w:pPr>
-      <w:r>
-        <w:rPr>
-          <w:rFonts w:ascii="Helvetica" w:hAnsi="Helvetica" w:eastAsia="Helvetica"/>
-          <w:b w:val="0"/>
-          <w:i w:val="0"/>
-          <w:color w:val="333333"/>
-          <w:sz w:val="22"/>
-        </w:rPr>
-        <w:t>•</w:t>
-      </w:r>
-      <w:r>
-        <w:tab/>
-      </w:r>
-      <w:r>
-        <w:rPr>
-          <w:rFonts w:ascii="Helvetica" w:hAnsi="Helvetica" w:eastAsia="Helvetica"/>
-          <w:b w:val="0"/>
-          <w:i/>
-          <w:color w:val="333333"/>
-          <w:sz w:val="22"/>
-        </w:rPr>
-        <w:t>Interpretability:</w:t>
-      </w:r>
-      <w:r>
-        <w:rPr>
-          <w:rFonts w:ascii="Helvetica" w:hAnsi="Helvetica" w:eastAsia="Helvetica"/>
-          <w:b w:val="0"/>
-          <w:i w:val="0"/>
-          <w:color w:val="333333"/>
-          <w:sz w:val="22"/>
-        </w:rPr>
-        <w:t xml:space="preserve"> Real estate appraisers require structural rules (e.g., how the bedrooms </w:t>
-      </w:r>
-      <w:r>
-        <w:tab/>
-      </w:r>
-      <w:r>
-        <w:rPr>
-          <w:rFonts w:ascii="Helvetica" w:hAnsi="Helvetica" w:eastAsia="Helvetica"/>
-          <w:b w:val="0"/>
-          <w:i w:val="0"/>
-          <w:color w:val="333333"/>
-          <w:sz w:val="22"/>
-        </w:rPr>
-        <w:t xml:space="preserve">ratio impacts price) which are inspectable in tree splits but completely hidden in deep </w:t>
-      </w:r>
-      <w:r>
-        <w:tab/>
-      </w:r>
-      <w:r>
-        <w:rPr>
-          <w:rFonts w:ascii="Helvetica" w:hAnsi="Helvetica" w:eastAsia="Helvetica"/>
-          <w:b w:val="0"/>
-          <w:i w:val="0"/>
-          <w:color w:val="333333"/>
-          <w:sz w:val="22"/>
-        </w:rPr>
-        <w:t>neural weights.</w:t>
-      </w:r>
-    </w:p>
-    <w:p>
-      <w:pPr>
-        <w:autoSpaceDN w:val="0"/>
-        <w:autoSpaceDE w:val="0"/>
-        <w:widowControl/>
-        <w:spacing w:line="332" w:lineRule="exact" w:before="1080" w:after="0"/>
-        <w:ind w:left="30" w:right="0" w:firstLine="0"/>
-        <w:jc w:val="left"/>
-      </w:pPr>
-      <w:r>
-        <w:rPr>
-          <w:rFonts w:ascii="Helvetica" w:hAnsi="Helvetica" w:eastAsia="Helvetica"/>
-          <w:b/>
-          <w:i w:val="0"/>
-          <w:color w:val="1F3A52"/>
-          <w:sz w:val="24"/>
-        </w:rPr>
-        <w:t>3. Limitations of the Current Approach</w:t>
-      </w:r>
-    </w:p>
-    <w:p>
-      <w:pPr>
-        <w:autoSpaceDN w:val="0"/>
-        <w:tabs>
-          <w:tab w:pos="660" w:val="left"/>
-        </w:tabs>
-        <w:autoSpaceDE w:val="0"/>
-        <w:widowControl/>
-        <w:spacing w:line="352" w:lineRule="exact" w:before="170" w:after="0"/>
-        <w:ind w:left="330" w:right="576" w:firstLine="0"/>
-        <w:jc w:val="left"/>
-      </w:pPr>
-      <w:r>
-        <w:rPr>
-          <w:rFonts w:ascii="Helvetica" w:hAnsi="Helvetica" w:eastAsia="Helvetica"/>
-          <w:b w:val="0"/>
-          <w:i w:val="0"/>
-          <w:color w:val="333333"/>
-          <w:sz w:val="22"/>
-        </w:rPr>
-        <w:t>•</w:t>
-      </w:r>
-      <w:r>
-        <w:tab/>
-      </w:r>
-      <w:r>
-        <w:rPr>
-          <w:rFonts w:ascii="Helvetica" w:hAnsi="Helvetica" w:eastAsia="Helvetica"/>
-          <w:b/>
-          <w:i w:val="0"/>
-          <w:color w:val="333333"/>
-          <w:sz w:val="22"/>
-        </w:rPr>
-        <w:t>Temporal Shift:</w:t>
-      </w:r>
-      <w:r>
-        <w:rPr>
-          <w:rFonts w:ascii="Helvetica" w:hAnsi="Helvetica" w:eastAsia="Helvetica"/>
-          <w:b w:val="0"/>
-          <w:i w:val="0"/>
-          <w:color w:val="333333"/>
-          <w:sz w:val="22"/>
-        </w:rPr>
-        <w:t xml:space="preserve"> The model does not include time metrics. Inflation, interest rates, and </w:t>
-      </w:r>
-      <w:r>
-        <w:tab/>
-      </w:r>
-      <w:r>
-        <w:rPr>
-          <w:rFonts w:ascii="Helvetica" w:hAnsi="Helvetica" w:eastAsia="Helvetica"/>
-          <w:b w:val="0"/>
-          <w:i w:val="0"/>
-          <w:color w:val="333333"/>
-          <w:sz w:val="22"/>
-        </w:rPr>
-        <w:t>seasonal spikes are completely ignored.</w:t>
-      </w:r>
-    </w:p>
-    <w:p>
-      <w:pPr>
-        <w:autoSpaceDN w:val="0"/>
-        <w:tabs>
-          <w:tab w:pos="660" w:val="left"/>
-        </w:tabs>
-        <w:autoSpaceDE w:val="0"/>
-        <w:widowControl/>
-        <w:spacing w:line="352" w:lineRule="exact" w:before="150" w:after="0"/>
-        <w:ind w:left="330" w:right="720" w:firstLine="0"/>
-        <w:jc w:val="left"/>
-      </w:pPr>
-      <w:r>
-        <w:rPr>
-          <w:rFonts w:ascii="Helvetica" w:hAnsi="Helvetica" w:eastAsia="Helvetica"/>
-          <w:b w:val="0"/>
-          <w:i w:val="0"/>
-          <w:color w:val="333333"/>
-          <w:sz w:val="22"/>
-        </w:rPr>
-        <w:t>•</w:t>
-      </w:r>
-      <w:r>
-        <w:tab/>
-      </w:r>
-      <w:r>
-        <w:rPr>
-          <w:rFonts w:ascii="Helvetica" w:hAnsi="Helvetica" w:eastAsia="Helvetica"/>
-          <w:b/>
-          <w:i w:val="0"/>
-          <w:color w:val="333333"/>
-          <w:sz w:val="22"/>
-        </w:rPr>
-        <w:t>Geographical Constraints:</w:t>
-      </w:r>
-      <w:r>
-        <w:rPr>
-          <w:rFonts w:ascii="Helvetica" w:hAnsi="Helvetica" w:eastAsia="Helvetica"/>
-          <w:b w:val="0"/>
-          <w:i w:val="0"/>
-          <w:color w:val="333333"/>
-          <w:sz w:val="22"/>
-        </w:rPr>
-        <w:t xml:space="preserve"> The model is bound to the coordinate boundaries of the </w:t>
-      </w:r>
-      <w:r>
-        <w:tab/>
-      </w:r>
-      <w:r>
-        <w:rPr>
-          <w:rFonts w:ascii="Helvetica" w:hAnsi="Helvetica" w:eastAsia="Helvetica"/>
-          <w:b w:val="0"/>
-          <w:i w:val="0"/>
-          <w:color w:val="333333"/>
-          <w:sz w:val="22"/>
-        </w:rPr>
-        <w:t xml:space="preserve">training dataset. It cannot predict prices for properties outside these geographical </w:t>
-      </w:r>
-      <w:r>
-        <w:tab/>
-      </w:r>
-      <w:r>
-        <w:rPr>
-          <w:rFonts w:ascii="Helvetica" w:hAnsi="Helvetica" w:eastAsia="Helvetica"/>
-          <w:b w:val="0"/>
-          <w:i w:val="0"/>
-          <w:color w:val="333333"/>
-          <w:sz w:val="22"/>
-        </w:rPr>
-        <w:t>boundaries.</w:t>
-      </w:r>
-    </w:p>
-    <w:p>
-      <w:pPr>
-        <w:autoSpaceDN w:val="0"/>
-        <w:autoSpaceDE w:val="0"/>
-        <w:widowControl/>
-        <w:spacing w:line="332" w:lineRule="exact" w:before="816" w:after="0"/>
-        <w:ind w:left="30" w:right="0" w:firstLine="0"/>
-        <w:jc w:val="left"/>
-      </w:pPr>
-      <w:r>
-        <w:rPr>
-          <w:rFonts w:ascii="Helvetica" w:hAnsi="Helvetica" w:eastAsia="Helvetica"/>
-          <w:b/>
-          <w:i w:val="0"/>
-          <w:color w:val="1F3A52"/>
-          <w:sz w:val="24"/>
-        </w:rPr>
-        <w:t>4. Future Suggestions</w:t>
-      </w:r>
-    </w:p>
-    <w:p>
-      <w:pPr>
-        <w:sectPr>
-          <w:pgSz w:w="11906" w:h="16838"/>
-          <w:pgMar w:top="680" w:right="1104" w:bottom="952" w:left="1124" w:header="720" w:footer="720" w:gutter="0"/>
-          <w:cols/>
-          <w:docGrid w:linePitch="360"/>
-        </w:sectPr>
-      </w:pPr>
-    </w:p>
-    <w:p>
-      <w:pPr>
-        <w:autoSpaceDN w:val="0"/>
-        <w:autoSpaceDE w:val="0"/>
-        <w:widowControl/>
-        <w:spacing w:line="220" w:lineRule="exact" w:before="0" w:after="458"/>
-        <w:ind w:left="0" w:right="0"/>
-      </w:pPr>
-    </w:p>
-    <w:p>
-      <w:pPr>
-        <w:autoSpaceDN w:val="0"/>
-        <w:tabs>
-          <w:tab w:pos="344" w:val="left"/>
-        </w:tabs>
-        <w:autoSpaceDE w:val="0"/>
-        <w:widowControl/>
-        <w:spacing w:line="304" w:lineRule="exact" w:before="0" w:after="0"/>
-        <w:ind w:left="14" w:right="0" w:firstLine="0"/>
-        <w:jc w:val="left"/>
-      </w:pPr>
-      <w:r>
-        <w:rPr>
-          <w:rFonts w:ascii="Helvetica" w:hAnsi="Helvetica" w:eastAsia="Helvetica"/>
-          <w:b w:val="0"/>
-          <w:i w:val="0"/>
-          <w:color w:val="333333"/>
-          <w:sz w:val="22"/>
-        </w:rPr>
-        <w:t>•</w:t>
-      </w:r>
-      <w:r>
-        <w:tab/>
-      </w:r>
-      <w:r>
-        <w:rPr>
-          <w:rFonts w:ascii="Helvetica" w:hAnsi="Helvetica" w:eastAsia="Helvetica"/>
-          <w:b w:val="0"/>
-          <w:i w:val="0"/>
-          <w:color w:val="333333"/>
-          <w:sz w:val="22"/>
-        </w:rPr>
-        <w:t xml:space="preserve">We successfully implemented XGBoost and improved the $R^2$ score to </w:t>
-      </w:r>
-      <w:r>
-        <w:rPr>
-          <w:rFonts w:ascii="Helvetica" w:hAnsi="Helvetica" w:eastAsia="Helvetica"/>
-          <w:b/>
-          <w:i w:val="0"/>
-          <w:color w:val="333333"/>
-          <w:sz w:val="22"/>
-        </w:rPr>
-        <w:t>0.8256</w:t>
-      </w:r>
-      <w:r>
-        <w:rPr>
-          <w:rFonts w:ascii="Helvetica" w:hAnsi="Helvetica" w:eastAsia="Helvetica"/>
-          <w:b w:val="0"/>
-          <w:i w:val="0"/>
-          <w:color w:val="333333"/>
-          <w:sz w:val="22"/>
-        </w:rPr>
-        <w:t>. Future</w:t>
-      </w:r>
-    </w:p>
-    <w:p>
-      <w:pPr>
-        <w:autoSpaceDN w:val="0"/>
-        <w:autoSpaceDE w:val="0"/>
-        <w:widowControl/>
-        <w:spacing w:line="304" w:lineRule="exact" w:before="48" w:after="0"/>
-        <w:ind w:left="344" w:right="0" w:firstLine="0"/>
-        <w:jc w:val="left"/>
-      </w:pPr>
-      <w:r>
-        <w:rPr>
-          <w:rFonts w:ascii="Helvetica" w:hAnsi="Helvetica" w:eastAsia="Helvetica"/>
-          <w:b w:val="0"/>
-          <w:i w:val="0"/>
-          <w:color w:val="333333"/>
-          <w:sz w:val="22"/>
-        </w:rPr>
-        <w:t>work could incorporate LightGBM to speed up training.</w:t>
-      </w:r>
-    </w:p>
-    <w:p>
-      <w:pPr>
-        <w:autoSpaceDN w:val="0"/>
-        <w:tabs>
-          <w:tab w:pos="344" w:val="left"/>
-        </w:tabs>
-        <w:autoSpaceDE w:val="0"/>
-        <w:widowControl/>
-        <w:spacing w:line="304" w:lineRule="exact" w:before="198" w:after="0"/>
-        <w:ind w:left="14" w:right="0" w:firstLine="0"/>
-        <w:jc w:val="left"/>
-      </w:pPr>
-      <w:r>
-        <w:rPr>
-          <w:rFonts w:ascii="Helvetica" w:hAnsi="Helvetica" w:eastAsia="Helvetica"/>
-          <w:b w:val="0"/>
-          <w:i w:val="0"/>
-          <w:color w:val="333333"/>
-          <w:sz w:val="22"/>
-        </w:rPr>
-        <w:t>•</w:t>
-      </w:r>
-      <w:r>
-        <w:tab/>
-      </w:r>
-      <w:r>
-        <w:rPr>
-          <w:rFonts w:ascii="Helvetica" w:hAnsi="Helvetica" w:eastAsia="Helvetica"/>
-          <w:b w:val="0"/>
-          <w:i w:val="0"/>
-          <w:color w:val="333333"/>
-          <w:sz w:val="22"/>
-        </w:rPr>
-        <w:t>Incorporate SHAP (Shapley Additive exPlanations) values to provide local feature</w:t>
-      </w:r>
-    </w:p>
-    <w:p>
-      <w:pPr>
-        <w:autoSpaceDN w:val="0"/>
-        <w:autoSpaceDE w:val="0"/>
-        <w:widowControl/>
-        <w:spacing w:line="304" w:lineRule="exact" w:before="48" w:after="0"/>
-        <w:ind w:left="344" w:right="0" w:firstLine="0"/>
-        <w:jc w:val="left"/>
-      </w:pPr>
       <w:r>
         <w:rPr>
           <w:rFonts w:ascii="Helvetica" w:hAnsi="Helvetica" w:eastAsia="Helvetica"/>
@@ -11792,7 +11806,7 @@
     </w:p>
     <w:sectPr>
       <w:pgSz w:w="11906" w:h="16838"/>
-      <w:pgMar w:top="680" w:right="1440" w:bottom="1440" w:left="1440" w:header="720" w:footer="720" w:gutter="0"/>
+      <w:pgMar w:top="680" w:right="1440" w:bottom="1440" w:left="1154" w:header="720" w:footer="720" w:gutter="0"/>
       <w:cols/>
       <w:docGrid w:linePitch="360"/>
     </w:sectPr>

</xml_diff>